<commit_message>
Refine final documentation title page
</commit_message>
<xml_diff>
--- a/docs/M122E_Final_Documentation.docx
+++ b/docs/M122E_Final_Documentation.docx
@@ -8,11 +8,334 @@
       </w:pPr>
       <w:r>
         <w:rPr>
+          <w:b/>
+          <w:color w:val="1DB954"/>
+          <w:sz w:val="56"/>
+        </w:rPr>
+        <w:t>Weekly Spotify Wrapped</w:t>
+      </w:r>
+    </w:p>
+    <w:p>
+      <w:pPr>
+        <w:jc w:val="center"/>
+      </w:pPr>
+      <w:r>
+        <w:rPr>
+          <w:b/>
+          <w:color w:val="121212"/>
+          <w:sz w:val="32"/>
+        </w:rPr>
+        <w:t>M122E Final Documentation</w:t>
+      </w:r>
+    </w:p>
+    <w:p>
+      <w:pPr>
+        <w:jc w:val="center"/>
+      </w:pPr>
+      <w:r>
+        <w:rPr>
+          <w:i/>
+          <w:color w:val="4B5563"/>
+        </w:rPr>
+        <w:t>Python automation project for a weekly personal music report</w:t>
+      </w:r>
+    </w:p>
+    <w:p/>
+    <w:tbl>
+      <w:tblPr>
+        <w:tblW w:w="0" w:type="auto"/>
+        <w:jc w:val="center"/>
+        <w:tblLook w:val="04A0" w:firstRow="1" w:lastRow="0" w:firstColumn="1" w:lastColumn="0" w:noHBand="0" w:noVBand="1"/>
+      </w:tblPr>
+      <w:tblGrid>
+        <w:gridCol w:w="2376"/>
+        <w:gridCol w:w="6696"/>
+      </w:tblGrid>
+      <w:tr>
+        <w:trPr>
+          <w:jc w:val="center"/>
+        </w:trPr>
+        <w:tc>
+          <w:tcPr>
+            <w:tcW w:w="2376" w:type="dxa"/>
+            <w:shd w:val="clear" w:color="auto" w:fill="F8FAFC"/>
+          </w:tcPr>
+          <w:p>
+            <w:pPr>
+              <w:spacing w:after="0"/>
+            </w:pPr>
+            <w:r>
+              <w:rPr>
+                <w:b/>
+                <w:color w:val="374151"/>
+                <w:sz w:val="19"/>
+              </w:rPr>
+              <w:t>Name</w:t>
+            </w:r>
+          </w:p>
+        </w:tc>
+        <w:tc>
+          <w:tcPr>
+            <w:tcW w:w="6696" w:type="dxa"/>
+            <w:shd w:val="clear" w:color="auto" w:fill="FFFFFF"/>
+          </w:tcPr>
+          <w:p>
+            <w:pPr>
+              <w:spacing w:after="0"/>
+            </w:pPr>
+            <w:r>
+              <w:rPr>
+                <w:sz w:val="19"/>
+              </w:rPr>
+              <w:t>S. Voutat</w:t>
+            </w:r>
+          </w:p>
+        </w:tc>
+      </w:tr>
+      <w:tr>
+        <w:trPr>
+          <w:jc w:val="center"/>
+        </w:trPr>
+        <w:tc>
+          <w:tcPr>
+            <w:tcW w:w="2376" w:type="dxa"/>
+            <w:shd w:val="clear" w:color="auto" w:fill="F8FAFC"/>
+          </w:tcPr>
+          <w:p>
+            <w:r>
+              <w:rPr>
+                <w:b/>
+                <w:color w:val="374151"/>
+                <w:sz w:val="19"/>
+              </w:rPr>
+              <w:t>Modul</w:t>
+            </w:r>
+          </w:p>
+        </w:tc>
+        <w:tc>
+          <w:tcPr>
+            <w:tcW w:w="6696" w:type="dxa"/>
+            <w:shd w:val="clear" w:color="auto" w:fill="FFFFFF"/>
+          </w:tcPr>
+          <w:p>
+            <w:pPr>
+              <w:spacing w:after="0"/>
+            </w:pPr>
+            <w:r>
+              <w:rPr>
+                <w:sz w:val="19"/>
+              </w:rPr>
+              <w:t>M122E - Automate process with a scripting language</w:t>
+            </w:r>
+          </w:p>
+        </w:tc>
+      </w:tr>
+      <w:tr>
+        <w:trPr>
+          <w:jc w:val="center"/>
+        </w:trPr>
+        <w:tc>
+          <w:tcPr>
+            <w:tcW w:w="2376" w:type="dxa"/>
+            <w:shd w:val="clear" w:color="auto" w:fill="F8FAFC"/>
+          </w:tcPr>
+          <w:p>
+            <w:r>
+              <w:rPr>
+                <w:b/>
+                <w:color w:val="374151"/>
+                <w:sz w:val="19"/>
+              </w:rPr>
+              <w:t>Schule</w:t>
+            </w:r>
+          </w:p>
+        </w:tc>
+        <w:tc>
+          <w:tcPr>
+            <w:tcW w:w="6696" w:type="dxa"/>
+            <w:shd w:val="clear" w:color="auto" w:fill="FFFFFF"/>
+          </w:tcPr>
+          <w:p>
+            <w:pPr>
+              <w:spacing w:after="0"/>
+            </w:pPr>
+            <w:r>
+              <w:rPr>
+                <w:sz w:val="19"/>
+              </w:rPr>
+              <w:t>GIBZ</w:t>
+            </w:r>
+          </w:p>
+        </w:tc>
+      </w:tr>
+      <w:tr>
+        <w:trPr>
+          <w:jc w:val="center"/>
+        </w:trPr>
+        <w:tc>
+          <w:tcPr>
+            <w:tcW w:w="2376" w:type="dxa"/>
+            <w:shd w:val="clear" w:color="auto" w:fill="F8FAFC"/>
+          </w:tcPr>
+          <w:p>
+            <w:r>
+              <w:rPr>
+                <w:b/>
+                <w:color w:val="374151"/>
+                <w:sz w:val="19"/>
+              </w:rPr>
+              <w:t>Lehrperson</w:t>
+            </w:r>
+          </w:p>
+        </w:tc>
+        <w:tc>
+          <w:tcPr>
+            <w:tcW w:w="6696" w:type="dxa"/>
+            <w:shd w:val="clear" w:color="auto" w:fill="FFFFFF"/>
+          </w:tcPr>
+          <w:p>
+            <w:pPr>
+              <w:spacing w:after="0"/>
+            </w:pPr>
+            <w:r>
+              <w:rPr>
+                <w:sz w:val="19"/>
+              </w:rPr>
+              <w:t>Roger M?ller</w:t>
+            </w:r>
+          </w:p>
+        </w:tc>
+      </w:tr>
+      <w:tr>
+        <w:trPr>
+          <w:jc w:val="center"/>
+        </w:trPr>
+        <w:tc>
+          <w:tcPr>
+            <w:tcW w:w="2376" w:type="dxa"/>
+            <w:shd w:val="clear" w:color="auto" w:fill="F8FAFC"/>
+          </w:tcPr>
+          <w:p>
+            <w:r>
+              <w:rPr>
+                <w:b/>
+                <w:color w:val="374151"/>
+                <w:sz w:val="19"/>
+              </w:rPr>
+              <w:t>Projekt</w:t>
+            </w:r>
+          </w:p>
+        </w:tc>
+        <w:tc>
+          <w:tcPr>
+            <w:tcW w:w="6696" w:type="dxa"/>
+            <w:shd w:val="clear" w:color="auto" w:fill="FFFFFF"/>
+          </w:tcPr>
+          <w:p>
+            <w:pPr>
+              <w:spacing w:after="0"/>
+            </w:pPr>
+            <w:r>
+              <w:rPr>
+                <w:sz w:val="19"/>
+              </w:rPr>
+              <w:t>Weekly Spotify Wrapped</w:t>
+            </w:r>
+          </w:p>
+        </w:tc>
+      </w:tr>
+      <w:tr>
+        <w:trPr>
+          <w:jc w:val="center"/>
+        </w:trPr>
+        <w:tc>
+          <w:tcPr>
+            <w:tcW w:w="2376" w:type="dxa"/>
+            <w:shd w:val="clear" w:color="auto" w:fill="F8FAFC"/>
+          </w:tcPr>
+          <w:p>
+            <w:pPr>
+              <w:spacing w:after="0"/>
+            </w:pPr>
+            <w:r>
+              <w:rPr>
+                <w:b/>
+                <w:color w:val="374151"/>
+                <w:sz w:val="19"/>
+              </w:rPr>
+              <w:t>Repository</w:t>
+            </w:r>
+          </w:p>
+        </w:tc>
+        <w:tc>
+          <w:tcPr>
+            <w:tcW w:w="6696" w:type="dxa"/>
+            <w:shd w:val="clear" w:color="auto" w:fill="FFFFFF"/>
+          </w:tcPr>
+          <w:p>
+            <w:pPr>
+              <w:spacing w:after="0"/>
+            </w:pPr>
+            <w:r>
+              <w:rPr>
+                <w:sz w:val="19"/>
+              </w:rPr>
+              <w:t>https://github.com/Svoutat/weekly-spotify-wrapped</w:t>
+            </w:r>
+          </w:p>
+        </w:tc>
+      </w:tr>
+      <w:tr>
+        <w:trPr>
+          <w:jc w:val="center"/>
+        </w:trPr>
+        <w:tc>
+          <w:tcPr>
+            <w:tcW w:w="2376" w:type="dxa"/>
+            <w:shd w:val="clear" w:color="auto" w:fill="F8FAFC"/>
+          </w:tcPr>
+          <w:p>
+            <w:r>
+              <w:rPr>
+                <w:b/>
+                <w:color w:val="374151"/>
+                <w:sz w:val="19"/>
+              </w:rPr>
+              <w:t>Datum</w:t>
+            </w:r>
+          </w:p>
+        </w:tc>
+        <w:tc>
+          <w:tcPr>
+            <w:tcW w:w="6696" w:type="dxa"/>
+            <w:shd w:val="clear" w:color="auto" w:fill="FFFFFF"/>
+          </w:tcPr>
+          <w:p>
+            <w:pPr>
+              <w:spacing w:after="0"/>
+            </w:pPr>
+            <w:r>
+              <w:rPr>
+                <w:sz w:val="19"/>
+              </w:rPr>
+              <w:t>16 June 2026</w:t>
+            </w:r>
+          </w:p>
+        </w:tc>
+      </w:tr>
+    </w:tbl>
+    <w:p/>
+    <w:p>
+      <w:pPr>
+        <w:jc w:val="center"/>
+      </w:pPr>
+      <w:r>
+        <w:rPr>
           <w:noProof/>
         </w:rPr>
         <w:drawing>
-          <wp:inline distT="0" distB="0" distL="0" distR="0" wp14:anchorId="22333670" wp14:editId="21BC22A2">
-            <wp:extent cx="6263640" cy="3131820"/>
+          <wp:inline distT="0" distB="0" distL="0" distR="0" wp14:anchorId="1E78395C" wp14:editId="053D435C">
+            <wp:extent cx="1417320" cy="1417320"/>
             <wp:effectExtent l="0" t="0" r="0" b="0"/>
             <wp:docPr id="1" name="Picture 1"/>
             <wp:cNvGraphicFramePr>
@@ -22,7 +345,7 @@
               <a:graphicData uri="http://schemas.openxmlformats.org/drawingml/2006/picture">
                 <pic:pic xmlns:pic="http://schemas.openxmlformats.org/drawingml/2006/picture">
                   <pic:nvPicPr>
-                    <pic:cNvPr id="0" name="weekly_spotify_wrapped_cover.png"/>
+                    <pic:cNvPr id="0" name="weekly_spotify_wrapped_icon.png"/>
                     <pic:cNvPicPr/>
                   </pic:nvPicPr>
                   <pic:blipFill>
@@ -34,7 +357,7 @@
                   <pic:spPr>
                     <a:xfrm>
                       <a:off x="0" y="0"/>
-                      <a:ext cx="6263640" cy="3131820"/>
+                      <a:ext cx="1417320" cy="1417320"/>
                     </a:xfrm>
                     <a:prstGeom prst="rect">
                       <a:avLst/>
@@ -53,34 +376,10 @@
       </w:pPr>
       <w:r>
         <w:rPr>
-          <w:b/>
-          <w:color w:val="1DB954"/>
-          <w:sz w:val="36"/>
+          <w:color w:val="4B5563"/>
+          <w:sz w:val="19"/>
         </w:rPr>
-        <w:t>M122E Final Documentation</w:t>
-      </w:r>
-    </w:p>
-    <w:p>
-      <w:pPr>
-        <w:jc w:val="center"/>
-      </w:pPr>
-      <w:r>
-        <w:rPr>
-          <w:i/>
-          <w:sz w:val="22"/>
-        </w:rPr>
-        <w:t>Python automation project for a weekly personal music report</w:t>
-      </w:r>
-    </w:p>
-    <w:p>
-      <w:pPr>
-        <w:jc w:val="center"/>
-      </w:pPr>
-      <w:r>
-        <w:rPr>
-          <w:sz w:val="18"/>
-        </w:rPr>
-        <w:t>Repository: https://github.com/Svoutat/weekly-spotify-wrapped</w:t>
+        <w:t>Last.fm listening history, Spotify metadata, SQLite storage and Gmail delivery in one automated weekly workflow.</w:t>
       </w:r>
     </w:p>
     <w:p>
@@ -92,7 +391,7 @@
       <w:pPr>
         <w:pStyle w:val="berschrift1"/>
       </w:pPr>
-      <w:bookmarkStart w:id="0" w:name="_Toc232536542"/>
+      <w:bookmarkStart w:id="0" w:name="_Toc232537672"/>
       <w:r>
         <w:lastRenderedPageBreak/>
         <w:t>Table of Contents</w:t>
@@ -119,12 +418,12 @@
         <w:fldChar w:fldCharType="begin"/>
       </w:r>
       <w:r>
-        <w:instrText>TOC \o "1-3" \h \z \u</w:instrText>
+        <w:instrText>TOC \o "1-1" \h \z \u</w:instrText>
       </w:r>
       <w:r>
         <w:fldChar w:fldCharType="separate"/>
       </w:r>
-      <w:hyperlink w:anchor="_Toc232536542" w:history="1">
+      <w:hyperlink w:anchor="_Toc232537672" w:history="1">
         <w:r>
           <w:rPr>
             <w:rStyle w:val="Hyperlink"/>
@@ -151,7 +450,7 @@
             <w:noProof/>
             <w:webHidden/>
           </w:rPr>
-          <w:instrText xml:space="preserve"> PAGEREF _Toc232536542 \h </w:instrText>
+          <w:instrText xml:space="preserve"> PAGEREF _Toc232537672 \h </w:instrText>
         </w:r>
         <w:r>
           <w:rPr>
@@ -198,7 +497,7 @@
           <w14:ligatures w14:val="standardContextual"/>
         </w:rPr>
       </w:pPr>
-      <w:hyperlink w:anchor="_Toc232536543" w:history="1">
+      <w:hyperlink w:anchor="_Toc232537673" w:history="1">
         <w:r>
           <w:rPr>
             <w:rStyle w:val="Hyperlink"/>
@@ -225,7 +524,155 @@
             <w:noProof/>
             <w:webHidden/>
           </w:rPr>
-          <w:instrText xml:space="preserve"> PAGEREF _Toc232536543 \h </w:instrText>
+          <w:instrText xml:space="preserve"> PAGEREF _Toc232537673 \h </w:instrText>
+        </w:r>
+        <w:r>
+          <w:rPr>
+            <w:noProof/>
+            <w:webHidden/>
+          </w:rPr>
+        </w:r>
+        <w:r>
+          <w:rPr>
+            <w:noProof/>
+            <w:webHidden/>
+          </w:rPr>
+          <w:fldChar w:fldCharType="separate"/>
+        </w:r>
+        <w:r>
+          <w:rPr>
+            <w:noProof/>
+            <w:webHidden/>
+          </w:rPr>
+          <w:t>3</w:t>
+        </w:r>
+        <w:r>
+          <w:rPr>
+            <w:noProof/>
+            <w:webHidden/>
+          </w:rPr>
+          <w:fldChar w:fldCharType="end"/>
+        </w:r>
+      </w:hyperlink>
+    </w:p>
+    <w:p>
+      <w:pPr>
+        <w:pStyle w:val="Verzeichnis1"/>
+        <w:tabs>
+          <w:tab w:val="right" w:leader="dot" w:pos="10156"/>
+        </w:tabs>
+        <w:rPr>
+          <w:rFonts w:asciiTheme="minorHAnsi" w:hAnsiTheme="minorHAnsi"/>
+          <w:noProof/>
+          <w:kern w:val="2"/>
+          <w:sz w:val="24"/>
+          <w:szCs w:val="24"/>
+          <w:lang w:val="de-CH" w:eastAsia="de-CH"/>
+          <w14:ligatures w14:val="standardContextual"/>
+        </w:rPr>
+      </w:pPr>
+      <w:hyperlink w:anchor="_Toc232537674" w:history="1">
+        <w:r>
+          <w:rPr>
+            <w:rStyle w:val="Hyperlink"/>
+            <w:noProof/>
+          </w:rPr>
+          <w:t>2. Project Work And Personal Approach</w:t>
+        </w:r>
+        <w:r>
+          <w:rPr>
+            <w:noProof/>
+            <w:webHidden/>
+          </w:rPr>
+          <w:tab/>
+        </w:r>
+        <w:r>
+          <w:rPr>
+            <w:noProof/>
+            <w:webHidden/>
+          </w:rPr>
+          <w:fldChar w:fldCharType="begin"/>
+        </w:r>
+        <w:r>
+          <w:rPr>
+            <w:noProof/>
+            <w:webHidden/>
+          </w:rPr>
+          <w:instrText xml:space="preserve"> PAGEREF _Toc232537674 \h </w:instrText>
+        </w:r>
+        <w:r>
+          <w:rPr>
+            <w:noProof/>
+            <w:webHidden/>
+          </w:rPr>
+        </w:r>
+        <w:r>
+          <w:rPr>
+            <w:noProof/>
+            <w:webHidden/>
+          </w:rPr>
+          <w:fldChar w:fldCharType="separate"/>
+        </w:r>
+        <w:r>
+          <w:rPr>
+            <w:noProof/>
+            <w:webHidden/>
+          </w:rPr>
+          <w:t>3</w:t>
+        </w:r>
+        <w:r>
+          <w:rPr>
+            <w:noProof/>
+            <w:webHidden/>
+          </w:rPr>
+          <w:fldChar w:fldCharType="end"/>
+        </w:r>
+      </w:hyperlink>
+    </w:p>
+    <w:p>
+      <w:pPr>
+        <w:pStyle w:val="Verzeichnis1"/>
+        <w:tabs>
+          <w:tab w:val="right" w:leader="dot" w:pos="10156"/>
+        </w:tabs>
+        <w:rPr>
+          <w:rFonts w:asciiTheme="minorHAnsi" w:hAnsiTheme="minorHAnsi"/>
+          <w:noProof/>
+          <w:kern w:val="2"/>
+          <w:sz w:val="24"/>
+          <w:szCs w:val="24"/>
+          <w:lang w:val="de-CH" w:eastAsia="de-CH"/>
+          <w14:ligatures w14:val="standardContextual"/>
+        </w:rPr>
+      </w:pPr>
+      <w:hyperlink w:anchor="_Toc232537675" w:history="1">
+        <w:r>
+          <w:rPr>
+            <w:rStyle w:val="Hyperlink"/>
+            <w:noProof/>
+          </w:rPr>
+          <w:t>3. Project Plan</w:t>
+        </w:r>
+        <w:r>
+          <w:rPr>
+            <w:noProof/>
+            <w:webHidden/>
+          </w:rPr>
+          <w:tab/>
+        </w:r>
+        <w:r>
+          <w:rPr>
+            <w:noProof/>
+            <w:webHidden/>
+          </w:rPr>
+          <w:fldChar w:fldCharType="begin"/>
+        </w:r>
+        <w:r>
+          <w:rPr>
+            <w:noProof/>
+            <w:webHidden/>
+          </w:rPr>
+          <w:instrText xml:space="preserve"> PAGEREF _Toc232537675 \h </w:instrText>
         </w:r>
         <w:r>
           <w:rPr>
@@ -258,7 +705,7 @@
     </w:p>
     <w:p>
       <w:pPr>
-        <w:pStyle w:val="Verzeichnis2"/>
+        <w:pStyle w:val="Verzeichnis1"/>
         <w:tabs>
           <w:tab w:val="right" w:leader="dot" w:pos="10156"/>
         </w:tabs>
@@ -272,13 +719,13 @@
           <w14:ligatures w14:val="standardContextual"/>
         </w:rPr>
       </w:pPr>
-      <w:hyperlink w:anchor="_Toc232536544" w:history="1">
+      <w:hyperlink w:anchor="_Toc232537676" w:history="1">
         <w:r>
           <w:rPr>
             <w:rStyle w:val="Hyperlink"/>
             <w:noProof/>
           </w:rPr>
-          <w:t>1.1 Context</w:t>
+          <w:t>4. Requirements</w:t>
         </w:r>
         <w:r>
           <w:rPr>
@@ -299,7 +746,7 @@
             <w:noProof/>
             <w:webHidden/>
           </w:rPr>
-          <w:instrText xml:space="preserve"> PAGEREF _Toc232536544 \h </w:instrText>
+          <w:instrText xml:space="preserve"> PAGEREF _Toc232537676 \h </w:instrText>
         </w:r>
         <w:r>
           <w:rPr>
@@ -332,7 +779,7 @@
     </w:p>
     <w:p>
       <w:pPr>
-        <w:pStyle w:val="Verzeichnis2"/>
+        <w:pStyle w:val="Verzeichnis1"/>
         <w:tabs>
           <w:tab w:val="right" w:leader="dot" w:pos="10156"/>
         </w:tabs>
@@ -346,13 +793,13 @@
           <w14:ligatures w14:val="standardContextual"/>
         </w:rPr>
       </w:pPr>
-      <w:hyperlink w:anchor="_Toc232536545" w:history="1">
+      <w:hyperlink w:anchor="_Toc232537677" w:history="1">
         <w:r>
           <w:rPr>
             <w:rStyle w:val="Hyperlink"/>
             <w:noProof/>
           </w:rPr>
-          <w:t>1.2 Goal</w:t>
+          <w:t>5. System Design</w:t>
         </w:r>
         <w:r>
           <w:rPr>
@@ -373,377 +820,7 @@
             <w:noProof/>
             <w:webHidden/>
           </w:rPr>
-          <w:instrText xml:space="preserve"> PAGEREF _Toc232536545 \h </w:instrText>
-        </w:r>
-        <w:r>
-          <w:rPr>
-            <w:noProof/>
-            <w:webHidden/>
-          </w:rPr>
-        </w:r>
-        <w:r>
-          <w:rPr>
-            <w:noProof/>
-            <w:webHidden/>
-          </w:rPr>
-          <w:fldChar w:fldCharType="separate"/>
-        </w:r>
-        <w:r>
-          <w:rPr>
-            <w:noProof/>
-            <w:webHidden/>
-          </w:rPr>
-          <w:t>4</w:t>
-        </w:r>
-        <w:r>
-          <w:rPr>
-            <w:noProof/>
-            <w:webHidden/>
-          </w:rPr>
-          <w:fldChar w:fldCharType="end"/>
-        </w:r>
-      </w:hyperlink>
-    </w:p>
-    <w:p>
-      <w:pPr>
-        <w:pStyle w:val="Verzeichnis2"/>
-        <w:tabs>
-          <w:tab w:val="right" w:leader="dot" w:pos="10156"/>
-        </w:tabs>
-        <w:rPr>
-          <w:rFonts w:asciiTheme="minorHAnsi" w:hAnsiTheme="minorHAnsi"/>
-          <w:noProof/>
-          <w:kern w:val="2"/>
-          <w:sz w:val="24"/>
-          <w:szCs w:val="24"/>
-          <w:lang w:val="de-CH" w:eastAsia="de-CH"/>
-          <w14:ligatures w14:val="standardContextual"/>
-        </w:rPr>
-      </w:pPr>
-      <w:hyperlink w:anchor="_Toc232536546" w:history="1">
-        <w:r>
-          <w:rPr>
-            <w:rStyle w:val="Hyperlink"/>
-            <w:noProof/>
-          </w:rPr>
-          <w:t>1.3 What The Program Does</w:t>
-        </w:r>
-        <w:r>
-          <w:rPr>
-            <w:noProof/>
-            <w:webHidden/>
-          </w:rPr>
-          <w:tab/>
-        </w:r>
-        <w:r>
-          <w:rPr>
-            <w:noProof/>
-            <w:webHidden/>
-          </w:rPr>
-          <w:fldChar w:fldCharType="begin"/>
-        </w:r>
-        <w:r>
-          <w:rPr>
-            <w:noProof/>
-            <w:webHidden/>
-          </w:rPr>
-          <w:instrText xml:space="preserve"> PAGEREF _Toc232536546 \h </w:instrText>
-        </w:r>
-        <w:r>
-          <w:rPr>
-            <w:noProof/>
-            <w:webHidden/>
-          </w:rPr>
-        </w:r>
-        <w:r>
-          <w:rPr>
-            <w:noProof/>
-            <w:webHidden/>
-          </w:rPr>
-          <w:fldChar w:fldCharType="separate"/>
-        </w:r>
-        <w:r>
-          <w:rPr>
-            <w:noProof/>
-            <w:webHidden/>
-          </w:rPr>
-          <w:t>4</w:t>
-        </w:r>
-        <w:r>
-          <w:rPr>
-            <w:noProof/>
-            <w:webHidden/>
-          </w:rPr>
-          <w:fldChar w:fldCharType="end"/>
-        </w:r>
-      </w:hyperlink>
-    </w:p>
-    <w:p>
-      <w:pPr>
-        <w:pStyle w:val="Verzeichnis1"/>
-        <w:tabs>
-          <w:tab w:val="right" w:leader="dot" w:pos="10156"/>
-        </w:tabs>
-        <w:rPr>
-          <w:rFonts w:asciiTheme="minorHAnsi" w:hAnsiTheme="minorHAnsi"/>
-          <w:noProof/>
-          <w:kern w:val="2"/>
-          <w:sz w:val="24"/>
-          <w:szCs w:val="24"/>
-          <w:lang w:val="de-CH" w:eastAsia="de-CH"/>
-          <w14:ligatures w14:val="standardContextual"/>
-        </w:rPr>
-      </w:pPr>
-      <w:hyperlink w:anchor="_Toc232536547" w:history="1">
-        <w:r>
-          <w:rPr>
-            <w:rStyle w:val="Hyperlink"/>
-            <w:noProof/>
-          </w:rPr>
-          <w:t>2. Project Work And Personal Approach</w:t>
-        </w:r>
-        <w:r>
-          <w:rPr>
-            <w:noProof/>
-            <w:webHidden/>
-          </w:rPr>
-          <w:tab/>
-        </w:r>
-        <w:r>
-          <w:rPr>
-            <w:noProof/>
-            <w:webHidden/>
-          </w:rPr>
-          <w:fldChar w:fldCharType="begin"/>
-        </w:r>
-        <w:r>
-          <w:rPr>
-            <w:noProof/>
-            <w:webHidden/>
-          </w:rPr>
-          <w:instrText xml:space="preserve"> PAGEREF _Toc232536547 \h </w:instrText>
-        </w:r>
-        <w:r>
-          <w:rPr>
-            <w:noProof/>
-            <w:webHidden/>
-          </w:rPr>
-        </w:r>
-        <w:r>
-          <w:rPr>
-            <w:noProof/>
-            <w:webHidden/>
-          </w:rPr>
-          <w:fldChar w:fldCharType="separate"/>
-        </w:r>
-        <w:r>
-          <w:rPr>
-            <w:noProof/>
-            <w:webHidden/>
-          </w:rPr>
-          <w:t>4</w:t>
-        </w:r>
-        <w:r>
-          <w:rPr>
-            <w:noProof/>
-            <w:webHidden/>
-          </w:rPr>
-          <w:fldChar w:fldCharType="end"/>
-        </w:r>
-      </w:hyperlink>
-    </w:p>
-    <w:p>
-      <w:pPr>
-        <w:pStyle w:val="Verzeichnis2"/>
-        <w:tabs>
-          <w:tab w:val="right" w:leader="dot" w:pos="10156"/>
-        </w:tabs>
-        <w:rPr>
-          <w:rFonts w:asciiTheme="minorHAnsi" w:hAnsiTheme="minorHAnsi"/>
-          <w:noProof/>
-          <w:kern w:val="2"/>
-          <w:sz w:val="24"/>
-          <w:szCs w:val="24"/>
-          <w:lang w:val="de-CH" w:eastAsia="de-CH"/>
-          <w14:ligatures w14:val="standardContextual"/>
-        </w:rPr>
-      </w:pPr>
-      <w:hyperlink w:anchor="_Toc232536548" w:history="1">
-        <w:r>
-          <w:rPr>
-            <w:rStyle w:val="Hyperlink"/>
-            <w:noProof/>
-          </w:rPr>
-          <w:t>2.1 How I Started</w:t>
-        </w:r>
-        <w:r>
-          <w:rPr>
-            <w:noProof/>
-            <w:webHidden/>
-          </w:rPr>
-          <w:tab/>
-        </w:r>
-        <w:r>
-          <w:rPr>
-            <w:noProof/>
-            <w:webHidden/>
-          </w:rPr>
-          <w:fldChar w:fldCharType="begin"/>
-        </w:r>
-        <w:r>
-          <w:rPr>
-            <w:noProof/>
-            <w:webHidden/>
-          </w:rPr>
-          <w:instrText xml:space="preserve"> PAGEREF _Toc232536548 \h </w:instrText>
-        </w:r>
-        <w:r>
-          <w:rPr>
-            <w:noProof/>
-            <w:webHidden/>
-          </w:rPr>
-        </w:r>
-        <w:r>
-          <w:rPr>
-            <w:noProof/>
-            <w:webHidden/>
-          </w:rPr>
-          <w:fldChar w:fldCharType="separate"/>
-        </w:r>
-        <w:r>
-          <w:rPr>
-            <w:noProof/>
-            <w:webHidden/>
-          </w:rPr>
-          <w:t>4</w:t>
-        </w:r>
-        <w:r>
-          <w:rPr>
-            <w:noProof/>
-            <w:webHidden/>
-          </w:rPr>
-          <w:fldChar w:fldCharType="end"/>
-        </w:r>
-      </w:hyperlink>
-    </w:p>
-    <w:p>
-      <w:pPr>
-        <w:pStyle w:val="Verzeichnis2"/>
-        <w:tabs>
-          <w:tab w:val="right" w:leader="dot" w:pos="10156"/>
-        </w:tabs>
-        <w:rPr>
-          <w:rFonts w:asciiTheme="minorHAnsi" w:hAnsiTheme="minorHAnsi"/>
-          <w:noProof/>
-          <w:kern w:val="2"/>
-          <w:sz w:val="24"/>
-          <w:szCs w:val="24"/>
-          <w:lang w:val="de-CH" w:eastAsia="de-CH"/>
-          <w14:ligatures w14:val="standardContextual"/>
-        </w:rPr>
-      </w:pPr>
-      <w:hyperlink w:anchor="_Toc232536549" w:history="1">
-        <w:r>
-          <w:rPr>
-            <w:rStyle w:val="Hyperlink"/>
-            <w:noProof/>
-          </w:rPr>
-          <w:t>2.2 Difficulties During The Project</w:t>
-        </w:r>
-        <w:r>
-          <w:rPr>
-            <w:noProof/>
-            <w:webHidden/>
-          </w:rPr>
-          <w:tab/>
-        </w:r>
-        <w:r>
-          <w:rPr>
-            <w:noProof/>
-            <w:webHidden/>
-          </w:rPr>
-          <w:fldChar w:fldCharType="begin"/>
-        </w:r>
-        <w:r>
-          <w:rPr>
-            <w:noProof/>
-            <w:webHidden/>
-          </w:rPr>
-          <w:instrText xml:space="preserve"> PAGEREF _Toc232536549 \h </w:instrText>
-        </w:r>
-        <w:r>
-          <w:rPr>
-            <w:noProof/>
-            <w:webHidden/>
-          </w:rPr>
-        </w:r>
-        <w:r>
-          <w:rPr>
-            <w:noProof/>
-            <w:webHidden/>
-          </w:rPr>
-          <w:fldChar w:fldCharType="separate"/>
-        </w:r>
-        <w:r>
-          <w:rPr>
-            <w:noProof/>
-            <w:webHidden/>
-          </w:rPr>
-          <w:t>4</w:t>
-        </w:r>
-        <w:r>
-          <w:rPr>
-            <w:noProof/>
-            <w:webHidden/>
-          </w:rPr>
-          <w:fldChar w:fldCharType="end"/>
-        </w:r>
-      </w:hyperlink>
-    </w:p>
-    <w:p>
-      <w:pPr>
-        <w:pStyle w:val="Verzeichnis2"/>
-        <w:tabs>
-          <w:tab w:val="right" w:leader="dot" w:pos="10156"/>
-        </w:tabs>
-        <w:rPr>
-          <w:rFonts w:asciiTheme="minorHAnsi" w:hAnsiTheme="minorHAnsi"/>
-          <w:noProof/>
-          <w:kern w:val="2"/>
-          <w:sz w:val="24"/>
-          <w:szCs w:val="24"/>
-          <w:lang w:val="de-CH" w:eastAsia="de-CH"/>
-          <w14:ligatures w14:val="standardContextual"/>
-        </w:rPr>
-      </w:pPr>
-      <w:hyperlink w:anchor="_Toc232536550" w:history="1">
-        <w:r>
-          <w:rPr>
-            <w:rStyle w:val="Hyperlink"/>
-            <w:noProof/>
-          </w:rPr>
-          <w:t>2.3 What I Improved Near The End</w:t>
-        </w:r>
-        <w:r>
-          <w:rPr>
-            <w:noProof/>
-            <w:webHidden/>
-          </w:rPr>
-          <w:tab/>
-        </w:r>
-        <w:r>
-          <w:rPr>
-            <w:noProof/>
-            <w:webHidden/>
-          </w:rPr>
-          <w:fldChar w:fldCharType="begin"/>
-        </w:r>
-        <w:r>
-          <w:rPr>
-            <w:noProof/>
-            <w:webHidden/>
-          </w:rPr>
-          <w:instrText xml:space="preserve"> PAGEREF _Toc232536550 \h </w:instrText>
+          <w:instrText xml:space="preserve"> PAGEREF _Toc232537677 \h </w:instrText>
         </w:r>
         <w:r>
           <w:rPr>
@@ -790,13 +867,13 @@
           <w14:ligatures w14:val="standardContextual"/>
         </w:rPr>
       </w:pPr>
-      <w:hyperlink w:anchor="_Toc232536551" w:history="1">
+      <w:hyperlink w:anchor="_Toc232537678" w:history="1">
         <w:r>
           <w:rPr>
             <w:rStyle w:val="Hyperlink"/>
             <w:noProof/>
           </w:rPr>
-          <w:t>3. Project Plan</w:t>
+          <w:t>6. Database Design</w:t>
         </w:r>
         <w:r>
           <w:rPr>
@@ -817,895 +894,7 @@
             <w:noProof/>
             <w:webHidden/>
           </w:rPr>
-          <w:instrText xml:space="preserve"> PAGEREF _Toc232536551 \h </w:instrText>
-        </w:r>
-        <w:r>
-          <w:rPr>
-            <w:noProof/>
-            <w:webHidden/>
-          </w:rPr>
-        </w:r>
-        <w:r>
-          <w:rPr>
-            <w:noProof/>
-            <w:webHidden/>
-          </w:rPr>
-          <w:fldChar w:fldCharType="separate"/>
-        </w:r>
-        <w:r>
-          <w:rPr>
-            <w:noProof/>
-            <w:webHidden/>
-          </w:rPr>
-          <w:t>5</w:t>
-        </w:r>
-        <w:r>
-          <w:rPr>
-            <w:noProof/>
-            <w:webHidden/>
-          </w:rPr>
-          <w:fldChar w:fldCharType="end"/>
-        </w:r>
-      </w:hyperlink>
-    </w:p>
-    <w:p>
-      <w:pPr>
-        <w:pStyle w:val="Verzeichnis1"/>
-        <w:tabs>
-          <w:tab w:val="right" w:leader="dot" w:pos="10156"/>
-        </w:tabs>
-        <w:rPr>
-          <w:rFonts w:asciiTheme="minorHAnsi" w:hAnsiTheme="minorHAnsi"/>
-          <w:noProof/>
-          <w:kern w:val="2"/>
-          <w:sz w:val="24"/>
-          <w:szCs w:val="24"/>
-          <w:lang w:val="de-CH" w:eastAsia="de-CH"/>
-          <w14:ligatures w14:val="standardContextual"/>
-        </w:rPr>
-      </w:pPr>
-      <w:hyperlink w:anchor="_Toc232536552" w:history="1">
-        <w:r>
-          <w:rPr>
-            <w:rStyle w:val="Hyperlink"/>
-            <w:noProof/>
-          </w:rPr>
-          <w:t>4. Requirements</w:t>
-        </w:r>
-        <w:r>
-          <w:rPr>
-            <w:noProof/>
-            <w:webHidden/>
-          </w:rPr>
-          <w:tab/>
-        </w:r>
-        <w:r>
-          <w:rPr>
-            <w:noProof/>
-            <w:webHidden/>
-          </w:rPr>
-          <w:fldChar w:fldCharType="begin"/>
-        </w:r>
-        <w:r>
-          <w:rPr>
-            <w:noProof/>
-            <w:webHidden/>
-          </w:rPr>
-          <w:instrText xml:space="preserve"> PAGEREF _Toc232536552 \h </w:instrText>
-        </w:r>
-        <w:r>
-          <w:rPr>
-            <w:noProof/>
-            <w:webHidden/>
-          </w:rPr>
-        </w:r>
-        <w:r>
-          <w:rPr>
-            <w:noProof/>
-            <w:webHidden/>
-          </w:rPr>
-          <w:fldChar w:fldCharType="separate"/>
-        </w:r>
-        <w:r>
-          <w:rPr>
-            <w:noProof/>
-            <w:webHidden/>
-          </w:rPr>
-          <w:t>5</w:t>
-        </w:r>
-        <w:r>
-          <w:rPr>
-            <w:noProof/>
-            <w:webHidden/>
-          </w:rPr>
-          <w:fldChar w:fldCharType="end"/>
-        </w:r>
-      </w:hyperlink>
-    </w:p>
-    <w:p>
-      <w:pPr>
-        <w:pStyle w:val="Verzeichnis2"/>
-        <w:tabs>
-          <w:tab w:val="right" w:leader="dot" w:pos="10156"/>
-        </w:tabs>
-        <w:rPr>
-          <w:rFonts w:asciiTheme="minorHAnsi" w:hAnsiTheme="minorHAnsi"/>
-          <w:noProof/>
-          <w:kern w:val="2"/>
-          <w:sz w:val="24"/>
-          <w:szCs w:val="24"/>
-          <w:lang w:val="de-CH" w:eastAsia="de-CH"/>
-          <w14:ligatures w14:val="standardContextual"/>
-        </w:rPr>
-      </w:pPr>
-      <w:hyperlink w:anchor="_Toc232536553" w:history="1">
-        <w:r>
-          <w:rPr>
-            <w:rStyle w:val="Hyperlink"/>
-            <w:noProof/>
-          </w:rPr>
-          <w:t>4.1 Functional Requirements</w:t>
-        </w:r>
-        <w:r>
-          <w:rPr>
-            <w:noProof/>
-            <w:webHidden/>
-          </w:rPr>
-          <w:tab/>
-        </w:r>
-        <w:r>
-          <w:rPr>
-            <w:noProof/>
-            <w:webHidden/>
-          </w:rPr>
-          <w:fldChar w:fldCharType="begin"/>
-        </w:r>
-        <w:r>
-          <w:rPr>
-            <w:noProof/>
-            <w:webHidden/>
-          </w:rPr>
-          <w:instrText xml:space="preserve"> PAGEREF _Toc232536553 \h </w:instrText>
-        </w:r>
-        <w:r>
-          <w:rPr>
-            <w:noProof/>
-            <w:webHidden/>
-          </w:rPr>
-        </w:r>
-        <w:r>
-          <w:rPr>
-            <w:noProof/>
-            <w:webHidden/>
-          </w:rPr>
-          <w:fldChar w:fldCharType="separate"/>
-        </w:r>
-        <w:r>
-          <w:rPr>
-            <w:noProof/>
-            <w:webHidden/>
-          </w:rPr>
-          <w:t>5</w:t>
-        </w:r>
-        <w:r>
-          <w:rPr>
-            <w:noProof/>
-            <w:webHidden/>
-          </w:rPr>
-          <w:fldChar w:fldCharType="end"/>
-        </w:r>
-      </w:hyperlink>
-    </w:p>
-    <w:p>
-      <w:pPr>
-        <w:pStyle w:val="Verzeichnis2"/>
-        <w:tabs>
-          <w:tab w:val="right" w:leader="dot" w:pos="10156"/>
-        </w:tabs>
-        <w:rPr>
-          <w:rFonts w:asciiTheme="minorHAnsi" w:hAnsiTheme="minorHAnsi"/>
-          <w:noProof/>
-          <w:kern w:val="2"/>
-          <w:sz w:val="24"/>
-          <w:szCs w:val="24"/>
-          <w:lang w:val="de-CH" w:eastAsia="de-CH"/>
-          <w14:ligatures w14:val="standardContextual"/>
-        </w:rPr>
-      </w:pPr>
-      <w:hyperlink w:anchor="_Toc232536554" w:history="1">
-        <w:r>
-          <w:rPr>
-            <w:rStyle w:val="Hyperlink"/>
-            <w:noProof/>
-          </w:rPr>
-          <w:t>4.2 Non-Functional Requirements</w:t>
-        </w:r>
-        <w:r>
-          <w:rPr>
-            <w:noProof/>
-            <w:webHidden/>
-          </w:rPr>
-          <w:tab/>
-        </w:r>
-        <w:r>
-          <w:rPr>
-            <w:noProof/>
-            <w:webHidden/>
-          </w:rPr>
-          <w:fldChar w:fldCharType="begin"/>
-        </w:r>
-        <w:r>
-          <w:rPr>
-            <w:noProof/>
-            <w:webHidden/>
-          </w:rPr>
-          <w:instrText xml:space="preserve"> PAGEREF _Toc232536554 \h </w:instrText>
-        </w:r>
-        <w:r>
-          <w:rPr>
-            <w:noProof/>
-            <w:webHidden/>
-          </w:rPr>
-        </w:r>
-        <w:r>
-          <w:rPr>
-            <w:noProof/>
-            <w:webHidden/>
-          </w:rPr>
-          <w:fldChar w:fldCharType="separate"/>
-        </w:r>
-        <w:r>
-          <w:rPr>
-            <w:noProof/>
-            <w:webHidden/>
-          </w:rPr>
-          <w:t>6</w:t>
-        </w:r>
-        <w:r>
-          <w:rPr>
-            <w:noProof/>
-            <w:webHidden/>
-          </w:rPr>
-          <w:fldChar w:fldCharType="end"/>
-        </w:r>
-      </w:hyperlink>
-    </w:p>
-    <w:p>
-      <w:pPr>
-        <w:pStyle w:val="Verzeichnis1"/>
-        <w:tabs>
-          <w:tab w:val="right" w:leader="dot" w:pos="10156"/>
-        </w:tabs>
-        <w:rPr>
-          <w:rFonts w:asciiTheme="minorHAnsi" w:hAnsiTheme="minorHAnsi"/>
-          <w:noProof/>
-          <w:kern w:val="2"/>
-          <w:sz w:val="24"/>
-          <w:szCs w:val="24"/>
-          <w:lang w:val="de-CH" w:eastAsia="de-CH"/>
-          <w14:ligatures w14:val="standardContextual"/>
-        </w:rPr>
-      </w:pPr>
-      <w:hyperlink w:anchor="_Toc232536555" w:history="1">
-        <w:r>
-          <w:rPr>
-            <w:rStyle w:val="Hyperlink"/>
-            <w:noProof/>
-          </w:rPr>
-          <w:t>5. System Design</w:t>
-        </w:r>
-        <w:r>
-          <w:rPr>
-            <w:noProof/>
-            <w:webHidden/>
-          </w:rPr>
-          <w:tab/>
-        </w:r>
-        <w:r>
-          <w:rPr>
-            <w:noProof/>
-            <w:webHidden/>
-          </w:rPr>
-          <w:fldChar w:fldCharType="begin"/>
-        </w:r>
-        <w:r>
-          <w:rPr>
-            <w:noProof/>
-            <w:webHidden/>
-          </w:rPr>
-          <w:instrText xml:space="preserve"> PAGEREF _Toc232536555 \h </w:instrText>
-        </w:r>
-        <w:r>
-          <w:rPr>
-            <w:noProof/>
-            <w:webHidden/>
-          </w:rPr>
-        </w:r>
-        <w:r>
-          <w:rPr>
-            <w:noProof/>
-            <w:webHidden/>
-          </w:rPr>
-          <w:fldChar w:fldCharType="separate"/>
-        </w:r>
-        <w:r>
-          <w:rPr>
-            <w:noProof/>
-            <w:webHidden/>
-          </w:rPr>
-          <w:t>6</w:t>
-        </w:r>
-        <w:r>
-          <w:rPr>
-            <w:noProof/>
-            <w:webHidden/>
-          </w:rPr>
-          <w:fldChar w:fldCharType="end"/>
-        </w:r>
-      </w:hyperlink>
-    </w:p>
-    <w:p>
-      <w:pPr>
-        <w:pStyle w:val="Verzeichnis2"/>
-        <w:tabs>
-          <w:tab w:val="right" w:leader="dot" w:pos="10156"/>
-        </w:tabs>
-        <w:rPr>
-          <w:rFonts w:asciiTheme="minorHAnsi" w:hAnsiTheme="minorHAnsi"/>
-          <w:noProof/>
-          <w:kern w:val="2"/>
-          <w:sz w:val="24"/>
-          <w:szCs w:val="24"/>
-          <w:lang w:val="de-CH" w:eastAsia="de-CH"/>
-          <w14:ligatures w14:val="standardContextual"/>
-        </w:rPr>
-      </w:pPr>
-      <w:hyperlink w:anchor="_Toc232536556" w:history="1">
-        <w:r>
-          <w:rPr>
-            <w:rStyle w:val="Hyperlink"/>
-            <w:noProof/>
-          </w:rPr>
-          <w:t>5.1 Module Overview</w:t>
-        </w:r>
-        <w:r>
-          <w:rPr>
-            <w:noProof/>
-            <w:webHidden/>
-          </w:rPr>
-          <w:tab/>
-        </w:r>
-        <w:r>
-          <w:rPr>
-            <w:noProof/>
-            <w:webHidden/>
-          </w:rPr>
-          <w:fldChar w:fldCharType="begin"/>
-        </w:r>
-        <w:r>
-          <w:rPr>
-            <w:noProof/>
-            <w:webHidden/>
-          </w:rPr>
-          <w:instrText xml:space="preserve"> PAGEREF _Toc232536556 \h </w:instrText>
-        </w:r>
-        <w:r>
-          <w:rPr>
-            <w:noProof/>
-            <w:webHidden/>
-          </w:rPr>
-        </w:r>
-        <w:r>
-          <w:rPr>
-            <w:noProof/>
-            <w:webHidden/>
-          </w:rPr>
-          <w:fldChar w:fldCharType="separate"/>
-        </w:r>
-        <w:r>
-          <w:rPr>
-            <w:noProof/>
-            <w:webHidden/>
-          </w:rPr>
-          <w:t>6</w:t>
-        </w:r>
-        <w:r>
-          <w:rPr>
-            <w:noProof/>
-            <w:webHidden/>
-          </w:rPr>
-          <w:fldChar w:fldCharType="end"/>
-        </w:r>
-      </w:hyperlink>
-    </w:p>
-    <w:p>
-      <w:pPr>
-        <w:pStyle w:val="Verzeichnis2"/>
-        <w:tabs>
-          <w:tab w:val="right" w:leader="dot" w:pos="10156"/>
-        </w:tabs>
-        <w:rPr>
-          <w:rFonts w:asciiTheme="minorHAnsi" w:hAnsiTheme="minorHAnsi"/>
-          <w:noProof/>
-          <w:kern w:val="2"/>
-          <w:sz w:val="24"/>
-          <w:szCs w:val="24"/>
-          <w:lang w:val="de-CH" w:eastAsia="de-CH"/>
-          <w14:ligatures w14:val="standardContextual"/>
-        </w:rPr>
-      </w:pPr>
-      <w:hyperlink w:anchor="_Toc232536557" w:history="1">
-        <w:r>
-          <w:rPr>
-            <w:rStyle w:val="Hyperlink"/>
-            <w:noProof/>
-          </w:rPr>
-          <w:t>5.2 Main Workflow</w:t>
-        </w:r>
-        <w:r>
-          <w:rPr>
-            <w:noProof/>
-            <w:webHidden/>
-          </w:rPr>
-          <w:tab/>
-        </w:r>
-        <w:r>
-          <w:rPr>
-            <w:noProof/>
-            <w:webHidden/>
-          </w:rPr>
-          <w:fldChar w:fldCharType="begin"/>
-        </w:r>
-        <w:r>
-          <w:rPr>
-            <w:noProof/>
-            <w:webHidden/>
-          </w:rPr>
-          <w:instrText xml:space="preserve"> PAGEREF _Toc232536557 \h </w:instrText>
-        </w:r>
-        <w:r>
-          <w:rPr>
-            <w:noProof/>
-            <w:webHidden/>
-          </w:rPr>
-        </w:r>
-        <w:r>
-          <w:rPr>
-            <w:noProof/>
-            <w:webHidden/>
-          </w:rPr>
-          <w:fldChar w:fldCharType="separate"/>
-        </w:r>
-        <w:r>
-          <w:rPr>
-            <w:noProof/>
-            <w:webHidden/>
-          </w:rPr>
-          <w:t>6</w:t>
-        </w:r>
-        <w:r>
-          <w:rPr>
-            <w:noProof/>
-            <w:webHidden/>
-          </w:rPr>
-          <w:fldChar w:fldCharType="end"/>
-        </w:r>
-      </w:hyperlink>
-    </w:p>
-    <w:p>
-      <w:pPr>
-        <w:pStyle w:val="Verzeichnis2"/>
-        <w:tabs>
-          <w:tab w:val="right" w:leader="dot" w:pos="10156"/>
-        </w:tabs>
-        <w:rPr>
-          <w:rFonts w:asciiTheme="minorHAnsi" w:hAnsiTheme="minorHAnsi"/>
-          <w:noProof/>
-          <w:kern w:val="2"/>
-          <w:sz w:val="24"/>
-          <w:szCs w:val="24"/>
-          <w:lang w:val="de-CH" w:eastAsia="de-CH"/>
-          <w14:ligatures w14:val="standardContextual"/>
-        </w:rPr>
-      </w:pPr>
-      <w:hyperlink w:anchor="_Toc232536558" w:history="1">
-        <w:r>
-          <w:rPr>
-            <w:rStyle w:val="Hyperlink"/>
-            <w:noProof/>
-          </w:rPr>
-          <w:t>5.3 System Architecture Diagram</w:t>
-        </w:r>
-        <w:r>
-          <w:rPr>
-            <w:noProof/>
-            <w:webHidden/>
-          </w:rPr>
-          <w:tab/>
-        </w:r>
-        <w:r>
-          <w:rPr>
-            <w:noProof/>
-            <w:webHidden/>
-          </w:rPr>
-          <w:fldChar w:fldCharType="begin"/>
-        </w:r>
-        <w:r>
-          <w:rPr>
-            <w:noProof/>
-            <w:webHidden/>
-          </w:rPr>
-          <w:instrText xml:space="preserve"> PAGEREF _Toc232536558 \h </w:instrText>
-        </w:r>
-        <w:r>
-          <w:rPr>
-            <w:noProof/>
-            <w:webHidden/>
-          </w:rPr>
-        </w:r>
-        <w:r>
-          <w:rPr>
-            <w:noProof/>
-            <w:webHidden/>
-          </w:rPr>
-          <w:fldChar w:fldCharType="separate"/>
-        </w:r>
-        <w:r>
-          <w:rPr>
-            <w:noProof/>
-            <w:webHidden/>
-          </w:rPr>
-          <w:t>7</w:t>
-        </w:r>
-        <w:r>
-          <w:rPr>
-            <w:noProof/>
-            <w:webHidden/>
-          </w:rPr>
-          <w:fldChar w:fldCharType="end"/>
-        </w:r>
-      </w:hyperlink>
-    </w:p>
-    <w:p>
-      <w:pPr>
-        <w:pStyle w:val="Verzeichnis2"/>
-        <w:tabs>
-          <w:tab w:val="right" w:leader="dot" w:pos="10156"/>
-        </w:tabs>
-        <w:rPr>
-          <w:rFonts w:asciiTheme="minorHAnsi" w:hAnsiTheme="minorHAnsi"/>
-          <w:noProof/>
-          <w:kern w:val="2"/>
-          <w:sz w:val="24"/>
-          <w:szCs w:val="24"/>
-          <w:lang w:val="de-CH" w:eastAsia="de-CH"/>
-          <w14:ligatures w14:val="standardContextual"/>
-        </w:rPr>
-      </w:pPr>
-      <w:hyperlink w:anchor="_Toc232536559" w:history="1">
-        <w:r>
-          <w:rPr>
-            <w:rStyle w:val="Hyperlink"/>
-            <w:noProof/>
-          </w:rPr>
-          <w:t>5.4 UML Activity Diagram</w:t>
-        </w:r>
-        <w:r>
-          <w:rPr>
-            <w:noProof/>
-            <w:webHidden/>
-          </w:rPr>
-          <w:tab/>
-        </w:r>
-        <w:r>
-          <w:rPr>
-            <w:noProof/>
-            <w:webHidden/>
-          </w:rPr>
-          <w:fldChar w:fldCharType="begin"/>
-        </w:r>
-        <w:r>
-          <w:rPr>
-            <w:noProof/>
-            <w:webHidden/>
-          </w:rPr>
-          <w:instrText xml:space="preserve"> PAGEREF _Toc232536559 \h </w:instrText>
-        </w:r>
-        <w:r>
-          <w:rPr>
-            <w:noProof/>
-            <w:webHidden/>
-          </w:rPr>
-        </w:r>
-        <w:r>
-          <w:rPr>
-            <w:noProof/>
-            <w:webHidden/>
-          </w:rPr>
-          <w:fldChar w:fldCharType="separate"/>
-        </w:r>
-        <w:r>
-          <w:rPr>
-            <w:noProof/>
-            <w:webHidden/>
-          </w:rPr>
-          <w:t>8</w:t>
-        </w:r>
-        <w:r>
-          <w:rPr>
-            <w:noProof/>
-            <w:webHidden/>
-          </w:rPr>
-          <w:fldChar w:fldCharType="end"/>
-        </w:r>
-      </w:hyperlink>
-    </w:p>
-    <w:p>
-      <w:pPr>
-        <w:pStyle w:val="Verzeichnis2"/>
-        <w:tabs>
-          <w:tab w:val="right" w:leader="dot" w:pos="10156"/>
-        </w:tabs>
-        <w:rPr>
-          <w:rFonts w:asciiTheme="minorHAnsi" w:hAnsiTheme="minorHAnsi"/>
-          <w:noProof/>
-          <w:kern w:val="2"/>
-          <w:sz w:val="24"/>
-          <w:szCs w:val="24"/>
-          <w:lang w:val="de-CH" w:eastAsia="de-CH"/>
-          <w14:ligatures w14:val="standardContextual"/>
-        </w:rPr>
-      </w:pPr>
-      <w:hyperlink w:anchor="_Toc232536560" w:history="1">
-        <w:r>
-          <w:rPr>
-            <w:rStyle w:val="Hyperlink"/>
-            <w:noProof/>
-          </w:rPr>
-          <w:t>5.5 UML Component Diagram</w:t>
-        </w:r>
-        <w:r>
-          <w:rPr>
-            <w:noProof/>
-            <w:webHidden/>
-          </w:rPr>
-          <w:tab/>
-        </w:r>
-        <w:r>
-          <w:rPr>
-            <w:noProof/>
-            <w:webHidden/>
-          </w:rPr>
-          <w:fldChar w:fldCharType="begin"/>
-        </w:r>
-        <w:r>
-          <w:rPr>
-            <w:noProof/>
-            <w:webHidden/>
-          </w:rPr>
-          <w:instrText xml:space="preserve"> PAGEREF _Toc232536560 \h </w:instrText>
-        </w:r>
-        <w:r>
-          <w:rPr>
-            <w:noProof/>
-            <w:webHidden/>
-          </w:rPr>
-        </w:r>
-        <w:r>
-          <w:rPr>
-            <w:noProof/>
-            <w:webHidden/>
-          </w:rPr>
-          <w:fldChar w:fldCharType="separate"/>
-        </w:r>
-        <w:r>
-          <w:rPr>
-            <w:noProof/>
-            <w:webHidden/>
-          </w:rPr>
-          <w:t>9</w:t>
-        </w:r>
-        <w:r>
-          <w:rPr>
-            <w:noProof/>
-            <w:webHidden/>
-          </w:rPr>
-          <w:fldChar w:fldCharType="end"/>
-        </w:r>
-      </w:hyperlink>
-    </w:p>
-    <w:p>
-      <w:pPr>
-        <w:pStyle w:val="Verzeichnis2"/>
-        <w:tabs>
-          <w:tab w:val="right" w:leader="dot" w:pos="10156"/>
-        </w:tabs>
-        <w:rPr>
-          <w:rFonts w:asciiTheme="minorHAnsi" w:hAnsiTheme="minorHAnsi"/>
-          <w:noProof/>
-          <w:kern w:val="2"/>
-          <w:sz w:val="24"/>
-          <w:szCs w:val="24"/>
-          <w:lang w:val="de-CH" w:eastAsia="de-CH"/>
-          <w14:ligatures w14:val="standardContextual"/>
-        </w:rPr>
-      </w:pPr>
-      <w:hyperlink w:anchor="_Toc232536561" w:history="1">
-        <w:r>
-          <w:rPr>
-            <w:rStyle w:val="Hyperlink"/>
-            <w:noProof/>
-          </w:rPr>
-          <w:t>5.6 UML Deployment Diagram</w:t>
-        </w:r>
-        <w:r>
-          <w:rPr>
-            <w:noProof/>
-            <w:webHidden/>
-          </w:rPr>
-          <w:tab/>
-        </w:r>
-        <w:r>
-          <w:rPr>
-            <w:noProof/>
-            <w:webHidden/>
-          </w:rPr>
-          <w:fldChar w:fldCharType="begin"/>
-        </w:r>
-        <w:r>
-          <w:rPr>
-            <w:noProof/>
-            <w:webHidden/>
-          </w:rPr>
-          <w:instrText xml:space="preserve"> PAGEREF _Toc232536561 \h </w:instrText>
-        </w:r>
-        <w:r>
-          <w:rPr>
-            <w:noProof/>
-            <w:webHidden/>
-          </w:rPr>
-        </w:r>
-        <w:r>
-          <w:rPr>
-            <w:noProof/>
-            <w:webHidden/>
-          </w:rPr>
-          <w:fldChar w:fldCharType="separate"/>
-        </w:r>
-        <w:r>
-          <w:rPr>
-            <w:noProof/>
-            <w:webHidden/>
-          </w:rPr>
-          <w:t>9</w:t>
-        </w:r>
-        <w:r>
-          <w:rPr>
-            <w:noProof/>
-            <w:webHidden/>
-          </w:rPr>
-          <w:fldChar w:fldCharType="end"/>
-        </w:r>
-      </w:hyperlink>
-    </w:p>
-    <w:p>
-      <w:pPr>
-        <w:pStyle w:val="Verzeichnis2"/>
-        <w:tabs>
-          <w:tab w:val="right" w:leader="dot" w:pos="10156"/>
-        </w:tabs>
-        <w:rPr>
-          <w:rFonts w:asciiTheme="minorHAnsi" w:hAnsiTheme="minorHAnsi"/>
-          <w:noProof/>
-          <w:kern w:val="2"/>
-          <w:sz w:val="24"/>
-          <w:szCs w:val="24"/>
-          <w:lang w:val="de-CH" w:eastAsia="de-CH"/>
-          <w14:ligatures w14:val="standardContextual"/>
-        </w:rPr>
-      </w:pPr>
-      <w:hyperlink w:anchor="_Toc232536562" w:history="1">
-        <w:r>
-          <w:rPr>
-            <w:rStyle w:val="Hyperlink"/>
-            <w:noProof/>
-          </w:rPr>
-          <w:t>5.7 UML Class Diagram</w:t>
-        </w:r>
-        <w:r>
-          <w:rPr>
-            <w:noProof/>
-            <w:webHidden/>
-          </w:rPr>
-          <w:tab/>
-        </w:r>
-        <w:r>
-          <w:rPr>
-            <w:noProof/>
-            <w:webHidden/>
-          </w:rPr>
-          <w:fldChar w:fldCharType="begin"/>
-        </w:r>
-        <w:r>
-          <w:rPr>
-            <w:noProof/>
-            <w:webHidden/>
-          </w:rPr>
-          <w:instrText xml:space="preserve"> PAGEREF _Toc232536562 \h </w:instrText>
-        </w:r>
-        <w:r>
-          <w:rPr>
-            <w:noProof/>
-            <w:webHidden/>
-          </w:rPr>
-        </w:r>
-        <w:r>
-          <w:rPr>
-            <w:noProof/>
-            <w:webHidden/>
-          </w:rPr>
-          <w:fldChar w:fldCharType="separate"/>
-        </w:r>
-        <w:r>
-          <w:rPr>
-            <w:noProof/>
-            <w:webHidden/>
-          </w:rPr>
-          <w:t>10</w:t>
-        </w:r>
-        <w:r>
-          <w:rPr>
-            <w:noProof/>
-            <w:webHidden/>
-          </w:rPr>
-          <w:fldChar w:fldCharType="end"/>
-        </w:r>
-      </w:hyperlink>
-    </w:p>
-    <w:p>
-      <w:pPr>
-        <w:pStyle w:val="Verzeichnis2"/>
-        <w:tabs>
-          <w:tab w:val="right" w:leader="dot" w:pos="10156"/>
-        </w:tabs>
-        <w:rPr>
-          <w:rFonts w:asciiTheme="minorHAnsi" w:hAnsiTheme="minorHAnsi"/>
-          <w:noProof/>
-          <w:kern w:val="2"/>
-          <w:sz w:val="24"/>
-          <w:szCs w:val="24"/>
-          <w:lang w:val="de-CH" w:eastAsia="de-CH"/>
-          <w14:ligatures w14:val="standardContextual"/>
-        </w:rPr>
-      </w:pPr>
-      <w:hyperlink w:anchor="_Toc232536563" w:history="1">
-        <w:r>
-          <w:rPr>
-            <w:rStyle w:val="Hyperlink"/>
-            <w:noProof/>
-          </w:rPr>
-          <w:t>5.8 ER Diagram</w:t>
-        </w:r>
-        <w:r>
-          <w:rPr>
-            <w:noProof/>
-            <w:webHidden/>
-          </w:rPr>
-          <w:tab/>
-        </w:r>
-        <w:r>
-          <w:rPr>
-            <w:noProof/>
-            <w:webHidden/>
-          </w:rPr>
-          <w:fldChar w:fldCharType="begin"/>
-        </w:r>
-        <w:r>
-          <w:rPr>
-            <w:noProof/>
-            <w:webHidden/>
-          </w:rPr>
-          <w:instrText xml:space="preserve"> PAGEREF _Toc232536563 \h </w:instrText>
+          <w:instrText xml:space="preserve"> PAGEREF _Toc232537678 \h </w:instrText>
         </w:r>
         <w:r>
           <w:rPr>
@@ -1738,7 +927,7 @@
     </w:p>
     <w:p>
       <w:pPr>
-        <w:pStyle w:val="Verzeichnis2"/>
+        <w:pStyle w:val="Verzeichnis1"/>
         <w:tabs>
           <w:tab w:val="right" w:leader="dot" w:pos="10156"/>
         </w:tabs>
@@ -1752,13 +941,13 @@
           <w14:ligatures w14:val="standardContextual"/>
         </w:rPr>
       </w:pPr>
-      <w:hyperlink w:anchor="_Toc232536564" w:history="1">
+      <w:hyperlink w:anchor="_Toc232537679" w:history="1">
         <w:r>
           <w:rPr>
             <w:rStyle w:val="Hyperlink"/>
             <w:noProof/>
           </w:rPr>
-          <w:t>5.9 Flowchart</w:t>
+          <w:t>7. Installation And Usage</w:t>
         </w:r>
         <w:r>
           <w:rPr>
@@ -1779,7 +968,7 @@
             <w:noProof/>
             <w:webHidden/>
           </w:rPr>
-          <w:instrText xml:space="preserve"> PAGEREF _Toc232536564 \h </w:instrText>
+          <w:instrText xml:space="preserve"> PAGEREF _Toc232537679 \h </w:instrText>
         </w:r>
         <w:r>
           <w:rPr>
@@ -1826,13 +1015,13 @@
           <w14:ligatures w14:val="standardContextual"/>
         </w:rPr>
       </w:pPr>
-      <w:hyperlink w:anchor="_Toc232536565" w:history="1">
+      <w:hyperlink w:anchor="_Toc232537680" w:history="1">
         <w:r>
           <w:rPr>
             <w:rStyle w:val="Hyperlink"/>
             <w:noProof/>
           </w:rPr>
-          <w:t>6. Database Design</w:t>
+          <w:t>8. Testing</w:t>
         </w:r>
         <w:r>
           <w:rPr>
@@ -1853,81 +1042,7 @@
             <w:noProof/>
             <w:webHidden/>
           </w:rPr>
-          <w:instrText xml:space="preserve"> PAGEREF _Toc232536565 \h </w:instrText>
-        </w:r>
-        <w:r>
-          <w:rPr>
-            <w:noProof/>
-            <w:webHidden/>
-          </w:rPr>
-        </w:r>
-        <w:r>
-          <w:rPr>
-            <w:noProof/>
-            <w:webHidden/>
-          </w:rPr>
-          <w:fldChar w:fldCharType="separate"/>
-        </w:r>
-        <w:r>
-          <w:rPr>
-            <w:noProof/>
-            <w:webHidden/>
-          </w:rPr>
-          <w:t>12</w:t>
-        </w:r>
-        <w:r>
-          <w:rPr>
-            <w:noProof/>
-            <w:webHidden/>
-          </w:rPr>
-          <w:fldChar w:fldCharType="end"/>
-        </w:r>
-      </w:hyperlink>
-    </w:p>
-    <w:p>
-      <w:pPr>
-        <w:pStyle w:val="Verzeichnis1"/>
-        <w:tabs>
-          <w:tab w:val="right" w:leader="dot" w:pos="10156"/>
-        </w:tabs>
-        <w:rPr>
-          <w:rFonts w:asciiTheme="minorHAnsi" w:hAnsiTheme="minorHAnsi"/>
-          <w:noProof/>
-          <w:kern w:val="2"/>
-          <w:sz w:val="24"/>
-          <w:szCs w:val="24"/>
-          <w:lang w:val="de-CH" w:eastAsia="de-CH"/>
-          <w14:ligatures w14:val="standardContextual"/>
-        </w:rPr>
-      </w:pPr>
-      <w:hyperlink w:anchor="_Toc232536566" w:history="1">
-        <w:r>
-          <w:rPr>
-            <w:rStyle w:val="Hyperlink"/>
-            <w:noProof/>
-          </w:rPr>
-          <w:t>7. Installation And Usage</w:t>
-        </w:r>
-        <w:r>
-          <w:rPr>
-            <w:noProof/>
-            <w:webHidden/>
-          </w:rPr>
-          <w:tab/>
-        </w:r>
-        <w:r>
-          <w:rPr>
-            <w:noProof/>
-            <w:webHidden/>
-          </w:rPr>
-          <w:fldChar w:fldCharType="begin"/>
-        </w:r>
-        <w:r>
-          <w:rPr>
-            <w:noProof/>
-            <w:webHidden/>
-          </w:rPr>
-          <w:instrText xml:space="preserve"> PAGEREF _Toc232536566 \h </w:instrText>
+          <w:instrText xml:space="preserve"> PAGEREF _Toc232537680 \h </w:instrText>
         </w:r>
         <w:r>
           <w:rPr>
@@ -1960,7 +1075,7 @@
     </w:p>
     <w:p>
       <w:pPr>
-        <w:pStyle w:val="Verzeichnis2"/>
+        <w:pStyle w:val="Verzeichnis1"/>
         <w:tabs>
           <w:tab w:val="right" w:leader="dot" w:pos="10156"/>
         </w:tabs>
@@ -1974,13 +1089,13 @@
           <w14:ligatures w14:val="standardContextual"/>
         </w:rPr>
       </w:pPr>
-      <w:hyperlink w:anchor="_Toc232536567" w:history="1">
+      <w:hyperlink w:anchor="_Toc232537681" w:history="1">
         <w:r>
           <w:rPr>
             <w:rStyle w:val="Hyperlink"/>
             <w:noProof/>
           </w:rPr>
-          <w:t>7.1 Prerequisites</w:t>
+          <w:t>9. Assignment Coverage</w:t>
         </w:r>
         <w:r>
           <w:rPr>
@@ -2001,7 +1116,7 @@
             <w:noProof/>
             <w:webHidden/>
           </w:rPr>
-          <w:instrText xml:space="preserve"> PAGEREF _Toc232536567 \h </w:instrText>
+          <w:instrText xml:space="preserve"> PAGEREF _Toc232537681 \h </w:instrText>
         </w:r>
         <w:r>
           <w:rPr>
@@ -2034,7 +1149,7 @@
     </w:p>
     <w:p>
       <w:pPr>
-        <w:pStyle w:val="Verzeichnis2"/>
+        <w:pStyle w:val="Verzeichnis1"/>
         <w:tabs>
           <w:tab w:val="right" w:leader="dot" w:pos="10156"/>
         </w:tabs>
@@ -2048,13 +1163,13 @@
           <w14:ligatures w14:val="standardContextual"/>
         </w:rPr>
       </w:pPr>
-      <w:hyperlink w:anchor="_Toc232536568" w:history="1">
+      <w:hyperlink w:anchor="_Toc232537682" w:history="1">
         <w:r>
           <w:rPr>
             <w:rStyle w:val="Hyperlink"/>
             <w:noProof/>
           </w:rPr>
-          <w:t>7.2 Clone Or Open The Project</w:t>
+          <w:t>10. Conclusion</w:t>
         </w:r>
         <w:r>
           <w:rPr>
@@ -2075,303 +1190,7 @@
             <w:noProof/>
             <w:webHidden/>
           </w:rPr>
-          <w:instrText xml:space="preserve"> PAGEREF _Toc232536568 \h </w:instrText>
-        </w:r>
-        <w:r>
-          <w:rPr>
-            <w:noProof/>
-            <w:webHidden/>
-          </w:rPr>
-        </w:r>
-        <w:r>
-          <w:rPr>
-            <w:noProof/>
-            <w:webHidden/>
-          </w:rPr>
-          <w:fldChar w:fldCharType="separate"/>
-        </w:r>
-        <w:r>
-          <w:rPr>
-            <w:noProof/>
-            <w:webHidden/>
-          </w:rPr>
-          <w:t>13</w:t>
-        </w:r>
-        <w:r>
-          <w:rPr>
-            <w:noProof/>
-            <w:webHidden/>
-          </w:rPr>
-          <w:fldChar w:fldCharType="end"/>
-        </w:r>
-      </w:hyperlink>
-    </w:p>
-    <w:p>
-      <w:pPr>
-        <w:pStyle w:val="Verzeichnis2"/>
-        <w:tabs>
-          <w:tab w:val="right" w:leader="dot" w:pos="10156"/>
-        </w:tabs>
-        <w:rPr>
-          <w:rFonts w:asciiTheme="minorHAnsi" w:hAnsiTheme="minorHAnsi"/>
-          <w:noProof/>
-          <w:kern w:val="2"/>
-          <w:sz w:val="24"/>
-          <w:szCs w:val="24"/>
-          <w:lang w:val="de-CH" w:eastAsia="de-CH"/>
-          <w14:ligatures w14:val="standardContextual"/>
-        </w:rPr>
-      </w:pPr>
-      <w:hyperlink w:anchor="_Toc232536569" w:history="1">
-        <w:r>
-          <w:rPr>
-            <w:rStyle w:val="Hyperlink"/>
-            <w:noProof/>
-          </w:rPr>
-          <w:t>7.3 Install Dependencies</w:t>
-        </w:r>
-        <w:r>
-          <w:rPr>
-            <w:noProof/>
-            <w:webHidden/>
-          </w:rPr>
-          <w:tab/>
-        </w:r>
-        <w:r>
-          <w:rPr>
-            <w:noProof/>
-            <w:webHidden/>
-          </w:rPr>
-          <w:fldChar w:fldCharType="begin"/>
-        </w:r>
-        <w:r>
-          <w:rPr>
-            <w:noProof/>
-            <w:webHidden/>
-          </w:rPr>
-          <w:instrText xml:space="preserve"> PAGEREF _Toc232536569 \h </w:instrText>
-        </w:r>
-        <w:r>
-          <w:rPr>
-            <w:noProof/>
-            <w:webHidden/>
-          </w:rPr>
-        </w:r>
-        <w:r>
-          <w:rPr>
-            <w:noProof/>
-            <w:webHidden/>
-          </w:rPr>
-          <w:fldChar w:fldCharType="separate"/>
-        </w:r>
-        <w:r>
-          <w:rPr>
-            <w:noProof/>
-            <w:webHidden/>
-          </w:rPr>
-          <w:t>13</w:t>
-        </w:r>
-        <w:r>
-          <w:rPr>
-            <w:noProof/>
-            <w:webHidden/>
-          </w:rPr>
-          <w:fldChar w:fldCharType="end"/>
-        </w:r>
-      </w:hyperlink>
-    </w:p>
-    <w:p>
-      <w:pPr>
-        <w:pStyle w:val="Verzeichnis2"/>
-        <w:tabs>
-          <w:tab w:val="right" w:leader="dot" w:pos="10156"/>
-        </w:tabs>
-        <w:rPr>
-          <w:rFonts w:asciiTheme="minorHAnsi" w:hAnsiTheme="minorHAnsi"/>
-          <w:noProof/>
-          <w:kern w:val="2"/>
-          <w:sz w:val="24"/>
-          <w:szCs w:val="24"/>
-          <w:lang w:val="de-CH" w:eastAsia="de-CH"/>
-          <w14:ligatures w14:val="standardContextual"/>
-        </w:rPr>
-      </w:pPr>
-      <w:hyperlink w:anchor="_Toc232536570" w:history="1">
-        <w:r>
-          <w:rPr>
-            <w:rStyle w:val="Hyperlink"/>
-            <w:noProof/>
-          </w:rPr>
-          <w:t>7.4 Configure The .env File</w:t>
-        </w:r>
-        <w:r>
-          <w:rPr>
-            <w:noProof/>
-            <w:webHidden/>
-          </w:rPr>
-          <w:tab/>
-        </w:r>
-        <w:r>
-          <w:rPr>
-            <w:noProof/>
-            <w:webHidden/>
-          </w:rPr>
-          <w:fldChar w:fldCharType="begin"/>
-        </w:r>
-        <w:r>
-          <w:rPr>
-            <w:noProof/>
-            <w:webHidden/>
-          </w:rPr>
-          <w:instrText xml:space="preserve"> PAGEREF _Toc232536570 \h </w:instrText>
-        </w:r>
-        <w:r>
-          <w:rPr>
-            <w:noProof/>
-            <w:webHidden/>
-          </w:rPr>
-        </w:r>
-        <w:r>
-          <w:rPr>
-            <w:noProof/>
-            <w:webHidden/>
-          </w:rPr>
-          <w:fldChar w:fldCharType="separate"/>
-        </w:r>
-        <w:r>
-          <w:rPr>
-            <w:noProof/>
-            <w:webHidden/>
-          </w:rPr>
-          <w:t>13</w:t>
-        </w:r>
-        <w:r>
-          <w:rPr>
-            <w:noProof/>
-            <w:webHidden/>
-          </w:rPr>
-          <w:fldChar w:fldCharType="end"/>
-        </w:r>
-      </w:hyperlink>
-    </w:p>
-    <w:p>
-      <w:pPr>
-        <w:pStyle w:val="Verzeichnis2"/>
-        <w:tabs>
-          <w:tab w:val="right" w:leader="dot" w:pos="10156"/>
-        </w:tabs>
-        <w:rPr>
-          <w:rFonts w:asciiTheme="minorHAnsi" w:hAnsiTheme="minorHAnsi"/>
-          <w:noProof/>
-          <w:kern w:val="2"/>
-          <w:sz w:val="24"/>
-          <w:szCs w:val="24"/>
-          <w:lang w:val="de-CH" w:eastAsia="de-CH"/>
-          <w14:ligatures w14:val="standardContextual"/>
-        </w:rPr>
-      </w:pPr>
-      <w:hyperlink w:anchor="_Toc232536571" w:history="1">
-        <w:r>
-          <w:rPr>
-            <w:rStyle w:val="Hyperlink"/>
-            <w:noProof/>
-          </w:rPr>
-          <w:t>7.5 API Setup Explained Simply</w:t>
-        </w:r>
-        <w:r>
-          <w:rPr>
-            <w:noProof/>
-            <w:webHidden/>
-          </w:rPr>
-          <w:tab/>
-        </w:r>
-        <w:r>
-          <w:rPr>
-            <w:noProof/>
-            <w:webHidden/>
-          </w:rPr>
-          <w:fldChar w:fldCharType="begin"/>
-        </w:r>
-        <w:r>
-          <w:rPr>
-            <w:noProof/>
-            <w:webHidden/>
-          </w:rPr>
-          <w:instrText xml:space="preserve"> PAGEREF _Toc232536571 \h </w:instrText>
-        </w:r>
-        <w:r>
-          <w:rPr>
-            <w:noProof/>
-            <w:webHidden/>
-          </w:rPr>
-        </w:r>
-        <w:r>
-          <w:rPr>
-            <w:noProof/>
-            <w:webHidden/>
-          </w:rPr>
-          <w:fldChar w:fldCharType="separate"/>
-        </w:r>
-        <w:r>
-          <w:rPr>
-            <w:noProof/>
-            <w:webHidden/>
-          </w:rPr>
-          <w:t>13</w:t>
-        </w:r>
-        <w:r>
-          <w:rPr>
-            <w:noProof/>
-            <w:webHidden/>
-          </w:rPr>
-          <w:fldChar w:fldCharType="end"/>
-        </w:r>
-      </w:hyperlink>
-    </w:p>
-    <w:p>
-      <w:pPr>
-        <w:pStyle w:val="Verzeichnis2"/>
-        <w:tabs>
-          <w:tab w:val="right" w:leader="dot" w:pos="10156"/>
-        </w:tabs>
-        <w:rPr>
-          <w:rFonts w:asciiTheme="minorHAnsi" w:hAnsiTheme="minorHAnsi"/>
-          <w:noProof/>
-          <w:kern w:val="2"/>
-          <w:sz w:val="24"/>
-          <w:szCs w:val="24"/>
-          <w:lang w:val="de-CH" w:eastAsia="de-CH"/>
-          <w14:ligatures w14:val="standardContextual"/>
-        </w:rPr>
-      </w:pPr>
-      <w:hyperlink w:anchor="_Toc232536572" w:history="1">
-        <w:r>
-          <w:rPr>
-            <w:rStyle w:val="Hyperlink"/>
-            <w:noProof/>
-          </w:rPr>
-          <w:t>7.6 Start The Program</w:t>
-        </w:r>
-        <w:r>
-          <w:rPr>
-            <w:noProof/>
-            <w:webHidden/>
-          </w:rPr>
-          <w:tab/>
-        </w:r>
-        <w:r>
-          <w:rPr>
-            <w:noProof/>
-            <w:webHidden/>
-          </w:rPr>
-          <w:fldChar w:fldCharType="begin"/>
-        </w:r>
-        <w:r>
-          <w:rPr>
-            <w:noProof/>
-            <w:webHidden/>
-          </w:rPr>
-          <w:instrText xml:space="preserve"> PAGEREF _Toc232536572 \h </w:instrText>
+          <w:instrText xml:space="preserve"> PAGEREF _Toc232537682 \h </w:instrText>
         </w:r>
         <w:r>
           <w:rPr>
@@ -2404,301 +1223,8 @@
     </w:p>
     <w:p>
       <w:pPr>
-        <w:pStyle w:val="Verzeichnis2"/>
-        <w:tabs>
-          <w:tab w:val="right" w:leader="dot" w:pos="10156"/>
-        </w:tabs>
-        <w:rPr>
-          <w:rFonts w:asciiTheme="minorHAnsi" w:hAnsiTheme="minorHAnsi"/>
-          <w:noProof/>
-          <w:kern w:val="2"/>
-          <w:sz w:val="24"/>
-          <w:szCs w:val="24"/>
-          <w:lang w:val="de-CH" w:eastAsia="de-CH"/>
-          <w14:ligatures w14:val="standardContextual"/>
-        </w:rPr>
-      </w:pPr>
-      <w:hyperlink w:anchor="_Toc232536573" w:history="1">
-        <w:r>
-          <w:rPr>
-            <w:rStyle w:val="Hyperlink"/>
-            <w:noProof/>
-          </w:rPr>
-          <w:t>7.7 Weekly Automation</w:t>
-        </w:r>
-        <w:r>
-          <w:rPr>
-            <w:noProof/>
-            <w:webHidden/>
-          </w:rPr>
-          <w:tab/>
-        </w:r>
-        <w:r>
-          <w:rPr>
-            <w:noProof/>
-            <w:webHidden/>
-          </w:rPr>
-          <w:fldChar w:fldCharType="begin"/>
-        </w:r>
-        <w:r>
-          <w:rPr>
-            <w:noProof/>
-            <w:webHidden/>
-          </w:rPr>
-          <w:instrText xml:space="preserve"> PAGEREF _Toc232536573 \h </w:instrText>
-        </w:r>
-        <w:r>
-          <w:rPr>
-            <w:noProof/>
-            <w:webHidden/>
-          </w:rPr>
-        </w:r>
-        <w:r>
-          <w:rPr>
-            <w:noProof/>
-            <w:webHidden/>
-          </w:rPr>
-          <w:fldChar w:fldCharType="separate"/>
-        </w:r>
-        <w:r>
-          <w:rPr>
-            <w:noProof/>
-            <w:webHidden/>
-          </w:rPr>
-          <w:t>14</w:t>
-        </w:r>
-        <w:r>
-          <w:rPr>
-            <w:noProof/>
-            <w:webHidden/>
-          </w:rPr>
-          <w:fldChar w:fldCharType="end"/>
-        </w:r>
-      </w:hyperlink>
-    </w:p>
-    <w:p>
-      <w:pPr>
-        <w:pStyle w:val="Verzeichnis1"/>
-        <w:tabs>
-          <w:tab w:val="right" w:leader="dot" w:pos="10156"/>
-        </w:tabs>
-        <w:rPr>
-          <w:rFonts w:asciiTheme="minorHAnsi" w:hAnsiTheme="minorHAnsi"/>
-          <w:noProof/>
-          <w:kern w:val="2"/>
-          <w:sz w:val="24"/>
-          <w:szCs w:val="24"/>
-          <w:lang w:val="de-CH" w:eastAsia="de-CH"/>
-          <w14:ligatures w14:val="standardContextual"/>
-        </w:rPr>
-      </w:pPr>
-      <w:hyperlink w:anchor="_Toc232536574" w:history="1">
-        <w:r>
-          <w:rPr>
-            <w:rStyle w:val="Hyperlink"/>
-            <w:noProof/>
-          </w:rPr>
-          <w:t>8. Testing</w:t>
-        </w:r>
-        <w:r>
-          <w:rPr>
-            <w:noProof/>
-            <w:webHidden/>
-          </w:rPr>
-          <w:tab/>
-        </w:r>
-        <w:r>
-          <w:rPr>
-            <w:noProof/>
-            <w:webHidden/>
-          </w:rPr>
-          <w:fldChar w:fldCharType="begin"/>
-        </w:r>
-        <w:r>
-          <w:rPr>
-            <w:noProof/>
-            <w:webHidden/>
-          </w:rPr>
-          <w:instrText xml:space="preserve"> PAGEREF _Toc232536574 \h </w:instrText>
-        </w:r>
-        <w:r>
-          <w:rPr>
-            <w:noProof/>
-            <w:webHidden/>
-          </w:rPr>
-        </w:r>
-        <w:r>
-          <w:rPr>
-            <w:noProof/>
-            <w:webHidden/>
-          </w:rPr>
-          <w:fldChar w:fldCharType="separate"/>
-        </w:r>
-        <w:r>
-          <w:rPr>
-            <w:noProof/>
-            <w:webHidden/>
-          </w:rPr>
-          <w:t>14</w:t>
-        </w:r>
-        <w:r>
-          <w:rPr>
-            <w:noProof/>
-            <w:webHidden/>
-          </w:rPr>
-          <w:fldChar w:fldCharType="end"/>
-        </w:r>
-      </w:hyperlink>
-    </w:p>
-    <w:p>
-      <w:pPr>
-        <w:pStyle w:val="Verzeichnis1"/>
-        <w:tabs>
-          <w:tab w:val="right" w:leader="dot" w:pos="10156"/>
-        </w:tabs>
-        <w:rPr>
-          <w:rFonts w:asciiTheme="minorHAnsi" w:hAnsiTheme="minorHAnsi"/>
-          <w:noProof/>
-          <w:kern w:val="2"/>
-          <w:sz w:val="24"/>
-          <w:szCs w:val="24"/>
-          <w:lang w:val="de-CH" w:eastAsia="de-CH"/>
-          <w14:ligatures w14:val="standardContextual"/>
-        </w:rPr>
-      </w:pPr>
-      <w:hyperlink w:anchor="_Toc232536575" w:history="1">
-        <w:r>
-          <w:rPr>
-            <w:rStyle w:val="Hyperlink"/>
-            <w:noProof/>
-          </w:rPr>
-          <w:t>9. Assignment Coverage</w:t>
-        </w:r>
-        <w:r>
-          <w:rPr>
-            <w:noProof/>
-            <w:webHidden/>
-          </w:rPr>
-          <w:tab/>
-        </w:r>
-        <w:r>
-          <w:rPr>
-            <w:noProof/>
-            <w:webHidden/>
-          </w:rPr>
-          <w:fldChar w:fldCharType="begin"/>
-        </w:r>
-        <w:r>
-          <w:rPr>
-            <w:noProof/>
-            <w:webHidden/>
-          </w:rPr>
-          <w:instrText xml:space="preserve"> PAGEREF _Toc232536575 \h </w:instrText>
-        </w:r>
-        <w:r>
-          <w:rPr>
-            <w:noProof/>
-            <w:webHidden/>
-          </w:rPr>
-        </w:r>
-        <w:r>
-          <w:rPr>
-            <w:noProof/>
-            <w:webHidden/>
-          </w:rPr>
-          <w:fldChar w:fldCharType="separate"/>
-        </w:r>
-        <w:r>
-          <w:rPr>
-            <w:noProof/>
-            <w:webHidden/>
-          </w:rPr>
-          <w:t>14</w:t>
-        </w:r>
-        <w:r>
-          <w:rPr>
-            <w:noProof/>
-            <w:webHidden/>
-          </w:rPr>
-          <w:fldChar w:fldCharType="end"/>
-        </w:r>
-      </w:hyperlink>
-    </w:p>
-    <w:p>
-      <w:pPr>
-        <w:pStyle w:val="Verzeichnis1"/>
-        <w:tabs>
-          <w:tab w:val="right" w:leader="dot" w:pos="10156"/>
-        </w:tabs>
-        <w:rPr>
-          <w:rFonts w:asciiTheme="minorHAnsi" w:hAnsiTheme="minorHAnsi"/>
-          <w:noProof/>
-          <w:kern w:val="2"/>
-          <w:sz w:val="24"/>
-          <w:szCs w:val="24"/>
-          <w:lang w:val="de-CH" w:eastAsia="de-CH"/>
-          <w14:ligatures w14:val="standardContextual"/>
-        </w:rPr>
-      </w:pPr>
-      <w:hyperlink w:anchor="_Toc232536576" w:history="1">
-        <w:r>
-          <w:rPr>
-            <w:rStyle w:val="Hyperlink"/>
-            <w:noProof/>
-          </w:rPr>
-          <w:t>10. Conclusion</w:t>
-        </w:r>
-        <w:r>
-          <w:rPr>
-            <w:noProof/>
-            <w:webHidden/>
-          </w:rPr>
-          <w:tab/>
-        </w:r>
-        <w:r>
-          <w:rPr>
-            <w:noProof/>
-            <w:webHidden/>
-          </w:rPr>
-          <w:fldChar w:fldCharType="begin"/>
-        </w:r>
-        <w:r>
-          <w:rPr>
-            <w:noProof/>
-            <w:webHidden/>
-          </w:rPr>
-          <w:instrText xml:space="preserve"> PAGEREF _Toc232536576 \h </w:instrText>
-        </w:r>
-        <w:r>
-          <w:rPr>
-            <w:noProof/>
-            <w:webHidden/>
-          </w:rPr>
-        </w:r>
-        <w:r>
-          <w:rPr>
-            <w:noProof/>
-            <w:webHidden/>
-          </w:rPr>
-          <w:fldChar w:fldCharType="separate"/>
-        </w:r>
-        <w:r>
-          <w:rPr>
-            <w:noProof/>
-            <w:webHidden/>
-          </w:rPr>
-          <w:t>15</w:t>
-        </w:r>
-        <w:r>
-          <w:rPr>
-            <w:noProof/>
-            <w:webHidden/>
-          </w:rPr>
-          <w:fldChar w:fldCharType="end"/>
-        </w:r>
-      </w:hyperlink>
-    </w:p>
-    <w:p>
+        <w:spacing w:after="0"/>
+      </w:pPr>
       <w:r>
         <w:fldChar w:fldCharType="end"/>
       </w:r>
@@ -2712,7 +1238,7 @@
       <w:pPr>
         <w:pStyle w:val="berschrift1"/>
       </w:pPr>
-      <w:bookmarkStart w:id="1" w:name="_Toc232536543"/>
+      <w:bookmarkStart w:id="1" w:name="_Toc232537673"/>
       <w:r>
         <w:lastRenderedPageBreak/>
         <w:t>1. Project Overview</w:t>
@@ -2723,11 +1249,9 @@
       <w:pPr>
         <w:pStyle w:val="berschrift2"/>
       </w:pPr>
-      <w:bookmarkStart w:id="2" w:name="_Toc232536544"/>
       <w:r>
         <w:t>1.1 Context</w:t>
       </w:r>
-      <w:bookmarkEnd w:id="2"/>
     </w:p>
     <w:p>
       <w:pPr>
@@ -2749,11 +1273,9 @@
       <w:pPr>
         <w:pStyle w:val="berschrift2"/>
       </w:pPr>
-      <w:bookmarkStart w:id="3" w:name="_Toc232536545"/>
       <w:r>
         <w:t>1.2 Goal</w:t>
       </w:r>
-      <w:bookmarkEnd w:id="3"/>
     </w:p>
     <w:p>
       <w:pPr>
@@ -2767,11 +1289,9 @@
       <w:pPr>
         <w:pStyle w:val="berschrift2"/>
       </w:pPr>
-      <w:bookmarkStart w:id="4" w:name="_Toc232536546"/>
       <w:r>
         <w:t>1.3 What The Program Does</w:t>
       </w:r>
-      <w:bookmarkEnd w:id="4"/>
     </w:p>
     <w:p>
       <w:pPr>
@@ -2785,21 +1305,19 @@
       <w:pPr>
         <w:pStyle w:val="berschrift1"/>
       </w:pPr>
-      <w:bookmarkStart w:id="5" w:name="_Toc232536547"/>
+      <w:bookmarkStart w:id="2" w:name="_Toc232537674"/>
       <w:r>
         <w:t>2. Project Work And Personal Approach</w:t>
       </w:r>
-      <w:bookmarkEnd w:id="5"/>
+      <w:bookmarkEnd w:id="2"/>
     </w:p>
     <w:p>
       <w:pPr>
         <w:pStyle w:val="berschrift2"/>
       </w:pPr>
-      <w:bookmarkStart w:id="6" w:name="_Toc232536548"/>
       <w:r>
         <w:t>2.1 How I Started</w:t>
       </w:r>
-      <w:bookmarkEnd w:id="6"/>
     </w:p>
     <w:p>
       <w:pPr>
@@ -2821,11 +1339,9 @@
       <w:pPr>
         <w:pStyle w:val="berschrift2"/>
       </w:pPr>
-      <w:bookmarkStart w:id="7" w:name="_Toc232536549"/>
       <w:r>
         <w:t>2.2 Difficulties During The Project</w:t>
       </w:r>
-      <w:bookmarkEnd w:id="7"/>
     </w:p>
     <w:p>
       <w:pPr>
@@ -2855,12 +1371,10 @@
       <w:pPr>
         <w:pStyle w:val="berschrift2"/>
       </w:pPr>
-      <w:bookmarkStart w:id="8" w:name="_Toc232536550"/>
       <w:r>
         <w:lastRenderedPageBreak/>
         <w:t>2.3 What I Improved Near The End</w:t>
       </w:r>
-      <w:bookmarkEnd w:id="8"/>
     </w:p>
     <w:p>
       <w:pPr>
@@ -2874,11 +1388,11 @@
       <w:pPr>
         <w:pStyle w:val="berschrift1"/>
       </w:pPr>
-      <w:bookmarkStart w:id="9" w:name="_Toc232536551"/>
+      <w:bookmarkStart w:id="3" w:name="_Toc232537675"/>
       <w:r>
         <w:t>3. Project Plan</w:t>
       </w:r>
-      <w:bookmarkEnd w:id="9"/>
+      <w:bookmarkEnd w:id="3"/>
     </w:p>
     <w:p>
       <w:pPr>
@@ -3223,21 +1737,19 @@
       <w:pPr>
         <w:pStyle w:val="berschrift1"/>
       </w:pPr>
-      <w:bookmarkStart w:id="10" w:name="_Toc232536552"/>
+      <w:bookmarkStart w:id="4" w:name="_Toc232537676"/>
       <w:r>
         <w:t>4. Requirements</w:t>
       </w:r>
-      <w:bookmarkEnd w:id="10"/>
+      <w:bookmarkEnd w:id="4"/>
     </w:p>
     <w:p>
       <w:pPr>
         <w:pStyle w:val="berschrift2"/>
       </w:pPr>
-      <w:bookmarkStart w:id="11" w:name="_Toc232536553"/>
       <w:r>
         <w:t>4.1 Functional Requirements</w:t>
       </w:r>
-      <w:bookmarkEnd w:id="11"/>
     </w:p>
     <w:tbl>
       <w:tblPr>
@@ -4184,12 +2696,9 @@
       <w:pPr>
         <w:pStyle w:val="berschrift2"/>
       </w:pPr>
-      <w:bookmarkStart w:id="12" w:name="_Toc232536554"/>
       <w:r>
-        <w:lastRenderedPageBreak/>
         <w:t>4.2 Non-Functional Requirements</w:t>
       </w:r>
-      <w:bookmarkEnd w:id="12"/>
     </w:p>
     <w:tbl>
       <w:tblPr>
@@ -4716,21 +3225,19 @@
       <w:pPr>
         <w:pStyle w:val="berschrift1"/>
       </w:pPr>
-      <w:bookmarkStart w:id="13" w:name="_Toc232536555"/>
+      <w:bookmarkStart w:id="5" w:name="_Toc232537677"/>
       <w:r>
         <w:t>5. System Design</w:t>
       </w:r>
-      <w:bookmarkEnd w:id="13"/>
+      <w:bookmarkEnd w:id="5"/>
     </w:p>
     <w:p>
       <w:pPr>
         <w:pStyle w:val="berschrift2"/>
       </w:pPr>
-      <w:bookmarkStart w:id="14" w:name="_Toc232536556"/>
       <w:r>
         <w:t>5.1 Module Overview</w:t>
       </w:r>
-      <w:bookmarkEnd w:id="14"/>
     </w:p>
     <w:p>
       <w:pPr>
@@ -5042,11 +3549,9 @@
       <w:pPr>
         <w:pStyle w:val="berschrift2"/>
       </w:pPr>
-      <w:bookmarkStart w:id="15" w:name="_Toc232536557"/>
       <w:r>
         <w:t>5.2 Main Workflow</w:t>
       </w:r>
-      <w:bookmarkEnd w:id="15"/>
     </w:p>
     <w:p>
       <w:pPr>
@@ -5141,12 +3646,10 @@
       <w:pPr>
         <w:pStyle w:val="berschrift2"/>
       </w:pPr>
-      <w:bookmarkStart w:id="16" w:name="_Toc232536558"/>
       <w:r>
         <w:lastRenderedPageBreak/>
         <w:t>5.3 System Architecture Diagram</w:t>
       </w:r>
-      <w:bookmarkEnd w:id="16"/>
     </w:p>
     <w:p>
       <w:pPr>
@@ -5158,7 +3661,7 @@
           <w:noProof/>
         </w:rPr>
         <w:drawing>
-          <wp:inline distT="0" distB="0" distL="0" distR="0" wp14:anchorId="49896051" wp14:editId="3640D77F">
+          <wp:inline distT="0" distB="0" distL="0" distR="0" wp14:anchorId="1A4DD819" wp14:editId="3767E8FC">
             <wp:extent cx="6172200" cy="3573379"/>
             <wp:effectExtent l="0" t="0" r="0" b="0"/>
             <wp:docPr id="2" name="Picture 2"/>
@@ -5206,12 +3709,10 @@
       <w:pPr>
         <w:pStyle w:val="berschrift2"/>
       </w:pPr>
-      <w:bookmarkStart w:id="17" w:name="_Toc232536559"/>
       <w:r>
         <w:lastRenderedPageBreak/>
         <w:t>5.4 UML Activity Diagram</w:t>
       </w:r>
-      <w:bookmarkEnd w:id="17"/>
     </w:p>
     <w:p>
       <w:pPr>
@@ -5223,7 +3724,7 @@
           <w:noProof/>
         </w:rPr>
         <w:drawing>
-          <wp:inline distT="0" distB="0" distL="0" distR="0" wp14:anchorId="7097F555" wp14:editId="10ABA1B0">
+          <wp:inline distT="0" distB="0" distL="0" distR="0" wp14:anchorId="2861E457" wp14:editId="4E819A72">
             <wp:extent cx="6172200" cy="6912864"/>
             <wp:effectExtent l="0" t="0" r="0" b="0"/>
             <wp:docPr id="3" name="Picture 3"/>
@@ -5263,12 +3764,10 @@
       <w:pPr>
         <w:pStyle w:val="berschrift2"/>
       </w:pPr>
-      <w:bookmarkStart w:id="18" w:name="_Toc232536560"/>
       <w:r>
         <w:lastRenderedPageBreak/>
         <w:t>5.5 UML Component Diagram</w:t>
       </w:r>
-      <w:bookmarkEnd w:id="18"/>
     </w:p>
     <w:p>
       <w:pPr>
@@ -5280,7 +3779,7 @@
           <w:noProof/>
         </w:rPr>
         <w:drawing>
-          <wp:inline distT="0" distB="0" distL="0" distR="0" wp14:anchorId="23668E51" wp14:editId="306E87CD">
+          <wp:inline distT="0" distB="0" distL="0" distR="0" wp14:anchorId="5D0EF422" wp14:editId="21B8ABB2">
             <wp:extent cx="6172200" cy="4064620"/>
             <wp:effectExtent l="0" t="0" r="0" b="0"/>
             <wp:docPr id="4" name="Picture 4"/>
@@ -5320,11 +3819,9 @@
       <w:pPr>
         <w:pStyle w:val="berschrift2"/>
       </w:pPr>
-      <w:bookmarkStart w:id="19" w:name="_Toc232536561"/>
       <w:r>
         <w:t>5.6 UML Deployment Diagram</w:t>
       </w:r>
-      <w:bookmarkEnd w:id="19"/>
     </w:p>
     <w:p>
       <w:pPr>
@@ -5336,7 +3833,7 @@
           <w:noProof/>
         </w:rPr>
         <w:drawing>
-          <wp:inline distT="0" distB="0" distL="0" distR="0" wp14:anchorId="1B5C9D2A" wp14:editId="4B0617FE">
+          <wp:inline distT="0" distB="0" distL="0" distR="0" wp14:anchorId="449FA25B" wp14:editId="3B245CF8">
             <wp:extent cx="6172200" cy="3967843"/>
             <wp:effectExtent l="0" t="0" r="0" b="0"/>
             <wp:docPr id="5" name="Picture 5"/>
@@ -5376,12 +3873,10 @@
       <w:pPr>
         <w:pStyle w:val="berschrift2"/>
       </w:pPr>
-      <w:bookmarkStart w:id="20" w:name="_Toc232536562"/>
       <w:r>
         <w:lastRenderedPageBreak/>
         <w:t>5.7 UML Class Diagram</w:t>
       </w:r>
-      <w:bookmarkEnd w:id="20"/>
     </w:p>
     <w:p>
       <w:pPr>
@@ -5393,7 +3888,7 @@
           <w:noProof/>
         </w:rPr>
         <w:drawing>
-          <wp:inline distT="0" distB="0" distL="0" distR="0" wp14:anchorId="43D34CE8" wp14:editId="1C3A2DC2">
+          <wp:inline distT="0" distB="0" distL="0" distR="0" wp14:anchorId="7D0F5CBF" wp14:editId="5166169A">
             <wp:extent cx="6172200" cy="3688266"/>
             <wp:effectExtent l="0" t="0" r="0" b="0"/>
             <wp:docPr id="6" name="Picture 6"/>
@@ -5433,12 +3928,10 @@
       <w:pPr>
         <w:pStyle w:val="berschrift2"/>
       </w:pPr>
-      <w:bookmarkStart w:id="21" w:name="_Toc232536563"/>
       <w:r>
         <w:lastRenderedPageBreak/>
         <w:t>5.8 ER Diagram</w:t>
       </w:r>
-      <w:bookmarkEnd w:id="21"/>
     </w:p>
     <w:p>
       <w:pPr>
@@ -5450,7 +3943,7 @@
           <w:noProof/>
         </w:rPr>
         <w:drawing>
-          <wp:inline distT="0" distB="0" distL="0" distR="0" wp14:anchorId="7EFA3E45" wp14:editId="6133D241">
+          <wp:inline distT="0" distB="0" distL="0" distR="0" wp14:anchorId="547DFEAA" wp14:editId="009FAF1B">
             <wp:extent cx="6172200" cy="5657850"/>
             <wp:effectExtent l="0" t="0" r="0" b="0"/>
             <wp:docPr id="7" name="Picture 7"/>
@@ -5490,12 +3983,10 @@
       <w:pPr>
         <w:pStyle w:val="berschrift2"/>
       </w:pPr>
-      <w:bookmarkStart w:id="22" w:name="_Toc232536564"/>
       <w:r>
         <w:lastRenderedPageBreak/>
         <w:t>5.9 Flowchart</w:t>
       </w:r>
-      <w:bookmarkEnd w:id="22"/>
     </w:p>
     <w:p>
       <w:pPr>
@@ -5507,7 +3998,7 @@
           <w:noProof/>
         </w:rPr>
         <w:drawing>
-          <wp:inline distT="0" distB="0" distL="0" distR="0" wp14:anchorId="1C15E4C0" wp14:editId="0EF56B20">
+          <wp:inline distT="0" distB="0" distL="0" distR="0" wp14:anchorId="090D4F24" wp14:editId="5EA1D19F">
             <wp:extent cx="6172200" cy="5746531"/>
             <wp:effectExtent l="0" t="0" r="0" b="0"/>
             <wp:docPr id="8" name="Picture 8"/>
@@ -5547,11 +4038,11 @@
       <w:pPr>
         <w:pStyle w:val="berschrift1"/>
       </w:pPr>
-      <w:bookmarkStart w:id="23" w:name="_Toc232536565"/>
+      <w:bookmarkStart w:id="6" w:name="_Toc232537678"/>
       <w:r>
         <w:t>6. Database Design</w:t>
       </w:r>
-      <w:bookmarkEnd w:id="23"/>
+      <w:bookmarkEnd w:id="6"/>
     </w:p>
     <w:p>
       <w:pPr>
@@ -5836,38 +4327,57 @@
         <w:t>Duplicate plays are prevented with this database rule:</w:t>
       </w:r>
     </w:p>
+    <w:tbl>
+      <w:tblPr>
+        <w:tblStyle w:val="Tabellenraster"/>
+        <w:tblW w:w="0" w:type="auto"/>
+        <w:jc w:val="center"/>
+        <w:tblLook w:val="04A0" w:firstRow="1" w:lastRow="0" w:firstColumn="1" w:lastColumn="0" w:noHBand="0" w:noVBand="1"/>
+      </w:tblPr>
+      <w:tblGrid>
+        <w:gridCol w:w="10166"/>
+      </w:tblGrid>
+      <w:tr>
+        <w:trPr>
+          <w:jc w:val="center"/>
+        </w:trPr>
+        <w:tc>
+          <w:tcPr>
+            <w:tcW w:w="10166" w:type="dxa"/>
+            <w:shd w:val="clear" w:color="auto" w:fill="F3F4F6"/>
+          </w:tcPr>
+          <w:p>
+            <w:r>
+              <w:rPr>
+                <w:rFonts w:ascii="Consolas" w:hAnsi="Consolas"/>
+                <w:color w:val="111827"/>
+                <w:sz w:val="17"/>
+              </w:rPr>
+              <w:lastRenderedPageBreak/>
+              <w:t>UNIQUE(track_name, artist_name, played_at)</w:t>
+            </w:r>
+          </w:p>
+        </w:tc>
+      </w:tr>
+    </w:tbl>
+    <w:p/>
     <w:p>
       <w:pPr>
-        <w:spacing w:after="60"/>
-      </w:pPr>
-      <w:r>
-        <w:rPr>
-          <w:rFonts w:ascii="Consolas" w:hAnsi="Consolas"/>
-          <w:sz w:val="18"/>
-        </w:rPr>
-        <w:lastRenderedPageBreak/>
-        <w:t>UNIQUE(track_name, artist_name, played_at)</w:t>
-      </w:r>
-    </w:p>
-    <w:p>
-      <w:pPr>
         <w:pStyle w:val="berschrift1"/>
       </w:pPr>
-      <w:bookmarkStart w:id="24" w:name="_Toc232536566"/>
+      <w:bookmarkStart w:id="7" w:name="_Toc232537679"/>
       <w:r>
         <w:t>7. Installation And Usage</w:t>
       </w:r>
-      <w:bookmarkEnd w:id="24"/>
+      <w:bookmarkEnd w:id="7"/>
     </w:p>
     <w:p>
       <w:pPr>
         <w:pStyle w:val="berschrift2"/>
       </w:pPr>
-      <w:bookmarkStart w:id="25" w:name="_Toc232536567"/>
       <w:r>
         <w:t>7.1 Prerequisites</w:t>
       </w:r>
-      <w:bookmarkEnd w:id="25"/>
     </w:p>
     <w:p>
       <w:pPr>
@@ -6086,11 +4596,9 @@
       <w:pPr>
         <w:pStyle w:val="berschrift2"/>
       </w:pPr>
-      <w:bookmarkStart w:id="26" w:name="_Toc232536568"/>
       <w:r>
         <w:t>7.2 Clone Or Open The Project</w:t>
       </w:r>
-      <w:bookmarkEnd w:id="26"/>
     </w:p>
     <w:p>
       <w:pPr>
@@ -6100,30 +4608,48 @@
         <w:t>If the project is opened from GitHub, clone the repository first.</w:t>
       </w:r>
     </w:p>
-    <w:p>
-      <w:pPr>
-        <w:spacing w:after="60"/>
-      </w:pPr>
-      <w:r>
-        <w:rPr>
-          <w:rFonts w:ascii="Consolas" w:hAnsi="Consolas"/>
-          <w:sz w:val="18"/>
-        </w:rPr>
-        <w:t>git clone https://github.com/Svoutat/weekly-spotify-wrapped.git</w:t>
-      </w:r>
-    </w:p>
-    <w:p>
-      <w:pPr>
-        <w:spacing w:after="60"/>
-      </w:pPr>
-      <w:r>
-        <w:rPr>
-          <w:rFonts w:ascii="Consolas" w:hAnsi="Consolas"/>
-          <w:sz w:val="18"/>
-        </w:rPr>
-        <w:t>cd weekly-spotify-wrapped</w:t>
-      </w:r>
-    </w:p>
+    <w:tbl>
+      <w:tblPr>
+        <w:tblStyle w:val="Tabellenraster"/>
+        <w:tblW w:w="0" w:type="auto"/>
+        <w:jc w:val="center"/>
+        <w:tblLook w:val="04A0" w:firstRow="1" w:lastRow="0" w:firstColumn="1" w:lastColumn="0" w:noHBand="0" w:noVBand="1"/>
+      </w:tblPr>
+      <w:tblGrid>
+        <w:gridCol w:w="10166"/>
+      </w:tblGrid>
+      <w:tr>
+        <w:trPr>
+          <w:jc w:val="center"/>
+        </w:trPr>
+        <w:tc>
+          <w:tcPr>
+            <w:tcW w:w="10166" w:type="dxa"/>
+            <w:shd w:val="clear" w:color="auto" w:fill="F3F4F6"/>
+          </w:tcPr>
+          <w:p>
+            <w:r>
+              <w:rPr>
+                <w:rFonts w:ascii="Consolas" w:hAnsi="Consolas"/>
+                <w:color w:val="111827"/>
+                <w:sz w:val="17"/>
+              </w:rPr>
+              <w:t>git clone https://github.com/Svoutat/weekly-spotify-wrapped.git</w:t>
+            </w:r>
+            <w:r>
+              <w:rPr>
+                <w:rFonts w:ascii="Consolas" w:hAnsi="Consolas"/>
+                <w:color w:val="111827"/>
+                <w:sz w:val="17"/>
+              </w:rPr>
+              <w:br/>
+              <w:t>cd weekly-spotify-wrapped</w:t>
+            </w:r>
+          </w:p>
+        </w:tc>
+      </w:tr>
+    </w:tbl>
+    <w:p/>
     <w:p>
       <w:pPr>
         <w:spacing w:after="140" w:line="259" w:lineRule="auto"/>
@@ -6132,27 +4658,46 @@
         <w:t>If the project is already stored locally, open PowerShell in the existing project folder instead.</w:t>
       </w:r>
     </w:p>
+    <w:tbl>
+      <w:tblPr>
+        <w:tblStyle w:val="Tabellenraster"/>
+        <w:tblW w:w="0" w:type="auto"/>
+        <w:jc w:val="center"/>
+        <w:tblLook w:val="04A0" w:firstRow="1" w:lastRow="0" w:firstColumn="1" w:lastColumn="0" w:noHBand="0" w:noVBand="1"/>
+      </w:tblPr>
+      <w:tblGrid>
+        <w:gridCol w:w="10166"/>
+      </w:tblGrid>
+      <w:tr>
+        <w:trPr>
+          <w:jc w:val="center"/>
+        </w:trPr>
+        <w:tc>
+          <w:tcPr>
+            <w:tcW w:w="10166" w:type="dxa"/>
+            <w:shd w:val="clear" w:color="auto" w:fill="F3F4F6"/>
+          </w:tcPr>
+          <w:p>
+            <w:r>
+              <w:rPr>
+                <w:rFonts w:ascii="Consolas" w:hAnsi="Consolas"/>
+                <w:color w:val="111827"/>
+                <w:sz w:val="17"/>
+              </w:rPr>
+              <w:t>cd C:\Users\voutats1\Documents\Gibz\Informatik\M122\M122ESpotifyProject\spotify_weekly_wrapped</w:t>
+            </w:r>
+          </w:p>
+        </w:tc>
+      </w:tr>
+    </w:tbl>
+    <w:p/>
     <w:p>
       <w:pPr>
-        <w:spacing w:after="60"/>
-      </w:pPr>
-      <w:r>
-        <w:rPr>
-          <w:rFonts w:ascii="Consolas" w:hAnsi="Consolas"/>
-          <w:sz w:val="18"/>
-        </w:rPr>
-        <w:t>cd C:\Users\voutats1\Documents\Gibz\Informatik\M122\M122ESpotifyProject\spotify_weekly_wrapped</w:t>
-      </w:r>
-    </w:p>
-    <w:p>
-      <w:pPr>
         <w:pStyle w:val="berschrift2"/>
       </w:pPr>
-      <w:bookmarkStart w:id="27" w:name="_Toc232536569"/>
       <w:r>
         <w:t>7.3 Install Dependencies</w:t>
       </w:r>
-      <w:bookmarkEnd w:id="27"/>
     </w:p>
     <w:p>
       <w:pPr>
@@ -6162,51 +4707,64 @@
         <w:t>The virtual environment keeps the project dependencies separate from other Python projects.</w:t>
       </w:r>
     </w:p>
+    <w:tbl>
+      <w:tblPr>
+        <w:tblStyle w:val="Tabellenraster"/>
+        <w:tblW w:w="0" w:type="auto"/>
+        <w:jc w:val="center"/>
+        <w:tblLook w:val="04A0" w:firstRow="1" w:lastRow="0" w:firstColumn="1" w:lastColumn="0" w:noHBand="0" w:noVBand="1"/>
+      </w:tblPr>
+      <w:tblGrid>
+        <w:gridCol w:w="10166"/>
+      </w:tblGrid>
+      <w:tr>
+        <w:trPr>
+          <w:jc w:val="center"/>
+        </w:trPr>
+        <w:tc>
+          <w:tcPr>
+            <w:tcW w:w="10166" w:type="dxa"/>
+            <w:shd w:val="clear" w:color="auto" w:fill="F3F4F6"/>
+          </w:tcPr>
+          <w:p>
+            <w:r>
+              <w:rPr>
+                <w:rFonts w:ascii="Consolas" w:hAnsi="Consolas"/>
+                <w:color w:val="111827"/>
+                <w:sz w:val="17"/>
+              </w:rPr>
+              <w:t>python -m venv .venv</w:t>
+            </w:r>
+            <w:r>
+              <w:rPr>
+                <w:rFonts w:ascii="Consolas" w:hAnsi="Consolas"/>
+                <w:color w:val="111827"/>
+                <w:sz w:val="17"/>
+              </w:rPr>
+              <w:br/>
+              <w:t>.\.venv\Scripts\Activate.ps1</w:t>
+            </w:r>
+            <w:r>
+              <w:rPr>
+                <w:rFonts w:ascii="Consolas" w:hAnsi="Consolas"/>
+                <w:color w:val="111827"/>
+                <w:sz w:val="17"/>
+              </w:rPr>
+              <w:br/>
+              <w:t>python -m pip install -r requirements.txt</w:t>
+            </w:r>
+          </w:p>
+        </w:tc>
+      </w:tr>
+    </w:tbl>
+    <w:p/>
     <w:p>
       <w:pPr>
-        <w:spacing w:after="60"/>
-      </w:pPr>
-      <w:r>
-        <w:rPr>
-          <w:rFonts w:ascii="Consolas" w:hAnsi="Consolas"/>
-          <w:sz w:val="18"/>
-        </w:rPr>
-        <w:t>python -m venv .venv</w:t>
-      </w:r>
-    </w:p>
-    <w:p>
-      <w:pPr>
-        <w:spacing w:after="60"/>
-      </w:pPr>
-      <w:r>
-        <w:rPr>
-          <w:rFonts w:ascii="Consolas" w:hAnsi="Consolas"/>
-          <w:sz w:val="18"/>
-        </w:rPr>
-        <w:t>.\.venv\Scripts\Activate.ps1</w:t>
-      </w:r>
-    </w:p>
-    <w:p>
-      <w:pPr>
-        <w:spacing w:after="60"/>
-      </w:pPr>
-      <w:r>
-        <w:rPr>
-          <w:rFonts w:ascii="Consolas" w:hAnsi="Consolas"/>
-          <w:sz w:val="18"/>
-        </w:rPr>
-        <w:t>python -m pip install -r requirements.txt</w:t>
-      </w:r>
-    </w:p>
-    <w:p>
-      <w:pPr>
         <w:pStyle w:val="berschrift2"/>
       </w:pPr>
-      <w:bookmarkStart w:id="28" w:name="_Toc232536570"/>
       <w:r>
         <w:t>7.4 Configure The .env File</w:t>
       </w:r>
-      <w:bookmarkEnd w:id="28"/>
     </w:p>
     <w:p>
       <w:pPr>
@@ -6216,18 +4774,39 @@
         <w:t>The .env file contains all private values and settings. The real .env file is ignored by Git and must not be uploaded. The project includes .env.example so a new user can see which values are needed.</w:t>
       </w:r>
     </w:p>
-    <w:p>
-      <w:pPr>
-        <w:spacing w:after="60"/>
-      </w:pPr>
-      <w:r>
-        <w:rPr>
-          <w:rFonts w:ascii="Consolas" w:hAnsi="Consolas"/>
-          <w:sz w:val="18"/>
-        </w:rPr>
-        <w:t>Copy-Item .env.example .env</w:t>
-      </w:r>
-    </w:p>
+    <w:tbl>
+      <w:tblPr>
+        <w:tblStyle w:val="Tabellenraster"/>
+        <w:tblW w:w="0" w:type="auto"/>
+        <w:jc w:val="center"/>
+        <w:tblLook w:val="04A0" w:firstRow="1" w:lastRow="0" w:firstColumn="1" w:lastColumn="0" w:noHBand="0" w:noVBand="1"/>
+      </w:tblPr>
+      <w:tblGrid>
+        <w:gridCol w:w="10166"/>
+      </w:tblGrid>
+      <w:tr>
+        <w:trPr>
+          <w:jc w:val="center"/>
+        </w:trPr>
+        <w:tc>
+          <w:tcPr>
+            <w:tcW w:w="10166" w:type="dxa"/>
+            <w:shd w:val="clear" w:color="auto" w:fill="F3F4F6"/>
+          </w:tcPr>
+          <w:p>
+            <w:r>
+              <w:rPr>
+                <w:rFonts w:ascii="Consolas" w:hAnsi="Consolas"/>
+                <w:color w:val="111827"/>
+                <w:sz w:val="17"/>
+              </w:rPr>
+              <w:t>Copy-Item .env.example .env</w:t>
+            </w:r>
+          </w:p>
+        </w:tc>
+      </w:tr>
+    </w:tbl>
+    <w:p/>
     <w:tbl>
       <w:tblPr>
         <w:tblStyle w:val="Tabellenraster"/>
@@ -6530,11 +5109,10 @@
       <w:pPr>
         <w:pStyle w:val="berschrift2"/>
       </w:pPr>
-      <w:bookmarkStart w:id="29" w:name="_Toc232536571"/>
       <w:r>
+        <w:lastRenderedPageBreak/>
         <w:t>7.5 API Setup Explained Simply</w:t>
       </w:r>
-      <w:bookmarkEnd w:id="29"/>
     </w:p>
     <w:p>
       <w:pPr>
@@ -6549,7 +5127,6 @@
         <w:spacing w:after="140" w:line="259" w:lineRule="auto"/>
       </w:pPr>
       <w:r>
-        <w:lastRenderedPageBreak/>
         <w:t>For Spotify, create an app at https://developer.spotify.com/dashboard and add http://127.0.0.1:8888/callback as redirect URI. Then copy the client ID and client secret into .env. If playlist updates should be used, run python spotify_setup.py to create the refresh token and playlist values.</w:t>
       </w:r>
     </w:p>
@@ -6565,11 +5142,9 @@
       <w:pPr>
         <w:pStyle w:val="berschrift2"/>
       </w:pPr>
-      <w:bookmarkStart w:id="30" w:name="_Toc232536572"/>
       <w:r>
         <w:t>7.6 Start The Program</w:t>
       </w:r>
-      <w:bookmarkEnd w:id="30"/>
     </w:p>
     <w:p>
       <w:pPr>
@@ -6579,30 +5154,48 @@
         <w:t>After the .env file is filled, the program can be started with two commands.</w:t>
       </w:r>
     </w:p>
-    <w:p>
-      <w:pPr>
-        <w:spacing w:after="60"/>
-      </w:pPr>
-      <w:r>
-        <w:rPr>
-          <w:rFonts w:ascii="Consolas" w:hAnsi="Consolas"/>
-          <w:sz w:val="18"/>
-        </w:rPr>
-        <w:t>.\.venv\Scripts\Activate.ps1</w:t>
-      </w:r>
-    </w:p>
-    <w:p>
-      <w:pPr>
-        <w:spacing w:after="60"/>
-      </w:pPr>
-      <w:r>
-        <w:rPr>
-          <w:rFonts w:ascii="Consolas" w:hAnsi="Consolas"/>
-          <w:sz w:val="18"/>
-        </w:rPr>
-        <w:t>python main.py</w:t>
-      </w:r>
-    </w:p>
+    <w:tbl>
+      <w:tblPr>
+        <w:tblStyle w:val="Tabellenraster"/>
+        <w:tblW w:w="0" w:type="auto"/>
+        <w:jc w:val="center"/>
+        <w:tblLook w:val="04A0" w:firstRow="1" w:lastRow="0" w:firstColumn="1" w:lastColumn="0" w:noHBand="0" w:noVBand="1"/>
+      </w:tblPr>
+      <w:tblGrid>
+        <w:gridCol w:w="10166"/>
+      </w:tblGrid>
+      <w:tr>
+        <w:trPr>
+          <w:jc w:val="center"/>
+        </w:trPr>
+        <w:tc>
+          <w:tcPr>
+            <w:tcW w:w="10166" w:type="dxa"/>
+            <w:shd w:val="clear" w:color="auto" w:fill="F3F4F6"/>
+          </w:tcPr>
+          <w:p>
+            <w:r>
+              <w:rPr>
+                <w:rFonts w:ascii="Consolas" w:hAnsi="Consolas"/>
+                <w:color w:val="111827"/>
+                <w:sz w:val="17"/>
+              </w:rPr>
+              <w:t>.\.venv\Scripts\Activate.ps1</w:t>
+            </w:r>
+            <w:r>
+              <w:rPr>
+                <w:rFonts w:ascii="Consolas" w:hAnsi="Consolas"/>
+                <w:color w:val="111827"/>
+                <w:sz w:val="17"/>
+              </w:rPr>
+              <w:br/>
+              <w:t>python main.py</w:t>
+            </w:r>
+          </w:p>
+        </w:tc>
+      </w:tr>
+    </w:tbl>
+    <w:p/>
     <w:p>
       <w:pPr>
         <w:spacing w:after="140" w:line="259" w:lineRule="auto"/>
@@ -6615,11 +5208,9 @@
       <w:pPr>
         <w:pStyle w:val="berschrift2"/>
       </w:pPr>
-      <w:bookmarkStart w:id="31" w:name="_Toc232536573"/>
       <w:r>
         <w:t>7.7 Weekly Automation</w:t>
       </w:r>
-      <w:bookmarkEnd w:id="31"/>
     </w:p>
     <w:p>
       <w:pPr>
@@ -6629,51 +5220,109 @@
         <w:t>The script can be run automatically once per week with Windows Task Scheduler. This is optional, but it matches the goal of the project because the weekly report should not need to be started manually every time.</w:t>
       </w:r>
     </w:p>
+    <w:tbl>
+      <w:tblPr>
+        <w:tblStyle w:val="Tabellenraster"/>
+        <w:tblW w:w="0" w:type="auto"/>
+        <w:jc w:val="center"/>
+        <w:tblLook w:val="04A0" w:firstRow="1" w:lastRow="0" w:firstColumn="1" w:lastColumn="0" w:noHBand="0" w:noVBand="1"/>
+      </w:tblPr>
+      <w:tblGrid>
+        <w:gridCol w:w="10382"/>
+      </w:tblGrid>
+      <w:tr>
+        <w:trPr>
+          <w:jc w:val="center"/>
+        </w:trPr>
+        <w:tc>
+          <w:tcPr>
+            <w:tcW w:w="10166" w:type="dxa"/>
+            <w:shd w:val="clear" w:color="auto" w:fill="F3F4F6"/>
+          </w:tcPr>
+          <w:p>
+            <w:r>
+              <w:rPr>
+                <w:rFonts w:ascii="Consolas" w:hAnsi="Consolas"/>
+                <w:color w:val="111827"/>
+                <w:sz w:val="17"/>
+              </w:rPr>
+              <w:t>Program:</w:t>
+            </w:r>
+            <w:r>
+              <w:rPr>
+                <w:rFonts w:ascii="Consolas" w:hAnsi="Consolas"/>
+                <w:color w:val="111827"/>
+                <w:sz w:val="17"/>
+              </w:rPr>
+              <w:br/>
+              <w:t>C:\Users\voutats1\Documents\Gibz\Informatik\M122\M122ESpotifyProject\spotify_weekly_wrapped\.venv\Scripts\python.exe</w:t>
+            </w:r>
+            <w:r>
+              <w:rPr>
+                <w:rFonts w:ascii="Consolas" w:hAnsi="Consolas"/>
+                <w:color w:val="111827"/>
+                <w:sz w:val="17"/>
+              </w:rPr>
+              <w:br/>
+            </w:r>
+            <w:r>
+              <w:rPr>
+                <w:rFonts w:ascii="Consolas" w:hAnsi="Consolas"/>
+                <w:color w:val="111827"/>
+                <w:sz w:val="17"/>
+              </w:rPr>
+              <w:br/>
+              <w:t>Arguments:</w:t>
+            </w:r>
+            <w:r>
+              <w:rPr>
+                <w:rFonts w:ascii="Consolas" w:hAnsi="Consolas"/>
+                <w:color w:val="111827"/>
+                <w:sz w:val="17"/>
+              </w:rPr>
+              <w:br/>
+              <w:t>main.py</w:t>
+            </w:r>
+            <w:r>
+              <w:rPr>
+                <w:rFonts w:ascii="Consolas" w:hAnsi="Consolas"/>
+                <w:color w:val="111827"/>
+                <w:sz w:val="17"/>
+              </w:rPr>
+              <w:br/>
+            </w:r>
+            <w:r>
+              <w:rPr>
+                <w:rFonts w:ascii="Consolas" w:hAnsi="Consolas"/>
+                <w:color w:val="111827"/>
+                <w:sz w:val="17"/>
+              </w:rPr>
+              <w:br/>
+              <w:t>Start in:</w:t>
+            </w:r>
+            <w:r>
+              <w:rPr>
+                <w:rFonts w:ascii="Consolas" w:hAnsi="Consolas"/>
+                <w:color w:val="111827"/>
+                <w:sz w:val="17"/>
+              </w:rPr>
+              <w:br/>
+              <w:t>C:\Users\voutats1\Documents\Gibz\Informatik\M122\M122ESpotifyProject\spotify_weekly_wrapped</w:t>
+            </w:r>
+          </w:p>
+        </w:tc>
+      </w:tr>
+    </w:tbl>
+    <w:p/>
     <w:p>
       <w:pPr>
-        <w:spacing w:after="60"/>
-      </w:pPr>
-      <w:r>
-        <w:rPr>
-          <w:rFonts w:ascii="Consolas" w:hAnsi="Consolas"/>
-          <w:sz w:val="18"/>
-        </w:rPr>
-        <w:t>Program: C:\Users\voutats1\Documents\Gibz\Informatik\M122\M122ESpotifyProject\spotify_weekly_wrapped\.venv\Scripts\python.exe</w:t>
-      </w:r>
-    </w:p>
-    <w:p>
-      <w:pPr>
-        <w:spacing w:after="60"/>
-      </w:pPr>
-      <w:r>
-        <w:rPr>
-          <w:rFonts w:ascii="Consolas" w:hAnsi="Consolas"/>
-          <w:sz w:val="18"/>
-        </w:rPr>
-        <w:t>Arguments: main.py</w:t>
-      </w:r>
-    </w:p>
-    <w:p>
-      <w:pPr>
-        <w:spacing w:after="60"/>
-      </w:pPr>
-      <w:r>
-        <w:rPr>
-          <w:rFonts w:ascii="Consolas" w:hAnsi="Consolas"/>
-          <w:sz w:val="18"/>
-        </w:rPr>
-        <w:t>Start in: C:\Users\voutats1\Documents\Gibz\Informatik\M122\M122ESpotifyProject\spotify_weekly_wrapped</w:t>
-      </w:r>
-    </w:p>
-    <w:p>
-      <w:pPr>
         <w:pStyle w:val="berschrift1"/>
       </w:pPr>
-      <w:bookmarkStart w:id="32" w:name="_Toc232536574"/>
+      <w:bookmarkStart w:id="8" w:name="_Toc232537680"/>
       <w:r>
         <w:t>8. Testing</w:t>
       </w:r>
-      <w:bookmarkEnd w:id="32"/>
+      <w:bookmarkEnd w:id="8"/>
     </w:p>
     <w:p>
       <w:pPr>
@@ -6683,30 +5332,56 @@
         <w:t>Testing was important because the project uses several external systems. The unit tests do not depend on real API calls. Instead, the external services are mocked where needed, which makes the tests faster and safer to run.</w:t>
       </w:r>
     </w:p>
-    <w:p>
-      <w:pPr>
-        <w:spacing w:after="60"/>
-      </w:pPr>
-      <w:r>
-        <w:rPr>
-          <w:rFonts w:ascii="Consolas" w:hAnsi="Consolas"/>
-          <w:sz w:val="18"/>
-        </w:rPr>
-        <w:t>python -m pytest</w:t>
-      </w:r>
-    </w:p>
-    <w:p>
-      <w:pPr>
-        <w:spacing w:after="60"/>
-      </w:pPr>
-      <w:r>
-        <w:rPr>
-          <w:rFonts w:ascii="Consolas" w:hAnsi="Consolas"/>
-          <w:sz w:val="18"/>
-        </w:rPr>
-        <w:t>35 passed</w:t>
-      </w:r>
-    </w:p>
+    <w:tbl>
+      <w:tblPr>
+        <w:tblStyle w:val="Tabellenraster"/>
+        <w:tblW w:w="0" w:type="auto"/>
+        <w:jc w:val="center"/>
+        <w:tblLook w:val="04A0" w:firstRow="1" w:lastRow="0" w:firstColumn="1" w:lastColumn="0" w:noHBand="0" w:noVBand="1"/>
+      </w:tblPr>
+      <w:tblGrid>
+        <w:gridCol w:w="10166"/>
+      </w:tblGrid>
+      <w:tr>
+        <w:trPr>
+          <w:jc w:val="center"/>
+        </w:trPr>
+        <w:tc>
+          <w:tcPr>
+            <w:tcW w:w="10166" w:type="dxa"/>
+            <w:shd w:val="clear" w:color="auto" w:fill="F3F4F6"/>
+          </w:tcPr>
+          <w:p>
+            <w:r>
+              <w:rPr>
+                <w:rFonts w:ascii="Consolas" w:hAnsi="Consolas"/>
+                <w:color w:val="111827"/>
+                <w:sz w:val="17"/>
+              </w:rPr>
+              <w:t>python -m pytest</w:t>
+            </w:r>
+            <w:r>
+              <w:rPr>
+                <w:rFonts w:ascii="Consolas" w:hAnsi="Consolas"/>
+                <w:color w:val="111827"/>
+                <w:sz w:val="17"/>
+              </w:rPr>
+              <w:br/>
+            </w:r>
+            <w:r>
+              <w:rPr>
+                <w:rFonts w:ascii="Consolas" w:hAnsi="Consolas"/>
+                <w:color w:val="111827"/>
+                <w:sz w:val="17"/>
+              </w:rPr>
+              <w:br/>
+              <w:t>35 passed</w:t>
+            </w:r>
+          </w:p>
+        </w:tc>
+      </w:tr>
+    </w:tbl>
+    <w:p/>
     <w:p>
       <w:pPr>
         <w:spacing w:after="140" w:line="259" w:lineRule="auto"/>
@@ -6719,11 +5394,11 @@
       <w:pPr>
         <w:pStyle w:val="berschrift1"/>
       </w:pPr>
-      <w:bookmarkStart w:id="33" w:name="_Toc232536575"/>
+      <w:bookmarkStart w:id="9" w:name="_Toc232537681"/>
       <w:r>
         <w:t>9. Assignment Coverage</w:t>
       </w:r>
-      <w:bookmarkEnd w:id="33"/>
+      <w:bookmarkEnd w:id="9"/>
     </w:p>
     <w:p>
       <w:pPr>
@@ -6794,6 +5469,7 @@
               <w:rPr>
                 <w:sz w:val="17"/>
               </w:rPr>
+              <w:lastRenderedPageBreak/>
               <w:t>Script performs multiple actions</w:t>
             </w:r>
           </w:p>
@@ -7097,11 +5773,11 @@
       <w:pPr>
         <w:pStyle w:val="berschrift1"/>
       </w:pPr>
-      <w:bookmarkStart w:id="34" w:name="_Toc232536576"/>
+      <w:bookmarkStart w:id="10" w:name="_Toc232537682"/>
       <w:r>
         <w:t>10. Conclusion</w:t>
       </w:r>
-      <w:bookmarkEnd w:id="34"/>
+      <w:bookmarkEnd w:id="10"/>
     </w:p>
     <w:p>
       <w:pPr>
@@ -7129,7 +5805,7 @@
     </w:p>
     <w:sectPr>
       <w:pgSz w:w="12240" w:h="15840"/>
-      <w:pgMar w:top="936" w:right="1037" w:bottom="936" w:left="1037" w:header="720" w:footer="720" w:gutter="0"/>
+      <w:pgMar w:top="979" w:right="1037" w:bottom="979" w:left="1037" w:header="720" w:footer="720" w:gutter="0"/>
       <w:cols w:space="720"/>
       <w:docGrid w:linePitch="360"/>
     </w:sectPr>
@@ -7310,31 +5986,31 @@
       </w:rPr>
     </w:lvl>
   </w:abstractNum>
-  <w:num w:numId="1" w16cid:durableId="790131073">
+  <w:num w:numId="1" w16cid:durableId="278149762">
     <w:abstractNumId w:val="8"/>
   </w:num>
-  <w:num w:numId="2" w16cid:durableId="1072049787">
+  <w:num w:numId="2" w16cid:durableId="513615426">
     <w:abstractNumId w:val="6"/>
   </w:num>
-  <w:num w:numId="3" w16cid:durableId="1770270921">
+  <w:num w:numId="3" w16cid:durableId="423262308">
     <w:abstractNumId w:val="5"/>
   </w:num>
-  <w:num w:numId="4" w16cid:durableId="835463218">
+  <w:num w:numId="4" w16cid:durableId="1483086749">
     <w:abstractNumId w:val="4"/>
   </w:num>
-  <w:num w:numId="5" w16cid:durableId="66922863">
+  <w:num w:numId="5" w16cid:durableId="663513174">
     <w:abstractNumId w:val="7"/>
   </w:num>
-  <w:num w:numId="6" w16cid:durableId="654458146">
+  <w:num w:numId="6" w16cid:durableId="1502741179">
     <w:abstractNumId w:val="3"/>
   </w:num>
-  <w:num w:numId="7" w16cid:durableId="211430851">
+  <w:num w:numId="7" w16cid:durableId="1103308142">
     <w:abstractNumId w:val="2"/>
   </w:num>
-  <w:num w:numId="8" w16cid:durableId="1743916720">
+  <w:num w:numId="8" w16cid:durableId="918830720">
     <w:abstractNumId w:val="1"/>
   </w:num>
-  <w:num w:numId="9" w16cid:durableId="1227840093">
+  <w:num w:numId="9" w16cid:durableId="2140493574">
     <w:abstractNumId w:val="0"/>
   </w:num>
 </w:numbering>
@@ -18732,22 +17408,9 @@
     <w:autoRedefine/>
     <w:uiPriority w:val="39"/>
     <w:unhideWhenUsed/>
-    <w:rsid w:val="00553CAF"/>
+    <w:rsid w:val="00D64666"/>
     <w:pPr>
       <w:spacing w:after="100"/>
-    </w:pPr>
-  </w:style>
-  <w:style w:type="paragraph" w:styleId="Verzeichnis2">
-    <w:name w:val="toc 2"/>
-    <w:basedOn w:val="Standard"/>
-    <w:next w:val="Standard"/>
-    <w:autoRedefine/>
-    <w:uiPriority w:val="39"/>
-    <w:unhideWhenUsed/>
-    <w:rsid w:val="00553CAF"/>
-    <w:pPr>
-      <w:spacing w:after="100"/>
-      <w:ind w:left="210"/>
     </w:pPr>
   </w:style>
   <w:style w:type="character" w:styleId="Hyperlink">
@@ -18755,7 +17418,7 @@
     <w:basedOn w:val="Absatz-Standardschriftart"/>
     <w:uiPriority w:val="99"/>
     <w:unhideWhenUsed/>
-    <w:rsid w:val="00553CAF"/>
+    <w:rsid w:val="00D64666"/>
     <w:rPr>
       <w:color w:val="0000FF" w:themeColor="hyperlink"/>
       <w:u w:val="single"/>

</xml_diff>

<commit_message>
Handle Spotify rate limits gracefully
</commit_message>
<xml_diff>
--- a/docs/M122E_Final_Documentation.docx
+++ b/docs/M122E_Final_Documentation.docx
@@ -437,12 +437,11 @@
         <w:tabs>
           <w:tab w:val="right" w:leader="dot" w:pos="10272"/>
         </w:tabs>
-        <w:spacing w:after="0" w:line="260" w:lineRule="exact"/>
         <w:rPr>
-          <w:rFonts w:ascii="Arial" w:hAnsi="Arial" w:cs="Arial"/>
+          <w:rFonts w:asciiTheme="minorHAnsi" w:hAnsiTheme="minorHAnsi"/>
           <w:noProof/>
           <w:kern w:val="2"/>
-          <w:sz w:val="22"/>
+          <w:sz w:val="24"/>
           <w:szCs w:val="24"/>
           <w:lang w:val="de-CH" w:eastAsia="de-CH"/>
           <w14:ligatures w14:val="standardContextual"/>
@@ -469,75 +468,59 @@
         </w:rPr>
         <w:fldChar w:fldCharType="separate"/>
       </w:r>
-      <w:hyperlink w:anchor="_Toc232605505" w:history="1">
+      <w:hyperlink w:anchor="_Toc232778795" w:history="1">
         <w:r>
           <w:rPr>
             <w:rStyle w:val="Hyperlink"/>
-            <w:rFonts w:ascii="Arial" w:hAnsi="Arial" w:cs="Arial"/>
-            <w:noProof/>
-            <w:sz w:val="22"/>
+            <w:noProof/>
           </w:rPr>
           <w:t>1. Project Overview</w:t>
         </w:r>
         <w:r>
           <w:rPr>
-            <w:rFonts w:ascii="Arial" w:hAnsi="Arial" w:cs="Arial"/>
-            <w:noProof/>
-            <w:webHidden/>
-            <w:sz w:val="22"/>
+            <w:noProof/>
+            <w:webHidden/>
           </w:rPr>
           <w:tab/>
         </w:r>
         <w:r>
           <w:rPr>
-            <w:rFonts w:ascii="Arial" w:hAnsi="Arial" w:cs="Arial"/>
-            <w:noProof/>
-            <w:webHidden/>
-            <w:sz w:val="22"/>
+            <w:noProof/>
+            <w:webHidden/>
           </w:rPr>
           <w:fldChar w:fldCharType="begin"/>
         </w:r>
         <w:r>
           <w:rPr>
-            <w:rFonts w:ascii="Arial" w:hAnsi="Arial" w:cs="Arial"/>
-            <w:noProof/>
-            <w:webHidden/>
-            <w:sz w:val="22"/>
-          </w:rPr>
-          <w:instrText xml:space="preserve"> PAGEREF _Toc232605505 \h </w:instrText>
-        </w:r>
-        <w:r>
-          <w:rPr>
-            <w:rFonts w:ascii="Arial" w:hAnsi="Arial" w:cs="Arial"/>
-            <w:noProof/>
-            <w:webHidden/>
-            <w:sz w:val="22"/>
-          </w:rPr>
-        </w:r>
-        <w:r>
-          <w:rPr>
-            <w:rFonts w:ascii="Arial" w:hAnsi="Arial" w:cs="Arial"/>
-            <w:noProof/>
-            <w:webHidden/>
-            <w:sz w:val="22"/>
+            <w:noProof/>
+            <w:webHidden/>
+          </w:rPr>
+          <w:instrText xml:space="preserve"> PAGEREF _Toc232778795 \h </w:instrText>
+        </w:r>
+        <w:r>
+          <w:rPr>
+            <w:noProof/>
+            <w:webHidden/>
+          </w:rPr>
+        </w:r>
+        <w:r>
+          <w:rPr>
+            <w:noProof/>
+            <w:webHidden/>
           </w:rPr>
           <w:fldChar w:fldCharType="separate"/>
         </w:r>
         <w:r>
           <w:rPr>
-            <w:rFonts w:ascii="Arial" w:hAnsi="Arial" w:cs="Arial"/>
-            <w:noProof/>
-            <w:webHidden/>
-            <w:sz w:val="22"/>
+            <w:noProof/>
+            <w:webHidden/>
           </w:rPr>
           <w:t>3</w:t>
         </w:r>
         <w:r>
           <w:rPr>
-            <w:rFonts w:ascii="Arial" w:hAnsi="Arial" w:cs="Arial"/>
-            <w:noProof/>
-            <w:webHidden/>
-            <w:sz w:val="22"/>
+            <w:noProof/>
+            <w:webHidden/>
           </w:rPr>
           <w:fldChar w:fldCharType="end"/>
         </w:r>
@@ -549,86 +532,69 @@
         <w:tabs>
           <w:tab w:val="right" w:leader="dot" w:pos="10272"/>
         </w:tabs>
-        <w:spacing w:after="0" w:line="260" w:lineRule="exact"/>
         <w:rPr>
-          <w:rFonts w:ascii="Arial" w:hAnsi="Arial" w:cs="Arial"/>
+          <w:rFonts w:asciiTheme="minorHAnsi" w:hAnsiTheme="minorHAnsi"/>
           <w:noProof/>
           <w:kern w:val="2"/>
-          <w:sz w:val="22"/>
+          <w:sz w:val="24"/>
           <w:szCs w:val="24"/>
           <w:lang w:val="de-CH" w:eastAsia="de-CH"/>
           <w14:ligatures w14:val="standardContextual"/>
         </w:rPr>
       </w:pPr>
-      <w:hyperlink w:anchor="_Toc232605506" w:history="1">
+      <w:hyperlink w:anchor="_Toc232778796" w:history="1">
         <w:r>
           <w:rPr>
             <w:rStyle w:val="Hyperlink"/>
-            <w:rFonts w:ascii="Arial" w:hAnsi="Arial" w:cs="Arial"/>
-            <w:noProof/>
-            <w:sz w:val="22"/>
+            <w:noProof/>
           </w:rPr>
           <w:t>1.1 Context</w:t>
         </w:r>
         <w:r>
           <w:rPr>
-            <w:rFonts w:ascii="Arial" w:hAnsi="Arial" w:cs="Arial"/>
-            <w:noProof/>
-            <w:webHidden/>
-            <w:sz w:val="22"/>
+            <w:noProof/>
+            <w:webHidden/>
           </w:rPr>
           <w:tab/>
         </w:r>
         <w:r>
           <w:rPr>
-            <w:rFonts w:ascii="Arial" w:hAnsi="Arial" w:cs="Arial"/>
-            <w:noProof/>
-            <w:webHidden/>
-            <w:sz w:val="22"/>
+            <w:noProof/>
+            <w:webHidden/>
           </w:rPr>
           <w:fldChar w:fldCharType="begin"/>
         </w:r>
         <w:r>
           <w:rPr>
-            <w:rFonts w:ascii="Arial" w:hAnsi="Arial" w:cs="Arial"/>
-            <w:noProof/>
-            <w:webHidden/>
-            <w:sz w:val="22"/>
-          </w:rPr>
-          <w:instrText xml:space="preserve"> PAGEREF _Toc232605506 \h </w:instrText>
-        </w:r>
-        <w:r>
-          <w:rPr>
-            <w:rFonts w:ascii="Arial" w:hAnsi="Arial" w:cs="Arial"/>
-            <w:noProof/>
-            <w:webHidden/>
-            <w:sz w:val="22"/>
-          </w:rPr>
-        </w:r>
-        <w:r>
-          <w:rPr>
-            <w:rFonts w:ascii="Arial" w:hAnsi="Arial" w:cs="Arial"/>
-            <w:noProof/>
-            <w:webHidden/>
-            <w:sz w:val="22"/>
+            <w:noProof/>
+            <w:webHidden/>
+          </w:rPr>
+          <w:instrText xml:space="preserve"> PAGEREF _Toc232778796 \h </w:instrText>
+        </w:r>
+        <w:r>
+          <w:rPr>
+            <w:noProof/>
+            <w:webHidden/>
+          </w:rPr>
+        </w:r>
+        <w:r>
+          <w:rPr>
+            <w:noProof/>
+            <w:webHidden/>
           </w:rPr>
           <w:fldChar w:fldCharType="separate"/>
         </w:r>
         <w:r>
           <w:rPr>
-            <w:rFonts w:ascii="Arial" w:hAnsi="Arial" w:cs="Arial"/>
-            <w:noProof/>
-            <w:webHidden/>
-            <w:sz w:val="22"/>
+            <w:noProof/>
+            <w:webHidden/>
           </w:rPr>
           <w:t>3</w:t>
         </w:r>
         <w:r>
           <w:rPr>
-            <w:rFonts w:ascii="Arial" w:hAnsi="Arial" w:cs="Arial"/>
-            <w:noProof/>
-            <w:webHidden/>
-            <w:sz w:val="22"/>
+            <w:noProof/>
+            <w:webHidden/>
           </w:rPr>
           <w:fldChar w:fldCharType="end"/>
         </w:r>
@@ -640,86 +606,69 @@
         <w:tabs>
           <w:tab w:val="right" w:leader="dot" w:pos="10272"/>
         </w:tabs>
-        <w:spacing w:after="0" w:line="260" w:lineRule="exact"/>
         <w:rPr>
-          <w:rFonts w:ascii="Arial" w:hAnsi="Arial" w:cs="Arial"/>
+          <w:rFonts w:asciiTheme="minorHAnsi" w:hAnsiTheme="minorHAnsi"/>
           <w:noProof/>
           <w:kern w:val="2"/>
-          <w:sz w:val="22"/>
+          <w:sz w:val="24"/>
           <w:szCs w:val="24"/>
           <w:lang w:val="de-CH" w:eastAsia="de-CH"/>
           <w14:ligatures w14:val="standardContextual"/>
         </w:rPr>
       </w:pPr>
-      <w:hyperlink w:anchor="_Toc232605507" w:history="1">
+      <w:hyperlink w:anchor="_Toc232778797" w:history="1">
         <w:r>
           <w:rPr>
             <w:rStyle w:val="Hyperlink"/>
-            <w:rFonts w:ascii="Arial" w:hAnsi="Arial" w:cs="Arial"/>
-            <w:noProof/>
-            <w:sz w:val="22"/>
+            <w:noProof/>
           </w:rPr>
           <w:t>1.2 Goal</w:t>
         </w:r>
         <w:r>
           <w:rPr>
-            <w:rFonts w:ascii="Arial" w:hAnsi="Arial" w:cs="Arial"/>
-            <w:noProof/>
-            <w:webHidden/>
-            <w:sz w:val="22"/>
+            <w:noProof/>
+            <w:webHidden/>
           </w:rPr>
           <w:tab/>
         </w:r>
         <w:r>
           <w:rPr>
-            <w:rFonts w:ascii="Arial" w:hAnsi="Arial" w:cs="Arial"/>
-            <w:noProof/>
-            <w:webHidden/>
-            <w:sz w:val="22"/>
+            <w:noProof/>
+            <w:webHidden/>
           </w:rPr>
           <w:fldChar w:fldCharType="begin"/>
         </w:r>
         <w:r>
           <w:rPr>
-            <w:rFonts w:ascii="Arial" w:hAnsi="Arial" w:cs="Arial"/>
-            <w:noProof/>
-            <w:webHidden/>
-            <w:sz w:val="22"/>
-          </w:rPr>
-          <w:instrText xml:space="preserve"> PAGEREF _Toc232605507 \h </w:instrText>
-        </w:r>
-        <w:r>
-          <w:rPr>
-            <w:rFonts w:ascii="Arial" w:hAnsi="Arial" w:cs="Arial"/>
-            <w:noProof/>
-            <w:webHidden/>
-            <w:sz w:val="22"/>
-          </w:rPr>
-        </w:r>
-        <w:r>
-          <w:rPr>
-            <w:rFonts w:ascii="Arial" w:hAnsi="Arial" w:cs="Arial"/>
-            <w:noProof/>
-            <w:webHidden/>
-            <w:sz w:val="22"/>
+            <w:noProof/>
+            <w:webHidden/>
+          </w:rPr>
+          <w:instrText xml:space="preserve"> PAGEREF _Toc232778797 \h </w:instrText>
+        </w:r>
+        <w:r>
+          <w:rPr>
+            <w:noProof/>
+            <w:webHidden/>
+          </w:rPr>
+        </w:r>
+        <w:r>
+          <w:rPr>
+            <w:noProof/>
+            <w:webHidden/>
           </w:rPr>
           <w:fldChar w:fldCharType="separate"/>
         </w:r>
         <w:r>
           <w:rPr>
-            <w:rFonts w:ascii="Arial" w:hAnsi="Arial" w:cs="Arial"/>
-            <w:noProof/>
-            <w:webHidden/>
-            <w:sz w:val="22"/>
+            <w:noProof/>
+            <w:webHidden/>
           </w:rPr>
           <w:t>3</w:t>
         </w:r>
         <w:r>
           <w:rPr>
-            <w:rFonts w:ascii="Arial" w:hAnsi="Arial" w:cs="Arial"/>
-            <w:noProof/>
-            <w:webHidden/>
-            <w:sz w:val="22"/>
+            <w:noProof/>
+            <w:webHidden/>
           </w:rPr>
           <w:fldChar w:fldCharType="end"/>
         </w:r>
@@ -731,86 +680,69 @@
         <w:tabs>
           <w:tab w:val="right" w:leader="dot" w:pos="10272"/>
         </w:tabs>
-        <w:spacing w:after="0" w:line="260" w:lineRule="exact"/>
         <w:rPr>
-          <w:rFonts w:ascii="Arial" w:hAnsi="Arial" w:cs="Arial"/>
+          <w:rFonts w:asciiTheme="minorHAnsi" w:hAnsiTheme="minorHAnsi"/>
           <w:noProof/>
           <w:kern w:val="2"/>
-          <w:sz w:val="22"/>
+          <w:sz w:val="24"/>
           <w:szCs w:val="24"/>
           <w:lang w:val="de-CH" w:eastAsia="de-CH"/>
           <w14:ligatures w14:val="standardContextual"/>
         </w:rPr>
       </w:pPr>
-      <w:hyperlink w:anchor="_Toc232605508" w:history="1">
+      <w:hyperlink w:anchor="_Toc232778798" w:history="1">
         <w:r>
           <w:rPr>
             <w:rStyle w:val="Hyperlink"/>
-            <w:rFonts w:ascii="Arial" w:hAnsi="Arial" w:cs="Arial"/>
-            <w:noProof/>
-            <w:sz w:val="22"/>
+            <w:noProof/>
           </w:rPr>
           <w:t>1.3 What The Program Does</w:t>
         </w:r>
         <w:r>
           <w:rPr>
-            <w:rFonts w:ascii="Arial" w:hAnsi="Arial" w:cs="Arial"/>
-            <w:noProof/>
-            <w:webHidden/>
-            <w:sz w:val="22"/>
+            <w:noProof/>
+            <w:webHidden/>
           </w:rPr>
           <w:tab/>
         </w:r>
         <w:r>
           <w:rPr>
-            <w:rFonts w:ascii="Arial" w:hAnsi="Arial" w:cs="Arial"/>
-            <w:noProof/>
-            <w:webHidden/>
-            <w:sz w:val="22"/>
+            <w:noProof/>
+            <w:webHidden/>
           </w:rPr>
           <w:fldChar w:fldCharType="begin"/>
         </w:r>
         <w:r>
           <w:rPr>
-            <w:rFonts w:ascii="Arial" w:hAnsi="Arial" w:cs="Arial"/>
-            <w:noProof/>
-            <w:webHidden/>
-            <w:sz w:val="22"/>
-          </w:rPr>
-          <w:instrText xml:space="preserve"> PAGEREF _Toc232605508 \h </w:instrText>
-        </w:r>
-        <w:r>
-          <w:rPr>
-            <w:rFonts w:ascii="Arial" w:hAnsi="Arial" w:cs="Arial"/>
-            <w:noProof/>
-            <w:webHidden/>
-            <w:sz w:val="22"/>
-          </w:rPr>
-        </w:r>
-        <w:r>
-          <w:rPr>
-            <w:rFonts w:ascii="Arial" w:hAnsi="Arial" w:cs="Arial"/>
-            <w:noProof/>
-            <w:webHidden/>
-            <w:sz w:val="22"/>
+            <w:noProof/>
+            <w:webHidden/>
+          </w:rPr>
+          <w:instrText xml:space="preserve"> PAGEREF _Toc232778798 \h </w:instrText>
+        </w:r>
+        <w:r>
+          <w:rPr>
+            <w:noProof/>
+            <w:webHidden/>
+          </w:rPr>
+        </w:r>
+        <w:r>
+          <w:rPr>
+            <w:noProof/>
+            <w:webHidden/>
           </w:rPr>
           <w:fldChar w:fldCharType="separate"/>
         </w:r>
         <w:r>
           <w:rPr>
-            <w:rFonts w:ascii="Arial" w:hAnsi="Arial" w:cs="Arial"/>
-            <w:noProof/>
-            <w:webHidden/>
-            <w:sz w:val="22"/>
+            <w:noProof/>
+            <w:webHidden/>
           </w:rPr>
           <w:t>3</w:t>
         </w:r>
         <w:r>
           <w:rPr>
-            <w:rFonts w:ascii="Arial" w:hAnsi="Arial" w:cs="Arial"/>
-            <w:noProof/>
-            <w:webHidden/>
-            <w:sz w:val="22"/>
+            <w:noProof/>
+            <w:webHidden/>
           </w:rPr>
           <w:fldChar w:fldCharType="end"/>
         </w:r>
@@ -822,86 +754,69 @@
         <w:tabs>
           <w:tab w:val="right" w:leader="dot" w:pos="10272"/>
         </w:tabs>
-        <w:spacing w:after="0" w:line="260" w:lineRule="exact"/>
         <w:rPr>
-          <w:rFonts w:ascii="Arial" w:hAnsi="Arial" w:cs="Arial"/>
+          <w:rFonts w:asciiTheme="minorHAnsi" w:hAnsiTheme="minorHAnsi"/>
           <w:noProof/>
           <w:kern w:val="2"/>
-          <w:sz w:val="22"/>
+          <w:sz w:val="24"/>
           <w:szCs w:val="24"/>
           <w:lang w:val="de-CH" w:eastAsia="de-CH"/>
           <w14:ligatures w14:val="standardContextual"/>
         </w:rPr>
       </w:pPr>
-      <w:hyperlink w:anchor="_Toc232605509" w:history="1">
+      <w:hyperlink w:anchor="_Toc232778799" w:history="1">
         <w:r>
           <w:rPr>
             <w:rStyle w:val="Hyperlink"/>
-            <w:rFonts w:ascii="Arial" w:hAnsi="Arial" w:cs="Arial"/>
-            <w:noProof/>
-            <w:sz w:val="22"/>
+            <w:noProof/>
           </w:rPr>
           <w:t>2. Project Work And Personal Approach</w:t>
         </w:r>
         <w:r>
           <w:rPr>
-            <w:rFonts w:ascii="Arial" w:hAnsi="Arial" w:cs="Arial"/>
-            <w:noProof/>
-            <w:webHidden/>
-            <w:sz w:val="22"/>
+            <w:noProof/>
+            <w:webHidden/>
           </w:rPr>
           <w:tab/>
         </w:r>
         <w:r>
           <w:rPr>
-            <w:rFonts w:ascii="Arial" w:hAnsi="Arial" w:cs="Arial"/>
-            <w:noProof/>
-            <w:webHidden/>
-            <w:sz w:val="22"/>
+            <w:noProof/>
+            <w:webHidden/>
           </w:rPr>
           <w:fldChar w:fldCharType="begin"/>
         </w:r>
         <w:r>
           <w:rPr>
-            <w:rFonts w:ascii="Arial" w:hAnsi="Arial" w:cs="Arial"/>
-            <w:noProof/>
-            <w:webHidden/>
-            <w:sz w:val="22"/>
-          </w:rPr>
-          <w:instrText xml:space="preserve"> PAGEREF _Toc232605509 \h </w:instrText>
-        </w:r>
-        <w:r>
-          <w:rPr>
-            <w:rFonts w:ascii="Arial" w:hAnsi="Arial" w:cs="Arial"/>
-            <w:noProof/>
-            <w:webHidden/>
-            <w:sz w:val="22"/>
-          </w:rPr>
-        </w:r>
-        <w:r>
-          <w:rPr>
-            <w:rFonts w:ascii="Arial" w:hAnsi="Arial" w:cs="Arial"/>
-            <w:noProof/>
-            <w:webHidden/>
-            <w:sz w:val="22"/>
+            <w:noProof/>
+            <w:webHidden/>
+          </w:rPr>
+          <w:instrText xml:space="preserve"> PAGEREF _Toc232778799 \h </w:instrText>
+        </w:r>
+        <w:r>
+          <w:rPr>
+            <w:noProof/>
+            <w:webHidden/>
+          </w:rPr>
+        </w:r>
+        <w:r>
+          <w:rPr>
+            <w:noProof/>
+            <w:webHidden/>
           </w:rPr>
           <w:fldChar w:fldCharType="separate"/>
         </w:r>
         <w:r>
           <w:rPr>
-            <w:rFonts w:ascii="Arial" w:hAnsi="Arial" w:cs="Arial"/>
-            <w:noProof/>
-            <w:webHidden/>
-            <w:sz w:val="22"/>
+            <w:noProof/>
+            <w:webHidden/>
           </w:rPr>
           <w:t>3</w:t>
         </w:r>
         <w:r>
           <w:rPr>
-            <w:rFonts w:ascii="Arial" w:hAnsi="Arial" w:cs="Arial"/>
-            <w:noProof/>
-            <w:webHidden/>
-            <w:sz w:val="22"/>
+            <w:noProof/>
+            <w:webHidden/>
           </w:rPr>
           <w:fldChar w:fldCharType="end"/>
         </w:r>
@@ -913,86 +828,69 @@
         <w:tabs>
           <w:tab w:val="right" w:leader="dot" w:pos="10272"/>
         </w:tabs>
-        <w:spacing w:after="0" w:line="260" w:lineRule="exact"/>
         <w:rPr>
-          <w:rFonts w:ascii="Arial" w:hAnsi="Arial" w:cs="Arial"/>
+          <w:rFonts w:asciiTheme="minorHAnsi" w:hAnsiTheme="minorHAnsi"/>
           <w:noProof/>
           <w:kern w:val="2"/>
-          <w:sz w:val="22"/>
+          <w:sz w:val="24"/>
           <w:szCs w:val="24"/>
           <w:lang w:val="de-CH" w:eastAsia="de-CH"/>
           <w14:ligatures w14:val="standardContextual"/>
         </w:rPr>
       </w:pPr>
-      <w:hyperlink w:anchor="_Toc232605510" w:history="1">
+      <w:hyperlink w:anchor="_Toc232778800" w:history="1">
         <w:r>
           <w:rPr>
             <w:rStyle w:val="Hyperlink"/>
-            <w:rFonts w:ascii="Arial" w:hAnsi="Arial" w:cs="Arial"/>
-            <w:noProof/>
-            <w:sz w:val="22"/>
+            <w:noProof/>
           </w:rPr>
           <w:t>2.1 How I Started</w:t>
         </w:r>
         <w:r>
           <w:rPr>
-            <w:rFonts w:ascii="Arial" w:hAnsi="Arial" w:cs="Arial"/>
-            <w:noProof/>
-            <w:webHidden/>
-            <w:sz w:val="22"/>
+            <w:noProof/>
+            <w:webHidden/>
           </w:rPr>
           <w:tab/>
         </w:r>
         <w:r>
           <w:rPr>
-            <w:rFonts w:ascii="Arial" w:hAnsi="Arial" w:cs="Arial"/>
-            <w:noProof/>
-            <w:webHidden/>
-            <w:sz w:val="22"/>
+            <w:noProof/>
+            <w:webHidden/>
           </w:rPr>
           <w:fldChar w:fldCharType="begin"/>
         </w:r>
         <w:r>
           <w:rPr>
-            <w:rFonts w:ascii="Arial" w:hAnsi="Arial" w:cs="Arial"/>
-            <w:noProof/>
-            <w:webHidden/>
-            <w:sz w:val="22"/>
-          </w:rPr>
-          <w:instrText xml:space="preserve"> PAGEREF _Toc232605510 \h </w:instrText>
-        </w:r>
-        <w:r>
-          <w:rPr>
-            <w:rFonts w:ascii="Arial" w:hAnsi="Arial" w:cs="Arial"/>
-            <w:noProof/>
-            <w:webHidden/>
-            <w:sz w:val="22"/>
-          </w:rPr>
-        </w:r>
-        <w:r>
-          <w:rPr>
-            <w:rFonts w:ascii="Arial" w:hAnsi="Arial" w:cs="Arial"/>
-            <w:noProof/>
-            <w:webHidden/>
-            <w:sz w:val="22"/>
+            <w:noProof/>
+            <w:webHidden/>
+          </w:rPr>
+          <w:instrText xml:space="preserve"> PAGEREF _Toc232778800 \h </w:instrText>
+        </w:r>
+        <w:r>
+          <w:rPr>
+            <w:noProof/>
+            <w:webHidden/>
+          </w:rPr>
+        </w:r>
+        <w:r>
+          <w:rPr>
+            <w:noProof/>
+            <w:webHidden/>
           </w:rPr>
           <w:fldChar w:fldCharType="separate"/>
         </w:r>
         <w:r>
           <w:rPr>
-            <w:rFonts w:ascii="Arial" w:hAnsi="Arial" w:cs="Arial"/>
-            <w:noProof/>
-            <w:webHidden/>
-            <w:sz w:val="22"/>
+            <w:noProof/>
+            <w:webHidden/>
           </w:rPr>
           <w:t>3</w:t>
         </w:r>
         <w:r>
           <w:rPr>
-            <w:rFonts w:ascii="Arial" w:hAnsi="Arial" w:cs="Arial"/>
-            <w:noProof/>
-            <w:webHidden/>
-            <w:sz w:val="22"/>
+            <w:noProof/>
+            <w:webHidden/>
           </w:rPr>
           <w:fldChar w:fldCharType="end"/>
         </w:r>
@@ -1004,86 +902,69 @@
         <w:tabs>
           <w:tab w:val="right" w:leader="dot" w:pos="10272"/>
         </w:tabs>
-        <w:spacing w:after="0" w:line="260" w:lineRule="exact"/>
         <w:rPr>
-          <w:rFonts w:ascii="Arial" w:hAnsi="Arial" w:cs="Arial"/>
+          <w:rFonts w:asciiTheme="minorHAnsi" w:hAnsiTheme="minorHAnsi"/>
           <w:noProof/>
           <w:kern w:val="2"/>
-          <w:sz w:val="22"/>
+          <w:sz w:val="24"/>
           <w:szCs w:val="24"/>
           <w:lang w:val="de-CH" w:eastAsia="de-CH"/>
           <w14:ligatures w14:val="standardContextual"/>
         </w:rPr>
       </w:pPr>
-      <w:hyperlink w:anchor="_Toc232605511" w:history="1">
+      <w:hyperlink w:anchor="_Toc232778801" w:history="1">
         <w:r>
           <w:rPr>
             <w:rStyle w:val="Hyperlink"/>
-            <w:rFonts w:ascii="Arial" w:hAnsi="Arial" w:cs="Arial"/>
-            <w:noProof/>
-            <w:sz w:val="22"/>
+            <w:noProof/>
           </w:rPr>
           <w:t>2.2 Difficulties During The Project</w:t>
         </w:r>
         <w:r>
           <w:rPr>
-            <w:rFonts w:ascii="Arial" w:hAnsi="Arial" w:cs="Arial"/>
-            <w:noProof/>
-            <w:webHidden/>
-            <w:sz w:val="22"/>
+            <w:noProof/>
+            <w:webHidden/>
           </w:rPr>
           <w:tab/>
         </w:r>
         <w:r>
           <w:rPr>
-            <w:rFonts w:ascii="Arial" w:hAnsi="Arial" w:cs="Arial"/>
-            <w:noProof/>
-            <w:webHidden/>
-            <w:sz w:val="22"/>
+            <w:noProof/>
+            <w:webHidden/>
           </w:rPr>
           <w:fldChar w:fldCharType="begin"/>
         </w:r>
         <w:r>
           <w:rPr>
-            <w:rFonts w:ascii="Arial" w:hAnsi="Arial" w:cs="Arial"/>
-            <w:noProof/>
-            <w:webHidden/>
-            <w:sz w:val="22"/>
-          </w:rPr>
-          <w:instrText xml:space="preserve"> PAGEREF _Toc232605511 \h </w:instrText>
-        </w:r>
-        <w:r>
-          <w:rPr>
-            <w:rFonts w:ascii="Arial" w:hAnsi="Arial" w:cs="Arial"/>
-            <w:noProof/>
-            <w:webHidden/>
-            <w:sz w:val="22"/>
-          </w:rPr>
-        </w:r>
-        <w:r>
-          <w:rPr>
-            <w:rFonts w:ascii="Arial" w:hAnsi="Arial" w:cs="Arial"/>
-            <w:noProof/>
-            <w:webHidden/>
-            <w:sz w:val="22"/>
+            <w:noProof/>
+            <w:webHidden/>
+          </w:rPr>
+          <w:instrText xml:space="preserve"> PAGEREF _Toc232778801 \h </w:instrText>
+        </w:r>
+        <w:r>
+          <w:rPr>
+            <w:noProof/>
+            <w:webHidden/>
+          </w:rPr>
+        </w:r>
+        <w:r>
+          <w:rPr>
+            <w:noProof/>
+            <w:webHidden/>
           </w:rPr>
           <w:fldChar w:fldCharType="separate"/>
         </w:r>
         <w:r>
           <w:rPr>
-            <w:rFonts w:ascii="Arial" w:hAnsi="Arial" w:cs="Arial"/>
-            <w:noProof/>
-            <w:webHidden/>
-            <w:sz w:val="22"/>
+            <w:noProof/>
+            <w:webHidden/>
           </w:rPr>
           <w:t>3</w:t>
         </w:r>
         <w:r>
           <w:rPr>
-            <w:rFonts w:ascii="Arial" w:hAnsi="Arial" w:cs="Arial"/>
-            <w:noProof/>
-            <w:webHidden/>
-            <w:sz w:val="22"/>
+            <w:noProof/>
+            <w:webHidden/>
           </w:rPr>
           <w:fldChar w:fldCharType="end"/>
         </w:r>
@@ -1095,86 +976,69 @@
         <w:tabs>
           <w:tab w:val="right" w:leader="dot" w:pos="10272"/>
         </w:tabs>
-        <w:spacing w:after="0" w:line="260" w:lineRule="exact"/>
         <w:rPr>
-          <w:rFonts w:ascii="Arial" w:hAnsi="Arial" w:cs="Arial"/>
+          <w:rFonts w:asciiTheme="minorHAnsi" w:hAnsiTheme="minorHAnsi"/>
           <w:noProof/>
           <w:kern w:val="2"/>
-          <w:sz w:val="22"/>
+          <w:sz w:val="24"/>
           <w:szCs w:val="24"/>
           <w:lang w:val="de-CH" w:eastAsia="de-CH"/>
           <w14:ligatures w14:val="standardContextual"/>
         </w:rPr>
       </w:pPr>
-      <w:hyperlink w:anchor="_Toc232605512" w:history="1">
+      <w:hyperlink w:anchor="_Toc232778802" w:history="1">
         <w:r>
           <w:rPr>
             <w:rStyle w:val="Hyperlink"/>
-            <w:rFonts w:ascii="Arial" w:hAnsi="Arial" w:cs="Arial"/>
-            <w:noProof/>
-            <w:sz w:val="22"/>
+            <w:noProof/>
           </w:rPr>
           <w:t>2.3 What I Improved Near The End</w:t>
         </w:r>
         <w:r>
           <w:rPr>
-            <w:rFonts w:ascii="Arial" w:hAnsi="Arial" w:cs="Arial"/>
-            <w:noProof/>
-            <w:webHidden/>
-            <w:sz w:val="22"/>
+            <w:noProof/>
+            <w:webHidden/>
           </w:rPr>
           <w:tab/>
         </w:r>
         <w:r>
           <w:rPr>
-            <w:rFonts w:ascii="Arial" w:hAnsi="Arial" w:cs="Arial"/>
-            <w:noProof/>
-            <w:webHidden/>
-            <w:sz w:val="22"/>
+            <w:noProof/>
+            <w:webHidden/>
           </w:rPr>
           <w:fldChar w:fldCharType="begin"/>
         </w:r>
         <w:r>
           <w:rPr>
-            <w:rFonts w:ascii="Arial" w:hAnsi="Arial" w:cs="Arial"/>
-            <w:noProof/>
-            <w:webHidden/>
-            <w:sz w:val="22"/>
-          </w:rPr>
-          <w:instrText xml:space="preserve"> PAGEREF _Toc232605512 \h </w:instrText>
-        </w:r>
-        <w:r>
-          <w:rPr>
-            <w:rFonts w:ascii="Arial" w:hAnsi="Arial" w:cs="Arial"/>
-            <w:noProof/>
-            <w:webHidden/>
-            <w:sz w:val="22"/>
-          </w:rPr>
-        </w:r>
-        <w:r>
-          <w:rPr>
-            <w:rFonts w:ascii="Arial" w:hAnsi="Arial" w:cs="Arial"/>
-            <w:noProof/>
-            <w:webHidden/>
-            <w:sz w:val="22"/>
+            <w:noProof/>
+            <w:webHidden/>
+          </w:rPr>
+          <w:instrText xml:space="preserve"> PAGEREF _Toc232778802 \h </w:instrText>
+        </w:r>
+        <w:r>
+          <w:rPr>
+            <w:noProof/>
+            <w:webHidden/>
+          </w:rPr>
+        </w:r>
+        <w:r>
+          <w:rPr>
+            <w:noProof/>
+            <w:webHidden/>
           </w:rPr>
           <w:fldChar w:fldCharType="separate"/>
         </w:r>
         <w:r>
           <w:rPr>
-            <w:rFonts w:ascii="Arial" w:hAnsi="Arial" w:cs="Arial"/>
-            <w:noProof/>
-            <w:webHidden/>
-            <w:sz w:val="22"/>
+            <w:noProof/>
+            <w:webHidden/>
           </w:rPr>
           <w:t>3</w:t>
         </w:r>
         <w:r>
           <w:rPr>
-            <w:rFonts w:ascii="Arial" w:hAnsi="Arial" w:cs="Arial"/>
-            <w:noProof/>
-            <w:webHidden/>
-            <w:sz w:val="22"/>
+            <w:noProof/>
+            <w:webHidden/>
           </w:rPr>
           <w:fldChar w:fldCharType="end"/>
         </w:r>
@@ -1186,86 +1050,69 @@
         <w:tabs>
           <w:tab w:val="right" w:leader="dot" w:pos="10272"/>
         </w:tabs>
-        <w:spacing w:after="0" w:line="260" w:lineRule="exact"/>
         <w:rPr>
-          <w:rFonts w:ascii="Arial" w:hAnsi="Arial" w:cs="Arial"/>
+          <w:rFonts w:asciiTheme="minorHAnsi" w:hAnsiTheme="minorHAnsi"/>
           <w:noProof/>
           <w:kern w:val="2"/>
-          <w:sz w:val="22"/>
+          <w:sz w:val="24"/>
           <w:szCs w:val="24"/>
           <w:lang w:val="de-CH" w:eastAsia="de-CH"/>
           <w14:ligatures w14:val="standardContextual"/>
         </w:rPr>
       </w:pPr>
-      <w:hyperlink w:anchor="_Toc232605513" w:history="1">
+      <w:hyperlink w:anchor="_Toc232778803" w:history="1">
         <w:r>
           <w:rPr>
             <w:rStyle w:val="Hyperlink"/>
-            <w:rFonts w:ascii="Arial" w:hAnsi="Arial" w:cs="Arial"/>
-            <w:noProof/>
-            <w:sz w:val="22"/>
+            <w:noProof/>
           </w:rPr>
           <w:t>3. Project Plan</w:t>
         </w:r>
         <w:r>
           <w:rPr>
-            <w:rFonts w:ascii="Arial" w:hAnsi="Arial" w:cs="Arial"/>
-            <w:noProof/>
-            <w:webHidden/>
-            <w:sz w:val="22"/>
+            <w:noProof/>
+            <w:webHidden/>
           </w:rPr>
           <w:tab/>
         </w:r>
         <w:r>
           <w:rPr>
-            <w:rFonts w:ascii="Arial" w:hAnsi="Arial" w:cs="Arial"/>
-            <w:noProof/>
-            <w:webHidden/>
-            <w:sz w:val="22"/>
+            <w:noProof/>
+            <w:webHidden/>
           </w:rPr>
           <w:fldChar w:fldCharType="begin"/>
         </w:r>
         <w:r>
           <w:rPr>
-            <w:rFonts w:ascii="Arial" w:hAnsi="Arial" w:cs="Arial"/>
-            <w:noProof/>
-            <w:webHidden/>
-            <w:sz w:val="22"/>
-          </w:rPr>
-          <w:instrText xml:space="preserve"> PAGEREF _Toc232605513 \h </w:instrText>
-        </w:r>
-        <w:r>
-          <w:rPr>
-            <w:rFonts w:ascii="Arial" w:hAnsi="Arial" w:cs="Arial"/>
-            <w:noProof/>
-            <w:webHidden/>
-            <w:sz w:val="22"/>
-          </w:rPr>
-        </w:r>
-        <w:r>
-          <w:rPr>
-            <w:rFonts w:ascii="Arial" w:hAnsi="Arial" w:cs="Arial"/>
-            <w:noProof/>
-            <w:webHidden/>
-            <w:sz w:val="22"/>
+            <w:noProof/>
+            <w:webHidden/>
+          </w:rPr>
+          <w:instrText xml:space="preserve"> PAGEREF _Toc232778803 \h </w:instrText>
+        </w:r>
+        <w:r>
+          <w:rPr>
+            <w:noProof/>
+            <w:webHidden/>
+          </w:rPr>
+        </w:r>
+        <w:r>
+          <w:rPr>
+            <w:noProof/>
+            <w:webHidden/>
           </w:rPr>
           <w:fldChar w:fldCharType="separate"/>
         </w:r>
         <w:r>
           <w:rPr>
-            <w:rFonts w:ascii="Arial" w:hAnsi="Arial" w:cs="Arial"/>
-            <w:noProof/>
-            <w:webHidden/>
-            <w:sz w:val="22"/>
+            <w:noProof/>
+            <w:webHidden/>
           </w:rPr>
           <w:t>4</w:t>
         </w:r>
         <w:r>
           <w:rPr>
-            <w:rFonts w:ascii="Arial" w:hAnsi="Arial" w:cs="Arial"/>
-            <w:noProof/>
-            <w:webHidden/>
-            <w:sz w:val="22"/>
+            <w:noProof/>
+            <w:webHidden/>
           </w:rPr>
           <w:fldChar w:fldCharType="end"/>
         </w:r>
@@ -1277,86 +1124,69 @@
         <w:tabs>
           <w:tab w:val="right" w:leader="dot" w:pos="10272"/>
         </w:tabs>
-        <w:spacing w:after="0" w:line="260" w:lineRule="exact"/>
         <w:rPr>
-          <w:rFonts w:ascii="Arial" w:hAnsi="Arial" w:cs="Arial"/>
+          <w:rFonts w:asciiTheme="minorHAnsi" w:hAnsiTheme="minorHAnsi"/>
           <w:noProof/>
           <w:kern w:val="2"/>
-          <w:sz w:val="22"/>
+          <w:sz w:val="24"/>
           <w:szCs w:val="24"/>
           <w:lang w:val="de-CH" w:eastAsia="de-CH"/>
           <w14:ligatures w14:val="standardContextual"/>
         </w:rPr>
       </w:pPr>
-      <w:hyperlink w:anchor="_Toc232605514" w:history="1">
+      <w:hyperlink w:anchor="_Toc232778804" w:history="1">
         <w:r>
           <w:rPr>
             <w:rStyle w:val="Hyperlink"/>
-            <w:rFonts w:ascii="Arial" w:hAnsi="Arial" w:cs="Arial"/>
-            <w:noProof/>
-            <w:sz w:val="22"/>
+            <w:noProof/>
           </w:rPr>
           <w:t>4. Requirements</w:t>
         </w:r>
         <w:r>
           <w:rPr>
-            <w:rFonts w:ascii="Arial" w:hAnsi="Arial" w:cs="Arial"/>
-            <w:noProof/>
-            <w:webHidden/>
-            <w:sz w:val="22"/>
+            <w:noProof/>
+            <w:webHidden/>
           </w:rPr>
           <w:tab/>
         </w:r>
         <w:r>
           <w:rPr>
-            <w:rFonts w:ascii="Arial" w:hAnsi="Arial" w:cs="Arial"/>
-            <w:noProof/>
-            <w:webHidden/>
-            <w:sz w:val="22"/>
+            <w:noProof/>
+            <w:webHidden/>
           </w:rPr>
           <w:fldChar w:fldCharType="begin"/>
         </w:r>
         <w:r>
           <w:rPr>
-            <w:rFonts w:ascii="Arial" w:hAnsi="Arial" w:cs="Arial"/>
-            <w:noProof/>
-            <w:webHidden/>
-            <w:sz w:val="22"/>
-          </w:rPr>
-          <w:instrText xml:space="preserve"> PAGEREF _Toc232605514 \h </w:instrText>
-        </w:r>
-        <w:r>
-          <w:rPr>
-            <w:rFonts w:ascii="Arial" w:hAnsi="Arial" w:cs="Arial"/>
-            <w:noProof/>
-            <w:webHidden/>
-            <w:sz w:val="22"/>
-          </w:rPr>
-        </w:r>
-        <w:r>
-          <w:rPr>
-            <w:rFonts w:ascii="Arial" w:hAnsi="Arial" w:cs="Arial"/>
-            <w:noProof/>
-            <w:webHidden/>
-            <w:sz w:val="22"/>
+            <w:noProof/>
+            <w:webHidden/>
+          </w:rPr>
+          <w:instrText xml:space="preserve"> PAGEREF _Toc232778804 \h </w:instrText>
+        </w:r>
+        <w:r>
+          <w:rPr>
+            <w:noProof/>
+            <w:webHidden/>
+          </w:rPr>
+        </w:r>
+        <w:r>
+          <w:rPr>
+            <w:noProof/>
+            <w:webHidden/>
           </w:rPr>
           <w:fldChar w:fldCharType="separate"/>
         </w:r>
         <w:r>
           <w:rPr>
-            <w:rFonts w:ascii="Arial" w:hAnsi="Arial" w:cs="Arial"/>
-            <w:noProof/>
-            <w:webHidden/>
-            <w:sz w:val="22"/>
+            <w:noProof/>
+            <w:webHidden/>
           </w:rPr>
           <w:t>4</w:t>
         </w:r>
         <w:r>
           <w:rPr>
-            <w:rFonts w:ascii="Arial" w:hAnsi="Arial" w:cs="Arial"/>
-            <w:noProof/>
-            <w:webHidden/>
-            <w:sz w:val="22"/>
+            <w:noProof/>
+            <w:webHidden/>
           </w:rPr>
           <w:fldChar w:fldCharType="end"/>
         </w:r>
@@ -1368,86 +1198,69 @@
         <w:tabs>
           <w:tab w:val="right" w:leader="dot" w:pos="10272"/>
         </w:tabs>
-        <w:spacing w:after="0" w:line="260" w:lineRule="exact"/>
         <w:rPr>
-          <w:rFonts w:ascii="Arial" w:hAnsi="Arial" w:cs="Arial"/>
+          <w:rFonts w:asciiTheme="minorHAnsi" w:hAnsiTheme="minorHAnsi"/>
           <w:noProof/>
           <w:kern w:val="2"/>
-          <w:sz w:val="22"/>
+          <w:sz w:val="24"/>
           <w:szCs w:val="24"/>
           <w:lang w:val="de-CH" w:eastAsia="de-CH"/>
           <w14:ligatures w14:val="standardContextual"/>
         </w:rPr>
       </w:pPr>
-      <w:hyperlink w:anchor="_Toc232605515" w:history="1">
+      <w:hyperlink w:anchor="_Toc232778805" w:history="1">
         <w:r>
           <w:rPr>
             <w:rStyle w:val="Hyperlink"/>
-            <w:rFonts w:ascii="Arial" w:hAnsi="Arial" w:cs="Arial"/>
-            <w:noProof/>
-            <w:sz w:val="22"/>
+            <w:noProof/>
           </w:rPr>
           <w:t>4.1 Functional Requirements</w:t>
         </w:r>
         <w:r>
           <w:rPr>
-            <w:rFonts w:ascii="Arial" w:hAnsi="Arial" w:cs="Arial"/>
-            <w:noProof/>
-            <w:webHidden/>
-            <w:sz w:val="22"/>
+            <w:noProof/>
+            <w:webHidden/>
           </w:rPr>
           <w:tab/>
         </w:r>
         <w:r>
           <w:rPr>
-            <w:rFonts w:ascii="Arial" w:hAnsi="Arial" w:cs="Arial"/>
-            <w:noProof/>
-            <w:webHidden/>
-            <w:sz w:val="22"/>
+            <w:noProof/>
+            <w:webHidden/>
           </w:rPr>
           <w:fldChar w:fldCharType="begin"/>
         </w:r>
         <w:r>
           <w:rPr>
-            <w:rFonts w:ascii="Arial" w:hAnsi="Arial" w:cs="Arial"/>
-            <w:noProof/>
-            <w:webHidden/>
-            <w:sz w:val="22"/>
-          </w:rPr>
-          <w:instrText xml:space="preserve"> PAGEREF _Toc232605515 \h </w:instrText>
-        </w:r>
-        <w:r>
-          <w:rPr>
-            <w:rFonts w:ascii="Arial" w:hAnsi="Arial" w:cs="Arial"/>
-            <w:noProof/>
-            <w:webHidden/>
-            <w:sz w:val="22"/>
-          </w:rPr>
-        </w:r>
-        <w:r>
-          <w:rPr>
-            <w:rFonts w:ascii="Arial" w:hAnsi="Arial" w:cs="Arial"/>
-            <w:noProof/>
-            <w:webHidden/>
-            <w:sz w:val="22"/>
+            <w:noProof/>
+            <w:webHidden/>
+          </w:rPr>
+          <w:instrText xml:space="preserve"> PAGEREF _Toc232778805 \h </w:instrText>
+        </w:r>
+        <w:r>
+          <w:rPr>
+            <w:noProof/>
+            <w:webHidden/>
+          </w:rPr>
+        </w:r>
+        <w:r>
+          <w:rPr>
+            <w:noProof/>
+            <w:webHidden/>
           </w:rPr>
           <w:fldChar w:fldCharType="separate"/>
         </w:r>
         <w:r>
           <w:rPr>
-            <w:rFonts w:ascii="Arial" w:hAnsi="Arial" w:cs="Arial"/>
-            <w:noProof/>
-            <w:webHidden/>
-            <w:sz w:val="22"/>
+            <w:noProof/>
+            <w:webHidden/>
           </w:rPr>
           <w:t>4</w:t>
         </w:r>
         <w:r>
           <w:rPr>
-            <w:rFonts w:ascii="Arial" w:hAnsi="Arial" w:cs="Arial"/>
-            <w:noProof/>
-            <w:webHidden/>
-            <w:sz w:val="22"/>
+            <w:noProof/>
+            <w:webHidden/>
           </w:rPr>
           <w:fldChar w:fldCharType="end"/>
         </w:r>
@@ -1459,86 +1272,69 @@
         <w:tabs>
           <w:tab w:val="right" w:leader="dot" w:pos="10272"/>
         </w:tabs>
-        <w:spacing w:after="0" w:line="260" w:lineRule="exact"/>
         <w:rPr>
-          <w:rFonts w:ascii="Arial" w:hAnsi="Arial" w:cs="Arial"/>
+          <w:rFonts w:asciiTheme="minorHAnsi" w:hAnsiTheme="minorHAnsi"/>
           <w:noProof/>
           <w:kern w:val="2"/>
-          <w:sz w:val="22"/>
+          <w:sz w:val="24"/>
           <w:szCs w:val="24"/>
           <w:lang w:val="de-CH" w:eastAsia="de-CH"/>
           <w14:ligatures w14:val="standardContextual"/>
         </w:rPr>
       </w:pPr>
-      <w:hyperlink w:anchor="_Toc232605516" w:history="1">
+      <w:hyperlink w:anchor="_Toc232778806" w:history="1">
         <w:r>
           <w:rPr>
             <w:rStyle w:val="Hyperlink"/>
-            <w:rFonts w:ascii="Arial" w:hAnsi="Arial" w:cs="Arial"/>
-            <w:noProof/>
-            <w:sz w:val="22"/>
+            <w:noProof/>
           </w:rPr>
           <w:t>4.2 Non-Functional Requirements</w:t>
         </w:r>
         <w:r>
           <w:rPr>
-            <w:rFonts w:ascii="Arial" w:hAnsi="Arial" w:cs="Arial"/>
-            <w:noProof/>
-            <w:webHidden/>
-            <w:sz w:val="22"/>
+            <w:noProof/>
+            <w:webHidden/>
           </w:rPr>
           <w:tab/>
         </w:r>
         <w:r>
           <w:rPr>
-            <w:rFonts w:ascii="Arial" w:hAnsi="Arial" w:cs="Arial"/>
-            <w:noProof/>
-            <w:webHidden/>
-            <w:sz w:val="22"/>
+            <w:noProof/>
+            <w:webHidden/>
           </w:rPr>
           <w:fldChar w:fldCharType="begin"/>
         </w:r>
         <w:r>
           <w:rPr>
-            <w:rFonts w:ascii="Arial" w:hAnsi="Arial" w:cs="Arial"/>
-            <w:noProof/>
-            <w:webHidden/>
-            <w:sz w:val="22"/>
-          </w:rPr>
-          <w:instrText xml:space="preserve"> PAGEREF _Toc232605516 \h </w:instrText>
-        </w:r>
-        <w:r>
-          <w:rPr>
-            <w:rFonts w:ascii="Arial" w:hAnsi="Arial" w:cs="Arial"/>
-            <w:noProof/>
-            <w:webHidden/>
-            <w:sz w:val="22"/>
-          </w:rPr>
-        </w:r>
-        <w:r>
-          <w:rPr>
-            <w:rFonts w:ascii="Arial" w:hAnsi="Arial" w:cs="Arial"/>
-            <w:noProof/>
-            <w:webHidden/>
-            <w:sz w:val="22"/>
+            <w:noProof/>
+            <w:webHidden/>
+          </w:rPr>
+          <w:instrText xml:space="preserve"> PAGEREF _Toc232778806 \h </w:instrText>
+        </w:r>
+        <w:r>
+          <w:rPr>
+            <w:noProof/>
+            <w:webHidden/>
+          </w:rPr>
+        </w:r>
+        <w:r>
+          <w:rPr>
+            <w:noProof/>
+            <w:webHidden/>
           </w:rPr>
           <w:fldChar w:fldCharType="separate"/>
         </w:r>
         <w:r>
           <w:rPr>
-            <w:rFonts w:ascii="Arial" w:hAnsi="Arial" w:cs="Arial"/>
-            <w:noProof/>
-            <w:webHidden/>
-            <w:sz w:val="22"/>
+            <w:noProof/>
+            <w:webHidden/>
           </w:rPr>
           <w:t>4</w:t>
         </w:r>
         <w:r>
           <w:rPr>
-            <w:rFonts w:ascii="Arial" w:hAnsi="Arial" w:cs="Arial"/>
-            <w:noProof/>
-            <w:webHidden/>
-            <w:sz w:val="22"/>
+            <w:noProof/>
+            <w:webHidden/>
           </w:rPr>
           <w:fldChar w:fldCharType="end"/>
         </w:r>
@@ -1550,86 +1346,69 @@
         <w:tabs>
           <w:tab w:val="right" w:leader="dot" w:pos="10272"/>
         </w:tabs>
-        <w:spacing w:after="0" w:line="260" w:lineRule="exact"/>
         <w:rPr>
-          <w:rFonts w:ascii="Arial" w:hAnsi="Arial" w:cs="Arial"/>
+          <w:rFonts w:asciiTheme="minorHAnsi" w:hAnsiTheme="minorHAnsi"/>
           <w:noProof/>
           <w:kern w:val="2"/>
-          <w:sz w:val="22"/>
+          <w:sz w:val="24"/>
           <w:szCs w:val="24"/>
           <w:lang w:val="de-CH" w:eastAsia="de-CH"/>
           <w14:ligatures w14:val="standardContextual"/>
         </w:rPr>
       </w:pPr>
-      <w:hyperlink w:anchor="_Toc232605517" w:history="1">
+      <w:hyperlink w:anchor="_Toc232778807" w:history="1">
         <w:r>
           <w:rPr>
             <w:rStyle w:val="Hyperlink"/>
-            <w:rFonts w:ascii="Arial" w:hAnsi="Arial" w:cs="Arial"/>
-            <w:noProof/>
-            <w:sz w:val="22"/>
+            <w:noProof/>
           </w:rPr>
           <w:t>5. System Design</w:t>
         </w:r>
         <w:r>
           <w:rPr>
-            <w:rFonts w:ascii="Arial" w:hAnsi="Arial" w:cs="Arial"/>
-            <w:noProof/>
-            <w:webHidden/>
-            <w:sz w:val="22"/>
+            <w:noProof/>
+            <w:webHidden/>
           </w:rPr>
           <w:tab/>
         </w:r>
         <w:r>
           <w:rPr>
-            <w:rFonts w:ascii="Arial" w:hAnsi="Arial" w:cs="Arial"/>
-            <w:noProof/>
-            <w:webHidden/>
-            <w:sz w:val="22"/>
+            <w:noProof/>
+            <w:webHidden/>
           </w:rPr>
           <w:fldChar w:fldCharType="begin"/>
         </w:r>
         <w:r>
           <w:rPr>
-            <w:rFonts w:ascii="Arial" w:hAnsi="Arial" w:cs="Arial"/>
-            <w:noProof/>
-            <w:webHidden/>
-            <w:sz w:val="22"/>
-          </w:rPr>
-          <w:instrText xml:space="preserve"> PAGEREF _Toc232605517 \h </w:instrText>
-        </w:r>
-        <w:r>
-          <w:rPr>
-            <w:rFonts w:ascii="Arial" w:hAnsi="Arial" w:cs="Arial"/>
-            <w:noProof/>
-            <w:webHidden/>
-            <w:sz w:val="22"/>
-          </w:rPr>
-        </w:r>
-        <w:r>
-          <w:rPr>
-            <w:rFonts w:ascii="Arial" w:hAnsi="Arial" w:cs="Arial"/>
-            <w:noProof/>
-            <w:webHidden/>
-            <w:sz w:val="22"/>
+            <w:noProof/>
+            <w:webHidden/>
+          </w:rPr>
+          <w:instrText xml:space="preserve"> PAGEREF _Toc232778807 \h </w:instrText>
+        </w:r>
+        <w:r>
+          <w:rPr>
+            <w:noProof/>
+            <w:webHidden/>
+          </w:rPr>
+        </w:r>
+        <w:r>
+          <w:rPr>
+            <w:noProof/>
+            <w:webHidden/>
           </w:rPr>
           <w:fldChar w:fldCharType="separate"/>
         </w:r>
         <w:r>
           <w:rPr>
-            <w:rFonts w:ascii="Arial" w:hAnsi="Arial" w:cs="Arial"/>
-            <w:noProof/>
-            <w:webHidden/>
-            <w:sz w:val="22"/>
+            <w:noProof/>
+            <w:webHidden/>
           </w:rPr>
           <w:t>5</w:t>
         </w:r>
         <w:r>
           <w:rPr>
-            <w:rFonts w:ascii="Arial" w:hAnsi="Arial" w:cs="Arial"/>
-            <w:noProof/>
-            <w:webHidden/>
-            <w:sz w:val="22"/>
+            <w:noProof/>
+            <w:webHidden/>
           </w:rPr>
           <w:fldChar w:fldCharType="end"/>
         </w:r>
@@ -1641,86 +1420,69 @@
         <w:tabs>
           <w:tab w:val="right" w:leader="dot" w:pos="10272"/>
         </w:tabs>
-        <w:spacing w:after="0" w:line="260" w:lineRule="exact"/>
         <w:rPr>
-          <w:rFonts w:ascii="Arial" w:hAnsi="Arial" w:cs="Arial"/>
+          <w:rFonts w:asciiTheme="minorHAnsi" w:hAnsiTheme="minorHAnsi"/>
           <w:noProof/>
           <w:kern w:val="2"/>
-          <w:sz w:val="22"/>
+          <w:sz w:val="24"/>
           <w:szCs w:val="24"/>
           <w:lang w:val="de-CH" w:eastAsia="de-CH"/>
           <w14:ligatures w14:val="standardContextual"/>
         </w:rPr>
       </w:pPr>
-      <w:hyperlink w:anchor="_Toc232605518" w:history="1">
+      <w:hyperlink w:anchor="_Toc232778808" w:history="1">
         <w:r>
           <w:rPr>
             <w:rStyle w:val="Hyperlink"/>
-            <w:rFonts w:ascii="Arial" w:hAnsi="Arial" w:cs="Arial"/>
-            <w:noProof/>
-            <w:sz w:val="22"/>
+            <w:noProof/>
           </w:rPr>
           <w:t>5.1 Module Overview</w:t>
         </w:r>
         <w:r>
           <w:rPr>
-            <w:rFonts w:ascii="Arial" w:hAnsi="Arial" w:cs="Arial"/>
-            <w:noProof/>
-            <w:webHidden/>
-            <w:sz w:val="22"/>
+            <w:noProof/>
+            <w:webHidden/>
           </w:rPr>
           <w:tab/>
         </w:r>
         <w:r>
           <w:rPr>
-            <w:rFonts w:ascii="Arial" w:hAnsi="Arial" w:cs="Arial"/>
-            <w:noProof/>
-            <w:webHidden/>
-            <w:sz w:val="22"/>
+            <w:noProof/>
+            <w:webHidden/>
           </w:rPr>
           <w:fldChar w:fldCharType="begin"/>
         </w:r>
         <w:r>
           <w:rPr>
-            <w:rFonts w:ascii="Arial" w:hAnsi="Arial" w:cs="Arial"/>
-            <w:noProof/>
-            <w:webHidden/>
-            <w:sz w:val="22"/>
-          </w:rPr>
-          <w:instrText xml:space="preserve"> PAGEREF _Toc232605518 \h </w:instrText>
-        </w:r>
-        <w:r>
-          <w:rPr>
-            <w:rFonts w:ascii="Arial" w:hAnsi="Arial" w:cs="Arial"/>
-            <w:noProof/>
-            <w:webHidden/>
-            <w:sz w:val="22"/>
-          </w:rPr>
-        </w:r>
-        <w:r>
-          <w:rPr>
-            <w:rFonts w:ascii="Arial" w:hAnsi="Arial" w:cs="Arial"/>
-            <w:noProof/>
-            <w:webHidden/>
-            <w:sz w:val="22"/>
+            <w:noProof/>
+            <w:webHidden/>
+          </w:rPr>
+          <w:instrText xml:space="preserve"> PAGEREF _Toc232778808 \h </w:instrText>
+        </w:r>
+        <w:r>
+          <w:rPr>
+            <w:noProof/>
+            <w:webHidden/>
+          </w:rPr>
+        </w:r>
+        <w:r>
+          <w:rPr>
+            <w:noProof/>
+            <w:webHidden/>
           </w:rPr>
           <w:fldChar w:fldCharType="separate"/>
         </w:r>
         <w:r>
           <w:rPr>
-            <w:rFonts w:ascii="Arial" w:hAnsi="Arial" w:cs="Arial"/>
-            <w:noProof/>
-            <w:webHidden/>
-            <w:sz w:val="22"/>
+            <w:noProof/>
+            <w:webHidden/>
           </w:rPr>
           <w:t>5</w:t>
         </w:r>
         <w:r>
           <w:rPr>
-            <w:rFonts w:ascii="Arial" w:hAnsi="Arial" w:cs="Arial"/>
-            <w:noProof/>
-            <w:webHidden/>
-            <w:sz w:val="22"/>
+            <w:noProof/>
+            <w:webHidden/>
           </w:rPr>
           <w:fldChar w:fldCharType="end"/>
         </w:r>
@@ -1732,86 +1494,69 @@
         <w:tabs>
           <w:tab w:val="right" w:leader="dot" w:pos="10272"/>
         </w:tabs>
-        <w:spacing w:after="0" w:line="260" w:lineRule="exact"/>
         <w:rPr>
-          <w:rFonts w:ascii="Arial" w:hAnsi="Arial" w:cs="Arial"/>
+          <w:rFonts w:asciiTheme="minorHAnsi" w:hAnsiTheme="minorHAnsi"/>
           <w:noProof/>
           <w:kern w:val="2"/>
-          <w:sz w:val="22"/>
+          <w:sz w:val="24"/>
           <w:szCs w:val="24"/>
           <w:lang w:val="de-CH" w:eastAsia="de-CH"/>
           <w14:ligatures w14:val="standardContextual"/>
         </w:rPr>
       </w:pPr>
-      <w:hyperlink w:anchor="_Toc232605519" w:history="1">
+      <w:hyperlink w:anchor="_Toc232778809" w:history="1">
         <w:r>
           <w:rPr>
             <w:rStyle w:val="Hyperlink"/>
-            <w:rFonts w:ascii="Arial" w:hAnsi="Arial" w:cs="Arial"/>
-            <w:noProof/>
-            <w:sz w:val="22"/>
+            <w:noProof/>
           </w:rPr>
           <w:t>5.2 Main Workflow</w:t>
         </w:r>
         <w:r>
           <w:rPr>
-            <w:rFonts w:ascii="Arial" w:hAnsi="Arial" w:cs="Arial"/>
-            <w:noProof/>
-            <w:webHidden/>
-            <w:sz w:val="22"/>
+            <w:noProof/>
+            <w:webHidden/>
           </w:rPr>
           <w:tab/>
         </w:r>
         <w:r>
           <w:rPr>
-            <w:rFonts w:ascii="Arial" w:hAnsi="Arial" w:cs="Arial"/>
-            <w:noProof/>
-            <w:webHidden/>
-            <w:sz w:val="22"/>
+            <w:noProof/>
+            <w:webHidden/>
           </w:rPr>
           <w:fldChar w:fldCharType="begin"/>
         </w:r>
         <w:r>
           <w:rPr>
-            <w:rFonts w:ascii="Arial" w:hAnsi="Arial" w:cs="Arial"/>
-            <w:noProof/>
-            <w:webHidden/>
-            <w:sz w:val="22"/>
-          </w:rPr>
-          <w:instrText xml:space="preserve"> PAGEREF _Toc232605519 \h </w:instrText>
-        </w:r>
-        <w:r>
-          <w:rPr>
-            <w:rFonts w:ascii="Arial" w:hAnsi="Arial" w:cs="Arial"/>
-            <w:noProof/>
-            <w:webHidden/>
-            <w:sz w:val="22"/>
-          </w:rPr>
-        </w:r>
-        <w:r>
-          <w:rPr>
-            <w:rFonts w:ascii="Arial" w:hAnsi="Arial" w:cs="Arial"/>
-            <w:noProof/>
-            <w:webHidden/>
-            <w:sz w:val="22"/>
+            <w:noProof/>
+            <w:webHidden/>
+          </w:rPr>
+          <w:instrText xml:space="preserve"> PAGEREF _Toc232778809 \h </w:instrText>
+        </w:r>
+        <w:r>
+          <w:rPr>
+            <w:noProof/>
+            <w:webHidden/>
+          </w:rPr>
+        </w:r>
+        <w:r>
+          <w:rPr>
+            <w:noProof/>
+            <w:webHidden/>
           </w:rPr>
           <w:fldChar w:fldCharType="separate"/>
         </w:r>
         <w:r>
           <w:rPr>
-            <w:rFonts w:ascii="Arial" w:hAnsi="Arial" w:cs="Arial"/>
-            <w:noProof/>
-            <w:webHidden/>
-            <w:sz w:val="22"/>
+            <w:noProof/>
+            <w:webHidden/>
           </w:rPr>
           <w:t>5</w:t>
         </w:r>
         <w:r>
           <w:rPr>
-            <w:rFonts w:ascii="Arial" w:hAnsi="Arial" w:cs="Arial"/>
-            <w:noProof/>
-            <w:webHidden/>
-            <w:sz w:val="22"/>
+            <w:noProof/>
+            <w:webHidden/>
           </w:rPr>
           <w:fldChar w:fldCharType="end"/>
         </w:r>
@@ -1823,86 +1568,69 @@
         <w:tabs>
           <w:tab w:val="right" w:leader="dot" w:pos="10272"/>
         </w:tabs>
-        <w:spacing w:after="0" w:line="260" w:lineRule="exact"/>
         <w:rPr>
-          <w:rFonts w:ascii="Arial" w:hAnsi="Arial" w:cs="Arial"/>
+          <w:rFonts w:asciiTheme="minorHAnsi" w:hAnsiTheme="minorHAnsi"/>
           <w:noProof/>
           <w:kern w:val="2"/>
-          <w:sz w:val="22"/>
+          <w:sz w:val="24"/>
           <w:szCs w:val="24"/>
           <w:lang w:val="de-CH" w:eastAsia="de-CH"/>
           <w14:ligatures w14:val="standardContextual"/>
         </w:rPr>
       </w:pPr>
-      <w:hyperlink w:anchor="_Toc232605520" w:history="1">
+      <w:hyperlink w:anchor="_Toc232778810" w:history="1">
         <w:r>
           <w:rPr>
             <w:rStyle w:val="Hyperlink"/>
-            <w:rFonts w:ascii="Arial" w:hAnsi="Arial" w:cs="Arial"/>
-            <w:noProof/>
-            <w:sz w:val="22"/>
+            <w:noProof/>
           </w:rPr>
           <w:t>5.3 System Architecture Diagram</w:t>
         </w:r>
         <w:r>
           <w:rPr>
-            <w:rFonts w:ascii="Arial" w:hAnsi="Arial" w:cs="Arial"/>
-            <w:noProof/>
-            <w:webHidden/>
-            <w:sz w:val="22"/>
+            <w:noProof/>
+            <w:webHidden/>
           </w:rPr>
           <w:tab/>
         </w:r>
         <w:r>
           <w:rPr>
-            <w:rFonts w:ascii="Arial" w:hAnsi="Arial" w:cs="Arial"/>
-            <w:noProof/>
-            <w:webHidden/>
-            <w:sz w:val="22"/>
+            <w:noProof/>
+            <w:webHidden/>
           </w:rPr>
           <w:fldChar w:fldCharType="begin"/>
         </w:r>
         <w:r>
           <w:rPr>
-            <w:rFonts w:ascii="Arial" w:hAnsi="Arial" w:cs="Arial"/>
-            <w:noProof/>
-            <w:webHidden/>
-            <w:sz w:val="22"/>
-          </w:rPr>
-          <w:instrText xml:space="preserve"> PAGEREF _Toc232605520 \h </w:instrText>
-        </w:r>
-        <w:r>
-          <w:rPr>
-            <w:rFonts w:ascii="Arial" w:hAnsi="Arial" w:cs="Arial"/>
-            <w:noProof/>
-            <w:webHidden/>
-            <w:sz w:val="22"/>
-          </w:rPr>
-        </w:r>
-        <w:r>
-          <w:rPr>
-            <w:rFonts w:ascii="Arial" w:hAnsi="Arial" w:cs="Arial"/>
-            <w:noProof/>
-            <w:webHidden/>
-            <w:sz w:val="22"/>
+            <w:noProof/>
+            <w:webHidden/>
+          </w:rPr>
+          <w:instrText xml:space="preserve"> PAGEREF _Toc232778810 \h </w:instrText>
+        </w:r>
+        <w:r>
+          <w:rPr>
+            <w:noProof/>
+            <w:webHidden/>
+          </w:rPr>
+        </w:r>
+        <w:r>
+          <w:rPr>
+            <w:noProof/>
+            <w:webHidden/>
           </w:rPr>
           <w:fldChar w:fldCharType="separate"/>
         </w:r>
         <w:r>
           <w:rPr>
-            <w:rFonts w:ascii="Arial" w:hAnsi="Arial" w:cs="Arial"/>
-            <w:noProof/>
-            <w:webHidden/>
-            <w:sz w:val="22"/>
+            <w:noProof/>
+            <w:webHidden/>
           </w:rPr>
           <w:t>6</w:t>
         </w:r>
         <w:r>
           <w:rPr>
-            <w:rFonts w:ascii="Arial" w:hAnsi="Arial" w:cs="Arial"/>
-            <w:noProof/>
-            <w:webHidden/>
-            <w:sz w:val="22"/>
+            <w:noProof/>
+            <w:webHidden/>
           </w:rPr>
           <w:fldChar w:fldCharType="end"/>
         </w:r>
@@ -1914,86 +1642,69 @@
         <w:tabs>
           <w:tab w:val="right" w:leader="dot" w:pos="10272"/>
         </w:tabs>
-        <w:spacing w:after="0" w:line="260" w:lineRule="exact"/>
         <w:rPr>
-          <w:rFonts w:ascii="Arial" w:hAnsi="Arial" w:cs="Arial"/>
+          <w:rFonts w:asciiTheme="minorHAnsi" w:hAnsiTheme="minorHAnsi"/>
           <w:noProof/>
           <w:kern w:val="2"/>
-          <w:sz w:val="22"/>
+          <w:sz w:val="24"/>
           <w:szCs w:val="24"/>
           <w:lang w:val="de-CH" w:eastAsia="de-CH"/>
           <w14:ligatures w14:val="standardContextual"/>
         </w:rPr>
       </w:pPr>
-      <w:hyperlink w:anchor="_Toc232605521" w:history="1">
+      <w:hyperlink w:anchor="_Toc232778811" w:history="1">
         <w:r>
           <w:rPr>
             <w:rStyle w:val="Hyperlink"/>
-            <w:rFonts w:ascii="Arial" w:hAnsi="Arial" w:cs="Arial"/>
-            <w:noProof/>
-            <w:sz w:val="22"/>
+            <w:noProof/>
           </w:rPr>
           <w:t>5.4 UML Activity Diagram</w:t>
         </w:r>
         <w:r>
           <w:rPr>
-            <w:rFonts w:ascii="Arial" w:hAnsi="Arial" w:cs="Arial"/>
-            <w:noProof/>
-            <w:webHidden/>
-            <w:sz w:val="22"/>
+            <w:noProof/>
+            <w:webHidden/>
           </w:rPr>
           <w:tab/>
         </w:r>
         <w:r>
           <w:rPr>
-            <w:rFonts w:ascii="Arial" w:hAnsi="Arial" w:cs="Arial"/>
-            <w:noProof/>
-            <w:webHidden/>
-            <w:sz w:val="22"/>
+            <w:noProof/>
+            <w:webHidden/>
           </w:rPr>
           <w:fldChar w:fldCharType="begin"/>
         </w:r>
         <w:r>
           <w:rPr>
-            <w:rFonts w:ascii="Arial" w:hAnsi="Arial" w:cs="Arial"/>
-            <w:noProof/>
-            <w:webHidden/>
-            <w:sz w:val="22"/>
-          </w:rPr>
-          <w:instrText xml:space="preserve"> PAGEREF _Toc232605521 \h </w:instrText>
-        </w:r>
-        <w:r>
-          <w:rPr>
-            <w:rFonts w:ascii="Arial" w:hAnsi="Arial" w:cs="Arial"/>
-            <w:noProof/>
-            <w:webHidden/>
-            <w:sz w:val="22"/>
-          </w:rPr>
-        </w:r>
-        <w:r>
-          <w:rPr>
-            <w:rFonts w:ascii="Arial" w:hAnsi="Arial" w:cs="Arial"/>
-            <w:noProof/>
-            <w:webHidden/>
-            <w:sz w:val="22"/>
+            <w:noProof/>
+            <w:webHidden/>
+          </w:rPr>
+          <w:instrText xml:space="preserve"> PAGEREF _Toc232778811 \h </w:instrText>
+        </w:r>
+        <w:r>
+          <w:rPr>
+            <w:noProof/>
+            <w:webHidden/>
+          </w:rPr>
+        </w:r>
+        <w:r>
+          <w:rPr>
+            <w:noProof/>
+            <w:webHidden/>
           </w:rPr>
           <w:fldChar w:fldCharType="separate"/>
         </w:r>
         <w:r>
           <w:rPr>
-            <w:rFonts w:ascii="Arial" w:hAnsi="Arial" w:cs="Arial"/>
-            <w:noProof/>
-            <w:webHidden/>
-            <w:sz w:val="22"/>
+            <w:noProof/>
+            <w:webHidden/>
           </w:rPr>
           <w:t>7</w:t>
         </w:r>
         <w:r>
           <w:rPr>
-            <w:rFonts w:ascii="Arial" w:hAnsi="Arial" w:cs="Arial"/>
-            <w:noProof/>
-            <w:webHidden/>
-            <w:sz w:val="22"/>
+            <w:noProof/>
+            <w:webHidden/>
           </w:rPr>
           <w:fldChar w:fldCharType="end"/>
         </w:r>
@@ -2005,86 +1716,69 @@
         <w:tabs>
           <w:tab w:val="right" w:leader="dot" w:pos="10272"/>
         </w:tabs>
-        <w:spacing w:after="0" w:line="260" w:lineRule="exact"/>
         <w:rPr>
-          <w:rFonts w:ascii="Arial" w:hAnsi="Arial" w:cs="Arial"/>
+          <w:rFonts w:asciiTheme="minorHAnsi" w:hAnsiTheme="minorHAnsi"/>
           <w:noProof/>
           <w:kern w:val="2"/>
-          <w:sz w:val="22"/>
+          <w:sz w:val="24"/>
           <w:szCs w:val="24"/>
           <w:lang w:val="de-CH" w:eastAsia="de-CH"/>
           <w14:ligatures w14:val="standardContextual"/>
         </w:rPr>
       </w:pPr>
-      <w:hyperlink w:anchor="_Toc232605522" w:history="1">
+      <w:hyperlink w:anchor="_Toc232778812" w:history="1">
         <w:r>
           <w:rPr>
             <w:rStyle w:val="Hyperlink"/>
-            <w:rFonts w:ascii="Arial" w:hAnsi="Arial" w:cs="Arial"/>
-            <w:noProof/>
-            <w:sz w:val="22"/>
+            <w:noProof/>
           </w:rPr>
           <w:t>5.5 UML Component Diagram</w:t>
         </w:r>
         <w:r>
           <w:rPr>
-            <w:rFonts w:ascii="Arial" w:hAnsi="Arial" w:cs="Arial"/>
-            <w:noProof/>
-            <w:webHidden/>
-            <w:sz w:val="22"/>
+            <w:noProof/>
+            <w:webHidden/>
           </w:rPr>
           <w:tab/>
         </w:r>
         <w:r>
           <w:rPr>
-            <w:rFonts w:ascii="Arial" w:hAnsi="Arial" w:cs="Arial"/>
-            <w:noProof/>
-            <w:webHidden/>
-            <w:sz w:val="22"/>
+            <w:noProof/>
+            <w:webHidden/>
           </w:rPr>
           <w:fldChar w:fldCharType="begin"/>
         </w:r>
         <w:r>
           <w:rPr>
-            <w:rFonts w:ascii="Arial" w:hAnsi="Arial" w:cs="Arial"/>
-            <w:noProof/>
-            <w:webHidden/>
-            <w:sz w:val="22"/>
-          </w:rPr>
-          <w:instrText xml:space="preserve"> PAGEREF _Toc232605522 \h </w:instrText>
-        </w:r>
-        <w:r>
-          <w:rPr>
-            <w:rFonts w:ascii="Arial" w:hAnsi="Arial" w:cs="Arial"/>
-            <w:noProof/>
-            <w:webHidden/>
-            <w:sz w:val="22"/>
-          </w:rPr>
-        </w:r>
-        <w:r>
-          <w:rPr>
-            <w:rFonts w:ascii="Arial" w:hAnsi="Arial" w:cs="Arial"/>
-            <w:noProof/>
-            <w:webHidden/>
-            <w:sz w:val="22"/>
+            <w:noProof/>
+            <w:webHidden/>
+          </w:rPr>
+          <w:instrText xml:space="preserve"> PAGEREF _Toc232778812 \h </w:instrText>
+        </w:r>
+        <w:r>
+          <w:rPr>
+            <w:noProof/>
+            <w:webHidden/>
+          </w:rPr>
+        </w:r>
+        <w:r>
+          <w:rPr>
+            <w:noProof/>
+            <w:webHidden/>
           </w:rPr>
           <w:fldChar w:fldCharType="separate"/>
         </w:r>
         <w:r>
           <w:rPr>
-            <w:rFonts w:ascii="Arial" w:hAnsi="Arial" w:cs="Arial"/>
-            <w:noProof/>
-            <w:webHidden/>
-            <w:sz w:val="22"/>
+            <w:noProof/>
+            <w:webHidden/>
           </w:rPr>
           <w:t>8</w:t>
         </w:r>
         <w:r>
           <w:rPr>
-            <w:rFonts w:ascii="Arial" w:hAnsi="Arial" w:cs="Arial"/>
-            <w:noProof/>
-            <w:webHidden/>
-            <w:sz w:val="22"/>
+            <w:noProof/>
+            <w:webHidden/>
           </w:rPr>
           <w:fldChar w:fldCharType="end"/>
         </w:r>
@@ -2096,86 +1790,69 @@
         <w:tabs>
           <w:tab w:val="right" w:leader="dot" w:pos="10272"/>
         </w:tabs>
-        <w:spacing w:after="0" w:line="260" w:lineRule="exact"/>
         <w:rPr>
-          <w:rFonts w:ascii="Arial" w:hAnsi="Arial" w:cs="Arial"/>
+          <w:rFonts w:asciiTheme="minorHAnsi" w:hAnsiTheme="minorHAnsi"/>
           <w:noProof/>
           <w:kern w:val="2"/>
-          <w:sz w:val="22"/>
+          <w:sz w:val="24"/>
           <w:szCs w:val="24"/>
           <w:lang w:val="de-CH" w:eastAsia="de-CH"/>
           <w14:ligatures w14:val="standardContextual"/>
         </w:rPr>
       </w:pPr>
-      <w:hyperlink w:anchor="_Toc232605523" w:history="1">
+      <w:hyperlink w:anchor="_Toc232778813" w:history="1">
         <w:r>
           <w:rPr>
             <w:rStyle w:val="Hyperlink"/>
-            <w:rFonts w:ascii="Arial" w:hAnsi="Arial" w:cs="Arial"/>
-            <w:noProof/>
-            <w:sz w:val="22"/>
+            <w:noProof/>
           </w:rPr>
           <w:t>5.6 UML Deployment Diagram</w:t>
         </w:r>
         <w:r>
           <w:rPr>
-            <w:rFonts w:ascii="Arial" w:hAnsi="Arial" w:cs="Arial"/>
-            <w:noProof/>
-            <w:webHidden/>
-            <w:sz w:val="22"/>
+            <w:noProof/>
+            <w:webHidden/>
           </w:rPr>
           <w:tab/>
         </w:r>
         <w:r>
           <w:rPr>
-            <w:rFonts w:ascii="Arial" w:hAnsi="Arial" w:cs="Arial"/>
-            <w:noProof/>
-            <w:webHidden/>
-            <w:sz w:val="22"/>
+            <w:noProof/>
+            <w:webHidden/>
           </w:rPr>
           <w:fldChar w:fldCharType="begin"/>
         </w:r>
         <w:r>
           <w:rPr>
-            <w:rFonts w:ascii="Arial" w:hAnsi="Arial" w:cs="Arial"/>
-            <w:noProof/>
-            <w:webHidden/>
-            <w:sz w:val="22"/>
-          </w:rPr>
-          <w:instrText xml:space="preserve"> PAGEREF _Toc232605523 \h </w:instrText>
-        </w:r>
-        <w:r>
-          <w:rPr>
-            <w:rFonts w:ascii="Arial" w:hAnsi="Arial" w:cs="Arial"/>
-            <w:noProof/>
-            <w:webHidden/>
-            <w:sz w:val="22"/>
-          </w:rPr>
-        </w:r>
-        <w:r>
-          <w:rPr>
-            <w:rFonts w:ascii="Arial" w:hAnsi="Arial" w:cs="Arial"/>
-            <w:noProof/>
-            <w:webHidden/>
-            <w:sz w:val="22"/>
+            <w:noProof/>
+            <w:webHidden/>
+          </w:rPr>
+          <w:instrText xml:space="preserve"> PAGEREF _Toc232778813 \h </w:instrText>
+        </w:r>
+        <w:r>
+          <w:rPr>
+            <w:noProof/>
+            <w:webHidden/>
+          </w:rPr>
+        </w:r>
+        <w:r>
+          <w:rPr>
+            <w:noProof/>
+            <w:webHidden/>
           </w:rPr>
           <w:fldChar w:fldCharType="separate"/>
         </w:r>
         <w:r>
           <w:rPr>
-            <w:rFonts w:ascii="Arial" w:hAnsi="Arial" w:cs="Arial"/>
-            <w:noProof/>
-            <w:webHidden/>
-            <w:sz w:val="22"/>
+            <w:noProof/>
+            <w:webHidden/>
           </w:rPr>
           <w:t>8</w:t>
         </w:r>
         <w:r>
           <w:rPr>
-            <w:rFonts w:ascii="Arial" w:hAnsi="Arial" w:cs="Arial"/>
-            <w:noProof/>
-            <w:webHidden/>
-            <w:sz w:val="22"/>
+            <w:noProof/>
+            <w:webHidden/>
           </w:rPr>
           <w:fldChar w:fldCharType="end"/>
         </w:r>
@@ -2187,86 +1864,69 @@
         <w:tabs>
           <w:tab w:val="right" w:leader="dot" w:pos="10272"/>
         </w:tabs>
-        <w:spacing w:after="0" w:line="260" w:lineRule="exact"/>
         <w:rPr>
-          <w:rFonts w:ascii="Arial" w:hAnsi="Arial" w:cs="Arial"/>
+          <w:rFonts w:asciiTheme="minorHAnsi" w:hAnsiTheme="minorHAnsi"/>
           <w:noProof/>
           <w:kern w:val="2"/>
-          <w:sz w:val="22"/>
+          <w:sz w:val="24"/>
           <w:szCs w:val="24"/>
           <w:lang w:val="de-CH" w:eastAsia="de-CH"/>
           <w14:ligatures w14:val="standardContextual"/>
         </w:rPr>
       </w:pPr>
-      <w:hyperlink w:anchor="_Toc232605524" w:history="1">
+      <w:hyperlink w:anchor="_Toc232778814" w:history="1">
         <w:r>
           <w:rPr>
             <w:rStyle w:val="Hyperlink"/>
-            <w:rFonts w:ascii="Arial" w:hAnsi="Arial" w:cs="Arial"/>
-            <w:noProof/>
-            <w:sz w:val="22"/>
+            <w:noProof/>
           </w:rPr>
           <w:t>5.7 UML Class Diagram</w:t>
         </w:r>
         <w:r>
           <w:rPr>
-            <w:rFonts w:ascii="Arial" w:hAnsi="Arial" w:cs="Arial"/>
-            <w:noProof/>
-            <w:webHidden/>
-            <w:sz w:val="22"/>
+            <w:noProof/>
+            <w:webHidden/>
           </w:rPr>
           <w:tab/>
         </w:r>
         <w:r>
           <w:rPr>
-            <w:rFonts w:ascii="Arial" w:hAnsi="Arial" w:cs="Arial"/>
-            <w:noProof/>
-            <w:webHidden/>
-            <w:sz w:val="22"/>
+            <w:noProof/>
+            <w:webHidden/>
           </w:rPr>
           <w:fldChar w:fldCharType="begin"/>
         </w:r>
         <w:r>
           <w:rPr>
-            <w:rFonts w:ascii="Arial" w:hAnsi="Arial" w:cs="Arial"/>
-            <w:noProof/>
-            <w:webHidden/>
-            <w:sz w:val="22"/>
-          </w:rPr>
-          <w:instrText xml:space="preserve"> PAGEREF _Toc232605524 \h </w:instrText>
-        </w:r>
-        <w:r>
-          <w:rPr>
-            <w:rFonts w:ascii="Arial" w:hAnsi="Arial" w:cs="Arial"/>
-            <w:noProof/>
-            <w:webHidden/>
-            <w:sz w:val="22"/>
-          </w:rPr>
-        </w:r>
-        <w:r>
-          <w:rPr>
-            <w:rFonts w:ascii="Arial" w:hAnsi="Arial" w:cs="Arial"/>
-            <w:noProof/>
-            <w:webHidden/>
-            <w:sz w:val="22"/>
+            <w:noProof/>
+            <w:webHidden/>
+          </w:rPr>
+          <w:instrText xml:space="preserve"> PAGEREF _Toc232778814 \h </w:instrText>
+        </w:r>
+        <w:r>
+          <w:rPr>
+            <w:noProof/>
+            <w:webHidden/>
+          </w:rPr>
+        </w:r>
+        <w:r>
+          <w:rPr>
+            <w:noProof/>
+            <w:webHidden/>
           </w:rPr>
           <w:fldChar w:fldCharType="separate"/>
         </w:r>
         <w:r>
           <w:rPr>
-            <w:rFonts w:ascii="Arial" w:hAnsi="Arial" w:cs="Arial"/>
-            <w:noProof/>
-            <w:webHidden/>
-            <w:sz w:val="22"/>
+            <w:noProof/>
+            <w:webHidden/>
           </w:rPr>
           <w:t>9</w:t>
         </w:r>
         <w:r>
           <w:rPr>
-            <w:rFonts w:ascii="Arial" w:hAnsi="Arial" w:cs="Arial"/>
-            <w:noProof/>
-            <w:webHidden/>
-            <w:sz w:val="22"/>
+            <w:noProof/>
+            <w:webHidden/>
           </w:rPr>
           <w:fldChar w:fldCharType="end"/>
         </w:r>
@@ -2278,86 +1938,69 @@
         <w:tabs>
           <w:tab w:val="right" w:leader="dot" w:pos="10272"/>
         </w:tabs>
-        <w:spacing w:after="0" w:line="260" w:lineRule="exact"/>
         <w:rPr>
-          <w:rFonts w:ascii="Arial" w:hAnsi="Arial" w:cs="Arial"/>
+          <w:rFonts w:asciiTheme="minorHAnsi" w:hAnsiTheme="minorHAnsi"/>
           <w:noProof/>
           <w:kern w:val="2"/>
-          <w:sz w:val="22"/>
+          <w:sz w:val="24"/>
           <w:szCs w:val="24"/>
           <w:lang w:val="de-CH" w:eastAsia="de-CH"/>
           <w14:ligatures w14:val="standardContextual"/>
         </w:rPr>
       </w:pPr>
-      <w:hyperlink w:anchor="_Toc232605525" w:history="1">
+      <w:hyperlink w:anchor="_Toc232778815" w:history="1">
         <w:r>
           <w:rPr>
             <w:rStyle w:val="Hyperlink"/>
-            <w:rFonts w:ascii="Arial" w:hAnsi="Arial" w:cs="Arial"/>
-            <w:noProof/>
-            <w:sz w:val="22"/>
+            <w:noProof/>
           </w:rPr>
           <w:t>5.8 ER Diagram</w:t>
         </w:r>
         <w:r>
           <w:rPr>
-            <w:rFonts w:ascii="Arial" w:hAnsi="Arial" w:cs="Arial"/>
-            <w:noProof/>
-            <w:webHidden/>
-            <w:sz w:val="22"/>
+            <w:noProof/>
+            <w:webHidden/>
           </w:rPr>
           <w:tab/>
         </w:r>
         <w:r>
           <w:rPr>
-            <w:rFonts w:ascii="Arial" w:hAnsi="Arial" w:cs="Arial"/>
-            <w:noProof/>
-            <w:webHidden/>
-            <w:sz w:val="22"/>
+            <w:noProof/>
+            <w:webHidden/>
           </w:rPr>
           <w:fldChar w:fldCharType="begin"/>
         </w:r>
         <w:r>
           <w:rPr>
-            <w:rFonts w:ascii="Arial" w:hAnsi="Arial" w:cs="Arial"/>
-            <w:noProof/>
-            <w:webHidden/>
-            <w:sz w:val="22"/>
-          </w:rPr>
-          <w:instrText xml:space="preserve"> PAGEREF _Toc232605525 \h </w:instrText>
-        </w:r>
-        <w:r>
-          <w:rPr>
-            <w:rFonts w:ascii="Arial" w:hAnsi="Arial" w:cs="Arial"/>
-            <w:noProof/>
-            <w:webHidden/>
-            <w:sz w:val="22"/>
-          </w:rPr>
-        </w:r>
-        <w:r>
-          <w:rPr>
-            <w:rFonts w:ascii="Arial" w:hAnsi="Arial" w:cs="Arial"/>
-            <w:noProof/>
-            <w:webHidden/>
-            <w:sz w:val="22"/>
+            <w:noProof/>
+            <w:webHidden/>
+          </w:rPr>
+          <w:instrText xml:space="preserve"> PAGEREF _Toc232778815 \h </w:instrText>
+        </w:r>
+        <w:r>
+          <w:rPr>
+            <w:noProof/>
+            <w:webHidden/>
+          </w:rPr>
+        </w:r>
+        <w:r>
+          <w:rPr>
+            <w:noProof/>
+            <w:webHidden/>
           </w:rPr>
           <w:fldChar w:fldCharType="separate"/>
         </w:r>
         <w:r>
           <w:rPr>
-            <w:rFonts w:ascii="Arial" w:hAnsi="Arial" w:cs="Arial"/>
-            <w:noProof/>
-            <w:webHidden/>
-            <w:sz w:val="22"/>
+            <w:noProof/>
+            <w:webHidden/>
           </w:rPr>
           <w:t>9</w:t>
         </w:r>
         <w:r>
           <w:rPr>
-            <w:rFonts w:ascii="Arial" w:hAnsi="Arial" w:cs="Arial"/>
-            <w:noProof/>
-            <w:webHidden/>
-            <w:sz w:val="22"/>
+            <w:noProof/>
+            <w:webHidden/>
           </w:rPr>
           <w:fldChar w:fldCharType="end"/>
         </w:r>
@@ -2369,86 +2012,69 @@
         <w:tabs>
           <w:tab w:val="right" w:leader="dot" w:pos="10272"/>
         </w:tabs>
-        <w:spacing w:after="0" w:line="260" w:lineRule="exact"/>
         <w:rPr>
-          <w:rFonts w:ascii="Arial" w:hAnsi="Arial" w:cs="Arial"/>
+          <w:rFonts w:asciiTheme="minorHAnsi" w:hAnsiTheme="minorHAnsi"/>
           <w:noProof/>
           <w:kern w:val="2"/>
-          <w:sz w:val="22"/>
+          <w:sz w:val="24"/>
           <w:szCs w:val="24"/>
           <w:lang w:val="de-CH" w:eastAsia="de-CH"/>
           <w14:ligatures w14:val="standardContextual"/>
         </w:rPr>
       </w:pPr>
-      <w:hyperlink w:anchor="_Toc232605526" w:history="1">
+      <w:hyperlink w:anchor="_Toc232778816" w:history="1">
         <w:r>
           <w:rPr>
             <w:rStyle w:val="Hyperlink"/>
-            <w:rFonts w:ascii="Arial" w:hAnsi="Arial" w:cs="Arial"/>
-            <w:noProof/>
-            <w:sz w:val="22"/>
+            <w:noProof/>
           </w:rPr>
           <w:t>5.9 Flowchart</w:t>
         </w:r>
         <w:r>
           <w:rPr>
-            <w:rFonts w:ascii="Arial" w:hAnsi="Arial" w:cs="Arial"/>
-            <w:noProof/>
-            <w:webHidden/>
-            <w:sz w:val="22"/>
+            <w:noProof/>
+            <w:webHidden/>
           </w:rPr>
           <w:tab/>
         </w:r>
         <w:r>
           <w:rPr>
-            <w:rFonts w:ascii="Arial" w:hAnsi="Arial" w:cs="Arial"/>
-            <w:noProof/>
-            <w:webHidden/>
-            <w:sz w:val="22"/>
+            <w:noProof/>
+            <w:webHidden/>
           </w:rPr>
           <w:fldChar w:fldCharType="begin"/>
         </w:r>
         <w:r>
           <w:rPr>
-            <w:rFonts w:ascii="Arial" w:hAnsi="Arial" w:cs="Arial"/>
-            <w:noProof/>
-            <w:webHidden/>
-            <w:sz w:val="22"/>
-          </w:rPr>
-          <w:instrText xml:space="preserve"> PAGEREF _Toc232605526 \h </w:instrText>
-        </w:r>
-        <w:r>
-          <w:rPr>
-            <w:rFonts w:ascii="Arial" w:hAnsi="Arial" w:cs="Arial"/>
-            <w:noProof/>
-            <w:webHidden/>
-            <w:sz w:val="22"/>
-          </w:rPr>
-        </w:r>
-        <w:r>
-          <w:rPr>
-            <w:rFonts w:ascii="Arial" w:hAnsi="Arial" w:cs="Arial"/>
-            <w:noProof/>
-            <w:webHidden/>
-            <w:sz w:val="22"/>
+            <w:noProof/>
+            <w:webHidden/>
+          </w:rPr>
+          <w:instrText xml:space="preserve"> PAGEREF _Toc232778816 \h </w:instrText>
+        </w:r>
+        <w:r>
+          <w:rPr>
+            <w:noProof/>
+            <w:webHidden/>
+          </w:rPr>
+        </w:r>
+        <w:r>
+          <w:rPr>
+            <w:noProof/>
+            <w:webHidden/>
           </w:rPr>
           <w:fldChar w:fldCharType="separate"/>
         </w:r>
         <w:r>
           <w:rPr>
-            <w:rFonts w:ascii="Arial" w:hAnsi="Arial" w:cs="Arial"/>
-            <w:noProof/>
-            <w:webHidden/>
-            <w:sz w:val="22"/>
+            <w:noProof/>
+            <w:webHidden/>
           </w:rPr>
           <w:t>10</w:t>
         </w:r>
         <w:r>
           <w:rPr>
-            <w:rFonts w:ascii="Arial" w:hAnsi="Arial" w:cs="Arial"/>
-            <w:noProof/>
-            <w:webHidden/>
-            <w:sz w:val="22"/>
+            <w:noProof/>
+            <w:webHidden/>
           </w:rPr>
           <w:fldChar w:fldCharType="end"/>
         </w:r>
@@ -2460,86 +2086,69 @@
         <w:tabs>
           <w:tab w:val="right" w:leader="dot" w:pos="10272"/>
         </w:tabs>
-        <w:spacing w:after="0" w:line="260" w:lineRule="exact"/>
         <w:rPr>
-          <w:rFonts w:ascii="Arial" w:hAnsi="Arial" w:cs="Arial"/>
+          <w:rFonts w:asciiTheme="minorHAnsi" w:hAnsiTheme="minorHAnsi"/>
           <w:noProof/>
           <w:kern w:val="2"/>
-          <w:sz w:val="22"/>
+          <w:sz w:val="24"/>
           <w:szCs w:val="24"/>
           <w:lang w:val="de-CH" w:eastAsia="de-CH"/>
           <w14:ligatures w14:val="standardContextual"/>
         </w:rPr>
       </w:pPr>
-      <w:hyperlink w:anchor="_Toc232605527" w:history="1">
+      <w:hyperlink w:anchor="_Toc232778817" w:history="1">
         <w:r>
           <w:rPr>
             <w:rStyle w:val="Hyperlink"/>
-            <w:rFonts w:ascii="Arial" w:hAnsi="Arial" w:cs="Arial"/>
-            <w:noProof/>
-            <w:sz w:val="22"/>
+            <w:noProof/>
           </w:rPr>
           <w:t>6. Database Design</w:t>
         </w:r>
         <w:r>
           <w:rPr>
-            <w:rFonts w:ascii="Arial" w:hAnsi="Arial" w:cs="Arial"/>
-            <w:noProof/>
-            <w:webHidden/>
-            <w:sz w:val="22"/>
+            <w:noProof/>
+            <w:webHidden/>
           </w:rPr>
           <w:tab/>
         </w:r>
         <w:r>
           <w:rPr>
-            <w:rFonts w:ascii="Arial" w:hAnsi="Arial" w:cs="Arial"/>
-            <w:noProof/>
-            <w:webHidden/>
-            <w:sz w:val="22"/>
+            <w:noProof/>
+            <w:webHidden/>
           </w:rPr>
           <w:fldChar w:fldCharType="begin"/>
         </w:r>
         <w:r>
           <w:rPr>
-            <w:rFonts w:ascii="Arial" w:hAnsi="Arial" w:cs="Arial"/>
-            <w:noProof/>
-            <w:webHidden/>
-            <w:sz w:val="22"/>
-          </w:rPr>
-          <w:instrText xml:space="preserve"> PAGEREF _Toc232605527 \h </w:instrText>
-        </w:r>
-        <w:r>
-          <w:rPr>
-            <w:rFonts w:ascii="Arial" w:hAnsi="Arial" w:cs="Arial"/>
-            <w:noProof/>
-            <w:webHidden/>
-            <w:sz w:val="22"/>
-          </w:rPr>
-        </w:r>
-        <w:r>
-          <w:rPr>
-            <w:rFonts w:ascii="Arial" w:hAnsi="Arial" w:cs="Arial"/>
-            <w:noProof/>
-            <w:webHidden/>
-            <w:sz w:val="22"/>
+            <w:noProof/>
+            <w:webHidden/>
+          </w:rPr>
+          <w:instrText xml:space="preserve"> PAGEREF _Toc232778817 \h </w:instrText>
+        </w:r>
+        <w:r>
+          <w:rPr>
+            <w:noProof/>
+            <w:webHidden/>
+          </w:rPr>
+        </w:r>
+        <w:r>
+          <w:rPr>
+            <w:noProof/>
+            <w:webHidden/>
           </w:rPr>
           <w:fldChar w:fldCharType="separate"/>
         </w:r>
         <w:r>
           <w:rPr>
-            <w:rFonts w:ascii="Arial" w:hAnsi="Arial" w:cs="Arial"/>
-            <w:noProof/>
-            <w:webHidden/>
-            <w:sz w:val="22"/>
+            <w:noProof/>
+            <w:webHidden/>
           </w:rPr>
           <w:t>10</w:t>
         </w:r>
         <w:r>
           <w:rPr>
-            <w:rFonts w:ascii="Arial" w:hAnsi="Arial" w:cs="Arial"/>
-            <w:noProof/>
-            <w:webHidden/>
-            <w:sz w:val="22"/>
+            <w:noProof/>
+            <w:webHidden/>
           </w:rPr>
           <w:fldChar w:fldCharType="end"/>
         </w:r>
@@ -2551,86 +2160,69 @@
         <w:tabs>
           <w:tab w:val="right" w:leader="dot" w:pos="10272"/>
         </w:tabs>
-        <w:spacing w:after="0" w:line="260" w:lineRule="exact"/>
         <w:rPr>
-          <w:rFonts w:ascii="Arial" w:hAnsi="Arial" w:cs="Arial"/>
+          <w:rFonts w:asciiTheme="minorHAnsi" w:hAnsiTheme="minorHAnsi"/>
           <w:noProof/>
           <w:kern w:val="2"/>
-          <w:sz w:val="22"/>
+          <w:sz w:val="24"/>
           <w:szCs w:val="24"/>
           <w:lang w:val="de-CH" w:eastAsia="de-CH"/>
           <w14:ligatures w14:val="standardContextual"/>
         </w:rPr>
       </w:pPr>
-      <w:hyperlink w:anchor="_Toc232605528" w:history="1">
+      <w:hyperlink w:anchor="_Toc232778818" w:history="1">
         <w:r>
           <w:rPr>
             <w:rStyle w:val="Hyperlink"/>
-            <w:rFonts w:ascii="Arial" w:hAnsi="Arial" w:cs="Arial"/>
-            <w:noProof/>
-            <w:sz w:val="22"/>
+            <w:noProof/>
           </w:rPr>
           <w:t>7. Installation And Usage</w:t>
         </w:r>
         <w:r>
           <w:rPr>
-            <w:rFonts w:ascii="Arial" w:hAnsi="Arial" w:cs="Arial"/>
-            <w:noProof/>
-            <w:webHidden/>
-            <w:sz w:val="22"/>
+            <w:noProof/>
+            <w:webHidden/>
           </w:rPr>
           <w:tab/>
         </w:r>
         <w:r>
           <w:rPr>
-            <w:rFonts w:ascii="Arial" w:hAnsi="Arial" w:cs="Arial"/>
-            <w:noProof/>
-            <w:webHidden/>
-            <w:sz w:val="22"/>
+            <w:noProof/>
+            <w:webHidden/>
           </w:rPr>
           <w:fldChar w:fldCharType="begin"/>
         </w:r>
         <w:r>
           <w:rPr>
-            <w:rFonts w:ascii="Arial" w:hAnsi="Arial" w:cs="Arial"/>
-            <w:noProof/>
-            <w:webHidden/>
-            <w:sz w:val="22"/>
-          </w:rPr>
-          <w:instrText xml:space="preserve"> PAGEREF _Toc232605528 \h </w:instrText>
-        </w:r>
-        <w:r>
-          <w:rPr>
-            <w:rFonts w:ascii="Arial" w:hAnsi="Arial" w:cs="Arial"/>
-            <w:noProof/>
-            <w:webHidden/>
-            <w:sz w:val="22"/>
-          </w:rPr>
-        </w:r>
-        <w:r>
-          <w:rPr>
-            <w:rFonts w:ascii="Arial" w:hAnsi="Arial" w:cs="Arial"/>
-            <w:noProof/>
-            <w:webHidden/>
-            <w:sz w:val="22"/>
+            <w:noProof/>
+            <w:webHidden/>
+          </w:rPr>
+          <w:instrText xml:space="preserve"> PAGEREF _Toc232778818 \h </w:instrText>
+        </w:r>
+        <w:r>
+          <w:rPr>
+            <w:noProof/>
+            <w:webHidden/>
+          </w:rPr>
+        </w:r>
+        <w:r>
+          <w:rPr>
+            <w:noProof/>
+            <w:webHidden/>
           </w:rPr>
           <w:fldChar w:fldCharType="separate"/>
         </w:r>
         <w:r>
           <w:rPr>
-            <w:rFonts w:ascii="Arial" w:hAnsi="Arial" w:cs="Arial"/>
-            <w:noProof/>
-            <w:webHidden/>
-            <w:sz w:val="22"/>
+            <w:noProof/>
+            <w:webHidden/>
           </w:rPr>
           <w:t>11</w:t>
         </w:r>
         <w:r>
           <w:rPr>
-            <w:rFonts w:ascii="Arial" w:hAnsi="Arial" w:cs="Arial"/>
-            <w:noProof/>
-            <w:webHidden/>
-            <w:sz w:val="22"/>
+            <w:noProof/>
+            <w:webHidden/>
           </w:rPr>
           <w:fldChar w:fldCharType="end"/>
         </w:r>
@@ -2642,86 +2234,69 @@
         <w:tabs>
           <w:tab w:val="right" w:leader="dot" w:pos="10272"/>
         </w:tabs>
-        <w:spacing w:after="0" w:line="260" w:lineRule="exact"/>
         <w:rPr>
-          <w:rFonts w:ascii="Arial" w:hAnsi="Arial" w:cs="Arial"/>
+          <w:rFonts w:asciiTheme="minorHAnsi" w:hAnsiTheme="minorHAnsi"/>
           <w:noProof/>
           <w:kern w:val="2"/>
-          <w:sz w:val="22"/>
+          <w:sz w:val="24"/>
           <w:szCs w:val="24"/>
           <w:lang w:val="de-CH" w:eastAsia="de-CH"/>
           <w14:ligatures w14:val="standardContextual"/>
         </w:rPr>
       </w:pPr>
-      <w:hyperlink w:anchor="_Toc232605529" w:history="1">
+      <w:hyperlink w:anchor="_Toc232778819" w:history="1">
         <w:r>
           <w:rPr>
             <w:rStyle w:val="Hyperlink"/>
-            <w:rFonts w:ascii="Arial" w:hAnsi="Arial" w:cs="Arial"/>
-            <w:noProof/>
-            <w:sz w:val="22"/>
+            <w:noProof/>
           </w:rPr>
           <w:t>7.1 Prerequisites</w:t>
         </w:r>
         <w:r>
           <w:rPr>
-            <w:rFonts w:ascii="Arial" w:hAnsi="Arial" w:cs="Arial"/>
-            <w:noProof/>
-            <w:webHidden/>
-            <w:sz w:val="22"/>
+            <w:noProof/>
+            <w:webHidden/>
           </w:rPr>
           <w:tab/>
         </w:r>
         <w:r>
           <w:rPr>
-            <w:rFonts w:ascii="Arial" w:hAnsi="Arial" w:cs="Arial"/>
-            <w:noProof/>
-            <w:webHidden/>
-            <w:sz w:val="22"/>
+            <w:noProof/>
+            <w:webHidden/>
           </w:rPr>
           <w:fldChar w:fldCharType="begin"/>
         </w:r>
         <w:r>
           <w:rPr>
-            <w:rFonts w:ascii="Arial" w:hAnsi="Arial" w:cs="Arial"/>
-            <w:noProof/>
-            <w:webHidden/>
-            <w:sz w:val="22"/>
-          </w:rPr>
-          <w:instrText xml:space="preserve"> PAGEREF _Toc232605529 \h </w:instrText>
-        </w:r>
-        <w:r>
-          <w:rPr>
-            <w:rFonts w:ascii="Arial" w:hAnsi="Arial" w:cs="Arial"/>
-            <w:noProof/>
-            <w:webHidden/>
-            <w:sz w:val="22"/>
-          </w:rPr>
-        </w:r>
-        <w:r>
-          <w:rPr>
-            <w:rFonts w:ascii="Arial" w:hAnsi="Arial" w:cs="Arial"/>
-            <w:noProof/>
-            <w:webHidden/>
-            <w:sz w:val="22"/>
+            <w:noProof/>
+            <w:webHidden/>
+          </w:rPr>
+          <w:instrText xml:space="preserve"> PAGEREF _Toc232778819 \h </w:instrText>
+        </w:r>
+        <w:r>
+          <w:rPr>
+            <w:noProof/>
+            <w:webHidden/>
+          </w:rPr>
+        </w:r>
+        <w:r>
+          <w:rPr>
+            <w:noProof/>
+            <w:webHidden/>
           </w:rPr>
           <w:fldChar w:fldCharType="separate"/>
         </w:r>
         <w:r>
           <w:rPr>
-            <w:rFonts w:ascii="Arial" w:hAnsi="Arial" w:cs="Arial"/>
-            <w:noProof/>
-            <w:webHidden/>
-            <w:sz w:val="22"/>
+            <w:noProof/>
+            <w:webHidden/>
           </w:rPr>
           <w:t>11</w:t>
         </w:r>
         <w:r>
           <w:rPr>
-            <w:rFonts w:ascii="Arial" w:hAnsi="Arial" w:cs="Arial"/>
-            <w:noProof/>
-            <w:webHidden/>
-            <w:sz w:val="22"/>
+            <w:noProof/>
+            <w:webHidden/>
           </w:rPr>
           <w:fldChar w:fldCharType="end"/>
         </w:r>
@@ -2733,86 +2308,69 @@
         <w:tabs>
           <w:tab w:val="right" w:leader="dot" w:pos="10272"/>
         </w:tabs>
-        <w:spacing w:after="0" w:line="260" w:lineRule="exact"/>
         <w:rPr>
-          <w:rFonts w:ascii="Arial" w:hAnsi="Arial" w:cs="Arial"/>
+          <w:rFonts w:asciiTheme="minorHAnsi" w:hAnsiTheme="minorHAnsi"/>
           <w:noProof/>
           <w:kern w:val="2"/>
-          <w:sz w:val="22"/>
+          <w:sz w:val="24"/>
           <w:szCs w:val="24"/>
           <w:lang w:val="de-CH" w:eastAsia="de-CH"/>
           <w14:ligatures w14:val="standardContextual"/>
         </w:rPr>
       </w:pPr>
-      <w:hyperlink w:anchor="_Toc232605530" w:history="1">
+      <w:hyperlink w:anchor="_Toc232778820" w:history="1">
         <w:r>
           <w:rPr>
             <w:rStyle w:val="Hyperlink"/>
-            <w:rFonts w:ascii="Arial" w:hAnsi="Arial" w:cs="Arial"/>
-            <w:noProof/>
-            <w:sz w:val="22"/>
+            <w:noProof/>
           </w:rPr>
           <w:t>7.2 Clone Or Open The Project</w:t>
         </w:r>
         <w:r>
           <w:rPr>
-            <w:rFonts w:ascii="Arial" w:hAnsi="Arial" w:cs="Arial"/>
-            <w:noProof/>
-            <w:webHidden/>
-            <w:sz w:val="22"/>
+            <w:noProof/>
+            <w:webHidden/>
           </w:rPr>
           <w:tab/>
         </w:r>
         <w:r>
           <w:rPr>
-            <w:rFonts w:ascii="Arial" w:hAnsi="Arial" w:cs="Arial"/>
-            <w:noProof/>
-            <w:webHidden/>
-            <w:sz w:val="22"/>
+            <w:noProof/>
+            <w:webHidden/>
           </w:rPr>
           <w:fldChar w:fldCharType="begin"/>
         </w:r>
         <w:r>
           <w:rPr>
-            <w:rFonts w:ascii="Arial" w:hAnsi="Arial" w:cs="Arial"/>
-            <w:noProof/>
-            <w:webHidden/>
-            <w:sz w:val="22"/>
-          </w:rPr>
-          <w:instrText xml:space="preserve"> PAGEREF _Toc232605530 \h </w:instrText>
-        </w:r>
-        <w:r>
-          <w:rPr>
-            <w:rFonts w:ascii="Arial" w:hAnsi="Arial" w:cs="Arial"/>
-            <w:noProof/>
-            <w:webHidden/>
-            <w:sz w:val="22"/>
-          </w:rPr>
-        </w:r>
-        <w:r>
-          <w:rPr>
-            <w:rFonts w:ascii="Arial" w:hAnsi="Arial" w:cs="Arial"/>
-            <w:noProof/>
-            <w:webHidden/>
-            <w:sz w:val="22"/>
+            <w:noProof/>
+            <w:webHidden/>
+          </w:rPr>
+          <w:instrText xml:space="preserve"> PAGEREF _Toc232778820 \h </w:instrText>
+        </w:r>
+        <w:r>
+          <w:rPr>
+            <w:noProof/>
+            <w:webHidden/>
+          </w:rPr>
+        </w:r>
+        <w:r>
+          <w:rPr>
+            <w:noProof/>
+            <w:webHidden/>
           </w:rPr>
           <w:fldChar w:fldCharType="separate"/>
         </w:r>
         <w:r>
           <w:rPr>
-            <w:rFonts w:ascii="Arial" w:hAnsi="Arial" w:cs="Arial"/>
-            <w:noProof/>
-            <w:webHidden/>
-            <w:sz w:val="22"/>
+            <w:noProof/>
+            <w:webHidden/>
           </w:rPr>
           <w:t>11</w:t>
         </w:r>
         <w:r>
           <w:rPr>
-            <w:rFonts w:ascii="Arial" w:hAnsi="Arial" w:cs="Arial"/>
-            <w:noProof/>
-            <w:webHidden/>
-            <w:sz w:val="22"/>
+            <w:noProof/>
+            <w:webHidden/>
           </w:rPr>
           <w:fldChar w:fldCharType="end"/>
         </w:r>
@@ -2824,86 +2382,69 @@
         <w:tabs>
           <w:tab w:val="right" w:leader="dot" w:pos="10272"/>
         </w:tabs>
-        <w:spacing w:after="0" w:line="260" w:lineRule="exact"/>
         <w:rPr>
-          <w:rFonts w:ascii="Arial" w:hAnsi="Arial" w:cs="Arial"/>
+          <w:rFonts w:asciiTheme="minorHAnsi" w:hAnsiTheme="minorHAnsi"/>
           <w:noProof/>
           <w:kern w:val="2"/>
-          <w:sz w:val="22"/>
+          <w:sz w:val="24"/>
           <w:szCs w:val="24"/>
           <w:lang w:val="de-CH" w:eastAsia="de-CH"/>
           <w14:ligatures w14:val="standardContextual"/>
         </w:rPr>
       </w:pPr>
-      <w:hyperlink w:anchor="_Toc232605531" w:history="1">
+      <w:hyperlink w:anchor="_Toc232778821" w:history="1">
         <w:r>
           <w:rPr>
             <w:rStyle w:val="Hyperlink"/>
-            <w:rFonts w:ascii="Arial" w:hAnsi="Arial" w:cs="Arial"/>
-            <w:noProof/>
-            <w:sz w:val="22"/>
+            <w:noProof/>
           </w:rPr>
           <w:t>7.3 Install Dependencies</w:t>
         </w:r>
         <w:r>
           <w:rPr>
-            <w:rFonts w:ascii="Arial" w:hAnsi="Arial" w:cs="Arial"/>
-            <w:noProof/>
-            <w:webHidden/>
-            <w:sz w:val="22"/>
+            <w:noProof/>
+            <w:webHidden/>
           </w:rPr>
           <w:tab/>
         </w:r>
         <w:r>
           <w:rPr>
-            <w:rFonts w:ascii="Arial" w:hAnsi="Arial" w:cs="Arial"/>
-            <w:noProof/>
-            <w:webHidden/>
-            <w:sz w:val="22"/>
+            <w:noProof/>
+            <w:webHidden/>
           </w:rPr>
           <w:fldChar w:fldCharType="begin"/>
         </w:r>
         <w:r>
           <w:rPr>
-            <w:rFonts w:ascii="Arial" w:hAnsi="Arial" w:cs="Arial"/>
-            <w:noProof/>
-            <w:webHidden/>
-            <w:sz w:val="22"/>
-          </w:rPr>
-          <w:instrText xml:space="preserve"> PAGEREF _Toc232605531 \h </w:instrText>
-        </w:r>
-        <w:r>
-          <w:rPr>
-            <w:rFonts w:ascii="Arial" w:hAnsi="Arial" w:cs="Arial"/>
-            <w:noProof/>
-            <w:webHidden/>
-            <w:sz w:val="22"/>
-          </w:rPr>
-        </w:r>
-        <w:r>
-          <w:rPr>
-            <w:rFonts w:ascii="Arial" w:hAnsi="Arial" w:cs="Arial"/>
-            <w:noProof/>
-            <w:webHidden/>
-            <w:sz w:val="22"/>
+            <w:noProof/>
+            <w:webHidden/>
+          </w:rPr>
+          <w:instrText xml:space="preserve"> PAGEREF _Toc232778821 \h </w:instrText>
+        </w:r>
+        <w:r>
+          <w:rPr>
+            <w:noProof/>
+            <w:webHidden/>
+          </w:rPr>
+        </w:r>
+        <w:r>
+          <w:rPr>
+            <w:noProof/>
+            <w:webHidden/>
           </w:rPr>
           <w:fldChar w:fldCharType="separate"/>
         </w:r>
         <w:r>
           <w:rPr>
-            <w:rFonts w:ascii="Arial" w:hAnsi="Arial" w:cs="Arial"/>
-            <w:noProof/>
-            <w:webHidden/>
-            <w:sz w:val="22"/>
+            <w:noProof/>
+            <w:webHidden/>
           </w:rPr>
           <w:t>11</w:t>
         </w:r>
         <w:r>
           <w:rPr>
-            <w:rFonts w:ascii="Arial" w:hAnsi="Arial" w:cs="Arial"/>
-            <w:noProof/>
-            <w:webHidden/>
-            <w:sz w:val="22"/>
+            <w:noProof/>
+            <w:webHidden/>
           </w:rPr>
           <w:fldChar w:fldCharType="end"/>
         </w:r>
@@ -2915,86 +2456,69 @@
         <w:tabs>
           <w:tab w:val="right" w:leader="dot" w:pos="10272"/>
         </w:tabs>
-        <w:spacing w:after="0" w:line="260" w:lineRule="exact"/>
         <w:rPr>
-          <w:rFonts w:ascii="Arial" w:hAnsi="Arial" w:cs="Arial"/>
+          <w:rFonts w:asciiTheme="minorHAnsi" w:hAnsiTheme="minorHAnsi"/>
           <w:noProof/>
           <w:kern w:val="2"/>
-          <w:sz w:val="22"/>
+          <w:sz w:val="24"/>
           <w:szCs w:val="24"/>
           <w:lang w:val="de-CH" w:eastAsia="de-CH"/>
           <w14:ligatures w14:val="standardContextual"/>
         </w:rPr>
       </w:pPr>
-      <w:hyperlink w:anchor="_Toc232605532" w:history="1">
+      <w:hyperlink w:anchor="_Toc232778822" w:history="1">
         <w:r>
           <w:rPr>
             <w:rStyle w:val="Hyperlink"/>
-            <w:rFonts w:ascii="Arial" w:hAnsi="Arial" w:cs="Arial"/>
-            <w:noProof/>
-            <w:sz w:val="22"/>
+            <w:noProof/>
           </w:rPr>
           <w:t>7.4 Configure The .env File</w:t>
         </w:r>
         <w:r>
           <w:rPr>
-            <w:rFonts w:ascii="Arial" w:hAnsi="Arial" w:cs="Arial"/>
-            <w:noProof/>
-            <w:webHidden/>
-            <w:sz w:val="22"/>
+            <w:noProof/>
+            <w:webHidden/>
           </w:rPr>
           <w:tab/>
         </w:r>
         <w:r>
           <w:rPr>
-            <w:rFonts w:ascii="Arial" w:hAnsi="Arial" w:cs="Arial"/>
-            <w:noProof/>
-            <w:webHidden/>
-            <w:sz w:val="22"/>
+            <w:noProof/>
+            <w:webHidden/>
           </w:rPr>
           <w:fldChar w:fldCharType="begin"/>
         </w:r>
         <w:r>
           <w:rPr>
-            <w:rFonts w:ascii="Arial" w:hAnsi="Arial" w:cs="Arial"/>
-            <w:noProof/>
-            <w:webHidden/>
-            <w:sz w:val="22"/>
-          </w:rPr>
-          <w:instrText xml:space="preserve"> PAGEREF _Toc232605532 \h </w:instrText>
-        </w:r>
-        <w:r>
-          <w:rPr>
-            <w:rFonts w:ascii="Arial" w:hAnsi="Arial" w:cs="Arial"/>
-            <w:noProof/>
-            <w:webHidden/>
-            <w:sz w:val="22"/>
-          </w:rPr>
-        </w:r>
-        <w:r>
-          <w:rPr>
-            <w:rFonts w:ascii="Arial" w:hAnsi="Arial" w:cs="Arial"/>
-            <w:noProof/>
-            <w:webHidden/>
-            <w:sz w:val="22"/>
+            <w:noProof/>
+            <w:webHidden/>
+          </w:rPr>
+          <w:instrText xml:space="preserve"> PAGEREF _Toc232778822 \h </w:instrText>
+        </w:r>
+        <w:r>
+          <w:rPr>
+            <w:noProof/>
+            <w:webHidden/>
+          </w:rPr>
+        </w:r>
+        <w:r>
+          <w:rPr>
+            <w:noProof/>
+            <w:webHidden/>
           </w:rPr>
           <w:fldChar w:fldCharType="separate"/>
         </w:r>
         <w:r>
           <w:rPr>
-            <w:rFonts w:ascii="Arial" w:hAnsi="Arial" w:cs="Arial"/>
-            <w:noProof/>
-            <w:webHidden/>
-            <w:sz w:val="22"/>
+            <w:noProof/>
+            <w:webHidden/>
           </w:rPr>
           <w:t>11</w:t>
         </w:r>
         <w:r>
           <w:rPr>
-            <w:rFonts w:ascii="Arial" w:hAnsi="Arial" w:cs="Arial"/>
-            <w:noProof/>
-            <w:webHidden/>
-            <w:sz w:val="22"/>
+            <w:noProof/>
+            <w:webHidden/>
           </w:rPr>
           <w:fldChar w:fldCharType="end"/>
         </w:r>
@@ -3006,86 +2530,69 @@
         <w:tabs>
           <w:tab w:val="right" w:leader="dot" w:pos="10272"/>
         </w:tabs>
-        <w:spacing w:after="0" w:line="260" w:lineRule="exact"/>
         <w:rPr>
-          <w:rFonts w:ascii="Arial" w:hAnsi="Arial" w:cs="Arial"/>
+          <w:rFonts w:asciiTheme="minorHAnsi" w:hAnsiTheme="minorHAnsi"/>
           <w:noProof/>
           <w:kern w:val="2"/>
-          <w:sz w:val="22"/>
+          <w:sz w:val="24"/>
           <w:szCs w:val="24"/>
           <w:lang w:val="de-CH" w:eastAsia="de-CH"/>
           <w14:ligatures w14:val="standardContextual"/>
         </w:rPr>
       </w:pPr>
-      <w:hyperlink w:anchor="_Toc232605533" w:history="1">
+      <w:hyperlink w:anchor="_Toc232778823" w:history="1">
         <w:r>
           <w:rPr>
             <w:rStyle w:val="Hyperlink"/>
-            <w:rFonts w:ascii="Arial" w:hAnsi="Arial" w:cs="Arial"/>
-            <w:noProof/>
-            <w:sz w:val="22"/>
+            <w:noProof/>
           </w:rPr>
           <w:t>7.5 API Setup Explained Simply</w:t>
         </w:r>
         <w:r>
           <w:rPr>
-            <w:rFonts w:ascii="Arial" w:hAnsi="Arial" w:cs="Arial"/>
-            <w:noProof/>
-            <w:webHidden/>
-            <w:sz w:val="22"/>
+            <w:noProof/>
+            <w:webHidden/>
           </w:rPr>
           <w:tab/>
         </w:r>
         <w:r>
           <w:rPr>
-            <w:rFonts w:ascii="Arial" w:hAnsi="Arial" w:cs="Arial"/>
-            <w:noProof/>
-            <w:webHidden/>
-            <w:sz w:val="22"/>
+            <w:noProof/>
+            <w:webHidden/>
           </w:rPr>
           <w:fldChar w:fldCharType="begin"/>
         </w:r>
         <w:r>
           <w:rPr>
-            <w:rFonts w:ascii="Arial" w:hAnsi="Arial" w:cs="Arial"/>
-            <w:noProof/>
-            <w:webHidden/>
-            <w:sz w:val="22"/>
-          </w:rPr>
-          <w:instrText xml:space="preserve"> PAGEREF _Toc232605533 \h </w:instrText>
-        </w:r>
-        <w:r>
-          <w:rPr>
-            <w:rFonts w:ascii="Arial" w:hAnsi="Arial" w:cs="Arial"/>
-            <w:noProof/>
-            <w:webHidden/>
-            <w:sz w:val="22"/>
-          </w:rPr>
-        </w:r>
-        <w:r>
-          <w:rPr>
-            <w:rFonts w:ascii="Arial" w:hAnsi="Arial" w:cs="Arial"/>
-            <w:noProof/>
-            <w:webHidden/>
-            <w:sz w:val="22"/>
+            <w:noProof/>
+            <w:webHidden/>
+          </w:rPr>
+          <w:instrText xml:space="preserve"> PAGEREF _Toc232778823 \h </w:instrText>
+        </w:r>
+        <w:r>
+          <w:rPr>
+            <w:noProof/>
+            <w:webHidden/>
+          </w:rPr>
+        </w:r>
+        <w:r>
+          <w:rPr>
+            <w:noProof/>
+            <w:webHidden/>
           </w:rPr>
           <w:fldChar w:fldCharType="separate"/>
         </w:r>
         <w:r>
           <w:rPr>
-            <w:rFonts w:ascii="Arial" w:hAnsi="Arial" w:cs="Arial"/>
-            <w:noProof/>
-            <w:webHidden/>
-            <w:sz w:val="22"/>
+            <w:noProof/>
+            <w:webHidden/>
           </w:rPr>
           <w:t>11</w:t>
         </w:r>
         <w:r>
           <w:rPr>
-            <w:rFonts w:ascii="Arial" w:hAnsi="Arial" w:cs="Arial"/>
-            <w:noProof/>
-            <w:webHidden/>
-            <w:sz w:val="22"/>
+            <w:noProof/>
+            <w:webHidden/>
           </w:rPr>
           <w:fldChar w:fldCharType="end"/>
         </w:r>
@@ -3097,86 +2604,69 @@
         <w:tabs>
           <w:tab w:val="right" w:leader="dot" w:pos="10272"/>
         </w:tabs>
-        <w:spacing w:after="0" w:line="260" w:lineRule="exact"/>
         <w:rPr>
-          <w:rFonts w:ascii="Arial" w:hAnsi="Arial" w:cs="Arial"/>
+          <w:rFonts w:asciiTheme="minorHAnsi" w:hAnsiTheme="minorHAnsi"/>
           <w:noProof/>
           <w:kern w:val="2"/>
-          <w:sz w:val="22"/>
+          <w:sz w:val="24"/>
           <w:szCs w:val="24"/>
           <w:lang w:val="de-CH" w:eastAsia="de-CH"/>
           <w14:ligatures w14:val="standardContextual"/>
         </w:rPr>
       </w:pPr>
-      <w:hyperlink w:anchor="_Toc232605534" w:history="1">
+      <w:hyperlink w:anchor="_Toc232778824" w:history="1">
         <w:r>
           <w:rPr>
             <w:rStyle w:val="Hyperlink"/>
-            <w:rFonts w:ascii="Arial" w:hAnsi="Arial" w:cs="Arial"/>
-            <w:noProof/>
-            <w:sz w:val="22"/>
+            <w:noProof/>
           </w:rPr>
           <w:t>7.6 Start The Program</w:t>
         </w:r>
         <w:r>
           <w:rPr>
-            <w:rFonts w:ascii="Arial" w:hAnsi="Arial" w:cs="Arial"/>
-            <w:noProof/>
-            <w:webHidden/>
-            <w:sz w:val="22"/>
+            <w:noProof/>
+            <w:webHidden/>
           </w:rPr>
           <w:tab/>
         </w:r>
         <w:r>
           <w:rPr>
-            <w:rFonts w:ascii="Arial" w:hAnsi="Arial" w:cs="Arial"/>
-            <w:noProof/>
-            <w:webHidden/>
-            <w:sz w:val="22"/>
+            <w:noProof/>
+            <w:webHidden/>
           </w:rPr>
           <w:fldChar w:fldCharType="begin"/>
         </w:r>
         <w:r>
           <w:rPr>
-            <w:rFonts w:ascii="Arial" w:hAnsi="Arial" w:cs="Arial"/>
-            <w:noProof/>
-            <w:webHidden/>
-            <w:sz w:val="22"/>
-          </w:rPr>
-          <w:instrText xml:space="preserve"> PAGEREF _Toc232605534 \h </w:instrText>
-        </w:r>
-        <w:r>
-          <w:rPr>
-            <w:rFonts w:ascii="Arial" w:hAnsi="Arial" w:cs="Arial"/>
-            <w:noProof/>
-            <w:webHidden/>
-            <w:sz w:val="22"/>
-          </w:rPr>
-        </w:r>
-        <w:r>
-          <w:rPr>
-            <w:rFonts w:ascii="Arial" w:hAnsi="Arial" w:cs="Arial"/>
-            <w:noProof/>
-            <w:webHidden/>
-            <w:sz w:val="22"/>
+            <w:noProof/>
+            <w:webHidden/>
+          </w:rPr>
+          <w:instrText xml:space="preserve"> PAGEREF _Toc232778824 \h </w:instrText>
+        </w:r>
+        <w:r>
+          <w:rPr>
+            <w:noProof/>
+            <w:webHidden/>
+          </w:rPr>
+        </w:r>
+        <w:r>
+          <w:rPr>
+            <w:noProof/>
+            <w:webHidden/>
           </w:rPr>
           <w:fldChar w:fldCharType="separate"/>
         </w:r>
         <w:r>
           <w:rPr>
-            <w:rFonts w:ascii="Arial" w:hAnsi="Arial" w:cs="Arial"/>
-            <w:noProof/>
-            <w:webHidden/>
-            <w:sz w:val="22"/>
+            <w:noProof/>
+            <w:webHidden/>
           </w:rPr>
           <w:t>12</w:t>
         </w:r>
         <w:r>
           <w:rPr>
-            <w:rFonts w:ascii="Arial" w:hAnsi="Arial" w:cs="Arial"/>
-            <w:noProof/>
-            <w:webHidden/>
-            <w:sz w:val="22"/>
+            <w:noProof/>
+            <w:webHidden/>
           </w:rPr>
           <w:fldChar w:fldCharType="end"/>
         </w:r>
@@ -3188,86 +2678,69 @@
         <w:tabs>
           <w:tab w:val="right" w:leader="dot" w:pos="10272"/>
         </w:tabs>
-        <w:spacing w:after="0" w:line="260" w:lineRule="exact"/>
         <w:rPr>
-          <w:rFonts w:ascii="Arial" w:hAnsi="Arial" w:cs="Arial"/>
+          <w:rFonts w:asciiTheme="minorHAnsi" w:hAnsiTheme="minorHAnsi"/>
           <w:noProof/>
           <w:kern w:val="2"/>
-          <w:sz w:val="22"/>
+          <w:sz w:val="24"/>
           <w:szCs w:val="24"/>
           <w:lang w:val="de-CH" w:eastAsia="de-CH"/>
           <w14:ligatures w14:val="standardContextual"/>
         </w:rPr>
       </w:pPr>
-      <w:hyperlink w:anchor="_Toc232605535" w:history="1">
+      <w:hyperlink w:anchor="_Toc232778825" w:history="1">
         <w:r>
           <w:rPr>
             <w:rStyle w:val="Hyperlink"/>
-            <w:rFonts w:ascii="Arial" w:hAnsi="Arial" w:cs="Arial"/>
-            <w:noProof/>
-            <w:sz w:val="22"/>
+            <w:noProof/>
           </w:rPr>
           <w:t>7.7 Weekly Automation</w:t>
         </w:r>
         <w:r>
           <w:rPr>
-            <w:rFonts w:ascii="Arial" w:hAnsi="Arial" w:cs="Arial"/>
-            <w:noProof/>
-            <w:webHidden/>
-            <w:sz w:val="22"/>
+            <w:noProof/>
+            <w:webHidden/>
           </w:rPr>
           <w:tab/>
         </w:r>
         <w:r>
           <w:rPr>
-            <w:rFonts w:ascii="Arial" w:hAnsi="Arial" w:cs="Arial"/>
-            <w:noProof/>
-            <w:webHidden/>
-            <w:sz w:val="22"/>
+            <w:noProof/>
+            <w:webHidden/>
           </w:rPr>
           <w:fldChar w:fldCharType="begin"/>
         </w:r>
         <w:r>
           <w:rPr>
-            <w:rFonts w:ascii="Arial" w:hAnsi="Arial" w:cs="Arial"/>
-            <w:noProof/>
-            <w:webHidden/>
-            <w:sz w:val="22"/>
-          </w:rPr>
-          <w:instrText xml:space="preserve"> PAGEREF _Toc232605535 \h </w:instrText>
-        </w:r>
-        <w:r>
-          <w:rPr>
-            <w:rFonts w:ascii="Arial" w:hAnsi="Arial" w:cs="Arial"/>
-            <w:noProof/>
-            <w:webHidden/>
-            <w:sz w:val="22"/>
-          </w:rPr>
-        </w:r>
-        <w:r>
-          <w:rPr>
-            <w:rFonts w:ascii="Arial" w:hAnsi="Arial" w:cs="Arial"/>
-            <w:noProof/>
-            <w:webHidden/>
-            <w:sz w:val="22"/>
+            <w:noProof/>
+            <w:webHidden/>
+          </w:rPr>
+          <w:instrText xml:space="preserve"> PAGEREF _Toc232778825 \h </w:instrText>
+        </w:r>
+        <w:r>
+          <w:rPr>
+            <w:noProof/>
+            <w:webHidden/>
+          </w:rPr>
+        </w:r>
+        <w:r>
+          <w:rPr>
+            <w:noProof/>
+            <w:webHidden/>
           </w:rPr>
           <w:fldChar w:fldCharType="separate"/>
         </w:r>
         <w:r>
           <w:rPr>
-            <w:rFonts w:ascii="Arial" w:hAnsi="Arial" w:cs="Arial"/>
-            <w:noProof/>
-            <w:webHidden/>
-            <w:sz w:val="22"/>
+            <w:noProof/>
+            <w:webHidden/>
           </w:rPr>
           <w:t>12</w:t>
         </w:r>
         <w:r>
           <w:rPr>
-            <w:rFonts w:ascii="Arial" w:hAnsi="Arial" w:cs="Arial"/>
-            <w:noProof/>
-            <w:webHidden/>
-            <w:sz w:val="22"/>
+            <w:noProof/>
+            <w:webHidden/>
           </w:rPr>
           <w:fldChar w:fldCharType="end"/>
         </w:r>
@@ -3279,86 +2752,69 @@
         <w:tabs>
           <w:tab w:val="right" w:leader="dot" w:pos="10272"/>
         </w:tabs>
-        <w:spacing w:after="0" w:line="260" w:lineRule="exact"/>
         <w:rPr>
-          <w:rFonts w:ascii="Arial" w:hAnsi="Arial" w:cs="Arial"/>
+          <w:rFonts w:asciiTheme="minorHAnsi" w:hAnsiTheme="minorHAnsi"/>
           <w:noProof/>
           <w:kern w:val="2"/>
-          <w:sz w:val="22"/>
+          <w:sz w:val="24"/>
           <w:szCs w:val="24"/>
           <w:lang w:val="de-CH" w:eastAsia="de-CH"/>
           <w14:ligatures w14:val="standardContextual"/>
         </w:rPr>
       </w:pPr>
-      <w:hyperlink w:anchor="_Toc232605536" w:history="1">
+      <w:hyperlink w:anchor="_Toc232778826" w:history="1">
         <w:r>
           <w:rPr>
             <w:rStyle w:val="Hyperlink"/>
-            <w:rFonts w:ascii="Arial" w:hAnsi="Arial" w:cs="Arial"/>
-            <w:noProof/>
-            <w:sz w:val="22"/>
+            <w:noProof/>
           </w:rPr>
           <w:t>8. Testing</w:t>
         </w:r>
         <w:r>
           <w:rPr>
-            <w:rFonts w:ascii="Arial" w:hAnsi="Arial" w:cs="Arial"/>
-            <w:noProof/>
-            <w:webHidden/>
-            <w:sz w:val="22"/>
+            <w:noProof/>
+            <w:webHidden/>
           </w:rPr>
           <w:tab/>
         </w:r>
         <w:r>
           <w:rPr>
-            <w:rFonts w:ascii="Arial" w:hAnsi="Arial" w:cs="Arial"/>
-            <w:noProof/>
-            <w:webHidden/>
-            <w:sz w:val="22"/>
+            <w:noProof/>
+            <w:webHidden/>
           </w:rPr>
           <w:fldChar w:fldCharType="begin"/>
         </w:r>
         <w:r>
           <w:rPr>
-            <w:rFonts w:ascii="Arial" w:hAnsi="Arial" w:cs="Arial"/>
-            <w:noProof/>
-            <w:webHidden/>
-            <w:sz w:val="22"/>
-          </w:rPr>
-          <w:instrText xml:space="preserve"> PAGEREF _Toc232605536 \h </w:instrText>
-        </w:r>
-        <w:r>
-          <w:rPr>
-            <w:rFonts w:ascii="Arial" w:hAnsi="Arial" w:cs="Arial"/>
-            <w:noProof/>
-            <w:webHidden/>
-            <w:sz w:val="22"/>
-          </w:rPr>
-        </w:r>
-        <w:r>
-          <w:rPr>
-            <w:rFonts w:ascii="Arial" w:hAnsi="Arial" w:cs="Arial"/>
-            <w:noProof/>
-            <w:webHidden/>
-            <w:sz w:val="22"/>
+            <w:noProof/>
+            <w:webHidden/>
+          </w:rPr>
+          <w:instrText xml:space="preserve"> PAGEREF _Toc232778826 \h </w:instrText>
+        </w:r>
+        <w:r>
+          <w:rPr>
+            <w:noProof/>
+            <w:webHidden/>
+          </w:rPr>
+        </w:r>
+        <w:r>
+          <w:rPr>
+            <w:noProof/>
+            <w:webHidden/>
           </w:rPr>
           <w:fldChar w:fldCharType="separate"/>
         </w:r>
         <w:r>
           <w:rPr>
-            <w:rFonts w:ascii="Arial" w:hAnsi="Arial" w:cs="Arial"/>
-            <w:noProof/>
-            <w:webHidden/>
-            <w:sz w:val="22"/>
+            <w:noProof/>
+            <w:webHidden/>
           </w:rPr>
           <w:t>12</w:t>
         </w:r>
         <w:r>
           <w:rPr>
-            <w:rFonts w:ascii="Arial" w:hAnsi="Arial" w:cs="Arial"/>
-            <w:noProof/>
-            <w:webHidden/>
-            <w:sz w:val="22"/>
+            <w:noProof/>
+            <w:webHidden/>
           </w:rPr>
           <w:fldChar w:fldCharType="end"/>
         </w:r>
@@ -3370,86 +2826,69 @@
         <w:tabs>
           <w:tab w:val="right" w:leader="dot" w:pos="10272"/>
         </w:tabs>
-        <w:spacing w:after="0" w:line="260" w:lineRule="exact"/>
         <w:rPr>
-          <w:rFonts w:ascii="Arial" w:hAnsi="Arial" w:cs="Arial"/>
+          <w:rFonts w:asciiTheme="minorHAnsi" w:hAnsiTheme="minorHAnsi"/>
           <w:noProof/>
           <w:kern w:val="2"/>
-          <w:sz w:val="22"/>
+          <w:sz w:val="24"/>
           <w:szCs w:val="24"/>
           <w:lang w:val="de-CH" w:eastAsia="de-CH"/>
           <w14:ligatures w14:val="standardContextual"/>
         </w:rPr>
       </w:pPr>
-      <w:hyperlink w:anchor="_Toc232605537" w:history="1">
+      <w:hyperlink w:anchor="_Toc232778827" w:history="1">
         <w:r>
           <w:rPr>
             <w:rStyle w:val="Hyperlink"/>
-            <w:rFonts w:ascii="Arial" w:hAnsi="Arial" w:cs="Arial"/>
-            <w:noProof/>
-            <w:sz w:val="22"/>
+            <w:noProof/>
           </w:rPr>
           <w:t>9. Assignment Coverage</w:t>
         </w:r>
         <w:r>
           <w:rPr>
-            <w:rFonts w:ascii="Arial" w:hAnsi="Arial" w:cs="Arial"/>
-            <w:noProof/>
-            <w:webHidden/>
-            <w:sz w:val="22"/>
+            <w:noProof/>
+            <w:webHidden/>
           </w:rPr>
           <w:tab/>
         </w:r>
         <w:r>
           <w:rPr>
-            <w:rFonts w:ascii="Arial" w:hAnsi="Arial" w:cs="Arial"/>
-            <w:noProof/>
-            <w:webHidden/>
-            <w:sz w:val="22"/>
+            <w:noProof/>
+            <w:webHidden/>
           </w:rPr>
           <w:fldChar w:fldCharType="begin"/>
         </w:r>
         <w:r>
           <w:rPr>
-            <w:rFonts w:ascii="Arial" w:hAnsi="Arial" w:cs="Arial"/>
-            <w:noProof/>
-            <w:webHidden/>
-            <w:sz w:val="22"/>
-          </w:rPr>
-          <w:instrText xml:space="preserve"> PAGEREF _Toc232605537 \h </w:instrText>
-        </w:r>
-        <w:r>
-          <w:rPr>
-            <w:rFonts w:ascii="Arial" w:hAnsi="Arial" w:cs="Arial"/>
-            <w:noProof/>
-            <w:webHidden/>
-            <w:sz w:val="22"/>
-          </w:rPr>
-        </w:r>
-        <w:r>
-          <w:rPr>
-            <w:rFonts w:ascii="Arial" w:hAnsi="Arial" w:cs="Arial"/>
-            <w:noProof/>
-            <w:webHidden/>
-            <w:sz w:val="22"/>
+            <w:noProof/>
+            <w:webHidden/>
+          </w:rPr>
+          <w:instrText xml:space="preserve"> PAGEREF _Toc232778827 \h </w:instrText>
+        </w:r>
+        <w:r>
+          <w:rPr>
+            <w:noProof/>
+            <w:webHidden/>
+          </w:rPr>
+        </w:r>
+        <w:r>
+          <w:rPr>
+            <w:noProof/>
+            <w:webHidden/>
           </w:rPr>
           <w:fldChar w:fldCharType="separate"/>
         </w:r>
         <w:r>
           <w:rPr>
-            <w:rFonts w:ascii="Arial" w:hAnsi="Arial" w:cs="Arial"/>
-            <w:noProof/>
-            <w:webHidden/>
-            <w:sz w:val="22"/>
+            <w:noProof/>
+            <w:webHidden/>
           </w:rPr>
           <w:t>13</w:t>
         </w:r>
         <w:r>
           <w:rPr>
-            <w:rFonts w:ascii="Arial" w:hAnsi="Arial" w:cs="Arial"/>
-            <w:noProof/>
-            <w:webHidden/>
-            <w:sz w:val="22"/>
+            <w:noProof/>
+            <w:webHidden/>
           </w:rPr>
           <w:fldChar w:fldCharType="end"/>
         </w:r>
@@ -3461,86 +2900,69 @@
         <w:tabs>
           <w:tab w:val="right" w:leader="dot" w:pos="10272"/>
         </w:tabs>
-        <w:spacing w:after="0" w:line="260" w:lineRule="exact"/>
         <w:rPr>
-          <w:rFonts w:ascii="Arial" w:hAnsi="Arial" w:cs="Arial"/>
+          <w:rFonts w:asciiTheme="minorHAnsi" w:hAnsiTheme="minorHAnsi"/>
           <w:noProof/>
           <w:kern w:val="2"/>
-          <w:sz w:val="22"/>
+          <w:sz w:val="24"/>
           <w:szCs w:val="24"/>
           <w:lang w:val="de-CH" w:eastAsia="de-CH"/>
           <w14:ligatures w14:val="standardContextual"/>
         </w:rPr>
       </w:pPr>
-      <w:hyperlink w:anchor="_Toc232605538" w:history="1">
+      <w:hyperlink w:anchor="_Toc232778828" w:history="1">
         <w:r>
           <w:rPr>
             <w:rStyle w:val="Hyperlink"/>
-            <w:rFonts w:ascii="Arial" w:hAnsi="Arial" w:cs="Arial"/>
-            <w:noProof/>
-            <w:sz w:val="22"/>
+            <w:noProof/>
           </w:rPr>
           <w:t>10. Conclusion</w:t>
         </w:r>
         <w:r>
           <w:rPr>
-            <w:rFonts w:ascii="Arial" w:hAnsi="Arial" w:cs="Arial"/>
-            <w:noProof/>
-            <w:webHidden/>
-            <w:sz w:val="22"/>
+            <w:noProof/>
+            <w:webHidden/>
           </w:rPr>
           <w:tab/>
         </w:r>
         <w:r>
           <w:rPr>
-            <w:rFonts w:ascii="Arial" w:hAnsi="Arial" w:cs="Arial"/>
-            <w:noProof/>
-            <w:webHidden/>
-            <w:sz w:val="22"/>
+            <w:noProof/>
+            <w:webHidden/>
           </w:rPr>
           <w:fldChar w:fldCharType="begin"/>
         </w:r>
         <w:r>
           <w:rPr>
-            <w:rFonts w:ascii="Arial" w:hAnsi="Arial" w:cs="Arial"/>
-            <w:noProof/>
-            <w:webHidden/>
-            <w:sz w:val="22"/>
-          </w:rPr>
-          <w:instrText xml:space="preserve"> PAGEREF _Toc232605538 \h </w:instrText>
-        </w:r>
-        <w:r>
-          <w:rPr>
-            <w:rFonts w:ascii="Arial" w:hAnsi="Arial" w:cs="Arial"/>
-            <w:noProof/>
-            <w:webHidden/>
-            <w:sz w:val="22"/>
-          </w:rPr>
-        </w:r>
-        <w:r>
-          <w:rPr>
-            <w:rFonts w:ascii="Arial" w:hAnsi="Arial" w:cs="Arial"/>
-            <w:noProof/>
-            <w:webHidden/>
-            <w:sz w:val="22"/>
+            <w:noProof/>
+            <w:webHidden/>
+          </w:rPr>
+          <w:instrText xml:space="preserve"> PAGEREF _Toc232778828 \h </w:instrText>
+        </w:r>
+        <w:r>
+          <w:rPr>
+            <w:noProof/>
+            <w:webHidden/>
+          </w:rPr>
+        </w:r>
+        <w:r>
+          <w:rPr>
+            <w:noProof/>
+            <w:webHidden/>
           </w:rPr>
           <w:fldChar w:fldCharType="separate"/>
         </w:r>
         <w:r>
           <w:rPr>
-            <w:rFonts w:ascii="Arial" w:hAnsi="Arial" w:cs="Arial"/>
-            <w:noProof/>
-            <w:webHidden/>
-            <w:sz w:val="22"/>
+            <w:noProof/>
+            <w:webHidden/>
           </w:rPr>
           <w:t>13</w:t>
         </w:r>
         <w:r>
           <w:rPr>
-            <w:rFonts w:ascii="Arial" w:hAnsi="Arial" w:cs="Arial"/>
-            <w:noProof/>
-            <w:webHidden/>
-            <w:sz w:val="22"/>
+            <w:noProof/>
+            <w:webHidden/>
           </w:rPr>
           <w:fldChar w:fldCharType="end"/>
         </w:r>
@@ -3567,7 +2989,7 @@
       <w:pPr>
         <w:pStyle w:val="berschrift1"/>
       </w:pPr>
-      <w:bookmarkStart w:id="0" w:name="_Toc232605505"/>
+      <w:bookmarkStart w:id="0" w:name="_Toc232778795"/>
       <w:r>
         <w:lastRenderedPageBreak/>
         <w:t>1. Project Overview</w:t>
@@ -3578,7 +3000,7 @@
       <w:pPr>
         <w:pStyle w:val="berschrift2"/>
       </w:pPr>
-      <w:bookmarkStart w:id="1" w:name="_Toc232605506"/>
+      <w:bookmarkStart w:id="1" w:name="_Toc232778796"/>
       <w:r>
         <w:t>1.1 Context</w:t>
       </w:r>
@@ -3598,7 +3020,7 @@
       <w:pPr>
         <w:pStyle w:val="berschrift2"/>
       </w:pPr>
-      <w:bookmarkStart w:id="2" w:name="_Toc232605507"/>
+      <w:bookmarkStart w:id="2" w:name="_Toc232778797"/>
       <w:r>
         <w:t>1.2 Goal</w:t>
       </w:r>
@@ -3613,7 +3035,7 @@
       <w:pPr>
         <w:pStyle w:val="berschrift2"/>
       </w:pPr>
-      <w:bookmarkStart w:id="3" w:name="_Toc232605508"/>
+      <w:bookmarkStart w:id="3" w:name="_Toc232778798"/>
       <w:r>
         <w:t>1.3 What The Program Does</w:t>
       </w:r>
@@ -3628,7 +3050,7 @@
       <w:pPr>
         <w:pStyle w:val="berschrift1"/>
       </w:pPr>
-      <w:bookmarkStart w:id="4" w:name="_Toc232605509"/>
+      <w:bookmarkStart w:id="4" w:name="_Toc232778799"/>
       <w:r>
         <w:t>2. Project Work And Personal Approach</w:t>
       </w:r>
@@ -3638,7 +3060,7 @@
       <w:pPr>
         <w:pStyle w:val="berschrift2"/>
       </w:pPr>
-      <w:bookmarkStart w:id="5" w:name="_Toc232605510"/>
+      <w:bookmarkStart w:id="5" w:name="_Toc232778800"/>
       <w:r>
         <w:t>2.1 How I Started</w:t>
       </w:r>
@@ -3658,7 +3080,7 @@
       <w:pPr>
         <w:pStyle w:val="berschrift2"/>
       </w:pPr>
-      <w:bookmarkStart w:id="6" w:name="_Toc232605511"/>
+      <w:bookmarkStart w:id="6" w:name="_Toc232778801"/>
       <w:r>
         <w:t>2.2 Difficulties During The Project</w:t>
       </w:r>
@@ -3683,7 +3105,7 @@
       <w:pPr>
         <w:pStyle w:val="berschrift2"/>
       </w:pPr>
-      <w:bookmarkStart w:id="7" w:name="_Toc232605512"/>
+      <w:bookmarkStart w:id="7" w:name="_Toc232778802"/>
       <w:r>
         <w:t>2.3 What I Improved Near The End</w:t>
       </w:r>
@@ -3698,7 +3120,7 @@
       <w:pPr>
         <w:pStyle w:val="berschrift1"/>
       </w:pPr>
-      <w:bookmarkStart w:id="8" w:name="_Toc232605513"/>
+      <w:bookmarkStart w:id="8" w:name="_Toc232778803"/>
       <w:r>
         <w:lastRenderedPageBreak/>
         <w:t>3. Project Plan</w:t>
@@ -4235,7 +3657,7 @@
       <w:pPr>
         <w:pStyle w:val="berschrift1"/>
       </w:pPr>
-      <w:bookmarkStart w:id="9" w:name="_Toc232605514"/>
+      <w:bookmarkStart w:id="9" w:name="_Toc232778804"/>
       <w:r>
         <w:t>4. Requirements</w:t>
       </w:r>
@@ -4245,7 +3667,7 @@
       <w:pPr>
         <w:pStyle w:val="berschrift2"/>
       </w:pPr>
-      <w:bookmarkStart w:id="10" w:name="_Toc232605515"/>
+      <w:bookmarkStart w:id="10" w:name="_Toc232778805"/>
       <w:r>
         <w:t>4.1 Functional Requirements</w:t>
       </w:r>
@@ -5782,7 +5204,7 @@
       <w:pPr>
         <w:pStyle w:val="berschrift2"/>
       </w:pPr>
-      <w:bookmarkStart w:id="11" w:name="_Toc232605516"/>
+      <w:bookmarkStart w:id="11" w:name="_Toc232778806"/>
       <w:r>
         <w:t>4.2 Non-Functional Requirements</w:t>
       </w:r>
@@ -6630,7 +6052,7 @@
         <w:pStyle w:val="berschrift1"/>
         <w:pageBreakBefore/>
       </w:pPr>
-      <w:bookmarkStart w:id="12" w:name="_Toc232605517"/>
+      <w:bookmarkStart w:id="12" w:name="_Toc232778807"/>
       <w:r>
         <w:lastRenderedPageBreak/>
         <w:t>5. System Design</w:t>
@@ -6641,7 +6063,7 @@
       <w:pPr>
         <w:pStyle w:val="berschrift2"/>
       </w:pPr>
-      <w:bookmarkStart w:id="13" w:name="_Toc232605518"/>
+      <w:bookmarkStart w:id="13" w:name="_Toc232778808"/>
       <w:r>
         <w:t>5.1 Module Overview</w:t>
       </w:r>
@@ -7117,7 +6539,7 @@
       <w:pPr>
         <w:pStyle w:val="berschrift2"/>
       </w:pPr>
-      <w:bookmarkStart w:id="14" w:name="_Toc232605519"/>
+      <w:bookmarkStart w:id="14" w:name="_Toc232778809"/>
       <w:r>
         <w:t>5.2 Main Workflow</w:t>
       </w:r>
@@ -7218,7 +6640,7 @@
       <w:pPr>
         <w:pStyle w:val="berschrift2"/>
       </w:pPr>
-      <w:bookmarkStart w:id="15" w:name="_Toc232605520"/>
+      <w:bookmarkStart w:id="15" w:name="_Toc232778810"/>
       <w:r>
         <w:lastRenderedPageBreak/>
         <w:t>5.3 System Architecture Diagram</w:t>
@@ -7279,7 +6701,7 @@
       <w:pPr>
         <w:pStyle w:val="berschrift2"/>
       </w:pPr>
-      <w:bookmarkStart w:id="16" w:name="_Toc232605521"/>
+      <w:bookmarkStart w:id="16" w:name="_Toc232778811"/>
       <w:r>
         <w:lastRenderedPageBreak/>
         <w:t>5.4 UML Activity Diagram</w:t>
@@ -7335,7 +6757,7 @@
       <w:pPr>
         <w:pStyle w:val="berschrift2"/>
       </w:pPr>
-      <w:bookmarkStart w:id="17" w:name="_Toc232605522"/>
+      <w:bookmarkStart w:id="17" w:name="_Toc232778812"/>
       <w:r>
         <w:lastRenderedPageBreak/>
         <w:t>5.5 UML Component Diagram</w:t>
@@ -7391,7 +6813,7 @@
       <w:pPr>
         <w:pStyle w:val="berschrift2"/>
       </w:pPr>
-      <w:bookmarkStart w:id="18" w:name="_Toc232605523"/>
+      <w:bookmarkStart w:id="18" w:name="_Toc232778813"/>
       <w:r>
         <w:t>5.6 UML Deployment Diagram</w:t>
       </w:r>
@@ -7446,7 +6868,7 @@
       <w:pPr>
         <w:pStyle w:val="berschrift2"/>
       </w:pPr>
-      <w:bookmarkStart w:id="19" w:name="_Toc232605524"/>
+      <w:bookmarkStart w:id="19" w:name="_Toc232778814"/>
       <w:r>
         <w:lastRenderedPageBreak/>
         <w:t>5.7 UML Class Diagram</w:t>
@@ -7502,7 +6924,7 @@
       <w:pPr>
         <w:pStyle w:val="berschrift2"/>
       </w:pPr>
-      <w:bookmarkStart w:id="20" w:name="_Toc232605525"/>
+      <w:bookmarkStart w:id="20" w:name="_Toc232778815"/>
       <w:r>
         <w:t>5.8 ER Diagram</w:t>
       </w:r>
@@ -7557,7 +6979,7 @@
       <w:pPr>
         <w:pStyle w:val="berschrift2"/>
       </w:pPr>
-      <w:bookmarkStart w:id="21" w:name="_Toc232605526"/>
+      <w:bookmarkStart w:id="21" w:name="_Toc232778816"/>
       <w:r>
         <w:lastRenderedPageBreak/>
         <w:t>5.9 Flowchart</w:t>
@@ -7613,7 +7035,7 @@
       <w:pPr>
         <w:pStyle w:val="berschrift1"/>
       </w:pPr>
-      <w:bookmarkStart w:id="22" w:name="_Toc232605527"/>
+      <w:bookmarkStart w:id="22" w:name="_Toc232778817"/>
       <w:r>
         <w:t>6. Database Design</w:t>
       </w:r>
@@ -8089,7 +7511,7 @@
         <w:pStyle w:val="berschrift1"/>
         <w:pageBreakBefore/>
       </w:pPr>
-      <w:bookmarkStart w:id="23" w:name="_Toc232605528"/>
+      <w:bookmarkStart w:id="23" w:name="_Toc232778818"/>
       <w:r>
         <w:lastRenderedPageBreak/>
         <w:t>7. Installation And Usage</w:t>
@@ -8100,7 +7522,7 @@
       <w:pPr>
         <w:pStyle w:val="berschrift2"/>
       </w:pPr>
-      <w:bookmarkStart w:id="24" w:name="_Toc232605529"/>
+      <w:bookmarkStart w:id="24" w:name="_Toc232778819"/>
       <w:r>
         <w:t>7.1 Prerequisites</w:t>
       </w:r>
@@ -8429,7 +7851,7 @@
       <w:pPr>
         <w:pStyle w:val="berschrift2"/>
       </w:pPr>
-      <w:bookmarkStart w:id="25" w:name="_Toc232605530"/>
+      <w:bookmarkStart w:id="25" w:name="_Toc232778820"/>
       <w:r>
         <w:t>7.2 Clone Or Open The Project</w:t>
       </w:r>
@@ -8546,7 +7968,7 @@
       <w:pPr>
         <w:pStyle w:val="berschrift2"/>
       </w:pPr>
-      <w:bookmarkStart w:id="26" w:name="_Toc232605531"/>
+      <w:bookmarkStart w:id="26" w:name="_Toc232778821"/>
       <w:r>
         <w:t>7.3 Install Dependencies</w:t>
       </w:r>
@@ -8626,7 +8048,7 @@
       <w:pPr>
         <w:pStyle w:val="berschrift2"/>
       </w:pPr>
-      <w:bookmarkStart w:id="27" w:name="_Toc232605532"/>
+      <w:bookmarkStart w:id="27" w:name="_Toc232778822"/>
       <w:r>
         <w:t>7.4 Configure The .env File</w:t>
       </w:r>
@@ -9145,7 +8567,7 @@
       <w:pPr>
         <w:pStyle w:val="berschrift2"/>
       </w:pPr>
-      <w:bookmarkStart w:id="28" w:name="_Toc232605533"/>
+      <w:bookmarkStart w:id="28" w:name="_Toc232778823"/>
       <w:r>
         <w:t>7.5 API Setup Explained Simply</w:t>
       </w:r>
@@ -9171,7 +8593,7 @@
       <w:pPr>
         <w:pStyle w:val="berschrift2"/>
       </w:pPr>
-      <w:bookmarkStart w:id="29" w:name="_Toc232605534"/>
+      <w:bookmarkStart w:id="29" w:name="_Toc232778824"/>
       <w:r>
         <w:t>7.6 Start The Program</w:t>
       </w:r>
@@ -9245,7 +8667,7 @@
       <w:pPr>
         <w:pStyle w:val="berschrift2"/>
       </w:pPr>
-      <w:bookmarkStart w:id="30" w:name="_Toc232605535"/>
+      <w:bookmarkStart w:id="30" w:name="_Toc232778825"/>
       <w:r>
         <w:t>7.7 Weekly Automation</w:t>
       </w:r>
@@ -9364,7 +8786,7 @@
       <w:pPr>
         <w:pStyle w:val="berschrift1"/>
       </w:pPr>
-      <w:bookmarkStart w:id="31" w:name="_Toc232605536"/>
+      <w:bookmarkStart w:id="31" w:name="_Toc232778826"/>
       <w:r>
         <w:t>8. Testing</w:t>
       </w:r>
@@ -9425,7 +8847,7 @@
                 <w:color w:val="111827"/>
                 <w:sz w:val="17"/>
               </w:rPr>
-              <w:t>35 passed</w:t>
+              <w:t>37 passed</w:t>
             </w:r>
           </w:p>
         </w:tc>
@@ -9458,7 +8880,7 @@
         <w:pStyle w:val="berschrift1"/>
         <w:pageBreakBefore/>
       </w:pPr>
-      <w:bookmarkStart w:id="32" w:name="_Toc232605537"/>
+      <w:bookmarkStart w:id="32" w:name="_Toc232778827"/>
       <w:r>
         <w:lastRenderedPageBreak/>
         <w:t>9. Assignment Coverage</w:t>
@@ -10033,7 +9455,7 @@
       <w:pPr>
         <w:pStyle w:val="berschrift1"/>
       </w:pPr>
-      <w:bookmarkStart w:id="33" w:name="_Toc232605538"/>
+      <w:bookmarkStart w:id="33" w:name="_Toc232778828"/>
       <w:r>
         <w:t>10. Conclusion</w:t>
       </w:r>

</xml_diff>

<commit_message>
Expand setup instructions for teacher testing
</commit_message>
<xml_diff>
--- a/docs/M122E_Final_Documentation.docx
+++ b/docs/M122E_Final_Documentation.docx
@@ -437,11 +437,12 @@
         <w:tabs>
           <w:tab w:val="right" w:leader="dot" w:pos="10272"/>
         </w:tabs>
+        <w:spacing w:after="0" w:line="260" w:lineRule="exact"/>
         <w:rPr>
-          <w:rFonts w:asciiTheme="minorHAnsi" w:hAnsiTheme="minorHAnsi"/>
+          <w:rFonts w:ascii="Arial" w:hAnsi="Arial" w:cs="Arial"/>
           <w:noProof/>
           <w:kern w:val="2"/>
-          <w:sz w:val="24"/>
+          <w:sz w:val="22"/>
           <w:szCs w:val="24"/>
           <w:lang w:val="de-CH" w:eastAsia="de-CH"/>
           <w14:ligatures w14:val="standardContextual"/>
@@ -468,59 +469,75 @@
         </w:rPr>
         <w:fldChar w:fldCharType="separate"/>
       </w:r>
-      <w:hyperlink w:anchor="_Toc232778795" w:history="1">
+      <w:hyperlink w:anchor="_Toc232780578" w:history="1">
         <w:r>
           <w:rPr>
             <w:rStyle w:val="Hyperlink"/>
-            <w:noProof/>
+            <w:rFonts w:ascii="Arial" w:hAnsi="Arial" w:cs="Arial"/>
+            <w:noProof/>
+            <w:sz w:val="22"/>
           </w:rPr>
           <w:t>1. Project Overview</w:t>
         </w:r>
         <w:r>
           <w:rPr>
-            <w:noProof/>
-            <w:webHidden/>
+            <w:rFonts w:ascii="Arial" w:hAnsi="Arial" w:cs="Arial"/>
+            <w:noProof/>
+            <w:webHidden/>
+            <w:sz w:val="22"/>
           </w:rPr>
           <w:tab/>
         </w:r>
         <w:r>
           <w:rPr>
-            <w:noProof/>
-            <w:webHidden/>
+            <w:rFonts w:ascii="Arial" w:hAnsi="Arial" w:cs="Arial"/>
+            <w:noProof/>
+            <w:webHidden/>
+            <w:sz w:val="22"/>
           </w:rPr>
           <w:fldChar w:fldCharType="begin"/>
         </w:r>
         <w:r>
           <w:rPr>
-            <w:noProof/>
-            <w:webHidden/>
-          </w:rPr>
-          <w:instrText xml:space="preserve"> PAGEREF _Toc232778795 \h </w:instrText>
-        </w:r>
-        <w:r>
-          <w:rPr>
-            <w:noProof/>
-            <w:webHidden/>
-          </w:rPr>
-        </w:r>
-        <w:r>
-          <w:rPr>
-            <w:noProof/>
-            <w:webHidden/>
+            <w:rFonts w:ascii="Arial" w:hAnsi="Arial" w:cs="Arial"/>
+            <w:noProof/>
+            <w:webHidden/>
+            <w:sz w:val="22"/>
+          </w:rPr>
+          <w:instrText xml:space="preserve"> PAGEREF _Toc232780578 \h </w:instrText>
+        </w:r>
+        <w:r>
+          <w:rPr>
+            <w:rFonts w:ascii="Arial" w:hAnsi="Arial" w:cs="Arial"/>
+            <w:noProof/>
+            <w:webHidden/>
+            <w:sz w:val="22"/>
+          </w:rPr>
+        </w:r>
+        <w:r>
+          <w:rPr>
+            <w:rFonts w:ascii="Arial" w:hAnsi="Arial" w:cs="Arial"/>
+            <w:noProof/>
+            <w:webHidden/>
+            <w:sz w:val="22"/>
           </w:rPr>
           <w:fldChar w:fldCharType="separate"/>
         </w:r>
         <w:r>
           <w:rPr>
-            <w:noProof/>
-            <w:webHidden/>
+            <w:rFonts w:ascii="Arial" w:hAnsi="Arial" w:cs="Arial"/>
+            <w:noProof/>
+            <w:webHidden/>
+            <w:sz w:val="22"/>
           </w:rPr>
           <w:t>3</w:t>
         </w:r>
         <w:r>
           <w:rPr>
-            <w:noProof/>
-            <w:webHidden/>
+            <w:rFonts w:ascii="Arial" w:hAnsi="Arial" w:cs="Arial"/>
+            <w:noProof/>
+            <w:webHidden/>
+            <w:sz w:val="22"/>
           </w:rPr>
           <w:fldChar w:fldCharType="end"/>
         </w:r>
@@ -532,69 +549,86 @@
         <w:tabs>
           <w:tab w:val="right" w:leader="dot" w:pos="10272"/>
         </w:tabs>
+        <w:spacing w:after="0" w:line="260" w:lineRule="exact"/>
         <w:rPr>
-          <w:rFonts w:asciiTheme="minorHAnsi" w:hAnsiTheme="minorHAnsi"/>
+          <w:rFonts w:ascii="Arial" w:hAnsi="Arial" w:cs="Arial"/>
           <w:noProof/>
           <w:kern w:val="2"/>
-          <w:sz w:val="24"/>
+          <w:sz w:val="22"/>
           <w:szCs w:val="24"/>
           <w:lang w:val="de-CH" w:eastAsia="de-CH"/>
           <w14:ligatures w14:val="standardContextual"/>
         </w:rPr>
       </w:pPr>
-      <w:hyperlink w:anchor="_Toc232778796" w:history="1">
+      <w:hyperlink w:anchor="_Toc232780579" w:history="1">
         <w:r>
           <w:rPr>
             <w:rStyle w:val="Hyperlink"/>
-            <w:noProof/>
+            <w:rFonts w:ascii="Arial" w:hAnsi="Arial" w:cs="Arial"/>
+            <w:noProof/>
+            <w:sz w:val="22"/>
           </w:rPr>
           <w:t>1.1 Context</w:t>
         </w:r>
         <w:r>
           <w:rPr>
-            <w:noProof/>
-            <w:webHidden/>
+            <w:rFonts w:ascii="Arial" w:hAnsi="Arial" w:cs="Arial"/>
+            <w:noProof/>
+            <w:webHidden/>
+            <w:sz w:val="22"/>
           </w:rPr>
           <w:tab/>
         </w:r>
         <w:r>
           <w:rPr>
-            <w:noProof/>
-            <w:webHidden/>
+            <w:rFonts w:ascii="Arial" w:hAnsi="Arial" w:cs="Arial"/>
+            <w:noProof/>
+            <w:webHidden/>
+            <w:sz w:val="22"/>
           </w:rPr>
           <w:fldChar w:fldCharType="begin"/>
         </w:r>
         <w:r>
           <w:rPr>
-            <w:noProof/>
-            <w:webHidden/>
-          </w:rPr>
-          <w:instrText xml:space="preserve"> PAGEREF _Toc232778796 \h </w:instrText>
-        </w:r>
-        <w:r>
-          <w:rPr>
-            <w:noProof/>
-            <w:webHidden/>
-          </w:rPr>
-        </w:r>
-        <w:r>
-          <w:rPr>
-            <w:noProof/>
-            <w:webHidden/>
+            <w:rFonts w:ascii="Arial" w:hAnsi="Arial" w:cs="Arial"/>
+            <w:noProof/>
+            <w:webHidden/>
+            <w:sz w:val="22"/>
+          </w:rPr>
+          <w:instrText xml:space="preserve"> PAGEREF _Toc232780579 \h </w:instrText>
+        </w:r>
+        <w:r>
+          <w:rPr>
+            <w:rFonts w:ascii="Arial" w:hAnsi="Arial" w:cs="Arial"/>
+            <w:noProof/>
+            <w:webHidden/>
+            <w:sz w:val="22"/>
+          </w:rPr>
+        </w:r>
+        <w:r>
+          <w:rPr>
+            <w:rFonts w:ascii="Arial" w:hAnsi="Arial" w:cs="Arial"/>
+            <w:noProof/>
+            <w:webHidden/>
+            <w:sz w:val="22"/>
           </w:rPr>
           <w:fldChar w:fldCharType="separate"/>
         </w:r>
         <w:r>
           <w:rPr>
-            <w:noProof/>
-            <w:webHidden/>
+            <w:rFonts w:ascii="Arial" w:hAnsi="Arial" w:cs="Arial"/>
+            <w:noProof/>
+            <w:webHidden/>
+            <w:sz w:val="22"/>
           </w:rPr>
           <w:t>3</w:t>
         </w:r>
         <w:r>
           <w:rPr>
-            <w:noProof/>
-            <w:webHidden/>
+            <w:rFonts w:ascii="Arial" w:hAnsi="Arial" w:cs="Arial"/>
+            <w:noProof/>
+            <w:webHidden/>
+            <w:sz w:val="22"/>
           </w:rPr>
           <w:fldChar w:fldCharType="end"/>
         </w:r>
@@ -606,69 +640,86 @@
         <w:tabs>
           <w:tab w:val="right" w:leader="dot" w:pos="10272"/>
         </w:tabs>
+        <w:spacing w:after="0" w:line="260" w:lineRule="exact"/>
         <w:rPr>
-          <w:rFonts w:asciiTheme="minorHAnsi" w:hAnsiTheme="minorHAnsi"/>
+          <w:rFonts w:ascii="Arial" w:hAnsi="Arial" w:cs="Arial"/>
           <w:noProof/>
           <w:kern w:val="2"/>
-          <w:sz w:val="24"/>
+          <w:sz w:val="22"/>
           <w:szCs w:val="24"/>
           <w:lang w:val="de-CH" w:eastAsia="de-CH"/>
           <w14:ligatures w14:val="standardContextual"/>
         </w:rPr>
       </w:pPr>
-      <w:hyperlink w:anchor="_Toc232778797" w:history="1">
+      <w:hyperlink w:anchor="_Toc232780580" w:history="1">
         <w:r>
           <w:rPr>
             <w:rStyle w:val="Hyperlink"/>
-            <w:noProof/>
+            <w:rFonts w:ascii="Arial" w:hAnsi="Arial" w:cs="Arial"/>
+            <w:noProof/>
+            <w:sz w:val="22"/>
           </w:rPr>
           <w:t>1.2 Goal</w:t>
         </w:r>
         <w:r>
           <w:rPr>
-            <w:noProof/>
-            <w:webHidden/>
+            <w:rFonts w:ascii="Arial" w:hAnsi="Arial" w:cs="Arial"/>
+            <w:noProof/>
+            <w:webHidden/>
+            <w:sz w:val="22"/>
           </w:rPr>
           <w:tab/>
         </w:r>
         <w:r>
           <w:rPr>
-            <w:noProof/>
-            <w:webHidden/>
+            <w:rFonts w:ascii="Arial" w:hAnsi="Arial" w:cs="Arial"/>
+            <w:noProof/>
+            <w:webHidden/>
+            <w:sz w:val="22"/>
           </w:rPr>
           <w:fldChar w:fldCharType="begin"/>
         </w:r>
         <w:r>
           <w:rPr>
-            <w:noProof/>
-            <w:webHidden/>
-          </w:rPr>
-          <w:instrText xml:space="preserve"> PAGEREF _Toc232778797 \h </w:instrText>
-        </w:r>
-        <w:r>
-          <w:rPr>
-            <w:noProof/>
-            <w:webHidden/>
-          </w:rPr>
-        </w:r>
-        <w:r>
-          <w:rPr>
-            <w:noProof/>
-            <w:webHidden/>
+            <w:rFonts w:ascii="Arial" w:hAnsi="Arial" w:cs="Arial"/>
+            <w:noProof/>
+            <w:webHidden/>
+            <w:sz w:val="22"/>
+          </w:rPr>
+          <w:instrText xml:space="preserve"> PAGEREF _Toc232780580 \h </w:instrText>
+        </w:r>
+        <w:r>
+          <w:rPr>
+            <w:rFonts w:ascii="Arial" w:hAnsi="Arial" w:cs="Arial"/>
+            <w:noProof/>
+            <w:webHidden/>
+            <w:sz w:val="22"/>
+          </w:rPr>
+        </w:r>
+        <w:r>
+          <w:rPr>
+            <w:rFonts w:ascii="Arial" w:hAnsi="Arial" w:cs="Arial"/>
+            <w:noProof/>
+            <w:webHidden/>
+            <w:sz w:val="22"/>
           </w:rPr>
           <w:fldChar w:fldCharType="separate"/>
         </w:r>
         <w:r>
           <w:rPr>
-            <w:noProof/>
-            <w:webHidden/>
+            <w:rFonts w:ascii="Arial" w:hAnsi="Arial" w:cs="Arial"/>
+            <w:noProof/>
+            <w:webHidden/>
+            <w:sz w:val="22"/>
           </w:rPr>
           <w:t>3</w:t>
         </w:r>
         <w:r>
           <w:rPr>
-            <w:noProof/>
-            <w:webHidden/>
+            <w:rFonts w:ascii="Arial" w:hAnsi="Arial" w:cs="Arial"/>
+            <w:noProof/>
+            <w:webHidden/>
+            <w:sz w:val="22"/>
           </w:rPr>
           <w:fldChar w:fldCharType="end"/>
         </w:r>
@@ -680,69 +731,86 @@
         <w:tabs>
           <w:tab w:val="right" w:leader="dot" w:pos="10272"/>
         </w:tabs>
+        <w:spacing w:after="0" w:line="260" w:lineRule="exact"/>
         <w:rPr>
-          <w:rFonts w:asciiTheme="minorHAnsi" w:hAnsiTheme="minorHAnsi"/>
+          <w:rFonts w:ascii="Arial" w:hAnsi="Arial" w:cs="Arial"/>
           <w:noProof/>
           <w:kern w:val="2"/>
-          <w:sz w:val="24"/>
+          <w:sz w:val="22"/>
           <w:szCs w:val="24"/>
           <w:lang w:val="de-CH" w:eastAsia="de-CH"/>
           <w14:ligatures w14:val="standardContextual"/>
         </w:rPr>
       </w:pPr>
-      <w:hyperlink w:anchor="_Toc232778798" w:history="1">
+      <w:hyperlink w:anchor="_Toc232780581" w:history="1">
         <w:r>
           <w:rPr>
             <w:rStyle w:val="Hyperlink"/>
-            <w:noProof/>
+            <w:rFonts w:ascii="Arial" w:hAnsi="Arial" w:cs="Arial"/>
+            <w:noProof/>
+            <w:sz w:val="22"/>
           </w:rPr>
           <w:t>1.3 What The Program Does</w:t>
         </w:r>
         <w:r>
           <w:rPr>
-            <w:noProof/>
-            <w:webHidden/>
+            <w:rFonts w:ascii="Arial" w:hAnsi="Arial" w:cs="Arial"/>
+            <w:noProof/>
+            <w:webHidden/>
+            <w:sz w:val="22"/>
           </w:rPr>
           <w:tab/>
         </w:r>
         <w:r>
           <w:rPr>
-            <w:noProof/>
-            <w:webHidden/>
+            <w:rFonts w:ascii="Arial" w:hAnsi="Arial" w:cs="Arial"/>
+            <w:noProof/>
+            <w:webHidden/>
+            <w:sz w:val="22"/>
           </w:rPr>
           <w:fldChar w:fldCharType="begin"/>
         </w:r>
         <w:r>
           <w:rPr>
-            <w:noProof/>
-            <w:webHidden/>
-          </w:rPr>
-          <w:instrText xml:space="preserve"> PAGEREF _Toc232778798 \h </w:instrText>
-        </w:r>
-        <w:r>
-          <w:rPr>
-            <w:noProof/>
-            <w:webHidden/>
-          </w:rPr>
-        </w:r>
-        <w:r>
-          <w:rPr>
-            <w:noProof/>
-            <w:webHidden/>
+            <w:rFonts w:ascii="Arial" w:hAnsi="Arial" w:cs="Arial"/>
+            <w:noProof/>
+            <w:webHidden/>
+            <w:sz w:val="22"/>
+          </w:rPr>
+          <w:instrText xml:space="preserve"> PAGEREF _Toc232780581 \h </w:instrText>
+        </w:r>
+        <w:r>
+          <w:rPr>
+            <w:rFonts w:ascii="Arial" w:hAnsi="Arial" w:cs="Arial"/>
+            <w:noProof/>
+            <w:webHidden/>
+            <w:sz w:val="22"/>
+          </w:rPr>
+        </w:r>
+        <w:r>
+          <w:rPr>
+            <w:rFonts w:ascii="Arial" w:hAnsi="Arial" w:cs="Arial"/>
+            <w:noProof/>
+            <w:webHidden/>
+            <w:sz w:val="22"/>
           </w:rPr>
           <w:fldChar w:fldCharType="separate"/>
         </w:r>
         <w:r>
           <w:rPr>
-            <w:noProof/>
-            <w:webHidden/>
+            <w:rFonts w:ascii="Arial" w:hAnsi="Arial" w:cs="Arial"/>
+            <w:noProof/>
+            <w:webHidden/>
+            <w:sz w:val="22"/>
           </w:rPr>
           <w:t>3</w:t>
         </w:r>
         <w:r>
           <w:rPr>
-            <w:noProof/>
-            <w:webHidden/>
+            <w:rFonts w:ascii="Arial" w:hAnsi="Arial" w:cs="Arial"/>
+            <w:noProof/>
+            <w:webHidden/>
+            <w:sz w:val="22"/>
           </w:rPr>
           <w:fldChar w:fldCharType="end"/>
         </w:r>
@@ -754,69 +822,86 @@
         <w:tabs>
           <w:tab w:val="right" w:leader="dot" w:pos="10272"/>
         </w:tabs>
+        <w:spacing w:after="0" w:line="260" w:lineRule="exact"/>
         <w:rPr>
-          <w:rFonts w:asciiTheme="minorHAnsi" w:hAnsiTheme="minorHAnsi"/>
+          <w:rFonts w:ascii="Arial" w:hAnsi="Arial" w:cs="Arial"/>
           <w:noProof/>
           <w:kern w:val="2"/>
-          <w:sz w:val="24"/>
+          <w:sz w:val="22"/>
           <w:szCs w:val="24"/>
           <w:lang w:val="de-CH" w:eastAsia="de-CH"/>
           <w14:ligatures w14:val="standardContextual"/>
         </w:rPr>
       </w:pPr>
-      <w:hyperlink w:anchor="_Toc232778799" w:history="1">
+      <w:hyperlink w:anchor="_Toc232780582" w:history="1">
         <w:r>
           <w:rPr>
             <w:rStyle w:val="Hyperlink"/>
-            <w:noProof/>
+            <w:rFonts w:ascii="Arial" w:hAnsi="Arial" w:cs="Arial"/>
+            <w:noProof/>
+            <w:sz w:val="22"/>
           </w:rPr>
           <w:t>2. Project Work And Personal Approach</w:t>
         </w:r>
         <w:r>
           <w:rPr>
-            <w:noProof/>
-            <w:webHidden/>
+            <w:rFonts w:ascii="Arial" w:hAnsi="Arial" w:cs="Arial"/>
+            <w:noProof/>
+            <w:webHidden/>
+            <w:sz w:val="22"/>
           </w:rPr>
           <w:tab/>
         </w:r>
         <w:r>
           <w:rPr>
-            <w:noProof/>
-            <w:webHidden/>
+            <w:rFonts w:ascii="Arial" w:hAnsi="Arial" w:cs="Arial"/>
+            <w:noProof/>
+            <w:webHidden/>
+            <w:sz w:val="22"/>
           </w:rPr>
           <w:fldChar w:fldCharType="begin"/>
         </w:r>
         <w:r>
           <w:rPr>
-            <w:noProof/>
-            <w:webHidden/>
-          </w:rPr>
-          <w:instrText xml:space="preserve"> PAGEREF _Toc232778799 \h </w:instrText>
-        </w:r>
-        <w:r>
-          <w:rPr>
-            <w:noProof/>
-            <w:webHidden/>
-          </w:rPr>
-        </w:r>
-        <w:r>
-          <w:rPr>
-            <w:noProof/>
-            <w:webHidden/>
+            <w:rFonts w:ascii="Arial" w:hAnsi="Arial" w:cs="Arial"/>
+            <w:noProof/>
+            <w:webHidden/>
+            <w:sz w:val="22"/>
+          </w:rPr>
+          <w:instrText xml:space="preserve"> PAGEREF _Toc232780582 \h </w:instrText>
+        </w:r>
+        <w:r>
+          <w:rPr>
+            <w:rFonts w:ascii="Arial" w:hAnsi="Arial" w:cs="Arial"/>
+            <w:noProof/>
+            <w:webHidden/>
+            <w:sz w:val="22"/>
+          </w:rPr>
+        </w:r>
+        <w:r>
+          <w:rPr>
+            <w:rFonts w:ascii="Arial" w:hAnsi="Arial" w:cs="Arial"/>
+            <w:noProof/>
+            <w:webHidden/>
+            <w:sz w:val="22"/>
           </w:rPr>
           <w:fldChar w:fldCharType="separate"/>
         </w:r>
         <w:r>
           <w:rPr>
-            <w:noProof/>
-            <w:webHidden/>
+            <w:rFonts w:ascii="Arial" w:hAnsi="Arial" w:cs="Arial"/>
+            <w:noProof/>
+            <w:webHidden/>
+            <w:sz w:val="22"/>
           </w:rPr>
           <w:t>3</w:t>
         </w:r>
         <w:r>
           <w:rPr>
-            <w:noProof/>
-            <w:webHidden/>
+            <w:rFonts w:ascii="Arial" w:hAnsi="Arial" w:cs="Arial"/>
+            <w:noProof/>
+            <w:webHidden/>
+            <w:sz w:val="22"/>
           </w:rPr>
           <w:fldChar w:fldCharType="end"/>
         </w:r>
@@ -828,69 +913,86 @@
         <w:tabs>
           <w:tab w:val="right" w:leader="dot" w:pos="10272"/>
         </w:tabs>
+        <w:spacing w:after="0" w:line="260" w:lineRule="exact"/>
         <w:rPr>
-          <w:rFonts w:asciiTheme="minorHAnsi" w:hAnsiTheme="minorHAnsi"/>
+          <w:rFonts w:ascii="Arial" w:hAnsi="Arial" w:cs="Arial"/>
           <w:noProof/>
           <w:kern w:val="2"/>
-          <w:sz w:val="24"/>
+          <w:sz w:val="22"/>
           <w:szCs w:val="24"/>
           <w:lang w:val="de-CH" w:eastAsia="de-CH"/>
           <w14:ligatures w14:val="standardContextual"/>
         </w:rPr>
       </w:pPr>
-      <w:hyperlink w:anchor="_Toc232778800" w:history="1">
+      <w:hyperlink w:anchor="_Toc232780583" w:history="1">
         <w:r>
           <w:rPr>
             <w:rStyle w:val="Hyperlink"/>
-            <w:noProof/>
+            <w:rFonts w:ascii="Arial" w:hAnsi="Arial" w:cs="Arial"/>
+            <w:noProof/>
+            <w:sz w:val="22"/>
           </w:rPr>
           <w:t>2.1 How I Started</w:t>
         </w:r>
         <w:r>
           <w:rPr>
-            <w:noProof/>
-            <w:webHidden/>
+            <w:rFonts w:ascii="Arial" w:hAnsi="Arial" w:cs="Arial"/>
+            <w:noProof/>
+            <w:webHidden/>
+            <w:sz w:val="22"/>
           </w:rPr>
           <w:tab/>
         </w:r>
         <w:r>
           <w:rPr>
-            <w:noProof/>
-            <w:webHidden/>
+            <w:rFonts w:ascii="Arial" w:hAnsi="Arial" w:cs="Arial"/>
+            <w:noProof/>
+            <w:webHidden/>
+            <w:sz w:val="22"/>
           </w:rPr>
           <w:fldChar w:fldCharType="begin"/>
         </w:r>
         <w:r>
           <w:rPr>
-            <w:noProof/>
-            <w:webHidden/>
-          </w:rPr>
-          <w:instrText xml:space="preserve"> PAGEREF _Toc232778800 \h </w:instrText>
-        </w:r>
-        <w:r>
-          <w:rPr>
-            <w:noProof/>
-            <w:webHidden/>
-          </w:rPr>
-        </w:r>
-        <w:r>
-          <w:rPr>
-            <w:noProof/>
-            <w:webHidden/>
+            <w:rFonts w:ascii="Arial" w:hAnsi="Arial" w:cs="Arial"/>
+            <w:noProof/>
+            <w:webHidden/>
+            <w:sz w:val="22"/>
+          </w:rPr>
+          <w:instrText xml:space="preserve"> PAGEREF _Toc232780583 \h </w:instrText>
+        </w:r>
+        <w:r>
+          <w:rPr>
+            <w:rFonts w:ascii="Arial" w:hAnsi="Arial" w:cs="Arial"/>
+            <w:noProof/>
+            <w:webHidden/>
+            <w:sz w:val="22"/>
+          </w:rPr>
+        </w:r>
+        <w:r>
+          <w:rPr>
+            <w:rFonts w:ascii="Arial" w:hAnsi="Arial" w:cs="Arial"/>
+            <w:noProof/>
+            <w:webHidden/>
+            <w:sz w:val="22"/>
           </w:rPr>
           <w:fldChar w:fldCharType="separate"/>
         </w:r>
         <w:r>
           <w:rPr>
-            <w:noProof/>
-            <w:webHidden/>
+            <w:rFonts w:ascii="Arial" w:hAnsi="Arial" w:cs="Arial"/>
+            <w:noProof/>
+            <w:webHidden/>
+            <w:sz w:val="22"/>
           </w:rPr>
           <w:t>3</w:t>
         </w:r>
         <w:r>
           <w:rPr>
-            <w:noProof/>
-            <w:webHidden/>
+            <w:rFonts w:ascii="Arial" w:hAnsi="Arial" w:cs="Arial"/>
+            <w:noProof/>
+            <w:webHidden/>
+            <w:sz w:val="22"/>
           </w:rPr>
           <w:fldChar w:fldCharType="end"/>
         </w:r>
@@ -902,69 +1004,86 @@
         <w:tabs>
           <w:tab w:val="right" w:leader="dot" w:pos="10272"/>
         </w:tabs>
+        <w:spacing w:after="0" w:line="260" w:lineRule="exact"/>
         <w:rPr>
-          <w:rFonts w:asciiTheme="minorHAnsi" w:hAnsiTheme="minorHAnsi"/>
+          <w:rFonts w:ascii="Arial" w:hAnsi="Arial" w:cs="Arial"/>
           <w:noProof/>
           <w:kern w:val="2"/>
-          <w:sz w:val="24"/>
+          <w:sz w:val="22"/>
           <w:szCs w:val="24"/>
           <w:lang w:val="de-CH" w:eastAsia="de-CH"/>
           <w14:ligatures w14:val="standardContextual"/>
         </w:rPr>
       </w:pPr>
-      <w:hyperlink w:anchor="_Toc232778801" w:history="1">
+      <w:hyperlink w:anchor="_Toc232780584" w:history="1">
         <w:r>
           <w:rPr>
             <w:rStyle w:val="Hyperlink"/>
-            <w:noProof/>
+            <w:rFonts w:ascii="Arial" w:hAnsi="Arial" w:cs="Arial"/>
+            <w:noProof/>
+            <w:sz w:val="22"/>
           </w:rPr>
           <w:t>2.2 Difficulties During The Project</w:t>
         </w:r>
         <w:r>
           <w:rPr>
-            <w:noProof/>
-            <w:webHidden/>
+            <w:rFonts w:ascii="Arial" w:hAnsi="Arial" w:cs="Arial"/>
+            <w:noProof/>
+            <w:webHidden/>
+            <w:sz w:val="22"/>
           </w:rPr>
           <w:tab/>
         </w:r>
         <w:r>
           <w:rPr>
-            <w:noProof/>
-            <w:webHidden/>
+            <w:rFonts w:ascii="Arial" w:hAnsi="Arial" w:cs="Arial"/>
+            <w:noProof/>
+            <w:webHidden/>
+            <w:sz w:val="22"/>
           </w:rPr>
           <w:fldChar w:fldCharType="begin"/>
         </w:r>
         <w:r>
           <w:rPr>
-            <w:noProof/>
-            <w:webHidden/>
-          </w:rPr>
-          <w:instrText xml:space="preserve"> PAGEREF _Toc232778801 \h </w:instrText>
-        </w:r>
-        <w:r>
-          <w:rPr>
-            <w:noProof/>
-            <w:webHidden/>
-          </w:rPr>
-        </w:r>
-        <w:r>
-          <w:rPr>
-            <w:noProof/>
-            <w:webHidden/>
+            <w:rFonts w:ascii="Arial" w:hAnsi="Arial" w:cs="Arial"/>
+            <w:noProof/>
+            <w:webHidden/>
+            <w:sz w:val="22"/>
+          </w:rPr>
+          <w:instrText xml:space="preserve"> PAGEREF _Toc232780584 \h </w:instrText>
+        </w:r>
+        <w:r>
+          <w:rPr>
+            <w:rFonts w:ascii="Arial" w:hAnsi="Arial" w:cs="Arial"/>
+            <w:noProof/>
+            <w:webHidden/>
+            <w:sz w:val="22"/>
+          </w:rPr>
+        </w:r>
+        <w:r>
+          <w:rPr>
+            <w:rFonts w:ascii="Arial" w:hAnsi="Arial" w:cs="Arial"/>
+            <w:noProof/>
+            <w:webHidden/>
+            <w:sz w:val="22"/>
           </w:rPr>
           <w:fldChar w:fldCharType="separate"/>
         </w:r>
         <w:r>
           <w:rPr>
-            <w:noProof/>
-            <w:webHidden/>
+            <w:rFonts w:ascii="Arial" w:hAnsi="Arial" w:cs="Arial"/>
+            <w:noProof/>
+            <w:webHidden/>
+            <w:sz w:val="22"/>
           </w:rPr>
           <w:t>3</w:t>
         </w:r>
         <w:r>
           <w:rPr>
-            <w:noProof/>
-            <w:webHidden/>
+            <w:rFonts w:ascii="Arial" w:hAnsi="Arial" w:cs="Arial"/>
+            <w:noProof/>
+            <w:webHidden/>
+            <w:sz w:val="22"/>
           </w:rPr>
           <w:fldChar w:fldCharType="end"/>
         </w:r>
@@ -976,69 +1095,86 @@
         <w:tabs>
           <w:tab w:val="right" w:leader="dot" w:pos="10272"/>
         </w:tabs>
+        <w:spacing w:after="0" w:line="260" w:lineRule="exact"/>
         <w:rPr>
-          <w:rFonts w:asciiTheme="minorHAnsi" w:hAnsiTheme="minorHAnsi"/>
+          <w:rFonts w:ascii="Arial" w:hAnsi="Arial" w:cs="Arial"/>
           <w:noProof/>
           <w:kern w:val="2"/>
-          <w:sz w:val="24"/>
+          <w:sz w:val="22"/>
           <w:szCs w:val="24"/>
           <w:lang w:val="de-CH" w:eastAsia="de-CH"/>
           <w14:ligatures w14:val="standardContextual"/>
         </w:rPr>
       </w:pPr>
-      <w:hyperlink w:anchor="_Toc232778802" w:history="1">
+      <w:hyperlink w:anchor="_Toc232780585" w:history="1">
         <w:r>
           <w:rPr>
             <w:rStyle w:val="Hyperlink"/>
-            <w:noProof/>
+            <w:rFonts w:ascii="Arial" w:hAnsi="Arial" w:cs="Arial"/>
+            <w:noProof/>
+            <w:sz w:val="22"/>
           </w:rPr>
           <w:t>2.3 What I Improved Near The End</w:t>
         </w:r>
         <w:r>
           <w:rPr>
-            <w:noProof/>
-            <w:webHidden/>
+            <w:rFonts w:ascii="Arial" w:hAnsi="Arial" w:cs="Arial"/>
+            <w:noProof/>
+            <w:webHidden/>
+            <w:sz w:val="22"/>
           </w:rPr>
           <w:tab/>
         </w:r>
         <w:r>
           <w:rPr>
-            <w:noProof/>
-            <w:webHidden/>
+            <w:rFonts w:ascii="Arial" w:hAnsi="Arial" w:cs="Arial"/>
+            <w:noProof/>
+            <w:webHidden/>
+            <w:sz w:val="22"/>
           </w:rPr>
           <w:fldChar w:fldCharType="begin"/>
         </w:r>
         <w:r>
           <w:rPr>
-            <w:noProof/>
-            <w:webHidden/>
-          </w:rPr>
-          <w:instrText xml:space="preserve"> PAGEREF _Toc232778802 \h </w:instrText>
-        </w:r>
-        <w:r>
-          <w:rPr>
-            <w:noProof/>
-            <w:webHidden/>
-          </w:rPr>
-        </w:r>
-        <w:r>
-          <w:rPr>
-            <w:noProof/>
-            <w:webHidden/>
+            <w:rFonts w:ascii="Arial" w:hAnsi="Arial" w:cs="Arial"/>
+            <w:noProof/>
+            <w:webHidden/>
+            <w:sz w:val="22"/>
+          </w:rPr>
+          <w:instrText xml:space="preserve"> PAGEREF _Toc232780585 \h </w:instrText>
+        </w:r>
+        <w:r>
+          <w:rPr>
+            <w:rFonts w:ascii="Arial" w:hAnsi="Arial" w:cs="Arial"/>
+            <w:noProof/>
+            <w:webHidden/>
+            <w:sz w:val="22"/>
+          </w:rPr>
+        </w:r>
+        <w:r>
+          <w:rPr>
+            <w:rFonts w:ascii="Arial" w:hAnsi="Arial" w:cs="Arial"/>
+            <w:noProof/>
+            <w:webHidden/>
+            <w:sz w:val="22"/>
           </w:rPr>
           <w:fldChar w:fldCharType="separate"/>
         </w:r>
         <w:r>
           <w:rPr>
-            <w:noProof/>
-            <w:webHidden/>
+            <w:rFonts w:ascii="Arial" w:hAnsi="Arial" w:cs="Arial"/>
+            <w:noProof/>
+            <w:webHidden/>
+            <w:sz w:val="22"/>
           </w:rPr>
           <w:t>3</w:t>
         </w:r>
         <w:r>
           <w:rPr>
-            <w:noProof/>
-            <w:webHidden/>
+            <w:rFonts w:ascii="Arial" w:hAnsi="Arial" w:cs="Arial"/>
+            <w:noProof/>
+            <w:webHidden/>
+            <w:sz w:val="22"/>
           </w:rPr>
           <w:fldChar w:fldCharType="end"/>
         </w:r>
@@ -1050,69 +1186,86 @@
         <w:tabs>
           <w:tab w:val="right" w:leader="dot" w:pos="10272"/>
         </w:tabs>
+        <w:spacing w:after="0" w:line="260" w:lineRule="exact"/>
         <w:rPr>
-          <w:rFonts w:asciiTheme="minorHAnsi" w:hAnsiTheme="minorHAnsi"/>
+          <w:rFonts w:ascii="Arial" w:hAnsi="Arial" w:cs="Arial"/>
           <w:noProof/>
           <w:kern w:val="2"/>
-          <w:sz w:val="24"/>
+          <w:sz w:val="22"/>
           <w:szCs w:val="24"/>
           <w:lang w:val="de-CH" w:eastAsia="de-CH"/>
           <w14:ligatures w14:val="standardContextual"/>
         </w:rPr>
       </w:pPr>
-      <w:hyperlink w:anchor="_Toc232778803" w:history="1">
+      <w:hyperlink w:anchor="_Toc232780586" w:history="1">
         <w:r>
           <w:rPr>
             <w:rStyle w:val="Hyperlink"/>
-            <w:noProof/>
+            <w:rFonts w:ascii="Arial" w:hAnsi="Arial" w:cs="Arial"/>
+            <w:noProof/>
+            <w:sz w:val="22"/>
           </w:rPr>
           <w:t>3. Project Plan</w:t>
         </w:r>
         <w:r>
           <w:rPr>
-            <w:noProof/>
-            <w:webHidden/>
+            <w:rFonts w:ascii="Arial" w:hAnsi="Arial" w:cs="Arial"/>
+            <w:noProof/>
+            <w:webHidden/>
+            <w:sz w:val="22"/>
           </w:rPr>
           <w:tab/>
         </w:r>
         <w:r>
           <w:rPr>
-            <w:noProof/>
-            <w:webHidden/>
+            <w:rFonts w:ascii="Arial" w:hAnsi="Arial" w:cs="Arial"/>
+            <w:noProof/>
+            <w:webHidden/>
+            <w:sz w:val="22"/>
           </w:rPr>
           <w:fldChar w:fldCharType="begin"/>
         </w:r>
         <w:r>
           <w:rPr>
-            <w:noProof/>
-            <w:webHidden/>
-          </w:rPr>
-          <w:instrText xml:space="preserve"> PAGEREF _Toc232778803 \h </w:instrText>
-        </w:r>
-        <w:r>
-          <w:rPr>
-            <w:noProof/>
-            <w:webHidden/>
-          </w:rPr>
-        </w:r>
-        <w:r>
-          <w:rPr>
-            <w:noProof/>
-            <w:webHidden/>
+            <w:rFonts w:ascii="Arial" w:hAnsi="Arial" w:cs="Arial"/>
+            <w:noProof/>
+            <w:webHidden/>
+            <w:sz w:val="22"/>
+          </w:rPr>
+          <w:instrText xml:space="preserve"> PAGEREF _Toc232780586 \h </w:instrText>
+        </w:r>
+        <w:r>
+          <w:rPr>
+            <w:rFonts w:ascii="Arial" w:hAnsi="Arial" w:cs="Arial"/>
+            <w:noProof/>
+            <w:webHidden/>
+            <w:sz w:val="22"/>
+          </w:rPr>
+        </w:r>
+        <w:r>
+          <w:rPr>
+            <w:rFonts w:ascii="Arial" w:hAnsi="Arial" w:cs="Arial"/>
+            <w:noProof/>
+            <w:webHidden/>
+            <w:sz w:val="22"/>
           </w:rPr>
           <w:fldChar w:fldCharType="separate"/>
         </w:r>
         <w:r>
           <w:rPr>
-            <w:noProof/>
-            <w:webHidden/>
+            <w:rFonts w:ascii="Arial" w:hAnsi="Arial" w:cs="Arial"/>
+            <w:noProof/>
+            <w:webHidden/>
+            <w:sz w:val="22"/>
           </w:rPr>
           <w:t>4</w:t>
         </w:r>
         <w:r>
           <w:rPr>
-            <w:noProof/>
-            <w:webHidden/>
+            <w:rFonts w:ascii="Arial" w:hAnsi="Arial" w:cs="Arial"/>
+            <w:noProof/>
+            <w:webHidden/>
+            <w:sz w:val="22"/>
           </w:rPr>
           <w:fldChar w:fldCharType="end"/>
         </w:r>
@@ -1124,69 +1277,86 @@
         <w:tabs>
           <w:tab w:val="right" w:leader="dot" w:pos="10272"/>
         </w:tabs>
+        <w:spacing w:after="0" w:line="260" w:lineRule="exact"/>
         <w:rPr>
-          <w:rFonts w:asciiTheme="minorHAnsi" w:hAnsiTheme="minorHAnsi"/>
+          <w:rFonts w:ascii="Arial" w:hAnsi="Arial" w:cs="Arial"/>
           <w:noProof/>
           <w:kern w:val="2"/>
-          <w:sz w:val="24"/>
+          <w:sz w:val="22"/>
           <w:szCs w:val="24"/>
           <w:lang w:val="de-CH" w:eastAsia="de-CH"/>
           <w14:ligatures w14:val="standardContextual"/>
         </w:rPr>
       </w:pPr>
-      <w:hyperlink w:anchor="_Toc232778804" w:history="1">
+      <w:hyperlink w:anchor="_Toc232780587" w:history="1">
         <w:r>
           <w:rPr>
             <w:rStyle w:val="Hyperlink"/>
-            <w:noProof/>
+            <w:rFonts w:ascii="Arial" w:hAnsi="Arial" w:cs="Arial"/>
+            <w:noProof/>
+            <w:sz w:val="22"/>
           </w:rPr>
           <w:t>4. Requirements</w:t>
         </w:r>
         <w:r>
           <w:rPr>
-            <w:noProof/>
-            <w:webHidden/>
+            <w:rFonts w:ascii="Arial" w:hAnsi="Arial" w:cs="Arial"/>
+            <w:noProof/>
+            <w:webHidden/>
+            <w:sz w:val="22"/>
           </w:rPr>
           <w:tab/>
         </w:r>
         <w:r>
           <w:rPr>
-            <w:noProof/>
-            <w:webHidden/>
+            <w:rFonts w:ascii="Arial" w:hAnsi="Arial" w:cs="Arial"/>
+            <w:noProof/>
+            <w:webHidden/>
+            <w:sz w:val="22"/>
           </w:rPr>
           <w:fldChar w:fldCharType="begin"/>
         </w:r>
         <w:r>
           <w:rPr>
-            <w:noProof/>
-            <w:webHidden/>
-          </w:rPr>
-          <w:instrText xml:space="preserve"> PAGEREF _Toc232778804 \h </w:instrText>
-        </w:r>
-        <w:r>
-          <w:rPr>
-            <w:noProof/>
-            <w:webHidden/>
-          </w:rPr>
-        </w:r>
-        <w:r>
-          <w:rPr>
-            <w:noProof/>
-            <w:webHidden/>
+            <w:rFonts w:ascii="Arial" w:hAnsi="Arial" w:cs="Arial"/>
+            <w:noProof/>
+            <w:webHidden/>
+            <w:sz w:val="22"/>
+          </w:rPr>
+          <w:instrText xml:space="preserve"> PAGEREF _Toc232780587 \h </w:instrText>
+        </w:r>
+        <w:r>
+          <w:rPr>
+            <w:rFonts w:ascii="Arial" w:hAnsi="Arial" w:cs="Arial"/>
+            <w:noProof/>
+            <w:webHidden/>
+            <w:sz w:val="22"/>
+          </w:rPr>
+        </w:r>
+        <w:r>
+          <w:rPr>
+            <w:rFonts w:ascii="Arial" w:hAnsi="Arial" w:cs="Arial"/>
+            <w:noProof/>
+            <w:webHidden/>
+            <w:sz w:val="22"/>
           </w:rPr>
           <w:fldChar w:fldCharType="separate"/>
         </w:r>
         <w:r>
           <w:rPr>
-            <w:noProof/>
-            <w:webHidden/>
+            <w:rFonts w:ascii="Arial" w:hAnsi="Arial" w:cs="Arial"/>
+            <w:noProof/>
+            <w:webHidden/>
+            <w:sz w:val="22"/>
           </w:rPr>
           <w:t>4</w:t>
         </w:r>
         <w:r>
           <w:rPr>
-            <w:noProof/>
-            <w:webHidden/>
+            <w:rFonts w:ascii="Arial" w:hAnsi="Arial" w:cs="Arial"/>
+            <w:noProof/>
+            <w:webHidden/>
+            <w:sz w:val="22"/>
           </w:rPr>
           <w:fldChar w:fldCharType="end"/>
         </w:r>
@@ -1198,69 +1368,86 @@
         <w:tabs>
           <w:tab w:val="right" w:leader="dot" w:pos="10272"/>
         </w:tabs>
+        <w:spacing w:after="0" w:line="260" w:lineRule="exact"/>
         <w:rPr>
-          <w:rFonts w:asciiTheme="minorHAnsi" w:hAnsiTheme="minorHAnsi"/>
+          <w:rFonts w:ascii="Arial" w:hAnsi="Arial" w:cs="Arial"/>
           <w:noProof/>
           <w:kern w:val="2"/>
-          <w:sz w:val="24"/>
+          <w:sz w:val="22"/>
           <w:szCs w:val="24"/>
           <w:lang w:val="de-CH" w:eastAsia="de-CH"/>
           <w14:ligatures w14:val="standardContextual"/>
         </w:rPr>
       </w:pPr>
-      <w:hyperlink w:anchor="_Toc232778805" w:history="1">
+      <w:hyperlink w:anchor="_Toc232780588" w:history="1">
         <w:r>
           <w:rPr>
             <w:rStyle w:val="Hyperlink"/>
-            <w:noProof/>
+            <w:rFonts w:ascii="Arial" w:hAnsi="Arial" w:cs="Arial"/>
+            <w:noProof/>
+            <w:sz w:val="22"/>
           </w:rPr>
           <w:t>4.1 Functional Requirements</w:t>
         </w:r>
         <w:r>
           <w:rPr>
-            <w:noProof/>
-            <w:webHidden/>
+            <w:rFonts w:ascii="Arial" w:hAnsi="Arial" w:cs="Arial"/>
+            <w:noProof/>
+            <w:webHidden/>
+            <w:sz w:val="22"/>
           </w:rPr>
           <w:tab/>
         </w:r>
         <w:r>
           <w:rPr>
-            <w:noProof/>
-            <w:webHidden/>
+            <w:rFonts w:ascii="Arial" w:hAnsi="Arial" w:cs="Arial"/>
+            <w:noProof/>
+            <w:webHidden/>
+            <w:sz w:val="22"/>
           </w:rPr>
           <w:fldChar w:fldCharType="begin"/>
         </w:r>
         <w:r>
           <w:rPr>
-            <w:noProof/>
-            <w:webHidden/>
-          </w:rPr>
-          <w:instrText xml:space="preserve"> PAGEREF _Toc232778805 \h </w:instrText>
-        </w:r>
-        <w:r>
-          <w:rPr>
-            <w:noProof/>
-            <w:webHidden/>
-          </w:rPr>
-        </w:r>
-        <w:r>
-          <w:rPr>
-            <w:noProof/>
-            <w:webHidden/>
+            <w:rFonts w:ascii="Arial" w:hAnsi="Arial" w:cs="Arial"/>
+            <w:noProof/>
+            <w:webHidden/>
+            <w:sz w:val="22"/>
+          </w:rPr>
+          <w:instrText xml:space="preserve"> PAGEREF _Toc232780588 \h </w:instrText>
+        </w:r>
+        <w:r>
+          <w:rPr>
+            <w:rFonts w:ascii="Arial" w:hAnsi="Arial" w:cs="Arial"/>
+            <w:noProof/>
+            <w:webHidden/>
+            <w:sz w:val="22"/>
+          </w:rPr>
+        </w:r>
+        <w:r>
+          <w:rPr>
+            <w:rFonts w:ascii="Arial" w:hAnsi="Arial" w:cs="Arial"/>
+            <w:noProof/>
+            <w:webHidden/>
+            <w:sz w:val="22"/>
           </w:rPr>
           <w:fldChar w:fldCharType="separate"/>
         </w:r>
         <w:r>
           <w:rPr>
-            <w:noProof/>
-            <w:webHidden/>
+            <w:rFonts w:ascii="Arial" w:hAnsi="Arial" w:cs="Arial"/>
+            <w:noProof/>
+            <w:webHidden/>
+            <w:sz w:val="22"/>
           </w:rPr>
           <w:t>4</w:t>
         </w:r>
         <w:r>
           <w:rPr>
-            <w:noProof/>
-            <w:webHidden/>
+            <w:rFonts w:ascii="Arial" w:hAnsi="Arial" w:cs="Arial"/>
+            <w:noProof/>
+            <w:webHidden/>
+            <w:sz w:val="22"/>
           </w:rPr>
           <w:fldChar w:fldCharType="end"/>
         </w:r>
@@ -1272,69 +1459,86 @@
         <w:tabs>
           <w:tab w:val="right" w:leader="dot" w:pos="10272"/>
         </w:tabs>
+        <w:spacing w:after="0" w:line="260" w:lineRule="exact"/>
         <w:rPr>
-          <w:rFonts w:asciiTheme="minorHAnsi" w:hAnsiTheme="minorHAnsi"/>
+          <w:rFonts w:ascii="Arial" w:hAnsi="Arial" w:cs="Arial"/>
           <w:noProof/>
           <w:kern w:val="2"/>
-          <w:sz w:val="24"/>
+          <w:sz w:val="22"/>
           <w:szCs w:val="24"/>
           <w:lang w:val="de-CH" w:eastAsia="de-CH"/>
           <w14:ligatures w14:val="standardContextual"/>
         </w:rPr>
       </w:pPr>
-      <w:hyperlink w:anchor="_Toc232778806" w:history="1">
+      <w:hyperlink w:anchor="_Toc232780589" w:history="1">
         <w:r>
           <w:rPr>
             <w:rStyle w:val="Hyperlink"/>
-            <w:noProof/>
+            <w:rFonts w:ascii="Arial" w:hAnsi="Arial" w:cs="Arial"/>
+            <w:noProof/>
+            <w:sz w:val="22"/>
           </w:rPr>
           <w:t>4.2 Non-Functional Requirements</w:t>
         </w:r>
         <w:r>
           <w:rPr>
-            <w:noProof/>
-            <w:webHidden/>
+            <w:rFonts w:ascii="Arial" w:hAnsi="Arial" w:cs="Arial"/>
+            <w:noProof/>
+            <w:webHidden/>
+            <w:sz w:val="22"/>
           </w:rPr>
           <w:tab/>
         </w:r>
         <w:r>
           <w:rPr>
-            <w:noProof/>
-            <w:webHidden/>
+            <w:rFonts w:ascii="Arial" w:hAnsi="Arial" w:cs="Arial"/>
+            <w:noProof/>
+            <w:webHidden/>
+            <w:sz w:val="22"/>
           </w:rPr>
           <w:fldChar w:fldCharType="begin"/>
         </w:r>
         <w:r>
           <w:rPr>
-            <w:noProof/>
-            <w:webHidden/>
-          </w:rPr>
-          <w:instrText xml:space="preserve"> PAGEREF _Toc232778806 \h </w:instrText>
-        </w:r>
-        <w:r>
-          <w:rPr>
-            <w:noProof/>
-            <w:webHidden/>
-          </w:rPr>
-        </w:r>
-        <w:r>
-          <w:rPr>
-            <w:noProof/>
-            <w:webHidden/>
+            <w:rFonts w:ascii="Arial" w:hAnsi="Arial" w:cs="Arial"/>
+            <w:noProof/>
+            <w:webHidden/>
+            <w:sz w:val="22"/>
+          </w:rPr>
+          <w:instrText xml:space="preserve"> PAGEREF _Toc232780589 \h </w:instrText>
+        </w:r>
+        <w:r>
+          <w:rPr>
+            <w:rFonts w:ascii="Arial" w:hAnsi="Arial" w:cs="Arial"/>
+            <w:noProof/>
+            <w:webHidden/>
+            <w:sz w:val="22"/>
+          </w:rPr>
+        </w:r>
+        <w:r>
+          <w:rPr>
+            <w:rFonts w:ascii="Arial" w:hAnsi="Arial" w:cs="Arial"/>
+            <w:noProof/>
+            <w:webHidden/>
+            <w:sz w:val="22"/>
           </w:rPr>
           <w:fldChar w:fldCharType="separate"/>
         </w:r>
         <w:r>
           <w:rPr>
-            <w:noProof/>
-            <w:webHidden/>
+            <w:rFonts w:ascii="Arial" w:hAnsi="Arial" w:cs="Arial"/>
+            <w:noProof/>
+            <w:webHidden/>
+            <w:sz w:val="22"/>
           </w:rPr>
           <w:t>4</w:t>
         </w:r>
         <w:r>
           <w:rPr>
-            <w:noProof/>
-            <w:webHidden/>
+            <w:rFonts w:ascii="Arial" w:hAnsi="Arial" w:cs="Arial"/>
+            <w:noProof/>
+            <w:webHidden/>
+            <w:sz w:val="22"/>
           </w:rPr>
           <w:fldChar w:fldCharType="end"/>
         </w:r>
@@ -1346,69 +1550,86 @@
         <w:tabs>
           <w:tab w:val="right" w:leader="dot" w:pos="10272"/>
         </w:tabs>
+        <w:spacing w:after="0" w:line="260" w:lineRule="exact"/>
         <w:rPr>
-          <w:rFonts w:asciiTheme="minorHAnsi" w:hAnsiTheme="minorHAnsi"/>
+          <w:rFonts w:ascii="Arial" w:hAnsi="Arial" w:cs="Arial"/>
           <w:noProof/>
           <w:kern w:val="2"/>
-          <w:sz w:val="24"/>
+          <w:sz w:val="22"/>
           <w:szCs w:val="24"/>
           <w:lang w:val="de-CH" w:eastAsia="de-CH"/>
           <w14:ligatures w14:val="standardContextual"/>
         </w:rPr>
       </w:pPr>
-      <w:hyperlink w:anchor="_Toc232778807" w:history="1">
+      <w:hyperlink w:anchor="_Toc232780590" w:history="1">
         <w:r>
           <w:rPr>
             <w:rStyle w:val="Hyperlink"/>
-            <w:noProof/>
+            <w:rFonts w:ascii="Arial" w:hAnsi="Arial" w:cs="Arial"/>
+            <w:noProof/>
+            <w:sz w:val="22"/>
           </w:rPr>
           <w:t>5. System Design</w:t>
         </w:r>
         <w:r>
           <w:rPr>
-            <w:noProof/>
-            <w:webHidden/>
+            <w:rFonts w:ascii="Arial" w:hAnsi="Arial" w:cs="Arial"/>
+            <w:noProof/>
+            <w:webHidden/>
+            <w:sz w:val="22"/>
           </w:rPr>
           <w:tab/>
         </w:r>
         <w:r>
           <w:rPr>
-            <w:noProof/>
-            <w:webHidden/>
+            <w:rFonts w:ascii="Arial" w:hAnsi="Arial" w:cs="Arial"/>
+            <w:noProof/>
+            <w:webHidden/>
+            <w:sz w:val="22"/>
           </w:rPr>
           <w:fldChar w:fldCharType="begin"/>
         </w:r>
         <w:r>
           <w:rPr>
-            <w:noProof/>
-            <w:webHidden/>
-          </w:rPr>
-          <w:instrText xml:space="preserve"> PAGEREF _Toc232778807 \h </w:instrText>
-        </w:r>
-        <w:r>
-          <w:rPr>
-            <w:noProof/>
-            <w:webHidden/>
-          </w:rPr>
-        </w:r>
-        <w:r>
-          <w:rPr>
-            <w:noProof/>
-            <w:webHidden/>
+            <w:rFonts w:ascii="Arial" w:hAnsi="Arial" w:cs="Arial"/>
+            <w:noProof/>
+            <w:webHidden/>
+            <w:sz w:val="22"/>
+          </w:rPr>
+          <w:instrText xml:space="preserve"> PAGEREF _Toc232780590 \h </w:instrText>
+        </w:r>
+        <w:r>
+          <w:rPr>
+            <w:rFonts w:ascii="Arial" w:hAnsi="Arial" w:cs="Arial"/>
+            <w:noProof/>
+            <w:webHidden/>
+            <w:sz w:val="22"/>
+          </w:rPr>
+        </w:r>
+        <w:r>
+          <w:rPr>
+            <w:rFonts w:ascii="Arial" w:hAnsi="Arial" w:cs="Arial"/>
+            <w:noProof/>
+            <w:webHidden/>
+            <w:sz w:val="22"/>
           </w:rPr>
           <w:fldChar w:fldCharType="separate"/>
         </w:r>
         <w:r>
           <w:rPr>
-            <w:noProof/>
-            <w:webHidden/>
+            <w:rFonts w:ascii="Arial" w:hAnsi="Arial" w:cs="Arial"/>
+            <w:noProof/>
+            <w:webHidden/>
+            <w:sz w:val="22"/>
           </w:rPr>
           <w:t>5</w:t>
         </w:r>
         <w:r>
           <w:rPr>
-            <w:noProof/>
-            <w:webHidden/>
+            <w:rFonts w:ascii="Arial" w:hAnsi="Arial" w:cs="Arial"/>
+            <w:noProof/>
+            <w:webHidden/>
+            <w:sz w:val="22"/>
           </w:rPr>
           <w:fldChar w:fldCharType="end"/>
         </w:r>
@@ -1420,69 +1641,86 @@
         <w:tabs>
           <w:tab w:val="right" w:leader="dot" w:pos="10272"/>
         </w:tabs>
+        <w:spacing w:after="0" w:line="260" w:lineRule="exact"/>
         <w:rPr>
-          <w:rFonts w:asciiTheme="minorHAnsi" w:hAnsiTheme="minorHAnsi"/>
+          <w:rFonts w:ascii="Arial" w:hAnsi="Arial" w:cs="Arial"/>
           <w:noProof/>
           <w:kern w:val="2"/>
-          <w:sz w:val="24"/>
+          <w:sz w:val="22"/>
           <w:szCs w:val="24"/>
           <w:lang w:val="de-CH" w:eastAsia="de-CH"/>
           <w14:ligatures w14:val="standardContextual"/>
         </w:rPr>
       </w:pPr>
-      <w:hyperlink w:anchor="_Toc232778808" w:history="1">
+      <w:hyperlink w:anchor="_Toc232780591" w:history="1">
         <w:r>
           <w:rPr>
             <w:rStyle w:val="Hyperlink"/>
-            <w:noProof/>
+            <w:rFonts w:ascii="Arial" w:hAnsi="Arial" w:cs="Arial"/>
+            <w:noProof/>
+            <w:sz w:val="22"/>
           </w:rPr>
           <w:t>5.1 Module Overview</w:t>
         </w:r>
         <w:r>
           <w:rPr>
-            <w:noProof/>
-            <w:webHidden/>
+            <w:rFonts w:ascii="Arial" w:hAnsi="Arial" w:cs="Arial"/>
+            <w:noProof/>
+            <w:webHidden/>
+            <w:sz w:val="22"/>
           </w:rPr>
           <w:tab/>
         </w:r>
         <w:r>
           <w:rPr>
-            <w:noProof/>
-            <w:webHidden/>
+            <w:rFonts w:ascii="Arial" w:hAnsi="Arial" w:cs="Arial"/>
+            <w:noProof/>
+            <w:webHidden/>
+            <w:sz w:val="22"/>
           </w:rPr>
           <w:fldChar w:fldCharType="begin"/>
         </w:r>
         <w:r>
           <w:rPr>
-            <w:noProof/>
-            <w:webHidden/>
-          </w:rPr>
-          <w:instrText xml:space="preserve"> PAGEREF _Toc232778808 \h </w:instrText>
-        </w:r>
-        <w:r>
-          <w:rPr>
-            <w:noProof/>
-            <w:webHidden/>
-          </w:rPr>
-        </w:r>
-        <w:r>
-          <w:rPr>
-            <w:noProof/>
-            <w:webHidden/>
+            <w:rFonts w:ascii="Arial" w:hAnsi="Arial" w:cs="Arial"/>
+            <w:noProof/>
+            <w:webHidden/>
+            <w:sz w:val="22"/>
+          </w:rPr>
+          <w:instrText xml:space="preserve"> PAGEREF _Toc232780591 \h </w:instrText>
+        </w:r>
+        <w:r>
+          <w:rPr>
+            <w:rFonts w:ascii="Arial" w:hAnsi="Arial" w:cs="Arial"/>
+            <w:noProof/>
+            <w:webHidden/>
+            <w:sz w:val="22"/>
+          </w:rPr>
+        </w:r>
+        <w:r>
+          <w:rPr>
+            <w:rFonts w:ascii="Arial" w:hAnsi="Arial" w:cs="Arial"/>
+            <w:noProof/>
+            <w:webHidden/>
+            <w:sz w:val="22"/>
           </w:rPr>
           <w:fldChar w:fldCharType="separate"/>
         </w:r>
         <w:r>
           <w:rPr>
-            <w:noProof/>
-            <w:webHidden/>
+            <w:rFonts w:ascii="Arial" w:hAnsi="Arial" w:cs="Arial"/>
+            <w:noProof/>
+            <w:webHidden/>
+            <w:sz w:val="22"/>
           </w:rPr>
           <w:t>5</w:t>
         </w:r>
         <w:r>
           <w:rPr>
-            <w:noProof/>
-            <w:webHidden/>
+            <w:rFonts w:ascii="Arial" w:hAnsi="Arial" w:cs="Arial"/>
+            <w:noProof/>
+            <w:webHidden/>
+            <w:sz w:val="22"/>
           </w:rPr>
           <w:fldChar w:fldCharType="end"/>
         </w:r>
@@ -1494,69 +1732,86 @@
         <w:tabs>
           <w:tab w:val="right" w:leader="dot" w:pos="10272"/>
         </w:tabs>
+        <w:spacing w:after="0" w:line="260" w:lineRule="exact"/>
         <w:rPr>
-          <w:rFonts w:asciiTheme="minorHAnsi" w:hAnsiTheme="minorHAnsi"/>
+          <w:rFonts w:ascii="Arial" w:hAnsi="Arial" w:cs="Arial"/>
           <w:noProof/>
           <w:kern w:val="2"/>
-          <w:sz w:val="24"/>
+          <w:sz w:val="22"/>
           <w:szCs w:val="24"/>
           <w:lang w:val="de-CH" w:eastAsia="de-CH"/>
           <w14:ligatures w14:val="standardContextual"/>
         </w:rPr>
       </w:pPr>
-      <w:hyperlink w:anchor="_Toc232778809" w:history="1">
+      <w:hyperlink w:anchor="_Toc232780592" w:history="1">
         <w:r>
           <w:rPr>
             <w:rStyle w:val="Hyperlink"/>
-            <w:noProof/>
+            <w:rFonts w:ascii="Arial" w:hAnsi="Arial" w:cs="Arial"/>
+            <w:noProof/>
+            <w:sz w:val="22"/>
           </w:rPr>
           <w:t>5.2 Main Workflow</w:t>
         </w:r>
         <w:r>
           <w:rPr>
-            <w:noProof/>
-            <w:webHidden/>
+            <w:rFonts w:ascii="Arial" w:hAnsi="Arial" w:cs="Arial"/>
+            <w:noProof/>
+            <w:webHidden/>
+            <w:sz w:val="22"/>
           </w:rPr>
           <w:tab/>
         </w:r>
         <w:r>
           <w:rPr>
-            <w:noProof/>
-            <w:webHidden/>
+            <w:rFonts w:ascii="Arial" w:hAnsi="Arial" w:cs="Arial"/>
+            <w:noProof/>
+            <w:webHidden/>
+            <w:sz w:val="22"/>
           </w:rPr>
           <w:fldChar w:fldCharType="begin"/>
         </w:r>
         <w:r>
           <w:rPr>
-            <w:noProof/>
-            <w:webHidden/>
-          </w:rPr>
-          <w:instrText xml:space="preserve"> PAGEREF _Toc232778809 \h </w:instrText>
-        </w:r>
-        <w:r>
-          <w:rPr>
-            <w:noProof/>
-            <w:webHidden/>
-          </w:rPr>
-        </w:r>
-        <w:r>
-          <w:rPr>
-            <w:noProof/>
-            <w:webHidden/>
+            <w:rFonts w:ascii="Arial" w:hAnsi="Arial" w:cs="Arial"/>
+            <w:noProof/>
+            <w:webHidden/>
+            <w:sz w:val="22"/>
+          </w:rPr>
+          <w:instrText xml:space="preserve"> PAGEREF _Toc232780592 \h </w:instrText>
+        </w:r>
+        <w:r>
+          <w:rPr>
+            <w:rFonts w:ascii="Arial" w:hAnsi="Arial" w:cs="Arial"/>
+            <w:noProof/>
+            <w:webHidden/>
+            <w:sz w:val="22"/>
+          </w:rPr>
+        </w:r>
+        <w:r>
+          <w:rPr>
+            <w:rFonts w:ascii="Arial" w:hAnsi="Arial" w:cs="Arial"/>
+            <w:noProof/>
+            <w:webHidden/>
+            <w:sz w:val="22"/>
           </w:rPr>
           <w:fldChar w:fldCharType="separate"/>
         </w:r>
         <w:r>
           <w:rPr>
-            <w:noProof/>
-            <w:webHidden/>
+            <w:rFonts w:ascii="Arial" w:hAnsi="Arial" w:cs="Arial"/>
+            <w:noProof/>
+            <w:webHidden/>
+            <w:sz w:val="22"/>
           </w:rPr>
           <w:t>5</w:t>
         </w:r>
         <w:r>
           <w:rPr>
-            <w:noProof/>
-            <w:webHidden/>
+            <w:rFonts w:ascii="Arial" w:hAnsi="Arial" w:cs="Arial"/>
+            <w:noProof/>
+            <w:webHidden/>
+            <w:sz w:val="22"/>
           </w:rPr>
           <w:fldChar w:fldCharType="end"/>
         </w:r>
@@ -1568,69 +1823,86 @@
         <w:tabs>
           <w:tab w:val="right" w:leader="dot" w:pos="10272"/>
         </w:tabs>
+        <w:spacing w:after="0" w:line="260" w:lineRule="exact"/>
         <w:rPr>
-          <w:rFonts w:asciiTheme="minorHAnsi" w:hAnsiTheme="minorHAnsi"/>
+          <w:rFonts w:ascii="Arial" w:hAnsi="Arial" w:cs="Arial"/>
           <w:noProof/>
           <w:kern w:val="2"/>
-          <w:sz w:val="24"/>
+          <w:sz w:val="22"/>
           <w:szCs w:val="24"/>
           <w:lang w:val="de-CH" w:eastAsia="de-CH"/>
           <w14:ligatures w14:val="standardContextual"/>
         </w:rPr>
       </w:pPr>
-      <w:hyperlink w:anchor="_Toc232778810" w:history="1">
+      <w:hyperlink w:anchor="_Toc232780593" w:history="1">
         <w:r>
           <w:rPr>
             <w:rStyle w:val="Hyperlink"/>
-            <w:noProof/>
+            <w:rFonts w:ascii="Arial" w:hAnsi="Arial" w:cs="Arial"/>
+            <w:noProof/>
+            <w:sz w:val="22"/>
           </w:rPr>
           <w:t>5.3 System Architecture Diagram</w:t>
         </w:r>
         <w:r>
           <w:rPr>
-            <w:noProof/>
-            <w:webHidden/>
+            <w:rFonts w:ascii="Arial" w:hAnsi="Arial" w:cs="Arial"/>
+            <w:noProof/>
+            <w:webHidden/>
+            <w:sz w:val="22"/>
           </w:rPr>
           <w:tab/>
         </w:r>
         <w:r>
           <w:rPr>
-            <w:noProof/>
-            <w:webHidden/>
+            <w:rFonts w:ascii="Arial" w:hAnsi="Arial" w:cs="Arial"/>
+            <w:noProof/>
+            <w:webHidden/>
+            <w:sz w:val="22"/>
           </w:rPr>
           <w:fldChar w:fldCharType="begin"/>
         </w:r>
         <w:r>
           <w:rPr>
-            <w:noProof/>
-            <w:webHidden/>
-          </w:rPr>
-          <w:instrText xml:space="preserve"> PAGEREF _Toc232778810 \h </w:instrText>
-        </w:r>
-        <w:r>
-          <w:rPr>
-            <w:noProof/>
-            <w:webHidden/>
-          </w:rPr>
-        </w:r>
-        <w:r>
-          <w:rPr>
-            <w:noProof/>
-            <w:webHidden/>
+            <w:rFonts w:ascii="Arial" w:hAnsi="Arial" w:cs="Arial"/>
+            <w:noProof/>
+            <w:webHidden/>
+            <w:sz w:val="22"/>
+          </w:rPr>
+          <w:instrText xml:space="preserve"> PAGEREF _Toc232780593 \h </w:instrText>
+        </w:r>
+        <w:r>
+          <w:rPr>
+            <w:rFonts w:ascii="Arial" w:hAnsi="Arial" w:cs="Arial"/>
+            <w:noProof/>
+            <w:webHidden/>
+            <w:sz w:val="22"/>
+          </w:rPr>
+        </w:r>
+        <w:r>
+          <w:rPr>
+            <w:rFonts w:ascii="Arial" w:hAnsi="Arial" w:cs="Arial"/>
+            <w:noProof/>
+            <w:webHidden/>
+            <w:sz w:val="22"/>
           </w:rPr>
           <w:fldChar w:fldCharType="separate"/>
         </w:r>
         <w:r>
           <w:rPr>
-            <w:noProof/>
-            <w:webHidden/>
+            <w:rFonts w:ascii="Arial" w:hAnsi="Arial" w:cs="Arial"/>
+            <w:noProof/>
+            <w:webHidden/>
+            <w:sz w:val="22"/>
           </w:rPr>
           <w:t>6</w:t>
         </w:r>
         <w:r>
           <w:rPr>
-            <w:noProof/>
-            <w:webHidden/>
+            <w:rFonts w:ascii="Arial" w:hAnsi="Arial" w:cs="Arial"/>
+            <w:noProof/>
+            <w:webHidden/>
+            <w:sz w:val="22"/>
           </w:rPr>
           <w:fldChar w:fldCharType="end"/>
         </w:r>
@@ -1642,69 +1914,86 @@
         <w:tabs>
           <w:tab w:val="right" w:leader="dot" w:pos="10272"/>
         </w:tabs>
+        <w:spacing w:after="0" w:line="260" w:lineRule="exact"/>
         <w:rPr>
-          <w:rFonts w:asciiTheme="minorHAnsi" w:hAnsiTheme="minorHAnsi"/>
+          <w:rFonts w:ascii="Arial" w:hAnsi="Arial" w:cs="Arial"/>
           <w:noProof/>
           <w:kern w:val="2"/>
-          <w:sz w:val="24"/>
+          <w:sz w:val="22"/>
           <w:szCs w:val="24"/>
           <w:lang w:val="de-CH" w:eastAsia="de-CH"/>
           <w14:ligatures w14:val="standardContextual"/>
         </w:rPr>
       </w:pPr>
-      <w:hyperlink w:anchor="_Toc232778811" w:history="1">
+      <w:hyperlink w:anchor="_Toc232780594" w:history="1">
         <w:r>
           <w:rPr>
             <w:rStyle w:val="Hyperlink"/>
-            <w:noProof/>
+            <w:rFonts w:ascii="Arial" w:hAnsi="Arial" w:cs="Arial"/>
+            <w:noProof/>
+            <w:sz w:val="22"/>
           </w:rPr>
           <w:t>5.4 UML Activity Diagram</w:t>
         </w:r>
         <w:r>
           <w:rPr>
-            <w:noProof/>
-            <w:webHidden/>
+            <w:rFonts w:ascii="Arial" w:hAnsi="Arial" w:cs="Arial"/>
+            <w:noProof/>
+            <w:webHidden/>
+            <w:sz w:val="22"/>
           </w:rPr>
           <w:tab/>
         </w:r>
         <w:r>
           <w:rPr>
-            <w:noProof/>
-            <w:webHidden/>
+            <w:rFonts w:ascii="Arial" w:hAnsi="Arial" w:cs="Arial"/>
+            <w:noProof/>
+            <w:webHidden/>
+            <w:sz w:val="22"/>
           </w:rPr>
           <w:fldChar w:fldCharType="begin"/>
         </w:r>
         <w:r>
           <w:rPr>
-            <w:noProof/>
-            <w:webHidden/>
-          </w:rPr>
-          <w:instrText xml:space="preserve"> PAGEREF _Toc232778811 \h </w:instrText>
-        </w:r>
-        <w:r>
-          <w:rPr>
-            <w:noProof/>
-            <w:webHidden/>
-          </w:rPr>
-        </w:r>
-        <w:r>
-          <w:rPr>
-            <w:noProof/>
-            <w:webHidden/>
+            <w:rFonts w:ascii="Arial" w:hAnsi="Arial" w:cs="Arial"/>
+            <w:noProof/>
+            <w:webHidden/>
+            <w:sz w:val="22"/>
+          </w:rPr>
+          <w:instrText xml:space="preserve"> PAGEREF _Toc232780594 \h </w:instrText>
+        </w:r>
+        <w:r>
+          <w:rPr>
+            <w:rFonts w:ascii="Arial" w:hAnsi="Arial" w:cs="Arial"/>
+            <w:noProof/>
+            <w:webHidden/>
+            <w:sz w:val="22"/>
+          </w:rPr>
+        </w:r>
+        <w:r>
+          <w:rPr>
+            <w:rFonts w:ascii="Arial" w:hAnsi="Arial" w:cs="Arial"/>
+            <w:noProof/>
+            <w:webHidden/>
+            <w:sz w:val="22"/>
           </w:rPr>
           <w:fldChar w:fldCharType="separate"/>
         </w:r>
         <w:r>
           <w:rPr>
-            <w:noProof/>
-            <w:webHidden/>
+            <w:rFonts w:ascii="Arial" w:hAnsi="Arial" w:cs="Arial"/>
+            <w:noProof/>
+            <w:webHidden/>
+            <w:sz w:val="22"/>
           </w:rPr>
           <w:t>7</w:t>
         </w:r>
         <w:r>
           <w:rPr>
-            <w:noProof/>
-            <w:webHidden/>
+            <w:rFonts w:ascii="Arial" w:hAnsi="Arial" w:cs="Arial"/>
+            <w:noProof/>
+            <w:webHidden/>
+            <w:sz w:val="22"/>
           </w:rPr>
           <w:fldChar w:fldCharType="end"/>
         </w:r>
@@ -1716,69 +2005,86 @@
         <w:tabs>
           <w:tab w:val="right" w:leader="dot" w:pos="10272"/>
         </w:tabs>
+        <w:spacing w:after="0" w:line="260" w:lineRule="exact"/>
         <w:rPr>
-          <w:rFonts w:asciiTheme="minorHAnsi" w:hAnsiTheme="minorHAnsi"/>
+          <w:rFonts w:ascii="Arial" w:hAnsi="Arial" w:cs="Arial"/>
           <w:noProof/>
           <w:kern w:val="2"/>
-          <w:sz w:val="24"/>
+          <w:sz w:val="22"/>
           <w:szCs w:val="24"/>
           <w:lang w:val="de-CH" w:eastAsia="de-CH"/>
           <w14:ligatures w14:val="standardContextual"/>
         </w:rPr>
       </w:pPr>
-      <w:hyperlink w:anchor="_Toc232778812" w:history="1">
+      <w:hyperlink w:anchor="_Toc232780595" w:history="1">
         <w:r>
           <w:rPr>
             <w:rStyle w:val="Hyperlink"/>
-            <w:noProof/>
+            <w:rFonts w:ascii="Arial" w:hAnsi="Arial" w:cs="Arial"/>
+            <w:noProof/>
+            <w:sz w:val="22"/>
           </w:rPr>
           <w:t>5.5 UML Component Diagram</w:t>
         </w:r>
         <w:r>
           <w:rPr>
-            <w:noProof/>
-            <w:webHidden/>
+            <w:rFonts w:ascii="Arial" w:hAnsi="Arial" w:cs="Arial"/>
+            <w:noProof/>
+            <w:webHidden/>
+            <w:sz w:val="22"/>
           </w:rPr>
           <w:tab/>
         </w:r>
         <w:r>
           <w:rPr>
-            <w:noProof/>
-            <w:webHidden/>
+            <w:rFonts w:ascii="Arial" w:hAnsi="Arial" w:cs="Arial"/>
+            <w:noProof/>
+            <w:webHidden/>
+            <w:sz w:val="22"/>
           </w:rPr>
           <w:fldChar w:fldCharType="begin"/>
         </w:r>
         <w:r>
           <w:rPr>
-            <w:noProof/>
-            <w:webHidden/>
-          </w:rPr>
-          <w:instrText xml:space="preserve"> PAGEREF _Toc232778812 \h </w:instrText>
-        </w:r>
-        <w:r>
-          <w:rPr>
-            <w:noProof/>
-            <w:webHidden/>
-          </w:rPr>
-        </w:r>
-        <w:r>
-          <w:rPr>
-            <w:noProof/>
-            <w:webHidden/>
+            <w:rFonts w:ascii="Arial" w:hAnsi="Arial" w:cs="Arial"/>
+            <w:noProof/>
+            <w:webHidden/>
+            <w:sz w:val="22"/>
+          </w:rPr>
+          <w:instrText xml:space="preserve"> PAGEREF _Toc232780595 \h </w:instrText>
+        </w:r>
+        <w:r>
+          <w:rPr>
+            <w:rFonts w:ascii="Arial" w:hAnsi="Arial" w:cs="Arial"/>
+            <w:noProof/>
+            <w:webHidden/>
+            <w:sz w:val="22"/>
+          </w:rPr>
+        </w:r>
+        <w:r>
+          <w:rPr>
+            <w:rFonts w:ascii="Arial" w:hAnsi="Arial" w:cs="Arial"/>
+            <w:noProof/>
+            <w:webHidden/>
+            <w:sz w:val="22"/>
           </w:rPr>
           <w:fldChar w:fldCharType="separate"/>
         </w:r>
         <w:r>
           <w:rPr>
-            <w:noProof/>
-            <w:webHidden/>
+            <w:rFonts w:ascii="Arial" w:hAnsi="Arial" w:cs="Arial"/>
+            <w:noProof/>
+            <w:webHidden/>
+            <w:sz w:val="22"/>
           </w:rPr>
           <w:t>8</w:t>
         </w:r>
         <w:r>
           <w:rPr>
-            <w:noProof/>
-            <w:webHidden/>
+            <w:rFonts w:ascii="Arial" w:hAnsi="Arial" w:cs="Arial"/>
+            <w:noProof/>
+            <w:webHidden/>
+            <w:sz w:val="22"/>
           </w:rPr>
           <w:fldChar w:fldCharType="end"/>
         </w:r>
@@ -1790,69 +2096,86 @@
         <w:tabs>
           <w:tab w:val="right" w:leader="dot" w:pos="10272"/>
         </w:tabs>
+        <w:spacing w:after="0" w:line="260" w:lineRule="exact"/>
         <w:rPr>
-          <w:rFonts w:asciiTheme="minorHAnsi" w:hAnsiTheme="minorHAnsi"/>
+          <w:rFonts w:ascii="Arial" w:hAnsi="Arial" w:cs="Arial"/>
           <w:noProof/>
           <w:kern w:val="2"/>
-          <w:sz w:val="24"/>
+          <w:sz w:val="22"/>
           <w:szCs w:val="24"/>
           <w:lang w:val="de-CH" w:eastAsia="de-CH"/>
           <w14:ligatures w14:val="standardContextual"/>
         </w:rPr>
       </w:pPr>
-      <w:hyperlink w:anchor="_Toc232778813" w:history="1">
+      <w:hyperlink w:anchor="_Toc232780596" w:history="1">
         <w:r>
           <w:rPr>
             <w:rStyle w:val="Hyperlink"/>
-            <w:noProof/>
+            <w:rFonts w:ascii="Arial" w:hAnsi="Arial" w:cs="Arial"/>
+            <w:noProof/>
+            <w:sz w:val="22"/>
           </w:rPr>
           <w:t>5.6 UML Deployment Diagram</w:t>
         </w:r>
         <w:r>
           <w:rPr>
-            <w:noProof/>
-            <w:webHidden/>
+            <w:rFonts w:ascii="Arial" w:hAnsi="Arial" w:cs="Arial"/>
+            <w:noProof/>
+            <w:webHidden/>
+            <w:sz w:val="22"/>
           </w:rPr>
           <w:tab/>
         </w:r>
         <w:r>
           <w:rPr>
-            <w:noProof/>
-            <w:webHidden/>
+            <w:rFonts w:ascii="Arial" w:hAnsi="Arial" w:cs="Arial"/>
+            <w:noProof/>
+            <w:webHidden/>
+            <w:sz w:val="22"/>
           </w:rPr>
           <w:fldChar w:fldCharType="begin"/>
         </w:r>
         <w:r>
           <w:rPr>
-            <w:noProof/>
-            <w:webHidden/>
-          </w:rPr>
-          <w:instrText xml:space="preserve"> PAGEREF _Toc232778813 \h </w:instrText>
-        </w:r>
-        <w:r>
-          <w:rPr>
-            <w:noProof/>
-            <w:webHidden/>
-          </w:rPr>
-        </w:r>
-        <w:r>
-          <w:rPr>
-            <w:noProof/>
-            <w:webHidden/>
+            <w:rFonts w:ascii="Arial" w:hAnsi="Arial" w:cs="Arial"/>
+            <w:noProof/>
+            <w:webHidden/>
+            <w:sz w:val="22"/>
+          </w:rPr>
+          <w:instrText xml:space="preserve"> PAGEREF _Toc232780596 \h </w:instrText>
+        </w:r>
+        <w:r>
+          <w:rPr>
+            <w:rFonts w:ascii="Arial" w:hAnsi="Arial" w:cs="Arial"/>
+            <w:noProof/>
+            <w:webHidden/>
+            <w:sz w:val="22"/>
+          </w:rPr>
+        </w:r>
+        <w:r>
+          <w:rPr>
+            <w:rFonts w:ascii="Arial" w:hAnsi="Arial" w:cs="Arial"/>
+            <w:noProof/>
+            <w:webHidden/>
+            <w:sz w:val="22"/>
           </w:rPr>
           <w:fldChar w:fldCharType="separate"/>
         </w:r>
         <w:r>
           <w:rPr>
-            <w:noProof/>
-            <w:webHidden/>
+            <w:rFonts w:ascii="Arial" w:hAnsi="Arial" w:cs="Arial"/>
+            <w:noProof/>
+            <w:webHidden/>
+            <w:sz w:val="22"/>
           </w:rPr>
           <w:t>8</w:t>
         </w:r>
         <w:r>
           <w:rPr>
-            <w:noProof/>
-            <w:webHidden/>
+            <w:rFonts w:ascii="Arial" w:hAnsi="Arial" w:cs="Arial"/>
+            <w:noProof/>
+            <w:webHidden/>
+            <w:sz w:val="22"/>
           </w:rPr>
           <w:fldChar w:fldCharType="end"/>
         </w:r>
@@ -1864,69 +2187,86 @@
         <w:tabs>
           <w:tab w:val="right" w:leader="dot" w:pos="10272"/>
         </w:tabs>
+        <w:spacing w:after="0" w:line="260" w:lineRule="exact"/>
         <w:rPr>
-          <w:rFonts w:asciiTheme="minorHAnsi" w:hAnsiTheme="minorHAnsi"/>
+          <w:rFonts w:ascii="Arial" w:hAnsi="Arial" w:cs="Arial"/>
           <w:noProof/>
           <w:kern w:val="2"/>
-          <w:sz w:val="24"/>
+          <w:sz w:val="22"/>
           <w:szCs w:val="24"/>
           <w:lang w:val="de-CH" w:eastAsia="de-CH"/>
           <w14:ligatures w14:val="standardContextual"/>
         </w:rPr>
       </w:pPr>
-      <w:hyperlink w:anchor="_Toc232778814" w:history="1">
+      <w:hyperlink w:anchor="_Toc232780597" w:history="1">
         <w:r>
           <w:rPr>
             <w:rStyle w:val="Hyperlink"/>
-            <w:noProof/>
+            <w:rFonts w:ascii="Arial" w:hAnsi="Arial" w:cs="Arial"/>
+            <w:noProof/>
+            <w:sz w:val="22"/>
           </w:rPr>
           <w:t>5.7 UML Class Diagram</w:t>
         </w:r>
         <w:r>
           <w:rPr>
-            <w:noProof/>
-            <w:webHidden/>
+            <w:rFonts w:ascii="Arial" w:hAnsi="Arial" w:cs="Arial"/>
+            <w:noProof/>
+            <w:webHidden/>
+            <w:sz w:val="22"/>
           </w:rPr>
           <w:tab/>
         </w:r>
         <w:r>
           <w:rPr>
-            <w:noProof/>
-            <w:webHidden/>
+            <w:rFonts w:ascii="Arial" w:hAnsi="Arial" w:cs="Arial"/>
+            <w:noProof/>
+            <w:webHidden/>
+            <w:sz w:val="22"/>
           </w:rPr>
           <w:fldChar w:fldCharType="begin"/>
         </w:r>
         <w:r>
           <w:rPr>
-            <w:noProof/>
-            <w:webHidden/>
-          </w:rPr>
-          <w:instrText xml:space="preserve"> PAGEREF _Toc232778814 \h </w:instrText>
-        </w:r>
-        <w:r>
-          <w:rPr>
-            <w:noProof/>
-            <w:webHidden/>
-          </w:rPr>
-        </w:r>
-        <w:r>
-          <w:rPr>
-            <w:noProof/>
-            <w:webHidden/>
+            <w:rFonts w:ascii="Arial" w:hAnsi="Arial" w:cs="Arial"/>
+            <w:noProof/>
+            <w:webHidden/>
+            <w:sz w:val="22"/>
+          </w:rPr>
+          <w:instrText xml:space="preserve"> PAGEREF _Toc232780597 \h </w:instrText>
+        </w:r>
+        <w:r>
+          <w:rPr>
+            <w:rFonts w:ascii="Arial" w:hAnsi="Arial" w:cs="Arial"/>
+            <w:noProof/>
+            <w:webHidden/>
+            <w:sz w:val="22"/>
+          </w:rPr>
+        </w:r>
+        <w:r>
+          <w:rPr>
+            <w:rFonts w:ascii="Arial" w:hAnsi="Arial" w:cs="Arial"/>
+            <w:noProof/>
+            <w:webHidden/>
+            <w:sz w:val="22"/>
           </w:rPr>
           <w:fldChar w:fldCharType="separate"/>
         </w:r>
         <w:r>
           <w:rPr>
-            <w:noProof/>
-            <w:webHidden/>
+            <w:rFonts w:ascii="Arial" w:hAnsi="Arial" w:cs="Arial"/>
+            <w:noProof/>
+            <w:webHidden/>
+            <w:sz w:val="22"/>
           </w:rPr>
           <w:t>9</w:t>
         </w:r>
         <w:r>
           <w:rPr>
-            <w:noProof/>
-            <w:webHidden/>
+            <w:rFonts w:ascii="Arial" w:hAnsi="Arial" w:cs="Arial"/>
+            <w:noProof/>
+            <w:webHidden/>
+            <w:sz w:val="22"/>
           </w:rPr>
           <w:fldChar w:fldCharType="end"/>
         </w:r>
@@ -1938,69 +2278,86 @@
         <w:tabs>
           <w:tab w:val="right" w:leader="dot" w:pos="10272"/>
         </w:tabs>
+        <w:spacing w:after="0" w:line="260" w:lineRule="exact"/>
         <w:rPr>
-          <w:rFonts w:asciiTheme="minorHAnsi" w:hAnsiTheme="minorHAnsi"/>
+          <w:rFonts w:ascii="Arial" w:hAnsi="Arial" w:cs="Arial"/>
           <w:noProof/>
           <w:kern w:val="2"/>
-          <w:sz w:val="24"/>
+          <w:sz w:val="22"/>
           <w:szCs w:val="24"/>
           <w:lang w:val="de-CH" w:eastAsia="de-CH"/>
           <w14:ligatures w14:val="standardContextual"/>
         </w:rPr>
       </w:pPr>
-      <w:hyperlink w:anchor="_Toc232778815" w:history="1">
+      <w:hyperlink w:anchor="_Toc232780598" w:history="1">
         <w:r>
           <w:rPr>
             <w:rStyle w:val="Hyperlink"/>
-            <w:noProof/>
+            <w:rFonts w:ascii="Arial" w:hAnsi="Arial" w:cs="Arial"/>
+            <w:noProof/>
+            <w:sz w:val="22"/>
           </w:rPr>
           <w:t>5.8 ER Diagram</w:t>
         </w:r>
         <w:r>
           <w:rPr>
-            <w:noProof/>
-            <w:webHidden/>
+            <w:rFonts w:ascii="Arial" w:hAnsi="Arial" w:cs="Arial"/>
+            <w:noProof/>
+            <w:webHidden/>
+            <w:sz w:val="22"/>
           </w:rPr>
           <w:tab/>
         </w:r>
         <w:r>
           <w:rPr>
-            <w:noProof/>
-            <w:webHidden/>
+            <w:rFonts w:ascii="Arial" w:hAnsi="Arial" w:cs="Arial"/>
+            <w:noProof/>
+            <w:webHidden/>
+            <w:sz w:val="22"/>
           </w:rPr>
           <w:fldChar w:fldCharType="begin"/>
         </w:r>
         <w:r>
           <w:rPr>
-            <w:noProof/>
-            <w:webHidden/>
-          </w:rPr>
-          <w:instrText xml:space="preserve"> PAGEREF _Toc232778815 \h </w:instrText>
-        </w:r>
-        <w:r>
-          <w:rPr>
-            <w:noProof/>
-            <w:webHidden/>
-          </w:rPr>
-        </w:r>
-        <w:r>
-          <w:rPr>
-            <w:noProof/>
-            <w:webHidden/>
+            <w:rFonts w:ascii="Arial" w:hAnsi="Arial" w:cs="Arial"/>
+            <w:noProof/>
+            <w:webHidden/>
+            <w:sz w:val="22"/>
+          </w:rPr>
+          <w:instrText xml:space="preserve"> PAGEREF _Toc232780598 \h </w:instrText>
+        </w:r>
+        <w:r>
+          <w:rPr>
+            <w:rFonts w:ascii="Arial" w:hAnsi="Arial" w:cs="Arial"/>
+            <w:noProof/>
+            <w:webHidden/>
+            <w:sz w:val="22"/>
+          </w:rPr>
+        </w:r>
+        <w:r>
+          <w:rPr>
+            <w:rFonts w:ascii="Arial" w:hAnsi="Arial" w:cs="Arial"/>
+            <w:noProof/>
+            <w:webHidden/>
+            <w:sz w:val="22"/>
           </w:rPr>
           <w:fldChar w:fldCharType="separate"/>
         </w:r>
         <w:r>
           <w:rPr>
-            <w:noProof/>
-            <w:webHidden/>
+            <w:rFonts w:ascii="Arial" w:hAnsi="Arial" w:cs="Arial"/>
+            <w:noProof/>
+            <w:webHidden/>
+            <w:sz w:val="22"/>
           </w:rPr>
           <w:t>9</w:t>
         </w:r>
         <w:r>
           <w:rPr>
-            <w:noProof/>
-            <w:webHidden/>
+            <w:rFonts w:ascii="Arial" w:hAnsi="Arial" w:cs="Arial"/>
+            <w:noProof/>
+            <w:webHidden/>
+            <w:sz w:val="22"/>
           </w:rPr>
           <w:fldChar w:fldCharType="end"/>
         </w:r>
@@ -2012,69 +2369,86 @@
         <w:tabs>
           <w:tab w:val="right" w:leader="dot" w:pos="10272"/>
         </w:tabs>
+        <w:spacing w:after="0" w:line="260" w:lineRule="exact"/>
         <w:rPr>
-          <w:rFonts w:asciiTheme="minorHAnsi" w:hAnsiTheme="minorHAnsi"/>
+          <w:rFonts w:ascii="Arial" w:hAnsi="Arial" w:cs="Arial"/>
           <w:noProof/>
           <w:kern w:val="2"/>
-          <w:sz w:val="24"/>
+          <w:sz w:val="22"/>
           <w:szCs w:val="24"/>
           <w:lang w:val="de-CH" w:eastAsia="de-CH"/>
           <w14:ligatures w14:val="standardContextual"/>
         </w:rPr>
       </w:pPr>
-      <w:hyperlink w:anchor="_Toc232778816" w:history="1">
+      <w:hyperlink w:anchor="_Toc232780599" w:history="1">
         <w:r>
           <w:rPr>
             <w:rStyle w:val="Hyperlink"/>
-            <w:noProof/>
+            <w:rFonts w:ascii="Arial" w:hAnsi="Arial" w:cs="Arial"/>
+            <w:noProof/>
+            <w:sz w:val="22"/>
           </w:rPr>
           <w:t>5.9 Flowchart</w:t>
         </w:r>
         <w:r>
           <w:rPr>
-            <w:noProof/>
-            <w:webHidden/>
+            <w:rFonts w:ascii="Arial" w:hAnsi="Arial" w:cs="Arial"/>
+            <w:noProof/>
+            <w:webHidden/>
+            <w:sz w:val="22"/>
           </w:rPr>
           <w:tab/>
         </w:r>
         <w:r>
           <w:rPr>
-            <w:noProof/>
-            <w:webHidden/>
+            <w:rFonts w:ascii="Arial" w:hAnsi="Arial" w:cs="Arial"/>
+            <w:noProof/>
+            <w:webHidden/>
+            <w:sz w:val="22"/>
           </w:rPr>
           <w:fldChar w:fldCharType="begin"/>
         </w:r>
         <w:r>
           <w:rPr>
-            <w:noProof/>
-            <w:webHidden/>
-          </w:rPr>
-          <w:instrText xml:space="preserve"> PAGEREF _Toc232778816 \h </w:instrText>
-        </w:r>
-        <w:r>
-          <w:rPr>
-            <w:noProof/>
-            <w:webHidden/>
-          </w:rPr>
-        </w:r>
-        <w:r>
-          <w:rPr>
-            <w:noProof/>
-            <w:webHidden/>
+            <w:rFonts w:ascii="Arial" w:hAnsi="Arial" w:cs="Arial"/>
+            <w:noProof/>
+            <w:webHidden/>
+            <w:sz w:val="22"/>
+          </w:rPr>
+          <w:instrText xml:space="preserve"> PAGEREF _Toc232780599 \h </w:instrText>
+        </w:r>
+        <w:r>
+          <w:rPr>
+            <w:rFonts w:ascii="Arial" w:hAnsi="Arial" w:cs="Arial"/>
+            <w:noProof/>
+            <w:webHidden/>
+            <w:sz w:val="22"/>
+          </w:rPr>
+        </w:r>
+        <w:r>
+          <w:rPr>
+            <w:rFonts w:ascii="Arial" w:hAnsi="Arial" w:cs="Arial"/>
+            <w:noProof/>
+            <w:webHidden/>
+            <w:sz w:val="22"/>
           </w:rPr>
           <w:fldChar w:fldCharType="separate"/>
         </w:r>
         <w:r>
           <w:rPr>
-            <w:noProof/>
-            <w:webHidden/>
+            <w:rFonts w:ascii="Arial" w:hAnsi="Arial" w:cs="Arial"/>
+            <w:noProof/>
+            <w:webHidden/>
+            <w:sz w:val="22"/>
           </w:rPr>
           <w:t>10</w:t>
         </w:r>
         <w:r>
           <w:rPr>
-            <w:noProof/>
-            <w:webHidden/>
+            <w:rFonts w:ascii="Arial" w:hAnsi="Arial" w:cs="Arial"/>
+            <w:noProof/>
+            <w:webHidden/>
+            <w:sz w:val="22"/>
           </w:rPr>
           <w:fldChar w:fldCharType="end"/>
         </w:r>
@@ -2086,69 +2460,86 @@
         <w:tabs>
           <w:tab w:val="right" w:leader="dot" w:pos="10272"/>
         </w:tabs>
+        <w:spacing w:after="0" w:line="260" w:lineRule="exact"/>
         <w:rPr>
-          <w:rFonts w:asciiTheme="minorHAnsi" w:hAnsiTheme="minorHAnsi"/>
+          <w:rFonts w:ascii="Arial" w:hAnsi="Arial" w:cs="Arial"/>
           <w:noProof/>
           <w:kern w:val="2"/>
-          <w:sz w:val="24"/>
+          <w:sz w:val="22"/>
           <w:szCs w:val="24"/>
           <w:lang w:val="de-CH" w:eastAsia="de-CH"/>
           <w14:ligatures w14:val="standardContextual"/>
         </w:rPr>
       </w:pPr>
-      <w:hyperlink w:anchor="_Toc232778817" w:history="1">
+      <w:hyperlink w:anchor="_Toc232780600" w:history="1">
         <w:r>
           <w:rPr>
             <w:rStyle w:val="Hyperlink"/>
-            <w:noProof/>
+            <w:rFonts w:ascii="Arial" w:hAnsi="Arial" w:cs="Arial"/>
+            <w:noProof/>
+            <w:sz w:val="22"/>
           </w:rPr>
           <w:t>6. Database Design</w:t>
         </w:r>
         <w:r>
           <w:rPr>
-            <w:noProof/>
-            <w:webHidden/>
+            <w:rFonts w:ascii="Arial" w:hAnsi="Arial" w:cs="Arial"/>
+            <w:noProof/>
+            <w:webHidden/>
+            <w:sz w:val="22"/>
           </w:rPr>
           <w:tab/>
         </w:r>
         <w:r>
           <w:rPr>
-            <w:noProof/>
-            <w:webHidden/>
+            <w:rFonts w:ascii="Arial" w:hAnsi="Arial" w:cs="Arial"/>
+            <w:noProof/>
+            <w:webHidden/>
+            <w:sz w:val="22"/>
           </w:rPr>
           <w:fldChar w:fldCharType="begin"/>
         </w:r>
         <w:r>
           <w:rPr>
-            <w:noProof/>
-            <w:webHidden/>
-          </w:rPr>
-          <w:instrText xml:space="preserve"> PAGEREF _Toc232778817 \h </w:instrText>
-        </w:r>
-        <w:r>
-          <w:rPr>
-            <w:noProof/>
-            <w:webHidden/>
-          </w:rPr>
-        </w:r>
-        <w:r>
-          <w:rPr>
-            <w:noProof/>
-            <w:webHidden/>
+            <w:rFonts w:ascii="Arial" w:hAnsi="Arial" w:cs="Arial"/>
+            <w:noProof/>
+            <w:webHidden/>
+            <w:sz w:val="22"/>
+          </w:rPr>
+          <w:instrText xml:space="preserve"> PAGEREF _Toc232780600 \h </w:instrText>
+        </w:r>
+        <w:r>
+          <w:rPr>
+            <w:rFonts w:ascii="Arial" w:hAnsi="Arial" w:cs="Arial"/>
+            <w:noProof/>
+            <w:webHidden/>
+            <w:sz w:val="22"/>
+          </w:rPr>
+        </w:r>
+        <w:r>
+          <w:rPr>
+            <w:rFonts w:ascii="Arial" w:hAnsi="Arial" w:cs="Arial"/>
+            <w:noProof/>
+            <w:webHidden/>
+            <w:sz w:val="22"/>
           </w:rPr>
           <w:fldChar w:fldCharType="separate"/>
         </w:r>
         <w:r>
           <w:rPr>
-            <w:noProof/>
-            <w:webHidden/>
+            <w:rFonts w:ascii="Arial" w:hAnsi="Arial" w:cs="Arial"/>
+            <w:noProof/>
+            <w:webHidden/>
+            <w:sz w:val="22"/>
           </w:rPr>
           <w:t>10</w:t>
         </w:r>
         <w:r>
           <w:rPr>
-            <w:noProof/>
-            <w:webHidden/>
+            <w:rFonts w:ascii="Arial" w:hAnsi="Arial" w:cs="Arial"/>
+            <w:noProof/>
+            <w:webHidden/>
+            <w:sz w:val="22"/>
           </w:rPr>
           <w:fldChar w:fldCharType="end"/>
         </w:r>
@@ -2160,69 +2551,86 @@
         <w:tabs>
           <w:tab w:val="right" w:leader="dot" w:pos="10272"/>
         </w:tabs>
+        <w:spacing w:after="0" w:line="260" w:lineRule="exact"/>
         <w:rPr>
-          <w:rFonts w:asciiTheme="minorHAnsi" w:hAnsiTheme="minorHAnsi"/>
+          <w:rFonts w:ascii="Arial" w:hAnsi="Arial" w:cs="Arial"/>
           <w:noProof/>
           <w:kern w:val="2"/>
-          <w:sz w:val="24"/>
+          <w:sz w:val="22"/>
           <w:szCs w:val="24"/>
           <w:lang w:val="de-CH" w:eastAsia="de-CH"/>
           <w14:ligatures w14:val="standardContextual"/>
         </w:rPr>
       </w:pPr>
-      <w:hyperlink w:anchor="_Toc232778818" w:history="1">
+      <w:hyperlink w:anchor="_Toc232780601" w:history="1">
         <w:r>
           <w:rPr>
             <w:rStyle w:val="Hyperlink"/>
-            <w:noProof/>
+            <w:rFonts w:ascii="Arial" w:hAnsi="Arial" w:cs="Arial"/>
+            <w:noProof/>
+            <w:sz w:val="22"/>
           </w:rPr>
           <w:t>7. Installation And Usage</w:t>
         </w:r>
         <w:r>
           <w:rPr>
-            <w:noProof/>
-            <w:webHidden/>
+            <w:rFonts w:ascii="Arial" w:hAnsi="Arial" w:cs="Arial"/>
+            <w:noProof/>
+            <w:webHidden/>
+            <w:sz w:val="22"/>
           </w:rPr>
           <w:tab/>
         </w:r>
         <w:r>
           <w:rPr>
-            <w:noProof/>
-            <w:webHidden/>
+            <w:rFonts w:ascii="Arial" w:hAnsi="Arial" w:cs="Arial"/>
+            <w:noProof/>
+            <w:webHidden/>
+            <w:sz w:val="22"/>
           </w:rPr>
           <w:fldChar w:fldCharType="begin"/>
         </w:r>
         <w:r>
           <w:rPr>
-            <w:noProof/>
-            <w:webHidden/>
-          </w:rPr>
-          <w:instrText xml:space="preserve"> PAGEREF _Toc232778818 \h </w:instrText>
-        </w:r>
-        <w:r>
-          <w:rPr>
-            <w:noProof/>
-            <w:webHidden/>
-          </w:rPr>
-        </w:r>
-        <w:r>
-          <w:rPr>
-            <w:noProof/>
-            <w:webHidden/>
+            <w:rFonts w:ascii="Arial" w:hAnsi="Arial" w:cs="Arial"/>
+            <w:noProof/>
+            <w:webHidden/>
+            <w:sz w:val="22"/>
+          </w:rPr>
+          <w:instrText xml:space="preserve"> PAGEREF _Toc232780601 \h </w:instrText>
+        </w:r>
+        <w:r>
+          <w:rPr>
+            <w:rFonts w:ascii="Arial" w:hAnsi="Arial" w:cs="Arial"/>
+            <w:noProof/>
+            <w:webHidden/>
+            <w:sz w:val="22"/>
+          </w:rPr>
+        </w:r>
+        <w:r>
+          <w:rPr>
+            <w:rFonts w:ascii="Arial" w:hAnsi="Arial" w:cs="Arial"/>
+            <w:noProof/>
+            <w:webHidden/>
+            <w:sz w:val="22"/>
           </w:rPr>
           <w:fldChar w:fldCharType="separate"/>
         </w:r>
         <w:r>
           <w:rPr>
-            <w:noProof/>
-            <w:webHidden/>
+            <w:rFonts w:ascii="Arial" w:hAnsi="Arial" w:cs="Arial"/>
+            <w:noProof/>
+            <w:webHidden/>
+            <w:sz w:val="22"/>
           </w:rPr>
           <w:t>11</w:t>
         </w:r>
         <w:r>
           <w:rPr>
-            <w:noProof/>
-            <w:webHidden/>
+            <w:rFonts w:ascii="Arial" w:hAnsi="Arial" w:cs="Arial"/>
+            <w:noProof/>
+            <w:webHidden/>
+            <w:sz w:val="22"/>
           </w:rPr>
           <w:fldChar w:fldCharType="end"/>
         </w:r>
@@ -2234,69 +2642,86 @@
         <w:tabs>
           <w:tab w:val="right" w:leader="dot" w:pos="10272"/>
         </w:tabs>
+        <w:spacing w:after="0" w:line="260" w:lineRule="exact"/>
         <w:rPr>
-          <w:rFonts w:asciiTheme="minorHAnsi" w:hAnsiTheme="minorHAnsi"/>
+          <w:rFonts w:ascii="Arial" w:hAnsi="Arial" w:cs="Arial"/>
           <w:noProof/>
           <w:kern w:val="2"/>
-          <w:sz w:val="24"/>
+          <w:sz w:val="22"/>
           <w:szCs w:val="24"/>
           <w:lang w:val="de-CH" w:eastAsia="de-CH"/>
           <w14:ligatures w14:val="standardContextual"/>
         </w:rPr>
       </w:pPr>
-      <w:hyperlink w:anchor="_Toc232778819" w:history="1">
+      <w:hyperlink w:anchor="_Toc232780602" w:history="1">
         <w:r>
           <w:rPr>
             <w:rStyle w:val="Hyperlink"/>
-            <w:noProof/>
+            <w:rFonts w:ascii="Arial" w:hAnsi="Arial" w:cs="Arial"/>
+            <w:noProof/>
+            <w:sz w:val="22"/>
           </w:rPr>
           <w:t>7.1 Prerequisites</w:t>
         </w:r>
         <w:r>
           <w:rPr>
-            <w:noProof/>
-            <w:webHidden/>
+            <w:rFonts w:ascii="Arial" w:hAnsi="Arial" w:cs="Arial"/>
+            <w:noProof/>
+            <w:webHidden/>
+            <w:sz w:val="22"/>
           </w:rPr>
           <w:tab/>
         </w:r>
         <w:r>
           <w:rPr>
-            <w:noProof/>
-            <w:webHidden/>
+            <w:rFonts w:ascii="Arial" w:hAnsi="Arial" w:cs="Arial"/>
+            <w:noProof/>
+            <w:webHidden/>
+            <w:sz w:val="22"/>
           </w:rPr>
           <w:fldChar w:fldCharType="begin"/>
         </w:r>
         <w:r>
           <w:rPr>
-            <w:noProof/>
-            <w:webHidden/>
-          </w:rPr>
-          <w:instrText xml:space="preserve"> PAGEREF _Toc232778819 \h </w:instrText>
-        </w:r>
-        <w:r>
-          <w:rPr>
-            <w:noProof/>
-            <w:webHidden/>
-          </w:rPr>
-        </w:r>
-        <w:r>
-          <w:rPr>
-            <w:noProof/>
-            <w:webHidden/>
+            <w:rFonts w:ascii="Arial" w:hAnsi="Arial" w:cs="Arial"/>
+            <w:noProof/>
+            <w:webHidden/>
+            <w:sz w:val="22"/>
+          </w:rPr>
+          <w:instrText xml:space="preserve"> PAGEREF _Toc232780602 \h </w:instrText>
+        </w:r>
+        <w:r>
+          <w:rPr>
+            <w:rFonts w:ascii="Arial" w:hAnsi="Arial" w:cs="Arial"/>
+            <w:noProof/>
+            <w:webHidden/>
+            <w:sz w:val="22"/>
+          </w:rPr>
+        </w:r>
+        <w:r>
+          <w:rPr>
+            <w:rFonts w:ascii="Arial" w:hAnsi="Arial" w:cs="Arial"/>
+            <w:noProof/>
+            <w:webHidden/>
+            <w:sz w:val="22"/>
           </w:rPr>
           <w:fldChar w:fldCharType="separate"/>
         </w:r>
         <w:r>
           <w:rPr>
-            <w:noProof/>
-            <w:webHidden/>
+            <w:rFonts w:ascii="Arial" w:hAnsi="Arial" w:cs="Arial"/>
+            <w:noProof/>
+            <w:webHidden/>
+            <w:sz w:val="22"/>
           </w:rPr>
           <w:t>11</w:t>
         </w:r>
         <w:r>
           <w:rPr>
-            <w:noProof/>
-            <w:webHidden/>
+            <w:rFonts w:ascii="Arial" w:hAnsi="Arial" w:cs="Arial"/>
+            <w:noProof/>
+            <w:webHidden/>
+            <w:sz w:val="22"/>
           </w:rPr>
           <w:fldChar w:fldCharType="end"/>
         </w:r>
@@ -2308,69 +2733,86 @@
         <w:tabs>
           <w:tab w:val="right" w:leader="dot" w:pos="10272"/>
         </w:tabs>
+        <w:spacing w:after="0" w:line="260" w:lineRule="exact"/>
         <w:rPr>
-          <w:rFonts w:asciiTheme="minorHAnsi" w:hAnsiTheme="minorHAnsi"/>
+          <w:rFonts w:ascii="Arial" w:hAnsi="Arial" w:cs="Arial"/>
           <w:noProof/>
           <w:kern w:val="2"/>
-          <w:sz w:val="24"/>
+          <w:sz w:val="22"/>
           <w:szCs w:val="24"/>
           <w:lang w:val="de-CH" w:eastAsia="de-CH"/>
           <w14:ligatures w14:val="standardContextual"/>
         </w:rPr>
       </w:pPr>
-      <w:hyperlink w:anchor="_Toc232778820" w:history="1">
+      <w:hyperlink w:anchor="_Toc232780603" w:history="1">
         <w:r>
           <w:rPr>
             <w:rStyle w:val="Hyperlink"/>
-            <w:noProof/>
+            <w:rFonts w:ascii="Arial" w:hAnsi="Arial" w:cs="Arial"/>
+            <w:noProof/>
+            <w:sz w:val="22"/>
           </w:rPr>
           <w:t>7.2 Clone Or Open The Project</w:t>
         </w:r>
         <w:r>
           <w:rPr>
-            <w:noProof/>
-            <w:webHidden/>
+            <w:rFonts w:ascii="Arial" w:hAnsi="Arial" w:cs="Arial"/>
+            <w:noProof/>
+            <w:webHidden/>
+            <w:sz w:val="22"/>
           </w:rPr>
           <w:tab/>
         </w:r>
         <w:r>
           <w:rPr>
-            <w:noProof/>
-            <w:webHidden/>
+            <w:rFonts w:ascii="Arial" w:hAnsi="Arial" w:cs="Arial"/>
+            <w:noProof/>
+            <w:webHidden/>
+            <w:sz w:val="22"/>
           </w:rPr>
           <w:fldChar w:fldCharType="begin"/>
         </w:r>
         <w:r>
           <w:rPr>
-            <w:noProof/>
-            <w:webHidden/>
-          </w:rPr>
-          <w:instrText xml:space="preserve"> PAGEREF _Toc232778820 \h </w:instrText>
-        </w:r>
-        <w:r>
-          <w:rPr>
-            <w:noProof/>
-            <w:webHidden/>
-          </w:rPr>
-        </w:r>
-        <w:r>
-          <w:rPr>
-            <w:noProof/>
-            <w:webHidden/>
+            <w:rFonts w:ascii="Arial" w:hAnsi="Arial" w:cs="Arial"/>
+            <w:noProof/>
+            <w:webHidden/>
+            <w:sz w:val="22"/>
+          </w:rPr>
+          <w:instrText xml:space="preserve"> PAGEREF _Toc232780603 \h </w:instrText>
+        </w:r>
+        <w:r>
+          <w:rPr>
+            <w:rFonts w:ascii="Arial" w:hAnsi="Arial" w:cs="Arial"/>
+            <w:noProof/>
+            <w:webHidden/>
+            <w:sz w:val="22"/>
+          </w:rPr>
+        </w:r>
+        <w:r>
+          <w:rPr>
+            <w:rFonts w:ascii="Arial" w:hAnsi="Arial" w:cs="Arial"/>
+            <w:noProof/>
+            <w:webHidden/>
+            <w:sz w:val="22"/>
           </w:rPr>
           <w:fldChar w:fldCharType="separate"/>
         </w:r>
         <w:r>
           <w:rPr>
-            <w:noProof/>
-            <w:webHidden/>
+            <w:rFonts w:ascii="Arial" w:hAnsi="Arial" w:cs="Arial"/>
+            <w:noProof/>
+            <w:webHidden/>
+            <w:sz w:val="22"/>
           </w:rPr>
           <w:t>11</w:t>
         </w:r>
         <w:r>
           <w:rPr>
-            <w:noProof/>
-            <w:webHidden/>
+            <w:rFonts w:ascii="Arial" w:hAnsi="Arial" w:cs="Arial"/>
+            <w:noProof/>
+            <w:webHidden/>
+            <w:sz w:val="22"/>
           </w:rPr>
           <w:fldChar w:fldCharType="end"/>
         </w:r>
@@ -2382,69 +2824,86 @@
         <w:tabs>
           <w:tab w:val="right" w:leader="dot" w:pos="10272"/>
         </w:tabs>
+        <w:spacing w:after="0" w:line="260" w:lineRule="exact"/>
         <w:rPr>
-          <w:rFonts w:asciiTheme="minorHAnsi" w:hAnsiTheme="minorHAnsi"/>
+          <w:rFonts w:ascii="Arial" w:hAnsi="Arial" w:cs="Arial"/>
           <w:noProof/>
           <w:kern w:val="2"/>
-          <w:sz w:val="24"/>
+          <w:sz w:val="22"/>
           <w:szCs w:val="24"/>
           <w:lang w:val="de-CH" w:eastAsia="de-CH"/>
           <w14:ligatures w14:val="standardContextual"/>
         </w:rPr>
       </w:pPr>
-      <w:hyperlink w:anchor="_Toc232778821" w:history="1">
+      <w:hyperlink w:anchor="_Toc232780604" w:history="1">
         <w:r>
           <w:rPr>
             <w:rStyle w:val="Hyperlink"/>
-            <w:noProof/>
+            <w:rFonts w:ascii="Arial" w:hAnsi="Arial" w:cs="Arial"/>
+            <w:noProof/>
+            <w:sz w:val="22"/>
           </w:rPr>
           <w:t>7.3 Install Dependencies</w:t>
         </w:r>
         <w:r>
           <w:rPr>
-            <w:noProof/>
-            <w:webHidden/>
+            <w:rFonts w:ascii="Arial" w:hAnsi="Arial" w:cs="Arial"/>
+            <w:noProof/>
+            <w:webHidden/>
+            <w:sz w:val="22"/>
           </w:rPr>
           <w:tab/>
         </w:r>
         <w:r>
           <w:rPr>
-            <w:noProof/>
-            <w:webHidden/>
+            <w:rFonts w:ascii="Arial" w:hAnsi="Arial" w:cs="Arial"/>
+            <w:noProof/>
+            <w:webHidden/>
+            <w:sz w:val="22"/>
           </w:rPr>
           <w:fldChar w:fldCharType="begin"/>
         </w:r>
         <w:r>
           <w:rPr>
-            <w:noProof/>
-            <w:webHidden/>
-          </w:rPr>
-          <w:instrText xml:space="preserve"> PAGEREF _Toc232778821 \h </w:instrText>
-        </w:r>
-        <w:r>
-          <w:rPr>
-            <w:noProof/>
-            <w:webHidden/>
-          </w:rPr>
-        </w:r>
-        <w:r>
-          <w:rPr>
-            <w:noProof/>
-            <w:webHidden/>
+            <w:rFonts w:ascii="Arial" w:hAnsi="Arial" w:cs="Arial"/>
+            <w:noProof/>
+            <w:webHidden/>
+            <w:sz w:val="22"/>
+          </w:rPr>
+          <w:instrText xml:space="preserve"> PAGEREF _Toc232780604 \h </w:instrText>
+        </w:r>
+        <w:r>
+          <w:rPr>
+            <w:rFonts w:ascii="Arial" w:hAnsi="Arial" w:cs="Arial"/>
+            <w:noProof/>
+            <w:webHidden/>
+            <w:sz w:val="22"/>
+          </w:rPr>
+        </w:r>
+        <w:r>
+          <w:rPr>
+            <w:rFonts w:ascii="Arial" w:hAnsi="Arial" w:cs="Arial"/>
+            <w:noProof/>
+            <w:webHidden/>
+            <w:sz w:val="22"/>
           </w:rPr>
           <w:fldChar w:fldCharType="separate"/>
         </w:r>
         <w:r>
           <w:rPr>
-            <w:noProof/>
-            <w:webHidden/>
+            <w:rFonts w:ascii="Arial" w:hAnsi="Arial" w:cs="Arial"/>
+            <w:noProof/>
+            <w:webHidden/>
+            <w:sz w:val="22"/>
           </w:rPr>
           <w:t>11</w:t>
         </w:r>
         <w:r>
           <w:rPr>
-            <w:noProof/>
-            <w:webHidden/>
+            <w:rFonts w:ascii="Arial" w:hAnsi="Arial" w:cs="Arial"/>
+            <w:noProof/>
+            <w:webHidden/>
+            <w:sz w:val="22"/>
           </w:rPr>
           <w:fldChar w:fldCharType="end"/>
         </w:r>
@@ -2456,69 +2915,86 @@
         <w:tabs>
           <w:tab w:val="right" w:leader="dot" w:pos="10272"/>
         </w:tabs>
+        <w:spacing w:after="0" w:line="260" w:lineRule="exact"/>
         <w:rPr>
-          <w:rFonts w:asciiTheme="minorHAnsi" w:hAnsiTheme="minorHAnsi"/>
+          <w:rFonts w:ascii="Arial" w:hAnsi="Arial" w:cs="Arial"/>
           <w:noProof/>
           <w:kern w:val="2"/>
-          <w:sz w:val="24"/>
+          <w:sz w:val="22"/>
           <w:szCs w:val="24"/>
           <w:lang w:val="de-CH" w:eastAsia="de-CH"/>
           <w14:ligatures w14:val="standardContextual"/>
         </w:rPr>
       </w:pPr>
-      <w:hyperlink w:anchor="_Toc232778822" w:history="1">
+      <w:hyperlink w:anchor="_Toc232780605" w:history="1">
         <w:r>
           <w:rPr>
             <w:rStyle w:val="Hyperlink"/>
-            <w:noProof/>
+            <w:rFonts w:ascii="Arial" w:hAnsi="Arial" w:cs="Arial"/>
+            <w:noProof/>
+            <w:sz w:val="22"/>
           </w:rPr>
           <w:t>7.4 Configure The .env File</w:t>
         </w:r>
         <w:r>
           <w:rPr>
-            <w:noProof/>
-            <w:webHidden/>
+            <w:rFonts w:ascii="Arial" w:hAnsi="Arial" w:cs="Arial"/>
+            <w:noProof/>
+            <w:webHidden/>
+            <w:sz w:val="22"/>
           </w:rPr>
           <w:tab/>
         </w:r>
         <w:r>
           <w:rPr>
-            <w:noProof/>
-            <w:webHidden/>
+            <w:rFonts w:ascii="Arial" w:hAnsi="Arial" w:cs="Arial"/>
+            <w:noProof/>
+            <w:webHidden/>
+            <w:sz w:val="22"/>
           </w:rPr>
           <w:fldChar w:fldCharType="begin"/>
         </w:r>
         <w:r>
           <w:rPr>
-            <w:noProof/>
-            <w:webHidden/>
-          </w:rPr>
-          <w:instrText xml:space="preserve"> PAGEREF _Toc232778822 \h </w:instrText>
-        </w:r>
-        <w:r>
-          <w:rPr>
-            <w:noProof/>
-            <w:webHidden/>
-          </w:rPr>
-        </w:r>
-        <w:r>
-          <w:rPr>
-            <w:noProof/>
-            <w:webHidden/>
+            <w:rFonts w:ascii="Arial" w:hAnsi="Arial" w:cs="Arial"/>
+            <w:noProof/>
+            <w:webHidden/>
+            <w:sz w:val="22"/>
+          </w:rPr>
+          <w:instrText xml:space="preserve"> PAGEREF _Toc232780605 \h </w:instrText>
+        </w:r>
+        <w:r>
+          <w:rPr>
+            <w:rFonts w:ascii="Arial" w:hAnsi="Arial" w:cs="Arial"/>
+            <w:noProof/>
+            <w:webHidden/>
+            <w:sz w:val="22"/>
+          </w:rPr>
+        </w:r>
+        <w:r>
+          <w:rPr>
+            <w:rFonts w:ascii="Arial" w:hAnsi="Arial" w:cs="Arial"/>
+            <w:noProof/>
+            <w:webHidden/>
+            <w:sz w:val="22"/>
           </w:rPr>
           <w:fldChar w:fldCharType="separate"/>
         </w:r>
         <w:r>
           <w:rPr>
-            <w:noProof/>
-            <w:webHidden/>
+            <w:rFonts w:ascii="Arial" w:hAnsi="Arial" w:cs="Arial"/>
+            <w:noProof/>
+            <w:webHidden/>
+            <w:sz w:val="22"/>
           </w:rPr>
           <w:t>11</w:t>
         </w:r>
         <w:r>
           <w:rPr>
-            <w:noProof/>
-            <w:webHidden/>
+            <w:rFonts w:ascii="Arial" w:hAnsi="Arial" w:cs="Arial"/>
+            <w:noProof/>
+            <w:webHidden/>
+            <w:sz w:val="22"/>
           </w:rPr>
           <w:fldChar w:fldCharType="end"/>
         </w:r>
@@ -2530,69 +3006,86 @@
         <w:tabs>
           <w:tab w:val="right" w:leader="dot" w:pos="10272"/>
         </w:tabs>
+        <w:spacing w:after="0" w:line="260" w:lineRule="exact"/>
         <w:rPr>
-          <w:rFonts w:asciiTheme="minorHAnsi" w:hAnsiTheme="minorHAnsi"/>
+          <w:rFonts w:ascii="Arial" w:hAnsi="Arial" w:cs="Arial"/>
           <w:noProof/>
           <w:kern w:val="2"/>
-          <w:sz w:val="24"/>
+          <w:sz w:val="22"/>
           <w:szCs w:val="24"/>
           <w:lang w:val="de-CH" w:eastAsia="de-CH"/>
           <w14:ligatures w14:val="standardContextual"/>
         </w:rPr>
       </w:pPr>
-      <w:hyperlink w:anchor="_Toc232778823" w:history="1">
+      <w:hyperlink w:anchor="_Toc232780606" w:history="1">
         <w:r>
           <w:rPr>
             <w:rStyle w:val="Hyperlink"/>
-            <w:noProof/>
+            <w:rFonts w:ascii="Arial" w:hAnsi="Arial" w:cs="Arial"/>
+            <w:noProof/>
+            <w:sz w:val="22"/>
           </w:rPr>
           <w:t>7.5 API Setup Explained Simply</w:t>
         </w:r>
         <w:r>
           <w:rPr>
-            <w:noProof/>
-            <w:webHidden/>
+            <w:rFonts w:ascii="Arial" w:hAnsi="Arial" w:cs="Arial"/>
+            <w:noProof/>
+            <w:webHidden/>
+            <w:sz w:val="22"/>
           </w:rPr>
           <w:tab/>
         </w:r>
         <w:r>
           <w:rPr>
-            <w:noProof/>
-            <w:webHidden/>
+            <w:rFonts w:ascii="Arial" w:hAnsi="Arial" w:cs="Arial"/>
+            <w:noProof/>
+            <w:webHidden/>
+            <w:sz w:val="22"/>
           </w:rPr>
           <w:fldChar w:fldCharType="begin"/>
         </w:r>
         <w:r>
           <w:rPr>
-            <w:noProof/>
-            <w:webHidden/>
-          </w:rPr>
-          <w:instrText xml:space="preserve"> PAGEREF _Toc232778823 \h </w:instrText>
-        </w:r>
-        <w:r>
-          <w:rPr>
-            <w:noProof/>
-            <w:webHidden/>
-          </w:rPr>
-        </w:r>
-        <w:r>
-          <w:rPr>
-            <w:noProof/>
-            <w:webHidden/>
+            <w:rFonts w:ascii="Arial" w:hAnsi="Arial" w:cs="Arial"/>
+            <w:noProof/>
+            <w:webHidden/>
+            <w:sz w:val="22"/>
+          </w:rPr>
+          <w:instrText xml:space="preserve"> PAGEREF _Toc232780606 \h </w:instrText>
+        </w:r>
+        <w:r>
+          <w:rPr>
+            <w:rFonts w:ascii="Arial" w:hAnsi="Arial" w:cs="Arial"/>
+            <w:noProof/>
+            <w:webHidden/>
+            <w:sz w:val="22"/>
+          </w:rPr>
+        </w:r>
+        <w:r>
+          <w:rPr>
+            <w:rFonts w:ascii="Arial" w:hAnsi="Arial" w:cs="Arial"/>
+            <w:noProof/>
+            <w:webHidden/>
+            <w:sz w:val="22"/>
           </w:rPr>
           <w:fldChar w:fldCharType="separate"/>
         </w:r>
         <w:r>
           <w:rPr>
-            <w:noProof/>
-            <w:webHidden/>
+            <w:rFonts w:ascii="Arial" w:hAnsi="Arial" w:cs="Arial"/>
+            <w:noProof/>
+            <w:webHidden/>
+            <w:sz w:val="22"/>
           </w:rPr>
           <w:t>11</w:t>
         </w:r>
         <w:r>
           <w:rPr>
-            <w:noProof/>
-            <w:webHidden/>
+            <w:rFonts w:ascii="Arial" w:hAnsi="Arial" w:cs="Arial"/>
+            <w:noProof/>
+            <w:webHidden/>
+            <w:sz w:val="22"/>
           </w:rPr>
           <w:fldChar w:fldCharType="end"/>
         </w:r>
@@ -2604,143 +3097,86 @@
         <w:tabs>
           <w:tab w:val="right" w:leader="dot" w:pos="10272"/>
         </w:tabs>
+        <w:spacing w:after="0" w:line="260" w:lineRule="exact"/>
         <w:rPr>
-          <w:rFonts w:asciiTheme="minorHAnsi" w:hAnsiTheme="minorHAnsi"/>
+          <w:rFonts w:ascii="Arial" w:hAnsi="Arial" w:cs="Arial"/>
           <w:noProof/>
           <w:kern w:val="2"/>
-          <w:sz w:val="24"/>
+          <w:sz w:val="22"/>
           <w:szCs w:val="24"/>
           <w:lang w:val="de-CH" w:eastAsia="de-CH"/>
           <w14:ligatures w14:val="standardContextual"/>
         </w:rPr>
       </w:pPr>
-      <w:hyperlink w:anchor="_Toc232778824" w:history="1">
+      <w:hyperlink w:anchor="_Toc232780607" w:history="1">
         <w:r>
           <w:rPr>
             <w:rStyle w:val="Hyperlink"/>
-            <w:noProof/>
-          </w:rPr>
-          <w:t>7.6 Start The Program</w:t>
-        </w:r>
-        <w:r>
-          <w:rPr>
-            <w:noProof/>
-            <w:webHidden/>
+            <w:rFonts w:ascii="Arial" w:hAnsi="Arial" w:cs="Arial"/>
+            <w:noProof/>
+            <w:sz w:val="22"/>
+          </w:rPr>
+          <w:t>7.7 Weekly Automation</w:t>
+        </w:r>
+        <w:r>
+          <w:rPr>
+            <w:rFonts w:ascii="Arial" w:hAnsi="Arial" w:cs="Arial"/>
+            <w:noProof/>
+            <w:webHidden/>
+            <w:sz w:val="22"/>
           </w:rPr>
           <w:tab/>
         </w:r>
         <w:r>
           <w:rPr>
-            <w:noProof/>
-            <w:webHidden/>
+            <w:rFonts w:ascii="Arial" w:hAnsi="Arial" w:cs="Arial"/>
+            <w:noProof/>
+            <w:webHidden/>
+            <w:sz w:val="22"/>
           </w:rPr>
           <w:fldChar w:fldCharType="begin"/>
         </w:r>
         <w:r>
           <w:rPr>
-            <w:noProof/>
-            <w:webHidden/>
-          </w:rPr>
-          <w:instrText xml:space="preserve"> PAGEREF _Toc232778824 \h </w:instrText>
-        </w:r>
-        <w:r>
-          <w:rPr>
-            <w:noProof/>
-            <w:webHidden/>
-          </w:rPr>
-        </w:r>
-        <w:r>
-          <w:rPr>
-            <w:noProof/>
-            <w:webHidden/>
+            <w:rFonts w:ascii="Arial" w:hAnsi="Arial" w:cs="Arial"/>
+            <w:noProof/>
+            <w:webHidden/>
+            <w:sz w:val="22"/>
+          </w:rPr>
+          <w:instrText xml:space="preserve"> PAGEREF _Toc232780607 \h </w:instrText>
+        </w:r>
+        <w:r>
+          <w:rPr>
+            <w:rFonts w:ascii="Arial" w:hAnsi="Arial" w:cs="Arial"/>
+            <w:noProof/>
+            <w:webHidden/>
+            <w:sz w:val="22"/>
+          </w:rPr>
+        </w:r>
+        <w:r>
+          <w:rPr>
+            <w:rFonts w:ascii="Arial" w:hAnsi="Arial" w:cs="Arial"/>
+            <w:noProof/>
+            <w:webHidden/>
+            <w:sz w:val="22"/>
           </w:rPr>
           <w:fldChar w:fldCharType="separate"/>
         </w:r>
         <w:r>
           <w:rPr>
-            <w:noProof/>
-            <w:webHidden/>
+            <w:rFonts w:ascii="Arial" w:hAnsi="Arial" w:cs="Arial"/>
+            <w:noProof/>
+            <w:webHidden/>
+            <w:sz w:val="22"/>
           </w:rPr>
           <w:t>12</w:t>
         </w:r>
         <w:r>
           <w:rPr>
-            <w:noProof/>
-            <w:webHidden/>
-          </w:rPr>
-          <w:fldChar w:fldCharType="end"/>
-        </w:r>
-      </w:hyperlink>
-    </w:p>
-    <w:p>
-      <w:pPr>
-        <w:pStyle w:val="Verzeichnis2"/>
-        <w:tabs>
-          <w:tab w:val="right" w:leader="dot" w:pos="10272"/>
-        </w:tabs>
-        <w:rPr>
-          <w:rFonts w:asciiTheme="minorHAnsi" w:hAnsiTheme="minorHAnsi"/>
-          <w:noProof/>
-          <w:kern w:val="2"/>
-          <w:sz w:val="24"/>
-          <w:szCs w:val="24"/>
-          <w:lang w:val="de-CH" w:eastAsia="de-CH"/>
-          <w14:ligatures w14:val="standardContextual"/>
-        </w:rPr>
-      </w:pPr>
-      <w:hyperlink w:anchor="_Toc232778825" w:history="1">
-        <w:r>
-          <w:rPr>
-            <w:rStyle w:val="Hyperlink"/>
-            <w:noProof/>
-          </w:rPr>
-          <w:t>7.7 Weekly Automation</w:t>
-        </w:r>
-        <w:r>
-          <w:rPr>
-            <w:noProof/>
-            <w:webHidden/>
-          </w:rPr>
-          <w:tab/>
-        </w:r>
-        <w:r>
-          <w:rPr>
-            <w:noProof/>
-            <w:webHidden/>
-          </w:rPr>
-          <w:fldChar w:fldCharType="begin"/>
-        </w:r>
-        <w:r>
-          <w:rPr>
-            <w:noProof/>
-            <w:webHidden/>
-          </w:rPr>
-          <w:instrText xml:space="preserve"> PAGEREF _Toc232778825 \h </w:instrText>
-        </w:r>
-        <w:r>
-          <w:rPr>
-            <w:noProof/>
-            <w:webHidden/>
-          </w:rPr>
-        </w:r>
-        <w:r>
-          <w:rPr>
-            <w:noProof/>
-            <w:webHidden/>
-          </w:rPr>
-          <w:fldChar w:fldCharType="separate"/>
-        </w:r>
-        <w:r>
-          <w:rPr>
-            <w:noProof/>
-            <w:webHidden/>
-          </w:rPr>
-          <w:t>12</w:t>
-        </w:r>
-        <w:r>
-          <w:rPr>
-            <w:noProof/>
-            <w:webHidden/>
+            <w:rFonts w:ascii="Arial" w:hAnsi="Arial" w:cs="Arial"/>
+            <w:noProof/>
+            <w:webHidden/>
+            <w:sz w:val="22"/>
           </w:rPr>
           <w:fldChar w:fldCharType="end"/>
         </w:r>
@@ -2752,69 +3188,86 @@
         <w:tabs>
           <w:tab w:val="right" w:leader="dot" w:pos="10272"/>
         </w:tabs>
+        <w:spacing w:after="0" w:line="260" w:lineRule="exact"/>
         <w:rPr>
-          <w:rFonts w:asciiTheme="minorHAnsi" w:hAnsiTheme="minorHAnsi"/>
+          <w:rFonts w:ascii="Arial" w:hAnsi="Arial" w:cs="Arial"/>
           <w:noProof/>
           <w:kern w:val="2"/>
-          <w:sz w:val="24"/>
+          <w:sz w:val="22"/>
           <w:szCs w:val="24"/>
           <w:lang w:val="de-CH" w:eastAsia="de-CH"/>
           <w14:ligatures w14:val="standardContextual"/>
         </w:rPr>
       </w:pPr>
-      <w:hyperlink w:anchor="_Toc232778826" w:history="1">
+      <w:hyperlink w:anchor="_Toc232780608" w:history="1">
         <w:r>
           <w:rPr>
             <w:rStyle w:val="Hyperlink"/>
-            <w:noProof/>
+            <w:rFonts w:ascii="Arial" w:hAnsi="Arial" w:cs="Arial"/>
+            <w:noProof/>
+            <w:sz w:val="22"/>
           </w:rPr>
           <w:t>8. Testing</w:t>
         </w:r>
         <w:r>
           <w:rPr>
-            <w:noProof/>
-            <w:webHidden/>
+            <w:rFonts w:ascii="Arial" w:hAnsi="Arial" w:cs="Arial"/>
+            <w:noProof/>
+            <w:webHidden/>
+            <w:sz w:val="22"/>
           </w:rPr>
           <w:tab/>
         </w:r>
         <w:r>
           <w:rPr>
-            <w:noProof/>
-            <w:webHidden/>
+            <w:rFonts w:ascii="Arial" w:hAnsi="Arial" w:cs="Arial"/>
+            <w:noProof/>
+            <w:webHidden/>
+            <w:sz w:val="22"/>
           </w:rPr>
           <w:fldChar w:fldCharType="begin"/>
         </w:r>
         <w:r>
           <w:rPr>
-            <w:noProof/>
-            <w:webHidden/>
-          </w:rPr>
-          <w:instrText xml:space="preserve"> PAGEREF _Toc232778826 \h </w:instrText>
-        </w:r>
-        <w:r>
-          <w:rPr>
-            <w:noProof/>
-            <w:webHidden/>
-          </w:rPr>
-        </w:r>
-        <w:r>
-          <w:rPr>
-            <w:noProof/>
-            <w:webHidden/>
+            <w:rFonts w:ascii="Arial" w:hAnsi="Arial" w:cs="Arial"/>
+            <w:noProof/>
+            <w:webHidden/>
+            <w:sz w:val="22"/>
+          </w:rPr>
+          <w:instrText xml:space="preserve"> PAGEREF _Toc232780608 \h </w:instrText>
+        </w:r>
+        <w:r>
+          <w:rPr>
+            <w:rFonts w:ascii="Arial" w:hAnsi="Arial" w:cs="Arial"/>
+            <w:noProof/>
+            <w:webHidden/>
+            <w:sz w:val="22"/>
+          </w:rPr>
+        </w:r>
+        <w:r>
+          <w:rPr>
+            <w:rFonts w:ascii="Arial" w:hAnsi="Arial" w:cs="Arial"/>
+            <w:noProof/>
+            <w:webHidden/>
+            <w:sz w:val="22"/>
           </w:rPr>
           <w:fldChar w:fldCharType="separate"/>
         </w:r>
         <w:r>
           <w:rPr>
-            <w:noProof/>
-            <w:webHidden/>
+            <w:rFonts w:ascii="Arial" w:hAnsi="Arial" w:cs="Arial"/>
+            <w:noProof/>
+            <w:webHidden/>
+            <w:sz w:val="22"/>
           </w:rPr>
           <w:t>12</w:t>
         </w:r>
         <w:r>
           <w:rPr>
-            <w:noProof/>
-            <w:webHidden/>
+            <w:rFonts w:ascii="Arial" w:hAnsi="Arial" w:cs="Arial"/>
+            <w:noProof/>
+            <w:webHidden/>
+            <w:sz w:val="22"/>
           </w:rPr>
           <w:fldChar w:fldCharType="end"/>
         </w:r>
@@ -2826,69 +3279,86 @@
         <w:tabs>
           <w:tab w:val="right" w:leader="dot" w:pos="10272"/>
         </w:tabs>
+        <w:spacing w:after="0" w:line="260" w:lineRule="exact"/>
         <w:rPr>
-          <w:rFonts w:asciiTheme="minorHAnsi" w:hAnsiTheme="minorHAnsi"/>
+          <w:rFonts w:ascii="Arial" w:hAnsi="Arial" w:cs="Arial"/>
           <w:noProof/>
           <w:kern w:val="2"/>
-          <w:sz w:val="24"/>
+          <w:sz w:val="22"/>
           <w:szCs w:val="24"/>
           <w:lang w:val="de-CH" w:eastAsia="de-CH"/>
           <w14:ligatures w14:val="standardContextual"/>
         </w:rPr>
       </w:pPr>
-      <w:hyperlink w:anchor="_Toc232778827" w:history="1">
+      <w:hyperlink w:anchor="_Toc232780609" w:history="1">
         <w:r>
           <w:rPr>
             <w:rStyle w:val="Hyperlink"/>
-            <w:noProof/>
+            <w:rFonts w:ascii="Arial" w:hAnsi="Arial" w:cs="Arial"/>
+            <w:noProof/>
+            <w:sz w:val="22"/>
           </w:rPr>
           <w:t>9. Assignment Coverage</w:t>
         </w:r>
         <w:r>
           <w:rPr>
-            <w:noProof/>
-            <w:webHidden/>
+            <w:rFonts w:ascii="Arial" w:hAnsi="Arial" w:cs="Arial"/>
+            <w:noProof/>
+            <w:webHidden/>
+            <w:sz w:val="22"/>
           </w:rPr>
           <w:tab/>
         </w:r>
         <w:r>
           <w:rPr>
-            <w:noProof/>
-            <w:webHidden/>
+            <w:rFonts w:ascii="Arial" w:hAnsi="Arial" w:cs="Arial"/>
+            <w:noProof/>
+            <w:webHidden/>
+            <w:sz w:val="22"/>
           </w:rPr>
           <w:fldChar w:fldCharType="begin"/>
         </w:r>
         <w:r>
           <w:rPr>
-            <w:noProof/>
-            <w:webHidden/>
-          </w:rPr>
-          <w:instrText xml:space="preserve"> PAGEREF _Toc232778827 \h </w:instrText>
-        </w:r>
-        <w:r>
-          <w:rPr>
-            <w:noProof/>
-            <w:webHidden/>
-          </w:rPr>
-        </w:r>
-        <w:r>
-          <w:rPr>
-            <w:noProof/>
-            <w:webHidden/>
+            <w:rFonts w:ascii="Arial" w:hAnsi="Arial" w:cs="Arial"/>
+            <w:noProof/>
+            <w:webHidden/>
+            <w:sz w:val="22"/>
+          </w:rPr>
+          <w:instrText xml:space="preserve"> PAGEREF _Toc232780609 \h </w:instrText>
+        </w:r>
+        <w:r>
+          <w:rPr>
+            <w:rFonts w:ascii="Arial" w:hAnsi="Arial" w:cs="Arial"/>
+            <w:noProof/>
+            <w:webHidden/>
+            <w:sz w:val="22"/>
+          </w:rPr>
+        </w:r>
+        <w:r>
+          <w:rPr>
+            <w:rFonts w:ascii="Arial" w:hAnsi="Arial" w:cs="Arial"/>
+            <w:noProof/>
+            <w:webHidden/>
+            <w:sz w:val="22"/>
           </w:rPr>
           <w:fldChar w:fldCharType="separate"/>
         </w:r>
         <w:r>
           <w:rPr>
-            <w:noProof/>
-            <w:webHidden/>
-          </w:rPr>
-          <w:t>13</w:t>
-        </w:r>
-        <w:r>
-          <w:rPr>
-            <w:noProof/>
-            <w:webHidden/>
+            <w:rFonts w:ascii="Arial" w:hAnsi="Arial" w:cs="Arial"/>
+            <w:noProof/>
+            <w:webHidden/>
+            <w:sz w:val="22"/>
+          </w:rPr>
+          <w:t>14</w:t>
+        </w:r>
+        <w:r>
+          <w:rPr>
+            <w:rFonts w:ascii="Arial" w:hAnsi="Arial" w:cs="Arial"/>
+            <w:noProof/>
+            <w:webHidden/>
+            <w:sz w:val="22"/>
           </w:rPr>
           <w:fldChar w:fldCharType="end"/>
         </w:r>
@@ -2900,69 +3370,86 @@
         <w:tabs>
           <w:tab w:val="right" w:leader="dot" w:pos="10272"/>
         </w:tabs>
+        <w:spacing w:after="0" w:line="260" w:lineRule="exact"/>
         <w:rPr>
-          <w:rFonts w:asciiTheme="minorHAnsi" w:hAnsiTheme="minorHAnsi"/>
+          <w:rFonts w:ascii="Arial" w:hAnsi="Arial" w:cs="Arial"/>
           <w:noProof/>
           <w:kern w:val="2"/>
-          <w:sz w:val="24"/>
+          <w:sz w:val="22"/>
           <w:szCs w:val="24"/>
           <w:lang w:val="de-CH" w:eastAsia="de-CH"/>
           <w14:ligatures w14:val="standardContextual"/>
         </w:rPr>
       </w:pPr>
-      <w:hyperlink w:anchor="_Toc232778828" w:history="1">
+      <w:hyperlink w:anchor="_Toc232780610" w:history="1">
         <w:r>
           <w:rPr>
             <w:rStyle w:val="Hyperlink"/>
-            <w:noProof/>
+            <w:rFonts w:ascii="Arial" w:hAnsi="Arial" w:cs="Arial"/>
+            <w:noProof/>
+            <w:sz w:val="22"/>
           </w:rPr>
           <w:t>10. Conclusion</w:t>
         </w:r>
         <w:r>
           <w:rPr>
-            <w:noProof/>
-            <w:webHidden/>
+            <w:rFonts w:ascii="Arial" w:hAnsi="Arial" w:cs="Arial"/>
+            <w:noProof/>
+            <w:webHidden/>
+            <w:sz w:val="22"/>
           </w:rPr>
           <w:tab/>
         </w:r>
         <w:r>
           <w:rPr>
-            <w:noProof/>
-            <w:webHidden/>
+            <w:rFonts w:ascii="Arial" w:hAnsi="Arial" w:cs="Arial"/>
+            <w:noProof/>
+            <w:webHidden/>
+            <w:sz w:val="22"/>
           </w:rPr>
           <w:fldChar w:fldCharType="begin"/>
         </w:r>
         <w:r>
           <w:rPr>
-            <w:noProof/>
-            <w:webHidden/>
-          </w:rPr>
-          <w:instrText xml:space="preserve"> PAGEREF _Toc232778828 \h </w:instrText>
-        </w:r>
-        <w:r>
-          <w:rPr>
-            <w:noProof/>
-            <w:webHidden/>
-          </w:rPr>
-        </w:r>
-        <w:r>
-          <w:rPr>
-            <w:noProof/>
-            <w:webHidden/>
+            <w:rFonts w:ascii="Arial" w:hAnsi="Arial" w:cs="Arial"/>
+            <w:noProof/>
+            <w:webHidden/>
+            <w:sz w:val="22"/>
+          </w:rPr>
+          <w:instrText xml:space="preserve"> PAGEREF _Toc232780610 \h </w:instrText>
+        </w:r>
+        <w:r>
+          <w:rPr>
+            <w:rFonts w:ascii="Arial" w:hAnsi="Arial" w:cs="Arial"/>
+            <w:noProof/>
+            <w:webHidden/>
+            <w:sz w:val="22"/>
+          </w:rPr>
+        </w:r>
+        <w:r>
+          <w:rPr>
+            <w:rFonts w:ascii="Arial" w:hAnsi="Arial" w:cs="Arial"/>
+            <w:noProof/>
+            <w:webHidden/>
+            <w:sz w:val="22"/>
           </w:rPr>
           <w:fldChar w:fldCharType="separate"/>
         </w:r>
         <w:r>
           <w:rPr>
-            <w:noProof/>
-            <w:webHidden/>
-          </w:rPr>
-          <w:t>13</w:t>
-        </w:r>
-        <w:r>
-          <w:rPr>
-            <w:noProof/>
-            <w:webHidden/>
+            <w:rFonts w:ascii="Arial" w:hAnsi="Arial" w:cs="Arial"/>
+            <w:noProof/>
+            <w:webHidden/>
+            <w:sz w:val="22"/>
+          </w:rPr>
+          <w:t>14</w:t>
+        </w:r>
+        <w:r>
+          <w:rPr>
+            <w:rFonts w:ascii="Arial" w:hAnsi="Arial" w:cs="Arial"/>
+            <w:noProof/>
+            <w:webHidden/>
+            <w:sz w:val="22"/>
           </w:rPr>
           <w:fldChar w:fldCharType="end"/>
         </w:r>
@@ -2989,7 +3476,7 @@
       <w:pPr>
         <w:pStyle w:val="berschrift1"/>
       </w:pPr>
-      <w:bookmarkStart w:id="0" w:name="_Toc232778795"/>
+      <w:bookmarkStart w:id="0" w:name="_Toc232780578"/>
       <w:r>
         <w:lastRenderedPageBreak/>
         <w:t>1. Project Overview</w:t>
@@ -3000,7 +3487,7 @@
       <w:pPr>
         <w:pStyle w:val="berschrift2"/>
       </w:pPr>
-      <w:bookmarkStart w:id="1" w:name="_Toc232778796"/>
+      <w:bookmarkStart w:id="1" w:name="_Toc232780579"/>
       <w:r>
         <w:t>1.1 Context</w:t>
       </w:r>
@@ -3020,7 +3507,7 @@
       <w:pPr>
         <w:pStyle w:val="berschrift2"/>
       </w:pPr>
-      <w:bookmarkStart w:id="2" w:name="_Toc232778797"/>
+      <w:bookmarkStart w:id="2" w:name="_Toc232780580"/>
       <w:r>
         <w:t>1.2 Goal</w:t>
       </w:r>
@@ -3035,7 +3522,7 @@
       <w:pPr>
         <w:pStyle w:val="berschrift2"/>
       </w:pPr>
-      <w:bookmarkStart w:id="3" w:name="_Toc232778798"/>
+      <w:bookmarkStart w:id="3" w:name="_Toc232780581"/>
       <w:r>
         <w:t>1.3 What The Program Does</w:t>
       </w:r>
@@ -3050,7 +3537,7 @@
       <w:pPr>
         <w:pStyle w:val="berschrift1"/>
       </w:pPr>
-      <w:bookmarkStart w:id="4" w:name="_Toc232778799"/>
+      <w:bookmarkStart w:id="4" w:name="_Toc232780582"/>
       <w:r>
         <w:t>2. Project Work And Personal Approach</w:t>
       </w:r>
@@ -3060,7 +3547,7 @@
       <w:pPr>
         <w:pStyle w:val="berschrift2"/>
       </w:pPr>
-      <w:bookmarkStart w:id="5" w:name="_Toc232778800"/>
+      <w:bookmarkStart w:id="5" w:name="_Toc232780583"/>
       <w:r>
         <w:t>2.1 How I Started</w:t>
       </w:r>
@@ -3080,7 +3567,7 @@
       <w:pPr>
         <w:pStyle w:val="berschrift2"/>
       </w:pPr>
-      <w:bookmarkStart w:id="6" w:name="_Toc232778801"/>
+      <w:bookmarkStart w:id="6" w:name="_Toc232780584"/>
       <w:r>
         <w:t>2.2 Difficulties During The Project</w:t>
       </w:r>
@@ -3105,7 +3592,7 @@
       <w:pPr>
         <w:pStyle w:val="berschrift2"/>
       </w:pPr>
-      <w:bookmarkStart w:id="7" w:name="_Toc232778802"/>
+      <w:bookmarkStart w:id="7" w:name="_Toc232780585"/>
       <w:r>
         <w:t>2.3 What I Improved Near The End</w:t>
       </w:r>
@@ -3120,7 +3607,7 @@
       <w:pPr>
         <w:pStyle w:val="berschrift1"/>
       </w:pPr>
-      <w:bookmarkStart w:id="8" w:name="_Toc232778803"/>
+      <w:bookmarkStart w:id="8" w:name="_Toc232780586"/>
       <w:r>
         <w:lastRenderedPageBreak/>
         <w:t>3. Project Plan</w:t>
@@ -3657,7 +4144,7 @@
       <w:pPr>
         <w:pStyle w:val="berschrift1"/>
       </w:pPr>
-      <w:bookmarkStart w:id="9" w:name="_Toc232778804"/>
+      <w:bookmarkStart w:id="9" w:name="_Toc232780587"/>
       <w:r>
         <w:t>4. Requirements</w:t>
       </w:r>
@@ -3667,7 +4154,7 @@
       <w:pPr>
         <w:pStyle w:val="berschrift2"/>
       </w:pPr>
-      <w:bookmarkStart w:id="10" w:name="_Toc232778805"/>
+      <w:bookmarkStart w:id="10" w:name="_Toc232780588"/>
       <w:r>
         <w:t>4.1 Functional Requirements</w:t>
       </w:r>
@@ -5204,7 +5691,7 @@
       <w:pPr>
         <w:pStyle w:val="berschrift2"/>
       </w:pPr>
-      <w:bookmarkStart w:id="11" w:name="_Toc232778806"/>
+      <w:bookmarkStart w:id="11" w:name="_Toc232780589"/>
       <w:r>
         <w:t>4.2 Non-Functional Requirements</w:t>
       </w:r>
@@ -6052,7 +6539,7 @@
         <w:pStyle w:val="berschrift1"/>
         <w:pageBreakBefore/>
       </w:pPr>
-      <w:bookmarkStart w:id="12" w:name="_Toc232778807"/>
+      <w:bookmarkStart w:id="12" w:name="_Toc232780590"/>
       <w:r>
         <w:lastRenderedPageBreak/>
         <w:t>5. System Design</w:t>
@@ -6063,7 +6550,7 @@
       <w:pPr>
         <w:pStyle w:val="berschrift2"/>
       </w:pPr>
-      <w:bookmarkStart w:id="13" w:name="_Toc232778808"/>
+      <w:bookmarkStart w:id="13" w:name="_Toc232780591"/>
       <w:r>
         <w:t>5.1 Module Overview</w:t>
       </w:r>
@@ -6539,7 +7026,7 @@
       <w:pPr>
         <w:pStyle w:val="berschrift2"/>
       </w:pPr>
-      <w:bookmarkStart w:id="14" w:name="_Toc232778809"/>
+      <w:bookmarkStart w:id="14" w:name="_Toc232780592"/>
       <w:r>
         <w:t>5.2 Main Workflow</w:t>
       </w:r>
@@ -6640,7 +7127,7 @@
       <w:pPr>
         <w:pStyle w:val="berschrift2"/>
       </w:pPr>
-      <w:bookmarkStart w:id="15" w:name="_Toc232778810"/>
+      <w:bookmarkStart w:id="15" w:name="_Toc232780593"/>
       <w:r>
         <w:lastRenderedPageBreak/>
         <w:t>5.3 System Architecture Diagram</w:t>
@@ -6701,7 +7188,7 @@
       <w:pPr>
         <w:pStyle w:val="berschrift2"/>
       </w:pPr>
-      <w:bookmarkStart w:id="16" w:name="_Toc232778811"/>
+      <w:bookmarkStart w:id="16" w:name="_Toc232780594"/>
       <w:r>
         <w:lastRenderedPageBreak/>
         <w:t>5.4 UML Activity Diagram</w:t>
@@ -6757,7 +7244,7 @@
       <w:pPr>
         <w:pStyle w:val="berschrift2"/>
       </w:pPr>
-      <w:bookmarkStart w:id="17" w:name="_Toc232778812"/>
+      <w:bookmarkStart w:id="17" w:name="_Toc232780595"/>
       <w:r>
         <w:lastRenderedPageBreak/>
         <w:t>5.5 UML Component Diagram</w:t>
@@ -6813,7 +7300,7 @@
       <w:pPr>
         <w:pStyle w:val="berschrift2"/>
       </w:pPr>
-      <w:bookmarkStart w:id="18" w:name="_Toc232778813"/>
+      <w:bookmarkStart w:id="18" w:name="_Toc232780596"/>
       <w:r>
         <w:t>5.6 UML Deployment Diagram</w:t>
       </w:r>
@@ -6868,7 +7355,7 @@
       <w:pPr>
         <w:pStyle w:val="berschrift2"/>
       </w:pPr>
-      <w:bookmarkStart w:id="19" w:name="_Toc232778814"/>
+      <w:bookmarkStart w:id="19" w:name="_Toc232780597"/>
       <w:r>
         <w:lastRenderedPageBreak/>
         <w:t>5.7 UML Class Diagram</w:t>
@@ -6924,7 +7411,7 @@
       <w:pPr>
         <w:pStyle w:val="berschrift2"/>
       </w:pPr>
-      <w:bookmarkStart w:id="20" w:name="_Toc232778815"/>
+      <w:bookmarkStart w:id="20" w:name="_Toc232780598"/>
       <w:r>
         <w:t>5.8 ER Diagram</w:t>
       </w:r>
@@ -6979,7 +7466,7 @@
       <w:pPr>
         <w:pStyle w:val="berschrift2"/>
       </w:pPr>
-      <w:bookmarkStart w:id="21" w:name="_Toc232778816"/>
+      <w:bookmarkStart w:id="21" w:name="_Toc232780599"/>
       <w:r>
         <w:lastRenderedPageBreak/>
         <w:t>5.9 Flowchart</w:t>
@@ -7035,7 +7522,7 @@
       <w:pPr>
         <w:pStyle w:val="berschrift1"/>
       </w:pPr>
-      <w:bookmarkStart w:id="22" w:name="_Toc232778817"/>
+      <w:bookmarkStart w:id="22" w:name="_Toc232780600"/>
       <w:r>
         <w:t>6. Database Design</w:t>
       </w:r>
@@ -7511,7 +7998,7 @@
         <w:pStyle w:val="berschrift1"/>
         <w:pageBreakBefore/>
       </w:pPr>
-      <w:bookmarkStart w:id="23" w:name="_Toc232778818"/>
+      <w:bookmarkStart w:id="23" w:name="_Toc232780601"/>
       <w:r>
         <w:lastRenderedPageBreak/>
         <w:t>7. Installation And Usage</w:t>
@@ -7522,7 +8009,7 @@
       <w:pPr>
         <w:pStyle w:val="berschrift2"/>
       </w:pPr>
-      <w:bookmarkStart w:id="24" w:name="_Toc232778819"/>
+      <w:bookmarkStart w:id="24" w:name="_Toc232780602"/>
       <w:r>
         <w:t>7.1 Prerequisites</w:t>
       </w:r>
@@ -7851,7 +8338,7 @@
       <w:pPr>
         <w:pStyle w:val="berschrift2"/>
       </w:pPr>
-      <w:bookmarkStart w:id="25" w:name="_Toc232778820"/>
+      <w:bookmarkStart w:id="25" w:name="_Toc232780603"/>
       <w:r>
         <w:t>7.2 Clone Or Open The Project</w:t>
       </w:r>
@@ -7968,7 +8455,7 @@
       <w:pPr>
         <w:pStyle w:val="berschrift2"/>
       </w:pPr>
-      <w:bookmarkStart w:id="26" w:name="_Toc232778821"/>
+      <w:bookmarkStart w:id="26" w:name="_Toc232780604"/>
       <w:r>
         <w:t>7.3 Install Dependencies</w:t>
       </w:r>
@@ -8048,7 +8535,7 @@
       <w:pPr>
         <w:pStyle w:val="berschrift2"/>
       </w:pPr>
-      <w:bookmarkStart w:id="27" w:name="_Toc232778822"/>
+      <w:bookmarkStart w:id="27" w:name="_Toc232780605"/>
       <w:r>
         <w:t>7.4 Configure The .env File</w:t>
       </w:r>
@@ -8567,37 +9054,92 @@
       <w:pPr>
         <w:pStyle w:val="berschrift2"/>
       </w:pPr>
-      <w:bookmarkStart w:id="28" w:name="_Toc232778823"/>
+      <w:bookmarkStart w:id="28" w:name="_Toc232780606"/>
       <w:r>
         <w:t>7.5 API Setup Explained Simply</w:t>
       </w:r>
       <w:bookmarkEnd w:id="28"/>
     </w:p>
     <w:p>
+      <w:pPr>
+        <w:rPr>
+          <w:rFonts w:ascii="Arial" w:hAnsi="Arial" w:cs="Arial"/>
+          <w:b/>
+          <w:bCs/>
+          <w:sz w:val="21"/>
+        </w:rPr>
+      </w:pPr>
       <w:r>
-        <w:t>For Last.fm, create an API application at https://www.last.fm/api/account/create and copy the API key into the .env file. The Last.fm API secret is not needed because the script reads recent public scrobbles.</w:t>
+        <w:rPr>
+          <w:rFonts w:ascii="Arial" w:hAnsi="Arial" w:cs="Arial"/>
+          <w:sz w:val="21"/>
+        </w:rPr>
+        <w:t xml:space="preserve">Last.fm is required because it provides the listening history. Open https://www.last.fm/api/account/create, log in with a Last.fm account and create an API application. A clear name such as Weekly Spotify Wrapped and a short school-project description are enough. The callback URL and homepage are not needed for this project; if Last.fm asks for a URL, http://localhost can be used as a placeholder. Copy the generated API key into </w:t>
       </w:r>
-    </w:p>
-    <w:p>
       <w:r>
-        <w:t>For Spotify, create an app at https://developer.spotify.com/dashboard and add http://127.0.0.1:8888/callback as redirect URI. Then copy the client ID and client secret into .env. If playlist updates should be used, run python spotify_setup.py to create the refresh token and playlist values.</w:t>
-      </w:r>
-    </w:p>
-    <w:p>
-      <w:r>
+        <w:rPr>
+          <w:rFonts w:ascii="Arial" w:hAnsi="Arial" w:cs="Arial"/>
+          <w:sz w:val="21"/>
+        </w:rPr>
         <w:lastRenderedPageBreak/>
-        <w:t>For Gmail, enable 2-Step Verification and create a Google app password at https://myaccount.google.com/apppasswords. The normal Gmail password should not be used in this project.</w:t>
+        <w:t>LASTFM_API_KEY and put the Last.fm username into LASTFM_USERNAME. The Last.fm API secret is not needed because the script only reads recent public scrobbles.</w:t>
       </w:r>
     </w:p>
     <w:p>
       <w:pPr>
-        <w:pStyle w:val="berschrift2"/>
+        <w:rPr>
+          <w:rFonts w:ascii="Arial" w:hAnsi="Arial" w:cs="Arial"/>
+          <w:b/>
+          <w:bCs/>
+          <w:sz w:val="21"/>
+        </w:rPr>
       </w:pPr>
-      <w:bookmarkStart w:id="29" w:name="_Toc232778824"/>
       <w:r>
+        <w:rPr>
+          <w:rFonts w:ascii="Arial" w:hAnsi="Arial" w:cs="Arial"/>
+          <w:sz w:val="21"/>
+        </w:rPr>
+        <w:t>Spotify is recommended because it adds covers, durations, artist images and track links. Open https://developer.spotify.com/dashboard, log in and create a new app. Use an app name such as Weekly Spotify Wrapped, add a short description such as Weekly music report using Spotify metadata and enter http://127.0.0.1:8888/callback as redirect URI. This redirect URI must be exactly the same as SPOTIFY_REDIRECT_URI in the .env file. Select Web API, accept the developer terms and create the app. Then open the app settings, copy the client ID into SPOTIFY_CLIENT_ID and reveal the client secret to copy it into SPOTIFY_CLIENT_SECRET.</w:t>
+      </w:r>
+    </w:p>
+    <w:p>
+      <w:pPr>
+        <w:rPr>
+          <w:rFonts w:ascii="Arial" w:hAnsi="Arial" w:cs="Arial"/>
+          <w:b/>
+          <w:bCs/>
+          <w:sz w:val="21"/>
+        </w:rPr>
+      </w:pPr>
+      <w:r>
+        <w:rPr>
+          <w:rFonts w:ascii="Arial" w:hAnsi="Arial" w:cs="Arial"/>
+          <w:sz w:val="21"/>
+        </w:rPr>
+        <w:t>Spotify playlist updates are optional. The report can run with only SPOTIFY_CLIENT_ID and SPOTIFY_CLIENT_SECRET. If playlist updates should be tested, set ENABLE_PLAYLIST=true and run python spotify_setup.py. The helper opens a Spotify login URL. After the login, Spotify redirects to the local callback URL and the helper saves SPOTIFY_REFRESH_TOKEN, SPOTIFY_PLAYLIST_ID and PLAYLIST_URL in the .env file. If Spotify returns HTTP 403 for playlist updates, set ENABLE_PLAYLIST=false. The report still works because playlist creation is not required for the main automation.</w:t>
+      </w:r>
+    </w:p>
+    <w:p>
+      <w:pPr>
+        <w:rPr>
+          <w:rFonts w:ascii="Arial" w:hAnsi="Arial" w:cs="Arial"/>
+          <w:sz w:val="21"/>
+        </w:rPr>
+      </w:pPr>
+      <w:r>
+        <w:rPr>
+          <w:rFonts w:ascii="Arial" w:hAnsi="Arial" w:cs="Arial"/>
+          <w:sz w:val="21"/>
+        </w:rPr>
+        <w:t>Gmail email sending is optional. If the teacher only wants to test report generation, set SEND_EMAIL=false. Then GMAIL_ADDRESS, GMAIL_APP_PASSWORD and RECIPIENT_EMAIL can stay empty, and the script still creates the HTML report in output/. To test email delivery, use a Gmail sender account, enable 2-Step Verification, open https://myaccount.google.com/apppasswords, create an app password, put the Gmail address into GMAIL_ADDRESS, put the app password into GMAIL_APP_PASSWORD, put the receiver address into RECIPIENT_EMAIL and set SEND_EMAIL=true. The normal Gmail password should never be used in this project.</w:t>
+      </w:r>
+      <w:r>
+        <w:rPr>
+          <w:rFonts w:ascii="Arial" w:hAnsi="Arial" w:cs="Arial"/>
+          <w:sz w:val="21"/>
+        </w:rPr>
         <w:t>7.6 Start The Program</w:t>
       </w:r>
-      <w:bookmarkEnd w:id="29"/>
     </w:p>
     <w:p>
       <w:r>
@@ -8667,11 +9209,11 @@
       <w:pPr>
         <w:pStyle w:val="berschrift2"/>
       </w:pPr>
-      <w:bookmarkStart w:id="30" w:name="_Toc232778825"/>
+      <w:bookmarkStart w:id="29" w:name="_Toc232780607"/>
       <w:r>
         <w:t>7.7 Weekly Automation</w:t>
       </w:r>
-      <w:bookmarkEnd w:id="30"/>
+      <w:bookmarkEnd w:id="29"/>
     </w:p>
     <w:p>
       <w:r>
@@ -8786,11 +9328,11 @@
       <w:pPr>
         <w:pStyle w:val="berschrift1"/>
       </w:pPr>
-      <w:bookmarkStart w:id="31" w:name="_Toc232778826"/>
+      <w:bookmarkStart w:id="30" w:name="_Toc232780608"/>
       <w:r>
         <w:t>8. Testing</w:t>
       </w:r>
-      <w:bookmarkEnd w:id="31"/>
+      <w:bookmarkEnd w:id="30"/>
     </w:p>
     <w:p>
       <w:r>
@@ -8856,6 +9398,7 @@
     <w:p/>
     <w:p>
       <w:r>
+        <w:lastRenderedPageBreak/>
         <w:t>The tests cover configuration loading, missing values, database duplicate handling, Last.fm parsing, Spotify enrichment, report generation, email sending, Spotify setup and the main workflow. The full executed test protocol is included as M122E_Test_Protocol.pdf and M122E_Test_Protocol.docx.</w:t>
       </w:r>
     </w:p>
@@ -8880,12 +9423,12 @@
         <w:pStyle w:val="berschrift1"/>
         <w:pageBreakBefore/>
       </w:pPr>
-      <w:bookmarkStart w:id="32" w:name="_Toc232778827"/>
+      <w:bookmarkStart w:id="31" w:name="_Toc232780609"/>
       <w:r>
         <w:lastRenderedPageBreak/>
         <w:t>9. Assignment Coverage</w:t>
       </w:r>
-      <w:bookmarkEnd w:id="32"/>
+      <w:bookmarkEnd w:id="31"/>
     </w:p>
     <w:p>
       <w:r>
@@ -9455,11 +9998,11 @@
       <w:pPr>
         <w:pStyle w:val="berschrift1"/>
       </w:pPr>
-      <w:bookmarkStart w:id="33" w:name="_Toc232778828"/>
+      <w:bookmarkStart w:id="32" w:name="_Toc232780610"/>
       <w:r>
         <w:t>10. Conclusion</w:t>
       </w:r>
-      <w:bookmarkEnd w:id="33"/>
+      <w:bookmarkEnd w:id="32"/>
     </w:p>
     <w:p>
       <w:r>

</xml_diff>

<commit_message>
Add CI pipeline and Spotify setup alternative
</commit_message>
<xml_diff>
--- a/docs/M122E_Final_Documentation.docx
+++ b/docs/M122E_Final_Documentation.docx
@@ -469,7 +469,7 @@
         </w:rPr>
         <w:fldChar w:fldCharType="separate"/>
       </w:r>
-      <w:hyperlink w:anchor="_Toc232780578" w:history="1">
+      <w:hyperlink w:anchor="_Toc232812571" w:history="1">
         <w:r>
           <w:rPr>
             <w:rStyle w:val="Hyperlink"/>
@@ -504,7 +504,7 @@
             <w:webHidden/>
             <w:sz w:val="22"/>
           </w:rPr>
-          <w:instrText xml:space="preserve"> PAGEREF _Toc232780578 \h </w:instrText>
+          <w:instrText xml:space="preserve"> PAGEREF _Toc232812571 \h </w:instrText>
         </w:r>
         <w:r>
           <w:rPr>
@@ -560,7 +560,7 @@
           <w14:ligatures w14:val="standardContextual"/>
         </w:rPr>
       </w:pPr>
-      <w:hyperlink w:anchor="_Toc232780579" w:history="1">
+      <w:hyperlink w:anchor="_Toc232812572" w:history="1">
         <w:r>
           <w:rPr>
             <w:rStyle w:val="Hyperlink"/>
@@ -595,7 +595,7 @@
             <w:webHidden/>
             <w:sz w:val="22"/>
           </w:rPr>
-          <w:instrText xml:space="preserve"> PAGEREF _Toc232780579 \h </w:instrText>
+          <w:instrText xml:space="preserve"> PAGEREF _Toc232812572 \h </w:instrText>
         </w:r>
         <w:r>
           <w:rPr>
@@ -651,7 +651,7 @@
           <w14:ligatures w14:val="standardContextual"/>
         </w:rPr>
       </w:pPr>
-      <w:hyperlink w:anchor="_Toc232780580" w:history="1">
+      <w:hyperlink w:anchor="_Toc232812573" w:history="1">
         <w:r>
           <w:rPr>
             <w:rStyle w:val="Hyperlink"/>
@@ -686,7 +686,7 @@
             <w:webHidden/>
             <w:sz w:val="22"/>
           </w:rPr>
-          <w:instrText xml:space="preserve"> PAGEREF _Toc232780580 \h </w:instrText>
+          <w:instrText xml:space="preserve"> PAGEREF _Toc232812573 \h </w:instrText>
         </w:r>
         <w:r>
           <w:rPr>
@@ -742,7 +742,7 @@
           <w14:ligatures w14:val="standardContextual"/>
         </w:rPr>
       </w:pPr>
-      <w:hyperlink w:anchor="_Toc232780581" w:history="1">
+      <w:hyperlink w:anchor="_Toc232812574" w:history="1">
         <w:r>
           <w:rPr>
             <w:rStyle w:val="Hyperlink"/>
@@ -777,7 +777,7 @@
             <w:webHidden/>
             <w:sz w:val="22"/>
           </w:rPr>
-          <w:instrText xml:space="preserve"> PAGEREF _Toc232780581 \h </w:instrText>
+          <w:instrText xml:space="preserve"> PAGEREF _Toc232812574 \h </w:instrText>
         </w:r>
         <w:r>
           <w:rPr>
@@ -833,7 +833,7 @@
           <w14:ligatures w14:val="standardContextual"/>
         </w:rPr>
       </w:pPr>
-      <w:hyperlink w:anchor="_Toc232780582" w:history="1">
+      <w:hyperlink w:anchor="_Toc232812575" w:history="1">
         <w:r>
           <w:rPr>
             <w:rStyle w:val="Hyperlink"/>
@@ -868,7 +868,7 @@
             <w:webHidden/>
             <w:sz w:val="22"/>
           </w:rPr>
-          <w:instrText xml:space="preserve"> PAGEREF _Toc232780582 \h </w:instrText>
+          <w:instrText xml:space="preserve"> PAGEREF _Toc232812575 \h </w:instrText>
         </w:r>
         <w:r>
           <w:rPr>
@@ -924,7 +924,7 @@
           <w14:ligatures w14:val="standardContextual"/>
         </w:rPr>
       </w:pPr>
-      <w:hyperlink w:anchor="_Toc232780583" w:history="1">
+      <w:hyperlink w:anchor="_Toc232812576" w:history="1">
         <w:r>
           <w:rPr>
             <w:rStyle w:val="Hyperlink"/>
@@ -959,7 +959,7 @@
             <w:webHidden/>
             <w:sz w:val="22"/>
           </w:rPr>
-          <w:instrText xml:space="preserve"> PAGEREF _Toc232780583 \h </w:instrText>
+          <w:instrText xml:space="preserve"> PAGEREF _Toc232812576 \h </w:instrText>
         </w:r>
         <w:r>
           <w:rPr>
@@ -1015,7 +1015,7 @@
           <w14:ligatures w14:val="standardContextual"/>
         </w:rPr>
       </w:pPr>
-      <w:hyperlink w:anchor="_Toc232780584" w:history="1">
+      <w:hyperlink w:anchor="_Toc232812577" w:history="1">
         <w:r>
           <w:rPr>
             <w:rStyle w:val="Hyperlink"/>
@@ -1050,7 +1050,7 @@
             <w:webHidden/>
             <w:sz w:val="22"/>
           </w:rPr>
-          <w:instrText xml:space="preserve"> PAGEREF _Toc232780584 \h </w:instrText>
+          <w:instrText xml:space="preserve"> PAGEREF _Toc232812577 \h </w:instrText>
         </w:r>
         <w:r>
           <w:rPr>
@@ -1106,7 +1106,7 @@
           <w14:ligatures w14:val="standardContextual"/>
         </w:rPr>
       </w:pPr>
-      <w:hyperlink w:anchor="_Toc232780585" w:history="1">
+      <w:hyperlink w:anchor="_Toc232812578" w:history="1">
         <w:r>
           <w:rPr>
             <w:rStyle w:val="Hyperlink"/>
@@ -1141,7 +1141,7 @@
             <w:webHidden/>
             <w:sz w:val="22"/>
           </w:rPr>
-          <w:instrText xml:space="preserve"> PAGEREF _Toc232780585 \h </w:instrText>
+          <w:instrText xml:space="preserve"> PAGEREF _Toc232812578 \h </w:instrText>
         </w:r>
         <w:r>
           <w:rPr>
@@ -1197,7 +1197,7 @@
           <w14:ligatures w14:val="standardContextual"/>
         </w:rPr>
       </w:pPr>
-      <w:hyperlink w:anchor="_Toc232780586" w:history="1">
+      <w:hyperlink w:anchor="_Toc232812579" w:history="1">
         <w:r>
           <w:rPr>
             <w:rStyle w:val="Hyperlink"/>
@@ -1232,7 +1232,7 @@
             <w:webHidden/>
             <w:sz w:val="22"/>
           </w:rPr>
-          <w:instrText xml:space="preserve"> PAGEREF _Toc232780586 \h </w:instrText>
+          <w:instrText xml:space="preserve"> PAGEREF _Toc232812579 \h </w:instrText>
         </w:r>
         <w:r>
           <w:rPr>
@@ -1288,7 +1288,7 @@
           <w14:ligatures w14:val="standardContextual"/>
         </w:rPr>
       </w:pPr>
-      <w:hyperlink w:anchor="_Toc232780587" w:history="1">
+      <w:hyperlink w:anchor="_Toc232812580" w:history="1">
         <w:r>
           <w:rPr>
             <w:rStyle w:val="Hyperlink"/>
@@ -1323,7 +1323,7 @@
             <w:webHidden/>
             <w:sz w:val="22"/>
           </w:rPr>
-          <w:instrText xml:space="preserve"> PAGEREF _Toc232780587 \h </w:instrText>
+          <w:instrText xml:space="preserve"> PAGEREF _Toc232812580 \h </w:instrText>
         </w:r>
         <w:r>
           <w:rPr>
@@ -1379,7 +1379,7 @@
           <w14:ligatures w14:val="standardContextual"/>
         </w:rPr>
       </w:pPr>
-      <w:hyperlink w:anchor="_Toc232780588" w:history="1">
+      <w:hyperlink w:anchor="_Toc232812581" w:history="1">
         <w:r>
           <w:rPr>
             <w:rStyle w:val="Hyperlink"/>
@@ -1414,7 +1414,7 @@
             <w:webHidden/>
             <w:sz w:val="22"/>
           </w:rPr>
-          <w:instrText xml:space="preserve"> PAGEREF _Toc232780588 \h </w:instrText>
+          <w:instrText xml:space="preserve"> PAGEREF _Toc232812581 \h </w:instrText>
         </w:r>
         <w:r>
           <w:rPr>
@@ -1470,7 +1470,7 @@
           <w14:ligatures w14:val="standardContextual"/>
         </w:rPr>
       </w:pPr>
-      <w:hyperlink w:anchor="_Toc232780589" w:history="1">
+      <w:hyperlink w:anchor="_Toc232812582" w:history="1">
         <w:r>
           <w:rPr>
             <w:rStyle w:val="Hyperlink"/>
@@ -1505,7 +1505,7 @@
             <w:webHidden/>
             <w:sz w:val="22"/>
           </w:rPr>
-          <w:instrText xml:space="preserve"> PAGEREF _Toc232780589 \h </w:instrText>
+          <w:instrText xml:space="preserve"> PAGEREF _Toc232812582 \h </w:instrText>
         </w:r>
         <w:r>
           <w:rPr>
@@ -1561,7 +1561,7 @@
           <w14:ligatures w14:val="standardContextual"/>
         </w:rPr>
       </w:pPr>
-      <w:hyperlink w:anchor="_Toc232780590" w:history="1">
+      <w:hyperlink w:anchor="_Toc232812583" w:history="1">
         <w:r>
           <w:rPr>
             <w:rStyle w:val="Hyperlink"/>
@@ -1596,7 +1596,7 @@
             <w:webHidden/>
             <w:sz w:val="22"/>
           </w:rPr>
-          <w:instrText xml:space="preserve"> PAGEREF _Toc232780590 \h </w:instrText>
+          <w:instrText xml:space="preserve"> PAGEREF _Toc232812583 \h </w:instrText>
         </w:r>
         <w:r>
           <w:rPr>
@@ -1652,7 +1652,7 @@
           <w14:ligatures w14:val="standardContextual"/>
         </w:rPr>
       </w:pPr>
-      <w:hyperlink w:anchor="_Toc232780591" w:history="1">
+      <w:hyperlink w:anchor="_Toc232812584" w:history="1">
         <w:r>
           <w:rPr>
             <w:rStyle w:val="Hyperlink"/>
@@ -1687,7 +1687,7 @@
             <w:webHidden/>
             <w:sz w:val="22"/>
           </w:rPr>
-          <w:instrText xml:space="preserve"> PAGEREF _Toc232780591 \h </w:instrText>
+          <w:instrText xml:space="preserve"> PAGEREF _Toc232812584 \h </w:instrText>
         </w:r>
         <w:r>
           <w:rPr>
@@ -1743,7 +1743,7 @@
           <w14:ligatures w14:val="standardContextual"/>
         </w:rPr>
       </w:pPr>
-      <w:hyperlink w:anchor="_Toc232780592" w:history="1">
+      <w:hyperlink w:anchor="_Toc232812585" w:history="1">
         <w:r>
           <w:rPr>
             <w:rStyle w:val="Hyperlink"/>
@@ -1778,7 +1778,7 @@
             <w:webHidden/>
             <w:sz w:val="22"/>
           </w:rPr>
-          <w:instrText xml:space="preserve"> PAGEREF _Toc232780592 \h </w:instrText>
+          <w:instrText xml:space="preserve"> PAGEREF _Toc232812585 \h </w:instrText>
         </w:r>
         <w:r>
           <w:rPr>
@@ -1834,7 +1834,7 @@
           <w14:ligatures w14:val="standardContextual"/>
         </w:rPr>
       </w:pPr>
-      <w:hyperlink w:anchor="_Toc232780593" w:history="1">
+      <w:hyperlink w:anchor="_Toc232812586" w:history="1">
         <w:r>
           <w:rPr>
             <w:rStyle w:val="Hyperlink"/>
@@ -1869,7 +1869,7 @@
             <w:webHidden/>
             <w:sz w:val="22"/>
           </w:rPr>
-          <w:instrText xml:space="preserve"> PAGEREF _Toc232780593 \h </w:instrText>
+          <w:instrText xml:space="preserve"> PAGEREF _Toc232812586 \h </w:instrText>
         </w:r>
         <w:r>
           <w:rPr>
@@ -1925,7 +1925,7 @@
           <w14:ligatures w14:val="standardContextual"/>
         </w:rPr>
       </w:pPr>
-      <w:hyperlink w:anchor="_Toc232780594" w:history="1">
+      <w:hyperlink w:anchor="_Toc232812587" w:history="1">
         <w:r>
           <w:rPr>
             <w:rStyle w:val="Hyperlink"/>
@@ -1960,7 +1960,7 @@
             <w:webHidden/>
             <w:sz w:val="22"/>
           </w:rPr>
-          <w:instrText xml:space="preserve"> PAGEREF _Toc232780594 \h </w:instrText>
+          <w:instrText xml:space="preserve"> PAGEREF _Toc232812587 \h </w:instrText>
         </w:r>
         <w:r>
           <w:rPr>
@@ -2016,7 +2016,7 @@
           <w14:ligatures w14:val="standardContextual"/>
         </w:rPr>
       </w:pPr>
-      <w:hyperlink w:anchor="_Toc232780595" w:history="1">
+      <w:hyperlink w:anchor="_Toc232812588" w:history="1">
         <w:r>
           <w:rPr>
             <w:rStyle w:val="Hyperlink"/>
@@ -2051,7 +2051,7 @@
             <w:webHidden/>
             <w:sz w:val="22"/>
           </w:rPr>
-          <w:instrText xml:space="preserve"> PAGEREF _Toc232780595 \h </w:instrText>
+          <w:instrText xml:space="preserve"> PAGEREF _Toc232812588 \h </w:instrText>
         </w:r>
         <w:r>
           <w:rPr>
@@ -2107,7 +2107,7 @@
           <w14:ligatures w14:val="standardContextual"/>
         </w:rPr>
       </w:pPr>
-      <w:hyperlink w:anchor="_Toc232780596" w:history="1">
+      <w:hyperlink w:anchor="_Toc232812589" w:history="1">
         <w:r>
           <w:rPr>
             <w:rStyle w:val="Hyperlink"/>
@@ -2142,7 +2142,7 @@
             <w:webHidden/>
             <w:sz w:val="22"/>
           </w:rPr>
-          <w:instrText xml:space="preserve"> PAGEREF _Toc232780596 \h </w:instrText>
+          <w:instrText xml:space="preserve"> PAGEREF _Toc232812589 \h </w:instrText>
         </w:r>
         <w:r>
           <w:rPr>
@@ -2198,7 +2198,7 @@
           <w14:ligatures w14:val="standardContextual"/>
         </w:rPr>
       </w:pPr>
-      <w:hyperlink w:anchor="_Toc232780597" w:history="1">
+      <w:hyperlink w:anchor="_Toc232812590" w:history="1">
         <w:r>
           <w:rPr>
             <w:rStyle w:val="Hyperlink"/>
@@ -2233,7 +2233,7 @@
             <w:webHidden/>
             <w:sz w:val="22"/>
           </w:rPr>
-          <w:instrText xml:space="preserve"> PAGEREF _Toc232780597 \h </w:instrText>
+          <w:instrText xml:space="preserve"> PAGEREF _Toc232812590 \h </w:instrText>
         </w:r>
         <w:r>
           <w:rPr>
@@ -2289,7 +2289,7 @@
           <w14:ligatures w14:val="standardContextual"/>
         </w:rPr>
       </w:pPr>
-      <w:hyperlink w:anchor="_Toc232780598" w:history="1">
+      <w:hyperlink w:anchor="_Toc232812591" w:history="1">
         <w:r>
           <w:rPr>
             <w:rStyle w:val="Hyperlink"/>
@@ -2324,7 +2324,7 @@
             <w:webHidden/>
             <w:sz w:val="22"/>
           </w:rPr>
-          <w:instrText xml:space="preserve"> PAGEREF _Toc232780598 \h </w:instrText>
+          <w:instrText xml:space="preserve"> PAGEREF _Toc232812591 \h </w:instrText>
         </w:r>
         <w:r>
           <w:rPr>
@@ -2380,7 +2380,7 @@
           <w14:ligatures w14:val="standardContextual"/>
         </w:rPr>
       </w:pPr>
-      <w:hyperlink w:anchor="_Toc232780599" w:history="1">
+      <w:hyperlink w:anchor="_Toc232812592" w:history="1">
         <w:r>
           <w:rPr>
             <w:rStyle w:val="Hyperlink"/>
@@ -2415,7 +2415,7 @@
             <w:webHidden/>
             <w:sz w:val="22"/>
           </w:rPr>
-          <w:instrText xml:space="preserve"> PAGEREF _Toc232780599 \h </w:instrText>
+          <w:instrText xml:space="preserve"> PAGEREF _Toc232812592 \h </w:instrText>
         </w:r>
         <w:r>
           <w:rPr>
@@ -2471,7 +2471,7 @@
           <w14:ligatures w14:val="standardContextual"/>
         </w:rPr>
       </w:pPr>
-      <w:hyperlink w:anchor="_Toc232780600" w:history="1">
+      <w:hyperlink w:anchor="_Toc232812593" w:history="1">
         <w:r>
           <w:rPr>
             <w:rStyle w:val="Hyperlink"/>
@@ -2506,7 +2506,7 @@
             <w:webHidden/>
             <w:sz w:val="22"/>
           </w:rPr>
-          <w:instrText xml:space="preserve"> PAGEREF _Toc232780600 \h </w:instrText>
+          <w:instrText xml:space="preserve"> PAGEREF _Toc232812593 \h </w:instrText>
         </w:r>
         <w:r>
           <w:rPr>
@@ -2562,7 +2562,7 @@
           <w14:ligatures w14:val="standardContextual"/>
         </w:rPr>
       </w:pPr>
-      <w:hyperlink w:anchor="_Toc232780601" w:history="1">
+      <w:hyperlink w:anchor="_Toc232812594" w:history="1">
         <w:r>
           <w:rPr>
             <w:rStyle w:val="Hyperlink"/>
@@ -2597,7 +2597,7 @@
             <w:webHidden/>
             <w:sz w:val="22"/>
           </w:rPr>
-          <w:instrText xml:space="preserve"> PAGEREF _Toc232780601 \h </w:instrText>
+          <w:instrText xml:space="preserve"> PAGEREF _Toc232812594 \h </w:instrText>
         </w:r>
         <w:r>
           <w:rPr>
@@ -2653,7 +2653,7 @@
           <w14:ligatures w14:val="standardContextual"/>
         </w:rPr>
       </w:pPr>
-      <w:hyperlink w:anchor="_Toc232780602" w:history="1">
+      <w:hyperlink w:anchor="_Toc232812595" w:history="1">
         <w:r>
           <w:rPr>
             <w:rStyle w:val="Hyperlink"/>
@@ -2688,7 +2688,7 @@
             <w:webHidden/>
             <w:sz w:val="22"/>
           </w:rPr>
-          <w:instrText xml:space="preserve"> PAGEREF _Toc232780602 \h </w:instrText>
+          <w:instrText xml:space="preserve"> PAGEREF _Toc232812595 \h </w:instrText>
         </w:r>
         <w:r>
           <w:rPr>
@@ -2744,7 +2744,7 @@
           <w14:ligatures w14:val="standardContextual"/>
         </w:rPr>
       </w:pPr>
-      <w:hyperlink w:anchor="_Toc232780603" w:history="1">
+      <w:hyperlink w:anchor="_Toc232812596" w:history="1">
         <w:r>
           <w:rPr>
             <w:rStyle w:val="Hyperlink"/>
@@ -2779,7 +2779,7 @@
             <w:webHidden/>
             <w:sz w:val="22"/>
           </w:rPr>
-          <w:instrText xml:space="preserve"> PAGEREF _Toc232780603 \h </w:instrText>
+          <w:instrText xml:space="preserve"> PAGEREF _Toc232812596 \h </w:instrText>
         </w:r>
         <w:r>
           <w:rPr>
@@ -2835,7 +2835,7 @@
           <w14:ligatures w14:val="standardContextual"/>
         </w:rPr>
       </w:pPr>
-      <w:hyperlink w:anchor="_Toc232780604" w:history="1">
+      <w:hyperlink w:anchor="_Toc232812597" w:history="1">
         <w:r>
           <w:rPr>
             <w:rStyle w:val="Hyperlink"/>
@@ -2870,7 +2870,7 @@
             <w:webHidden/>
             <w:sz w:val="22"/>
           </w:rPr>
-          <w:instrText xml:space="preserve"> PAGEREF _Toc232780604 \h </w:instrText>
+          <w:instrText xml:space="preserve"> PAGEREF _Toc232812597 \h </w:instrText>
         </w:r>
         <w:r>
           <w:rPr>
@@ -2926,7 +2926,7 @@
           <w14:ligatures w14:val="standardContextual"/>
         </w:rPr>
       </w:pPr>
-      <w:hyperlink w:anchor="_Toc232780605" w:history="1">
+      <w:hyperlink w:anchor="_Toc232812598" w:history="1">
         <w:r>
           <w:rPr>
             <w:rStyle w:val="Hyperlink"/>
@@ -2961,7 +2961,7 @@
             <w:webHidden/>
             <w:sz w:val="22"/>
           </w:rPr>
-          <w:instrText xml:space="preserve"> PAGEREF _Toc232780605 \h </w:instrText>
+          <w:instrText xml:space="preserve"> PAGEREF _Toc232812598 \h </w:instrText>
         </w:r>
         <w:r>
           <w:rPr>
@@ -3017,7 +3017,7 @@
           <w14:ligatures w14:val="standardContextual"/>
         </w:rPr>
       </w:pPr>
-      <w:hyperlink w:anchor="_Toc232780606" w:history="1">
+      <w:hyperlink w:anchor="_Toc232812599" w:history="1">
         <w:r>
           <w:rPr>
             <w:rStyle w:val="Hyperlink"/>
@@ -3052,7 +3052,7 @@
             <w:webHidden/>
             <w:sz w:val="22"/>
           </w:rPr>
-          <w:instrText xml:space="preserve"> PAGEREF _Toc232780606 \h </w:instrText>
+          <w:instrText xml:space="preserve"> PAGEREF _Toc232812599 \h </w:instrText>
         </w:r>
         <w:r>
           <w:rPr>
@@ -3108,7 +3108,7 @@
           <w14:ligatures w14:val="standardContextual"/>
         </w:rPr>
       </w:pPr>
-      <w:hyperlink w:anchor="_Toc232780607" w:history="1">
+      <w:hyperlink w:anchor="_Toc232812600" w:history="1">
         <w:r>
           <w:rPr>
             <w:rStyle w:val="Hyperlink"/>
@@ -3143,7 +3143,7 @@
             <w:webHidden/>
             <w:sz w:val="22"/>
           </w:rPr>
-          <w:instrText xml:space="preserve"> PAGEREF _Toc232780607 \h </w:instrText>
+          <w:instrText xml:space="preserve"> PAGEREF _Toc232812600 \h </w:instrText>
         </w:r>
         <w:r>
           <w:rPr>
@@ -3199,7 +3199,7 @@
           <w14:ligatures w14:val="standardContextual"/>
         </w:rPr>
       </w:pPr>
-      <w:hyperlink w:anchor="_Toc232780608" w:history="1">
+      <w:hyperlink w:anchor="_Toc232812601" w:history="1">
         <w:r>
           <w:rPr>
             <w:rStyle w:val="Hyperlink"/>
@@ -3234,7 +3234,7 @@
             <w:webHidden/>
             <w:sz w:val="22"/>
           </w:rPr>
-          <w:instrText xml:space="preserve"> PAGEREF _Toc232780608 \h </w:instrText>
+          <w:instrText xml:space="preserve"> PAGEREF _Toc232812601 \h </w:instrText>
         </w:r>
         <w:r>
           <w:rPr>
@@ -3290,7 +3290,7 @@
           <w14:ligatures w14:val="standardContextual"/>
         </w:rPr>
       </w:pPr>
-      <w:hyperlink w:anchor="_Toc232780609" w:history="1">
+      <w:hyperlink w:anchor="_Toc232812602" w:history="1">
         <w:r>
           <w:rPr>
             <w:rStyle w:val="Hyperlink"/>
@@ -3325,7 +3325,7 @@
             <w:webHidden/>
             <w:sz w:val="22"/>
           </w:rPr>
-          <w:instrText xml:space="preserve"> PAGEREF _Toc232780609 \h </w:instrText>
+          <w:instrText xml:space="preserve"> PAGEREF _Toc232812602 \h </w:instrText>
         </w:r>
         <w:r>
           <w:rPr>
@@ -3381,7 +3381,7 @@
           <w14:ligatures w14:val="standardContextual"/>
         </w:rPr>
       </w:pPr>
-      <w:hyperlink w:anchor="_Toc232780610" w:history="1">
+      <w:hyperlink w:anchor="_Toc232812603" w:history="1">
         <w:r>
           <w:rPr>
             <w:rStyle w:val="Hyperlink"/>
@@ -3416,7 +3416,7 @@
             <w:webHidden/>
             <w:sz w:val="22"/>
           </w:rPr>
-          <w:instrText xml:space="preserve"> PAGEREF _Toc232780610 \h </w:instrText>
+          <w:instrText xml:space="preserve"> PAGEREF _Toc232812603 \h </w:instrText>
         </w:r>
         <w:r>
           <w:rPr>
@@ -3476,7 +3476,7 @@
       <w:pPr>
         <w:pStyle w:val="berschrift1"/>
       </w:pPr>
-      <w:bookmarkStart w:id="0" w:name="_Toc232780578"/>
+      <w:bookmarkStart w:id="0" w:name="_Toc232812571"/>
       <w:r>
         <w:lastRenderedPageBreak/>
         <w:t>1. Project Overview</w:t>
@@ -3487,7 +3487,7 @@
       <w:pPr>
         <w:pStyle w:val="berschrift2"/>
       </w:pPr>
-      <w:bookmarkStart w:id="1" w:name="_Toc232780579"/>
+      <w:bookmarkStart w:id="1" w:name="_Toc232812572"/>
       <w:r>
         <w:t>1.1 Context</w:t>
       </w:r>
@@ -3507,7 +3507,7 @@
       <w:pPr>
         <w:pStyle w:val="berschrift2"/>
       </w:pPr>
-      <w:bookmarkStart w:id="2" w:name="_Toc232780580"/>
+      <w:bookmarkStart w:id="2" w:name="_Toc232812573"/>
       <w:r>
         <w:t>1.2 Goal</w:t>
       </w:r>
@@ -3522,7 +3522,7 @@
       <w:pPr>
         <w:pStyle w:val="berschrift2"/>
       </w:pPr>
-      <w:bookmarkStart w:id="3" w:name="_Toc232780581"/>
+      <w:bookmarkStart w:id="3" w:name="_Toc232812574"/>
       <w:r>
         <w:t>1.3 What The Program Does</w:t>
       </w:r>
@@ -3537,7 +3537,7 @@
       <w:pPr>
         <w:pStyle w:val="berschrift1"/>
       </w:pPr>
-      <w:bookmarkStart w:id="4" w:name="_Toc232780582"/>
+      <w:bookmarkStart w:id="4" w:name="_Toc232812575"/>
       <w:r>
         <w:t>2. Project Work And Personal Approach</w:t>
       </w:r>
@@ -3547,7 +3547,7 @@
       <w:pPr>
         <w:pStyle w:val="berschrift2"/>
       </w:pPr>
-      <w:bookmarkStart w:id="5" w:name="_Toc232780583"/>
+      <w:bookmarkStart w:id="5" w:name="_Toc232812576"/>
       <w:r>
         <w:t>2.1 How I Started</w:t>
       </w:r>
@@ -3567,7 +3567,7 @@
       <w:pPr>
         <w:pStyle w:val="berschrift2"/>
       </w:pPr>
-      <w:bookmarkStart w:id="6" w:name="_Toc232780584"/>
+      <w:bookmarkStart w:id="6" w:name="_Toc232812577"/>
       <w:r>
         <w:t>2.2 Difficulties During The Project</w:t>
       </w:r>
@@ -3592,7 +3592,7 @@
       <w:pPr>
         <w:pStyle w:val="berschrift2"/>
       </w:pPr>
-      <w:bookmarkStart w:id="7" w:name="_Toc232780585"/>
+      <w:bookmarkStart w:id="7" w:name="_Toc232812578"/>
       <w:r>
         <w:t>2.3 What I Improved Near The End</w:t>
       </w:r>
@@ -3607,7 +3607,7 @@
       <w:pPr>
         <w:pStyle w:val="berschrift1"/>
       </w:pPr>
-      <w:bookmarkStart w:id="8" w:name="_Toc232780586"/>
+      <w:bookmarkStart w:id="8" w:name="_Toc232812579"/>
       <w:r>
         <w:lastRenderedPageBreak/>
         <w:t>3. Project Plan</w:t>
@@ -4144,7 +4144,7 @@
       <w:pPr>
         <w:pStyle w:val="berschrift1"/>
       </w:pPr>
-      <w:bookmarkStart w:id="9" w:name="_Toc232780587"/>
+      <w:bookmarkStart w:id="9" w:name="_Toc232812580"/>
       <w:r>
         <w:t>4. Requirements</w:t>
       </w:r>
@@ -4154,7 +4154,7 @@
       <w:pPr>
         <w:pStyle w:val="berschrift2"/>
       </w:pPr>
-      <w:bookmarkStart w:id="10" w:name="_Toc232780588"/>
+      <w:bookmarkStart w:id="10" w:name="_Toc232812581"/>
       <w:r>
         <w:t>4.1 Functional Requirements</w:t>
       </w:r>
@@ -5691,7 +5691,7 @@
       <w:pPr>
         <w:pStyle w:val="berschrift2"/>
       </w:pPr>
-      <w:bookmarkStart w:id="11" w:name="_Toc232780589"/>
+      <w:bookmarkStart w:id="11" w:name="_Toc232812582"/>
       <w:r>
         <w:t>4.2 Non-Functional Requirements</w:t>
       </w:r>
@@ -6539,7 +6539,7 @@
         <w:pStyle w:val="berschrift1"/>
         <w:pageBreakBefore/>
       </w:pPr>
-      <w:bookmarkStart w:id="12" w:name="_Toc232780590"/>
+      <w:bookmarkStart w:id="12" w:name="_Toc232812583"/>
       <w:r>
         <w:lastRenderedPageBreak/>
         <w:t>5. System Design</w:t>
@@ -6550,7 +6550,7 @@
       <w:pPr>
         <w:pStyle w:val="berschrift2"/>
       </w:pPr>
-      <w:bookmarkStart w:id="13" w:name="_Toc232780591"/>
+      <w:bookmarkStart w:id="13" w:name="_Toc232812584"/>
       <w:r>
         <w:t>5.1 Module Overview</w:t>
       </w:r>
@@ -7026,7 +7026,7 @@
       <w:pPr>
         <w:pStyle w:val="berschrift2"/>
       </w:pPr>
-      <w:bookmarkStart w:id="14" w:name="_Toc232780592"/>
+      <w:bookmarkStart w:id="14" w:name="_Toc232812585"/>
       <w:r>
         <w:t>5.2 Main Workflow</w:t>
       </w:r>
@@ -7127,7 +7127,7 @@
       <w:pPr>
         <w:pStyle w:val="berschrift2"/>
       </w:pPr>
-      <w:bookmarkStart w:id="15" w:name="_Toc232780593"/>
+      <w:bookmarkStart w:id="15" w:name="_Toc232812586"/>
       <w:r>
         <w:lastRenderedPageBreak/>
         <w:t>5.3 System Architecture Diagram</w:t>
@@ -7188,7 +7188,7 @@
       <w:pPr>
         <w:pStyle w:val="berschrift2"/>
       </w:pPr>
-      <w:bookmarkStart w:id="16" w:name="_Toc232780594"/>
+      <w:bookmarkStart w:id="16" w:name="_Toc232812587"/>
       <w:r>
         <w:lastRenderedPageBreak/>
         <w:t>5.4 UML Activity Diagram</w:t>
@@ -7244,7 +7244,7 @@
       <w:pPr>
         <w:pStyle w:val="berschrift2"/>
       </w:pPr>
-      <w:bookmarkStart w:id="17" w:name="_Toc232780595"/>
+      <w:bookmarkStart w:id="17" w:name="_Toc232812588"/>
       <w:r>
         <w:lastRenderedPageBreak/>
         <w:t>5.5 UML Component Diagram</w:t>
@@ -7300,7 +7300,7 @@
       <w:pPr>
         <w:pStyle w:val="berschrift2"/>
       </w:pPr>
-      <w:bookmarkStart w:id="18" w:name="_Toc232780596"/>
+      <w:bookmarkStart w:id="18" w:name="_Toc232812589"/>
       <w:r>
         <w:t>5.6 UML Deployment Diagram</w:t>
       </w:r>
@@ -7355,7 +7355,7 @@
       <w:pPr>
         <w:pStyle w:val="berschrift2"/>
       </w:pPr>
-      <w:bookmarkStart w:id="19" w:name="_Toc232780597"/>
+      <w:bookmarkStart w:id="19" w:name="_Toc232812590"/>
       <w:r>
         <w:lastRenderedPageBreak/>
         <w:t>5.7 UML Class Diagram</w:t>
@@ -7411,7 +7411,7 @@
       <w:pPr>
         <w:pStyle w:val="berschrift2"/>
       </w:pPr>
-      <w:bookmarkStart w:id="20" w:name="_Toc232780598"/>
+      <w:bookmarkStart w:id="20" w:name="_Toc232812591"/>
       <w:r>
         <w:t>5.8 ER Diagram</w:t>
       </w:r>
@@ -7466,7 +7466,7 @@
       <w:pPr>
         <w:pStyle w:val="berschrift2"/>
       </w:pPr>
-      <w:bookmarkStart w:id="21" w:name="_Toc232780599"/>
+      <w:bookmarkStart w:id="21" w:name="_Toc232812592"/>
       <w:r>
         <w:lastRenderedPageBreak/>
         <w:t>5.9 Flowchart</w:t>
@@ -7522,7 +7522,7 @@
       <w:pPr>
         <w:pStyle w:val="berschrift1"/>
       </w:pPr>
-      <w:bookmarkStart w:id="22" w:name="_Toc232780600"/>
+      <w:bookmarkStart w:id="22" w:name="_Toc232812593"/>
       <w:r>
         <w:t>6. Database Design</w:t>
       </w:r>
@@ -7998,7 +7998,7 @@
         <w:pStyle w:val="berschrift1"/>
         <w:pageBreakBefore/>
       </w:pPr>
-      <w:bookmarkStart w:id="23" w:name="_Toc232780601"/>
+      <w:bookmarkStart w:id="23" w:name="_Toc232812594"/>
       <w:r>
         <w:lastRenderedPageBreak/>
         <w:t>7. Installation And Usage</w:t>
@@ -8009,7 +8009,7 @@
       <w:pPr>
         <w:pStyle w:val="berschrift2"/>
       </w:pPr>
-      <w:bookmarkStart w:id="24" w:name="_Toc232780602"/>
+      <w:bookmarkStart w:id="24" w:name="_Toc232812595"/>
       <w:r>
         <w:t>7.1 Prerequisites</w:t>
       </w:r>
@@ -8338,7 +8338,7 @@
       <w:pPr>
         <w:pStyle w:val="berschrift2"/>
       </w:pPr>
-      <w:bookmarkStart w:id="25" w:name="_Toc232780603"/>
+      <w:bookmarkStart w:id="25" w:name="_Toc232812596"/>
       <w:r>
         <w:t>7.2 Clone Or Open The Project</w:t>
       </w:r>
@@ -8455,7 +8455,7 @@
       <w:pPr>
         <w:pStyle w:val="berschrift2"/>
       </w:pPr>
-      <w:bookmarkStart w:id="26" w:name="_Toc232780604"/>
+      <w:bookmarkStart w:id="26" w:name="_Toc232812597"/>
       <w:r>
         <w:t>7.3 Install Dependencies</w:t>
       </w:r>
@@ -8535,7 +8535,7 @@
       <w:pPr>
         <w:pStyle w:val="berschrift2"/>
       </w:pPr>
-      <w:bookmarkStart w:id="27" w:name="_Toc232780605"/>
+      <w:bookmarkStart w:id="27" w:name="_Toc232812598"/>
       <w:r>
         <w:t>7.4 Configure The .env File</w:t>
       </w:r>
@@ -9054,7 +9054,7 @@
       <w:pPr>
         <w:pStyle w:val="berschrift2"/>
       </w:pPr>
-      <w:bookmarkStart w:id="28" w:name="_Toc232780606"/>
+      <w:bookmarkStart w:id="28" w:name="_Toc232812599"/>
       <w:r>
         <w:t>7.5 API Setup Explained Simply</w:t>
       </w:r>
@@ -9089,8 +9089,6 @@
       <w:pPr>
         <w:rPr>
           <w:rFonts w:ascii="Arial" w:hAnsi="Arial" w:cs="Arial"/>
-          <w:b/>
-          <w:bCs/>
           <w:sz w:val="21"/>
         </w:rPr>
       </w:pPr>
@@ -9099,7 +9097,7 @@
           <w:rFonts w:ascii="Arial" w:hAnsi="Arial" w:cs="Arial"/>
           <w:sz w:val="21"/>
         </w:rPr>
-        <w:t>Spotify is recommended because it adds covers, durations, artist images and track links. Open https://developer.spotify.com/dashboard, log in and create a new app. Use an app name such as Weekly Spotify Wrapped, add a short description such as Weekly music report using Spotify metadata and enter http://127.0.0.1:8888/callback as redirect URI. This redirect URI must be exactly the same as SPOTIFY_REDIRECT_URI in the .env file. Select Web API, accept the developer terms and create the app. Then open the app settings, copy the client ID into SPOTIFY_CLIENT_ID and reveal the client secret to copy it into SPOTIFY_CLIENT_SECRET.</w:t>
+        <w:t>Spotify is recommended because it adds covers, durations, artist images and track links. According to Spotify's Web API Getting Started page, a Spotify Premium account can be required to use the Web API. If the teacher does not have Spotify Premium or does not want to create a Spotify app, the project can still be tested without Spotify by leaving SPOTIFY_CLIENT_ID, SPOTIFY_CLIENT_SECRET, SPOTIFY_REFRESH_TOKEN, SPOTIFY_PLAYLIST_ID and PLAYLIST_URL empty and setting ENABLE_PLAYLIST=false. In that mode, the program uses Last.fm data only. The database, statistics, HTML report, tests and optional email sending still work, while Spotify covers, links, durations and playlist updates are skipped. With Spotify Premium or a working Spotify Developer account, open https://developer.spotify.com/dashboard, log in and create a new app. Use an app name such as Weekly Spotify Wrapped, add a short description such as Weekly music report using Spotify metadata and enter http://127.0.0.1:8888/callback as redirect URI. This redirect URI must be exactly the same as SPOTIFY_REDIRECT_URI in the .env file. Select Web API, accept the developer terms and create the app. Then open the app settings, copy the client ID into SPOTIFY_CLIENT_ID and reveal the client secret to copy it into SPOTIFY_CLIENT_SECRET.</w:t>
       </w:r>
     </w:p>
     <w:p>
@@ -9209,7 +9207,7 @@
       <w:pPr>
         <w:pStyle w:val="berschrift2"/>
       </w:pPr>
-      <w:bookmarkStart w:id="29" w:name="_Toc232780607"/>
+      <w:bookmarkStart w:id="29" w:name="_Toc232812600"/>
       <w:r>
         <w:t>7.7 Weekly Automation</w:t>
       </w:r>
@@ -9328,7 +9326,7 @@
       <w:pPr>
         <w:pStyle w:val="berschrift1"/>
       </w:pPr>
-      <w:bookmarkStart w:id="30" w:name="_Toc232780608"/>
+      <w:bookmarkStart w:id="30" w:name="_Toc232812601"/>
       <w:r>
         <w:t>8. Testing</w:t>
       </w:r>
@@ -9375,6 +9373,7 @@
                 <w:color w:val="111827"/>
                 <w:sz w:val="17"/>
               </w:rPr>
+              <w:lastRenderedPageBreak/>
               <w:t>python -m pytest</w:t>
             </w:r>
             <w:r>
@@ -9398,8 +9397,23 @@
     <w:p/>
     <w:p>
       <w:r>
-        <w:lastRenderedPageBreak/>
         <w:t>The tests cover configuration loading, missing values, database duplicate handling, Last.fm parsing, Spotify enrichment, report generation, email sending, Spotify setup and the main workflow. The full executed test protocol is included as M122E_Test_Protocol.pdf and M122E_Test_Protocol.docx.</w:t>
+      </w:r>
+    </w:p>
+    <w:p/>
+    <w:p>
+      <w:pPr>
+        <w:rPr>
+          <w:rFonts w:ascii="Arial" w:hAnsi="Arial" w:cs="Arial"/>
+          <w:sz w:val="21"/>
+        </w:rPr>
+      </w:pPr>
+      <w:r>
+        <w:rPr>
+          <w:rFonts w:ascii="Arial" w:hAnsi="Arial" w:cs="Arial"/>
+          <w:sz w:val="21"/>
+        </w:rPr>
+        <w:t>The repository also includes a GitHub Actions CI pipeline in .github/workflows/ci.yml. The pipeline runs on pushes and pull requests to main, sets up Python 3.12, installs the dependencies from requirements.txt and runs python -m pytest. There is no production deployment for this school project, so the CD part is limited to keeping the repository automatically tested and ready for submission.</w:t>
       </w:r>
     </w:p>
     <w:p/>
@@ -9423,7 +9437,7 @@
         <w:pStyle w:val="berschrift1"/>
         <w:pageBreakBefore/>
       </w:pPr>
-      <w:bookmarkStart w:id="31" w:name="_Toc232780609"/>
+      <w:bookmarkStart w:id="31" w:name="_Toc232812602"/>
       <w:r>
         <w:lastRenderedPageBreak/>
         <w:t>9. Assignment Coverage</w:t>
@@ -9998,7 +10012,7 @@
       <w:pPr>
         <w:pStyle w:val="berschrift1"/>
       </w:pPr>
-      <w:bookmarkStart w:id="32" w:name="_Toc232780610"/>
+      <w:bookmarkStart w:id="32" w:name="_Toc232812603"/>
       <w:r>
         <w:t>10. Conclusion</w:t>
       </w:r>

</xml_diff>

<commit_message>
Clarify optional Spotify and email setup
</commit_message>
<xml_diff>
--- a/docs/M122E_Final_Documentation.docx
+++ b/docs/M122E_Final_Documentation.docx
@@ -442,7 +442,7 @@
         <w:tabs>
           <w:tab w:val="right" w:leader="dot" w:pos="10272"/>
         </w:tabs>
-        <w:spacing w:after="0" w:line="196" w:lineRule="exact"/>
+        <w:spacing w:after="0" w:line="192" w:lineRule="exact"/>
         <w:rPr>
           <w:rFonts w:ascii="Arial" w:hAnsi="Arial" w:cs="Arial"/>
           <w:noProof/>
@@ -474,7 +474,7 @@
         </w:rPr>
         <w:fldChar w:fldCharType="separate"/>
       </w:r>
-      <w:hyperlink w:anchor="_Toc232814689" w:history="1">
+      <w:hyperlink w:anchor="_Toc232815358" w:history="1">
         <w:r>
           <w:rPr>
             <w:rStyle w:val="Hyperlink"/>
@@ -509,7 +509,7 @@
             <w:webHidden/>
             <w:sz w:val="17"/>
           </w:rPr>
-          <w:instrText xml:space="preserve"> PAGEREF _Toc232814689 \h </w:instrText>
+          <w:instrText xml:space="preserve"> PAGEREF _Toc232815358 \h </w:instrText>
         </w:r>
         <w:r>
           <w:rPr>
@@ -554,7 +554,7 @@
         <w:tabs>
           <w:tab w:val="right" w:leader="dot" w:pos="10272"/>
         </w:tabs>
-        <w:spacing w:after="0" w:line="196" w:lineRule="exact"/>
+        <w:spacing w:after="0" w:line="192" w:lineRule="exact"/>
         <w:rPr>
           <w:rFonts w:ascii="Arial" w:hAnsi="Arial" w:cs="Arial"/>
           <w:noProof/>
@@ -565,7 +565,7 @@
           <w14:ligatures w14:val="standardContextual"/>
         </w:rPr>
       </w:pPr>
-      <w:hyperlink w:anchor="_Toc232814690" w:history="1">
+      <w:hyperlink w:anchor="_Toc232815359" w:history="1">
         <w:r>
           <w:rPr>
             <w:rStyle w:val="Hyperlink"/>
@@ -600,7 +600,7 @@
             <w:webHidden/>
             <w:sz w:val="17"/>
           </w:rPr>
-          <w:instrText xml:space="preserve"> PAGEREF _Toc232814690 \h </w:instrText>
+          <w:instrText xml:space="preserve"> PAGEREF _Toc232815359 \h </w:instrText>
         </w:r>
         <w:r>
           <w:rPr>
@@ -645,7 +645,7 @@
         <w:tabs>
           <w:tab w:val="right" w:leader="dot" w:pos="10272"/>
         </w:tabs>
-        <w:spacing w:after="0" w:line="196" w:lineRule="exact"/>
+        <w:spacing w:after="0" w:line="192" w:lineRule="exact"/>
         <w:rPr>
           <w:rFonts w:ascii="Arial" w:hAnsi="Arial" w:cs="Arial"/>
           <w:noProof/>
@@ -656,7 +656,7 @@
           <w14:ligatures w14:val="standardContextual"/>
         </w:rPr>
       </w:pPr>
-      <w:hyperlink w:anchor="_Toc232814691" w:history="1">
+      <w:hyperlink w:anchor="_Toc232815360" w:history="1">
         <w:r>
           <w:rPr>
             <w:rStyle w:val="Hyperlink"/>
@@ -691,7 +691,7 @@
             <w:webHidden/>
             <w:sz w:val="17"/>
           </w:rPr>
-          <w:instrText xml:space="preserve"> PAGEREF _Toc232814691 \h </w:instrText>
+          <w:instrText xml:space="preserve"> PAGEREF _Toc232815360 \h </w:instrText>
         </w:r>
         <w:r>
           <w:rPr>
@@ -736,7 +736,7 @@
         <w:tabs>
           <w:tab w:val="right" w:leader="dot" w:pos="10272"/>
         </w:tabs>
-        <w:spacing w:after="0" w:line="196" w:lineRule="exact"/>
+        <w:spacing w:after="0" w:line="192" w:lineRule="exact"/>
         <w:rPr>
           <w:rFonts w:ascii="Arial" w:hAnsi="Arial" w:cs="Arial"/>
           <w:noProof/>
@@ -747,7 +747,7 @@
           <w14:ligatures w14:val="standardContextual"/>
         </w:rPr>
       </w:pPr>
-      <w:hyperlink w:anchor="_Toc232814692" w:history="1">
+      <w:hyperlink w:anchor="_Toc232815361" w:history="1">
         <w:r>
           <w:rPr>
             <w:rStyle w:val="Hyperlink"/>
@@ -782,7 +782,7 @@
             <w:webHidden/>
             <w:sz w:val="17"/>
           </w:rPr>
-          <w:instrText xml:space="preserve"> PAGEREF _Toc232814692 \h </w:instrText>
+          <w:instrText xml:space="preserve"> PAGEREF _Toc232815361 \h </w:instrText>
         </w:r>
         <w:r>
           <w:rPr>
@@ -827,7 +827,7 @@
         <w:tabs>
           <w:tab w:val="right" w:leader="dot" w:pos="10272"/>
         </w:tabs>
-        <w:spacing w:after="0" w:line="196" w:lineRule="exact"/>
+        <w:spacing w:after="0" w:line="192" w:lineRule="exact"/>
         <w:rPr>
           <w:rFonts w:ascii="Arial" w:hAnsi="Arial" w:cs="Arial"/>
           <w:noProof/>
@@ -838,7 +838,7 @@
           <w14:ligatures w14:val="standardContextual"/>
         </w:rPr>
       </w:pPr>
-      <w:hyperlink w:anchor="_Toc232814693" w:history="1">
+      <w:hyperlink w:anchor="_Toc232815362" w:history="1">
         <w:r>
           <w:rPr>
             <w:rStyle w:val="Hyperlink"/>
@@ -873,7 +873,7 @@
             <w:webHidden/>
             <w:sz w:val="17"/>
           </w:rPr>
-          <w:instrText xml:space="preserve"> PAGEREF _Toc232814693 \h </w:instrText>
+          <w:instrText xml:space="preserve"> PAGEREF _Toc232815362 \h </w:instrText>
         </w:r>
         <w:r>
           <w:rPr>
@@ -918,7 +918,7 @@
         <w:tabs>
           <w:tab w:val="right" w:leader="dot" w:pos="10272"/>
         </w:tabs>
-        <w:spacing w:after="0" w:line="196" w:lineRule="exact"/>
+        <w:spacing w:after="0" w:line="192" w:lineRule="exact"/>
         <w:rPr>
           <w:rFonts w:ascii="Arial" w:hAnsi="Arial" w:cs="Arial"/>
           <w:noProof/>
@@ -929,7 +929,7 @@
           <w14:ligatures w14:val="standardContextual"/>
         </w:rPr>
       </w:pPr>
-      <w:hyperlink w:anchor="_Toc232814694" w:history="1">
+      <w:hyperlink w:anchor="_Toc232815363" w:history="1">
         <w:r>
           <w:rPr>
             <w:rStyle w:val="Hyperlink"/>
@@ -964,7 +964,7 @@
             <w:webHidden/>
             <w:sz w:val="17"/>
           </w:rPr>
-          <w:instrText xml:space="preserve"> PAGEREF _Toc232814694 \h </w:instrText>
+          <w:instrText xml:space="preserve"> PAGEREF _Toc232815363 \h </w:instrText>
         </w:r>
         <w:r>
           <w:rPr>
@@ -1009,7 +1009,7 @@
         <w:tabs>
           <w:tab w:val="right" w:leader="dot" w:pos="10272"/>
         </w:tabs>
-        <w:spacing w:after="0" w:line="196" w:lineRule="exact"/>
+        <w:spacing w:after="0" w:line="192" w:lineRule="exact"/>
         <w:rPr>
           <w:rFonts w:ascii="Arial" w:hAnsi="Arial" w:cs="Arial"/>
           <w:noProof/>
@@ -1020,7 +1020,7 @@
           <w14:ligatures w14:val="standardContextual"/>
         </w:rPr>
       </w:pPr>
-      <w:hyperlink w:anchor="_Toc232814695" w:history="1">
+      <w:hyperlink w:anchor="_Toc232815364" w:history="1">
         <w:r>
           <w:rPr>
             <w:rStyle w:val="Hyperlink"/>
@@ -1055,7 +1055,7 @@
             <w:webHidden/>
             <w:sz w:val="17"/>
           </w:rPr>
-          <w:instrText xml:space="preserve"> PAGEREF _Toc232814695 \h </w:instrText>
+          <w:instrText xml:space="preserve"> PAGEREF _Toc232815364 \h </w:instrText>
         </w:r>
         <w:r>
           <w:rPr>
@@ -1100,7 +1100,7 @@
         <w:tabs>
           <w:tab w:val="right" w:leader="dot" w:pos="10272"/>
         </w:tabs>
-        <w:spacing w:after="0" w:line="196" w:lineRule="exact"/>
+        <w:spacing w:after="0" w:line="192" w:lineRule="exact"/>
         <w:rPr>
           <w:rFonts w:ascii="Arial" w:hAnsi="Arial" w:cs="Arial"/>
           <w:noProof/>
@@ -1111,7 +1111,7 @@
           <w14:ligatures w14:val="standardContextual"/>
         </w:rPr>
       </w:pPr>
-      <w:hyperlink w:anchor="_Toc232814696" w:history="1">
+      <w:hyperlink w:anchor="_Toc232815365" w:history="1">
         <w:r>
           <w:rPr>
             <w:rStyle w:val="Hyperlink"/>
@@ -1146,7 +1146,7 @@
             <w:webHidden/>
             <w:sz w:val="17"/>
           </w:rPr>
-          <w:instrText xml:space="preserve"> PAGEREF _Toc232814696 \h </w:instrText>
+          <w:instrText xml:space="preserve"> PAGEREF _Toc232815365 \h </w:instrText>
         </w:r>
         <w:r>
           <w:rPr>
@@ -1191,7 +1191,7 @@
         <w:tabs>
           <w:tab w:val="right" w:leader="dot" w:pos="10272"/>
         </w:tabs>
-        <w:spacing w:after="0" w:line="196" w:lineRule="exact"/>
+        <w:spacing w:after="0" w:line="192" w:lineRule="exact"/>
         <w:rPr>
           <w:rFonts w:ascii="Arial" w:hAnsi="Arial" w:cs="Arial"/>
           <w:noProof/>
@@ -1202,7 +1202,7 @@
           <w14:ligatures w14:val="standardContextual"/>
         </w:rPr>
       </w:pPr>
-      <w:hyperlink w:anchor="_Toc232814697" w:history="1">
+      <w:hyperlink w:anchor="_Toc232815366" w:history="1">
         <w:r>
           <w:rPr>
             <w:rStyle w:val="Hyperlink"/>
@@ -1237,7 +1237,7 @@
             <w:webHidden/>
             <w:sz w:val="17"/>
           </w:rPr>
-          <w:instrText xml:space="preserve"> PAGEREF _Toc232814697 \h </w:instrText>
+          <w:instrText xml:space="preserve"> PAGEREF _Toc232815366 \h </w:instrText>
         </w:r>
         <w:r>
           <w:rPr>
@@ -1282,7 +1282,7 @@
         <w:tabs>
           <w:tab w:val="right" w:leader="dot" w:pos="10272"/>
         </w:tabs>
-        <w:spacing w:after="0" w:line="196" w:lineRule="exact"/>
+        <w:spacing w:after="0" w:line="192" w:lineRule="exact"/>
         <w:rPr>
           <w:rFonts w:ascii="Arial" w:hAnsi="Arial" w:cs="Arial"/>
           <w:noProof/>
@@ -1293,7 +1293,7 @@
           <w14:ligatures w14:val="standardContextual"/>
         </w:rPr>
       </w:pPr>
-      <w:hyperlink w:anchor="_Toc232814698" w:history="1">
+      <w:hyperlink w:anchor="_Toc232815367" w:history="1">
         <w:r>
           <w:rPr>
             <w:rStyle w:val="Hyperlink"/>
@@ -1328,7 +1328,7 @@
             <w:webHidden/>
             <w:sz w:val="17"/>
           </w:rPr>
-          <w:instrText xml:space="preserve"> PAGEREF _Toc232814698 \h </w:instrText>
+          <w:instrText xml:space="preserve"> PAGEREF _Toc232815367 \h </w:instrText>
         </w:r>
         <w:r>
           <w:rPr>
@@ -1373,7 +1373,7 @@
         <w:tabs>
           <w:tab w:val="right" w:leader="dot" w:pos="10272"/>
         </w:tabs>
-        <w:spacing w:after="0" w:line="196" w:lineRule="exact"/>
+        <w:spacing w:after="0" w:line="192" w:lineRule="exact"/>
         <w:rPr>
           <w:rFonts w:ascii="Arial" w:hAnsi="Arial" w:cs="Arial"/>
           <w:noProof/>
@@ -1384,7 +1384,7 @@
           <w14:ligatures w14:val="standardContextual"/>
         </w:rPr>
       </w:pPr>
-      <w:hyperlink w:anchor="_Toc232814699" w:history="1">
+      <w:hyperlink w:anchor="_Toc232815368" w:history="1">
         <w:r>
           <w:rPr>
             <w:rStyle w:val="Hyperlink"/>
@@ -1419,7 +1419,7 @@
             <w:webHidden/>
             <w:sz w:val="17"/>
           </w:rPr>
-          <w:instrText xml:space="preserve"> PAGEREF _Toc232814699 \h </w:instrText>
+          <w:instrText xml:space="preserve"> PAGEREF _Toc232815368 \h </w:instrText>
         </w:r>
         <w:r>
           <w:rPr>
@@ -1464,7 +1464,7 @@
         <w:tabs>
           <w:tab w:val="right" w:leader="dot" w:pos="10272"/>
         </w:tabs>
-        <w:spacing w:after="0" w:line="196" w:lineRule="exact"/>
+        <w:spacing w:after="0" w:line="192" w:lineRule="exact"/>
         <w:rPr>
           <w:rFonts w:ascii="Arial" w:hAnsi="Arial" w:cs="Arial"/>
           <w:noProof/>
@@ -1475,7 +1475,7 @@
           <w14:ligatures w14:val="standardContextual"/>
         </w:rPr>
       </w:pPr>
-      <w:hyperlink w:anchor="_Toc232814700" w:history="1">
+      <w:hyperlink w:anchor="_Toc232815369" w:history="1">
         <w:r>
           <w:rPr>
             <w:rStyle w:val="Hyperlink"/>
@@ -1510,7 +1510,7 @@
             <w:webHidden/>
             <w:sz w:val="17"/>
           </w:rPr>
-          <w:instrText xml:space="preserve"> PAGEREF _Toc232814700 \h </w:instrText>
+          <w:instrText xml:space="preserve"> PAGEREF _Toc232815369 \h </w:instrText>
         </w:r>
         <w:r>
           <w:rPr>
@@ -1555,7 +1555,7 @@
         <w:tabs>
           <w:tab w:val="right" w:leader="dot" w:pos="10272"/>
         </w:tabs>
-        <w:spacing w:after="0" w:line="196" w:lineRule="exact"/>
+        <w:spacing w:after="0" w:line="192" w:lineRule="exact"/>
         <w:rPr>
           <w:rFonts w:ascii="Arial" w:hAnsi="Arial" w:cs="Arial"/>
           <w:noProof/>
@@ -1566,7 +1566,7 @@
           <w14:ligatures w14:val="standardContextual"/>
         </w:rPr>
       </w:pPr>
-      <w:hyperlink w:anchor="_Toc232814701" w:history="1">
+      <w:hyperlink w:anchor="_Toc232815370" w:history="1">
         <w:r>
           <w:rPr>
             <w:rStyle w:val="Hyperlink"/>
@@ -1601,7 +1601,7 @@
             <w:webHidden/>
             <w:sz w:val="17"/>
           </w:rPr>
-          <w:instrText xml:space="preserve"> PAGEREF _Toc232814701 \h </w:instrText>
+          <w:instrText xml:space="preserve"> PAGEREF _Toc232815370 \h </w:instrText>
         </w:r>
         <w:r>
           <w:rPr>
@@ -1646,7 +1646,7 @@
         <w:tabs>
           <w:tab w:val="right" w:leader="dot" w:pos="10272"/>
         </w:tabs>
-        <w:spacing w:after="0" w:line="196" w:lineRule="exact"/>
+        <w:spacing w:after="0" w:line="192" w:lineRule="exact"/>
         <w:rPr>
           <w:rFonts w:ascii="Arial" w:hAnsi="Arial" w:cs="Arial"/>
           <w:noProof/>
@@ -1657,7 +1657,7 @@
           <w14:ligatures w14:val="standardContextual"/>
         </w:rPr>
       </w:pPr>
-      <w:hyperlink w:anchor="_Toc232814702" w:history="1">
+      <w:hyperlink w:anchor="_Toc232815371" w:history="1">
         <w:r>
           <w:rPr>
             <w:rStyle w:val="Hyperlink"/>
@@ -1692,7 +1692,7 @@
             <w:webHidden/>
             <w:sz w:val="17"/>
           </w:rPr>
-          <w:instrText xml:space="preserve"> PAGEREF _Toc232814702 \h </w:instrText>
+          <w:instrText xml:space="preserve"> PAGEREF _Toc232815371 \h </w:instrText>
         </w:r>
         <w:r>
           <w:rPr>
@@ -1737,7 +1737,7 @@
         <w:tabs>
           <w:tab w:val="right" w:leader="dot" w:pos="10272"/>
         </w:tabs>
-        <w:spacing w:after="0" w:line="196" w:lineRule="exact"/>
+        <w:spacing w:after="0" w:line="192" w:lineRule="exact"/>
         <w:rPr>
           <w:rFonts w:ascii="Arial" w:hAnsi="Arial" w:cs="Arial"/>
           <w:noProof/>
@@ -1748,7 +1748,7 @@
           <w14:ligatures w14:val="standardContextual"/>
         </w:rPr>
       </w:pPr>
-      <w:hyperlink w:anchor="_Toc232814703" w:history="1">
+      <w:hyperlink w:anchor="_Toc232815372" w:history="1">
         <w:r>
           <w:rPr>
             <w:rStyle w:val="Hyperlink"/>
@@ -1783,7 +1783,7 @@
             <w:webHidden/>
             <w:sz w:val="17"/>
           </w:rPr>
-          <w:instrText xml:space="preserve"> PAGEREF _Toc232814703 \h </w:instrText>
+          <w:instrText xml:space="preserve"> PAGEREF _Toc232815372 \h </w:instrText>
         </w:r>
         <w:r>
           <w:rPr>
@@ -1828,7 +1828,7 @@
         <w:tabs>
           <w:tab w:val="right" w:leader="dot" w:pos="10272"/>
         </w:tabs>
-        <w:spacing w:after="0" w:line="196" w:lineRule="exact"/>
+        <w:spacing w:after="0" w:line="192" w:lineRule="exact"/>
         <w:rPr>
           <w:rFonts w:ascii="Arial" w:hAnsi="Arial" w:cs="Arial"/>
           <w:noProof/>
@@ -1839,7 +1839,7 @@
           <w14:ligatures w14:val="standardContextual"/>
         </w:rPr>
       </w:pPr>
-      <w:hyperlink w:anchor="_Toc232814704" w:history="1">
+      <w:hyperlink w:anchor="_Toc232815373" w:history="1">
         <w:r>
           <w:rPr>
             <w:rStyle w:val="Hyperlink"/>
@@ -1874,7 +1874,7 @@
             <w:webHidden/>
             <w:sz w:val="17"/>
           </w:rPr>
-          <w:instrText xml:space="preserve"> PAGEREF _Toc232814704 \h </w:instrText>
+          <w:instrText xml:space="preserve"> PAGEREF _Toc232815373 \h </w:instrText>
         </w:r>
         <w:r>
           <w:rPr>
@@ -1919,7 +1919,7 @@
         <w:tabs>
           <w:tab w:val="right" w:leader="dot" w:pos="10272"/>
         </w:tabs>
-        <w:spacing w:after="0" w:line="196" w:lineRule="exact"/>
+        <w:spacing w:after="0" w:line="192" w:lineRule="exact"/>
         <w:rPr>
           <w:rFonts w:ascii="Arial" w:hAnsi="Arial" w:cs="Arial"/>
           <w:noProof/>
@@ -1930,7 +1930,7 @@
           <w14:ligatures w14:val="standardContextual"/>
         </w:rPr>
       </w:pPr>
-      <w:hyperlink w:anchor="_Toc232814705" w:history="1">
+      <w:hyperlink w:anchor="_Toc232815374" w:history="1">
         <w:r>
           <w:rPr>
             <w:rStyle w:val="Hyperlink"/>
@@ -1965,7 +1965,7 @@
             <w:webHidden/>
             <w:sz w:val="17"/>
           </w:rPr>
-          <w:instrText xml:space="preserve"> PAGEREF _Toc232814705 \h </w:instrText>
+          <w:instrText xml:space="preserve"> PAGEREF _Toc232815374 \h </w:instrText>
         </w:r>
         <w:r>
           <w:rPr>
@@ -2010,7 +2010,7 @@
         <w:tabs>
           <w:tab w:val="right" w:leader="dot" w:pos="10272"/>
         </w:tabs>
-        <w:spacing w:after="0" w:line="196" w:lineRule="exact"/>
+        <w:spacing w:after="0" w:line="192" w:lineRule="exact"/>
         <w:rPr>
           <w:rFonts w:ascii="Arial" w:hAnsi="Arial" w:cs="Arial"/>
           <w:noProof/>
@@ -2021,7 +2021,7 @@
           <w14:ligatures w14:val="standardContextual"/>
         </w:rPr>
       </w:pPr>
-      <w:hyperlink w:anchor="_Toc232814706" w:history="1">
+      <w:hyperlink w:anchor="_Toc232815375" w:history="1">
         <w:r>
           <w:rPr>
             <w:rStyle w:val="Hyperlink"/>
@@ -2056,7 +2056,7 @@
             <w:webHidden/>
             <w:sz w:val="17"/>
           </w:rPr>
-          <w:instrText xml:space="preserve"> PAGEREF _Toc232814706 \h </w:instrText>
+          <w:instrText xml:space="preserve"> PAGEREF _Toc232815375 \h </w:instrText>
         </w:r>
         <w:r>
           <w:rPr>
@@ -2101,7 +2101,7 @@
         <w:tabs>
           <w:tab w:val="right" w:leader="dot" w:pos="10272"/>
         </w:tabs>
-        <w:spacing w:after="0" w:line="196" w:lineRule="exact"/>
+        <w:spacing w:after="0" w:line="192" w:lineRule="exact"/>
         <w:rPr>
           <w:rFonts w:ascii="Arial" w:hAnsi="Arial" w:cs="Arial"/>
           <w:noProof/>
@@ -2112,7 +2112,7 @@
           <w14:ligatures w14:val="standardContextual"/>
         </w:rPr>
       </w:pPr>
-      <w:hyperlink w:anchor="_Toc232814707" w:history="1">
+      <w:hyperlink w:anchor="_Toc232815376" w:history="1">
         <w:r>
           <w:rPr>
             <w:rStyle w:val="Hyperlink"/>
@@ -2147,7 +2147,7 @@
             <w:webHidden/>
             <w:sz w:val="17"/>
           </w:rPr>
-          <w:instrText xml:space="preserve"> PAGEREF _Toc232814707 \h </w:instrText>
+          <w:instrText xml:space="preserve"> PAGEREF _Toc232815376 \h </w:instrText>
         </w:r>
         <w:r>
           <w:rPr>
@@ -2192,7 +2192,7 @@
         <w:tabs>
           <w:tab w:val="right" w:leader="dot" w:pos="10272"/>
         </w:tabs>
-        <w:spacing w:after="0" w:line="196" w:lineRule="exact"/>
+        <w:spacing w:after="0" w:line="192" w:lineRule="exact"/>
         <w:rPr>
           <w:rFonts w:ascii="Arial" w:hAnsi="Arial" w:cs="Arial"/>
           <w:noProof/>
@@ -2203,7 +2203,7 @@
           <w14:ligatures w14:val="standardContextual"/>
         </w:rPr>
       </w:pPr>
-      <w:hyperlink w:anchor="_Toc232814708" w:history="1">
+      <w:hyperlink w:anchor="_Toc232815377" w:history="1">
         <w:r>
           <w:rPr>
             <w:rStyle w:val="Hyperlink"/>
@@ -2238,7 +2238,7 @@
             <w:webHidden/>
             <w:sz w:val="17"/>
           </w:rPr>
-          <w:instrText xml:space="preserve"> PAGEREF _Toc232814708 \h </w:instrText>
+          <w:instrText xml:space="preserve"> PAGEREF _Toc232815377 \h </w:instrText>
         </w:r>
         <w:r>
           <w:rPr>
@@ -2283,7 +2283,7 @@
         <w:tabs>
           <w:tab w:val="right" w:leader="dot" w:pos="10272"/>
         </w:tabs>
-        <w:spacing w:after="0" w:line="196" w:lineRule="exact"/>
+        <w:spacing w:after="0" w:line="192" w:lineRule="exact"/>
         <w:rPr>
           <w:rFonts w:ascii="Arial" w:hAnsi="Arial" w:cs="Arial"/>
           <w:noProof/>
@@ -2294,7 +2294,7 @@
           <w14:ligatures w14:val="standardContextual"/>
         </w:rPr>
       </w:pPr>
-      <w:hyperlink w:anchor="_Toc232814709" w:history="1">
+      <w:hyperlink w:anchor="_Toc232815378" w:history="1">
         <w:r>
           <w:rPr>
             <w:rStyle w:val="Hyperlink"/>
@@ -2329,7 +2329,7 @@
             <w:webHidden/>
             <w:sz w:val="17"/>
           </w:rPr>
-          <w:instrText xml:space="preserve"> PAGEREF _Toc232814709 \h </w:instrText>
+          <w:instrText xml:space="preserve"> PAGEREF _Toc232815378 \h </w:instrText>
         </w:r>
         <w:r>
           <w:rPr>
@@ -2374,7 +2374,7 @@
         <w:tabs>
           <w:tab w:val="right" w:leader="dot" w:pos="10272"/>
         </w:tabs>
-        <w:spacing w:after="0" w:line="196" w:lineRule="exact"/>
+        <w:spacing w:after="0" w:line="192" w:lineRule="exact"/>
         <w:rPr>
           <w:rFonts w:ascii="Arial" w:hAnsi="Arial" w:cs="Arial"/>
           <w:noProof/>
@@ -2385,7 +2385,7 @@
           <w14:ligatures w14:val="standardContextual"/>
         </w:rPr>
       </w:pPr>
-      <w:hyperlink w:anchor="_Toc232814710" w:history="1">
+      <w:hyperlink w:anchor="_Toc232815379" w:history="1">
         <w:r>
           <w:rPr>
             <w:rStyle w:val="Hyperlink"/>
@@ -2420,7 +2420,7 @@
             <w:webHidden/>
             <w:sz w:val="17"/>
           </w:rPr>
-          <w:instrText xml:space="preserve"> PAGEREF _Toc232814710 \h </w:instrText>
+          <w:instrText xml:space="preserve"> PAGEREF _Toc232815379 \h </w:instrText>
         </w:r>
         <w:r>
           <w:rPr>
@@ -2465,7 +2465,7 @@
         <w:tabs>
           <w:tab w:val="right" w:leader="dot" w:pos="10272"/>
         </w:tabs>
-        <w:spacing w:after="0" w:line="196" w:lineRule="exact"/>
+        <w:spacing w:after="0" w:line="192" w:lineRule="exact"/>
         <w:rPr>
           <w:rFonts w:ascii="Arial" w:hAnsi="Arial" w:cs="Arial"/>
           <w:noProof/>
@@ -2476,7 +2476,7 @@
           <w14:ligatures w14:val="standardContextual"/>
         </w:rPr>
       </w:pPr>
-      <w:hyperlink w:anchor="_Toc232814711" w:history="1">
+      <w:hyperlink w:anchor="_Toc232815380" w:history="1">
         <w:r>
           <w:rPr>
             <w:rStyle w:val="Hyperlink"/>
@@ -2511,7 +2511,7 @@
             <w:webHidden/>
             <w:sz w:val="17"/>
           </w:rPr>
-          <w:instrText xml:space="preserve"> PAGEREF _Toc232814711 \h </w:instrText>
+          <w:instrText xml:space="preserve"> PAGEREF _Toc232815380 \h </w:instrText>
         </w:r>
         <w:r>
           <w:rPr>
@@ -2556,7 +2556,7 @@
         <w:tabs>
           <w:tab w:val="right" w:leader="dot" w:pos="10272"/>
         </w:tabs>
-        <w:spacing w:after="0" w:line="196" w:lineRule="exact"/>
+        <w:spacing w:after="0" w:line="192" w:lineRule="exact"/>
         <w:rPr>
           <w:rFonts w:ascii="Arial" w:hAnsi="Arial" w:cs="Arial"/>
           <w:noProof/>
@@ -2567,7 +2567,7 @@
           <w14:ligatures w14:val="standardContextual"/>
         </w:rPr>
       </w:pPr>
-      <w:hyperlink w:anchor="_Toc232814712" w:history="1">
+      <w:hyperlink w:anchor="_Toc232815381" w:history="1">
         <w:r>
           <w:rPr>
             <w:rStyle w:val="Hyperlink"/>
@@ -2602,7 +2602,7 @@
             <w:webHidden/>
             <w:sz w:val="17"/>
           </w:rPr>
-          <w:instrText xml:space="preserve"> PAGEREF _Toc232814712 \h </w:instrText>
+          <w:instrText xml:space="preserve"> PAGEREF _Toc232815381 \h </w:instrText>
         </w:r>
         <w:r>
           <w:rPr>
@@ -2647,7 +2647,7 @@
         <w:tabs>
           <w:tab w:val="right" w:leader="dot" w:pos="10272"/>
         </w:tabs>
-        <w:spacing w:after="0" w:line="196" w:lineRule="exact"/>
+        <w:spacing w:after="0" w:line="192" w:lineRule="exact"/>
         <w:rPr>
           <w:rFonts w:ascii="Arial" w:hAnsi="Arial" w:cs="Arial"/>
           <w:noProof/>
@@ -2658,7 +2658,7 @@
           <w14:ligatures w14:val="standardContextual"/>
         </w:rPr>
       </w:pPr>
-      <w:hyperlink w:anchor="_Toc232814713" w:history="1">
+      <w:hyperlink w:anchor="_Toc232815382" w:history="1">
         <w:r>
           <w:rPr>
             <w:rStyle w:val="Hyperlink"/>
@@ -2693,7 +2693,7 @@
             <w:webHidden/>
             <w:sz w:val="17"/>
           </w:rPr>
-          <w:instrText xml:space="preserve"> PAGEREF _Toc232814713 \h </w:instrText>
+          <w:instrText xml:space="preserve"> PAGEREF _Toc232815382 \h </w:instrText>
         </w:r>
         <w:r>
           <w:rPr>
@@ -2738,7 +2738,7 @@
         <w:tabs>
           <w:tab w:val="right" w:leader="dot" w:pos="10272"/>
         </w:tabs>
-        <w:spacing w:after="0" w:line="196" w:lineRule="exact"/>
+        <w:spacing w:after="0" w:line="192" w:lineRule="exact"/>
         <w:rPr>
           <w:rFonts w:ascii="Arial" w:hAnsi="Arial" w:cs="Arial"/>
           <w:noProof/>
@@ -2749,7 +2749,7 @@
           <w14:ligatures w14:val="standardContextual"/>
         </w:rPr>
       </w:pPr>
-      <w:hyperlink w:anchor="_Toc232814714" w:history="1">
+      <w:hyperlink w:anchor="_Toc232815383" w:history="1">
         <w:r>
           <w:rPr>
             <w:rStyle w:val="Hyperlink"/>
@@ -2784,7 +2784,7 @@
             <w:webHidden/>
             <w:sz w:val="17"/>
           </w:rPr>
-          <w:instrText xml:space="preserve"> PAGEREF _Toc232814714 \h </w:instrText>
+          <w:instrText xml:space="preserve"> PAGEREF _Toc232815383 \h </w:instrText>
         </w:r>
         <w:r>
           <w:rPr>
@@ -2829,7 +2829,7 @@
         <w:tabs>
           <w:tab w:val="right" w:leader="dot" w:pos="10272"/>
         </w:tabs>
-        <w:spacing w:after="0" w:line="196" w:lineRule="exact"/>
+        <w:spacing w:after="0" w:line="192" w:lineRule="exact"/>
         <w:rPr>
           <w:rFonts w:ascii="Arial" w:hAnsi="Arial" w:cs="Arial"/>
           <w:noProof/>
@@ -2840,7 +2840,7 @@
           <w14:ligatures w14:val="standardContextual"/>
         </w:rPr>
       </w:pPr>
-      <w:hyperlink w:anchor="_Toc232814715" w:history="1">
+      <w:hyperlink w:anchor="_Toc232815384" w:history="1">
         <w:r>
           <w:rPr>
             <w:rStyle w:val="Hyperlink"/>
@@ -2875,7 +2875,7 @@
             <w:webHidden/>
             <w:sz w:val="17"/>
           </w:rPr>
-          <w:instrText xml:space="preserve"> PAGEREF _Toc232814715 \h </w:instrText>
+          <w:instrText xml:space="preserve"> PAGEREF _Toc232815384 \h </w:instrText>
         </w:r>
         <w:r>
           <w:rPr>
@@ -2920,7 +2920,7 @@
         <w:tabs>
           <w:tab w:val="right" w:leader="dot" w:pos="10272"/>
         </w:tabs>
-        <w:spacing w:after="0" w:line="196" w:lineRule="exact"/>
+        <w:spacing w:after="0" w:line="192" w:lineRule="exact"/>
         <w:rPr>
           <w:rFonts w:ascii="Arial" w:hAnsi="Arial" w:cs="Arial"/>
           <w:noProof/>
@@ -2931,7 +2931,7 @@
           <w14:ligatures w14:val="standardContextual"/>
         </w:rPr>
       </w:pPr>
-      <w:hyperlink w:anchor="_Toc232814716" w:history="1">
+      <w:hyperlink w:anchor="_Toc232815385" w:history="1">
         <w:r>
           <w:rPr>
             <w:rStyle w:val="Hyperlink"/>
@@ -2966,7 +2966,7 @@
             <w:webHidden/>
             <w:sz w:val="17"/>
           </w:rPr>
-          <w:instrText xml:space="preserve"> PAGEREF _Toc232814716 \h </w:instrText>
+          <w:instrText xml:space="preserve"> PAGEREF _Toc232815385 \h </w:instrText>
         </w:r>
         <w:r>
           <w:rPr>
@@ -3011,7 +3011,7 @@
         <w:tabs>
           <w:tab w:val="right" w:leader="dot" w:pos="10272"/>
         </w:tabs>
-        <w:spacing w:after="0" w:line="196" w:lineRule="exact"/>
+        <w:spacing w:after="0" w:line="192" w:lineRule="exact"/>
         <w:rPr>
           <w:rFonts w:ascii="Arial" w:hAnsi="Arial" w:cs="Arial"/>
           <w:noProof/>
@@ -3022,7 +3022,7 @@
           <w14:ligatures w14:val="standardContextual"/>
         </w:rPr>
       </w:pPr>
-      <w:hyperlink w:anchor="_Toc232814717" w:history="1">
+      <w:hyperlink w:anchor="_Toc232815386" w:history="1">
         <w:r>
           <w:rPr>
             <w:rStyle w:val="Hyperlink"/>
@@ -3057,7 +3057,7 @@
             <w:webHidden/>
             <w:sz w:val="17"/>
           </w:rPr>
-          <w:instrText xml:space="preserve"> PAGEREF _Toc232814717 \h </w:instrText>
+          <w:instrText xml:space="preserve"> PAGEREF _Toc232815386 \h </w:instrText>
         </w:r>
         <w:r>
           <w:rPr>
@@ -3102,7 +3102,7 @@
         <w:tabs>
           <w:tab w:val="right" w:leader="dot" w:pos="10272"/>
         </w:tabs>
-        <w:spacing w:after="0" w:line="196" w:lineRule="exact"/>
+        <w:spacing w:after="0" w:line="192" w:lineRule="exact"/>
         <w:rPr>
           <w:rFonts w:ascii="Arial" w:hAnsi="Arial" w:cs="Arial"/>
           <w:noProof/>
@@ -3113,7 +3113,7 @@
           <w14:ligatures w14:val="standardContextual"/>
         </w:rPr>
       </w:pPr>
-      <w:hyperlink w:anchor="_Toc232814718" w:history="1">
+      <w:hyperlink w:anchor="_Toc232815387" w:history="1">
         <w:r>
           <w:rPr>
             <w:rStyle w:val="Hyperlink"/>
@@ -3148,7 +3148,7 @@
             <w:webHidden/>
             <w:sz w:val="17"/>
           </w:rPr>
-          <w:instrText xml:space="preserve"> PAGEREF _Toc232814718 \h </w:instrText>
+          <w:instrText xml:space="preserve"> PAGEREF _Toc232815387 \h </w:instrText>
         </w:r>
         <w:r>
           <w:rPr>
@@ -3193,7 +3193,7 @@
         <w:tabs>
           <w:tab w:val="right" w:leader="dot" w:pos="10272"/>
         </w:tabs>
-        <w:spacing w:after="0" w:line="196" w:lineRule="exact"/>
+        <w:spacing w:after="0" w:line="192" w:lineRule="exact"/>
         <w:rPr>
           <w:rFonts w:ascii="Arial" w:hAnsi="Arial" w:cs="Arial"/>
           <w:noProof/>
@@ -3204,7 +3204,7 @@
           <w14:ligatures w14:val="standardContextual"/>
         </w:rPr>
       </w:pPr>
-      <w:hyperlink w:anchor="_Toc232814719" w:history="1">
+      <w:hyperlink w:anchor="_Toc232815388" w:history="1">
         <w:r>
           <w:rPr>
             <w:rStyle w:val="Hyperlink"/>
@@ -3239,7 +3239,7 @@
             <w:webHidden/>
             <w:sz w:val="17"/>
           </w:rPr>
-          <w:instrText xml:space="preserve"> PAGEREF _Toc232814719 \h </w:instrText>
+          <w:instrText xml:space="preserve"> PAGEREF _Toc232815388 \h </w:instrText>
         </w:r>
         <w:r>
           <w:rPr>
@@ -3284,7 +3284,7 @@
         <w:tabs>
           <w:tab w:val="right" w:leader="dot" w:pos="10272"/>
         </w:tabs>
-        <w:spacing w:after="0" w:line="196" w:lineRule="exact"/>
+        <w:spacing w:after="0" w:line="192" w:lineRule="exact"/>
         <w:rPr>
           <w:rFonts w:ascii="Arial" w:hAnsi="Arial" w:cs="Arial"/>
           <w:noProof/>
@@ -3295,7 +3295,7 @@
           <w14:ligatures w14:val="standardContextual"/>
         </w:rPr>
       </w:pPr>
-      <w:hyperlink w:anchor="_Toc232814720" w:history="1">
+      <w:hyperlink w:anchor="_Toc232815389" w:history="1">
         <w:r>
           <w:rPr>
             <w:rStyle w:val="Hyperlink"/>
@@ -3330,7 +3330,7 @@
             <w:webHidden/>
             <w:sz w:val="17"/>
           </w:rPr>
-          <w:instrText xml:space="preserve"> PAGEREF _Toc232814720 \h </w:instrText>
+          <w:instrText xml:space="preserve"> PAGEREF _Toc232815389 \h </w:instrText>
         </w:r>
         <w:r>
           <w:rPr>
@@ -3375,7 +3375,7 @@
         <w:tabs>
           <w:tab w:val="right" w:leader="dot" w:pos="10272"/>
         </w:tabs>
-        <w:spacing w:after="0" w:line="196" w:lineRule="exact"/>
+        <w:spacing w:after="0" w:line="192" w:lineRule="exact"/>
         <w:rPr>
           <w:rFonts w:ascii="Arial" w:hAnsi="Arial" w:cs="Arial"/>
           <w:noProof/>
@@ -3386,7 +3386,7 @@
           <w14:ligatures w14:val="standardContextual"/>
         </w:rPr>
       </w:pPr>
-      <w:hyperlink w:anchor="_Toc232814721" w:history="1">
+      <w:hyperlink w:anchor="_Toc232815390" w:history="1">
         <w:r>
           <w:rPr>
             <w:rStyle w:val="Hyperlink"/>
@@ -3421,7 +3421,7 @@
             <w:webHidden/>
             <w:sz w:val="17"/>
           </w:rPr>
-          <w:instrText xml:space="preserve"> PAGEREF _Toc232814721 \h </w:instrText>
+          <w:instrText xml:space="preserve"> PAGEREF _Toc232815390 \h </w:instrText>
         </w:r>
         <w:r>
           <w:rPr>
@@ -3466,7 +3466,7 @@
         <w:tabs>
           <w:tab w:val="right" w:leader="dot" w:pos="10272"/>
         </w:tabs>
-        <w:spacing w:after="0" w:line="196" w:lineRule="exact"/>
+        <w:spacing w:after="0" w:line="192" w:lineRule="exact"/>
         <w:rPr>
           <w:rFonts w:ascii="Arial" w:hAnsi="Arial" w:cs="Arial"/>
           <w:noProof/>
@@ -3477,7 +3477,7 @@
           <w14:ligatures w14:val="standardContextual"/>
         </w:rPr>
       </w:pPr>
-      <w:hyperlink w:anchor="_Toc232814722" w:history="1">
+      <w:hyperlink w:anchor="_Toc232815391" w:history="1">
         <w:r>
           <w:rPr>
             <w:rStyle w:val="Hyperlink"/>
@@ -3512,7 +3512,7 @@
             <w:webHidden/>
             <w:sz w:val="17"/>
           </w:rPr>
-          <w:instrText xml:space="preserve"> PAGEREF _Toc232814722 \h </w:instrText>
+          <w:instrText xml:space="preserve"> PAGEREF _Toc232815391 \h </w:instrText>
         </w:r>
         <w:r>
           <w:rPr>
@@ -3553,11 +3553,11 @@
     </w:p>
     <w:p>
       <w:pPr>
-        <w:pStyle w:val="Verzeichnis2"/>
+        <w:pStyle w:val="Verzeichnis3"/>
         <w:tabs>
           <w:tab w:val="right" w:leader="dot" w:pos="10272"/>
         </w:tabs>
-        <w:spacing w:after="0" w:line="196" w:lineRule="exact"/>
+        <w:spacing w:after="0" w:line="192" w:lineRule="exact"/>
         <w:rPr>
           <w:rFonts w:ascii="Arial" w:hAnsi="Arial" w:cs="Arial"/>
           <w:noProof/>
@@ -3568,7 +3568,7 @@
           <w14:ligatures w14:val="standardContextual"/>
         </w:rPr>
       </w:pPr>
-      <w:hyperlink w:anchor="_Toc232814723" w:history="1">
+      <w:hyperlink w:anchor="_Toc232815392" w:history="1">
         <w:r>
           <w:rPr>
             <w:rStyle w:val="Hyperlink"/>
@@ -3576,7 +3576,7 @@
             <w:noProof/>
             <w:sz w:val="17"/>
           </w:rPr>
-          <w:t>7.6 Start The Program</w:t>
+          <w:t>7.5.6 Running Without Spotify Or Email</w:t>
         </w:r>
         <w:r>
           <w:rPr>
@@ -3603,7 +3603,7 @@
             <w:webHidden/>
             <w:sz w:val="17"/>
           </w:rPr>
-          <w:instrText xml:space="preserve"> PAGEREF _Toc232814723 \h </w:instrText>
+          <w:instrText xml:space="preserve"> PAGEREF _Toc232815392 \h </w:instrText>
         </w:r>
         <w:r>
           <w:rPr>
@@ -3648,7 +3648,7 @@
         <w:tabs>
           <w:tab w:val="right" w:leader="dot" w:pos="10272"/>
         </w:tabs>
-        <w:spacing w:after="0" w:line="196" w:lineRule="exact"/>
+        <w:spacing w:after="0" w:line="192" w:lineRule="exact"/>
         <w:rPr>
           <w:rFonts w:ascii="Arial" w:hAnsi="Arial" w:cs="Arial"/>
           <w:noProof/>
@@ -3659,7 +3659,7 @@
           <w14:ligatures w14:val="standardContextual"/>
         </w:rPr>
       </w:pPr>
-      <w:hyperlink w:anchor="_Toc232814724" w:history="1">
+      <w:hyperlink w:anchor="_Toc232815393" w:history="1">
         <w:r>
           <w:rPr>
             <w:rStyle w:val="Hyperlink"/>
@@ -3667,7 +3667,7 @@
             <w:noProof/>
             <w:sz w:val="17"/>
           </w:rPr>
-          <w:t>7.7 Weekly Automation</w:t>
+          <w:t>7.6 Start The Program</w:t>
         </w:r>
         <w:r>
           <w:rPr>
@@ -3694,7 +3694,7 @@
             <w:webHidden/>
             <w:sz w:val="17"/>
           </w:rPr>
-          <w:instrText xml:space="preserve"> PAGEREF _Toc232814724 \h </w:instrText>
+          <w:instrText xml:space="preserve"> PAGEREF _Toc232815393 \h </w:instrText>
         </w:r>
         <w:r>
           <w:rPr>
@@ -3735,11 +3735,11 @@
     </w:p>
     <w:p>
       <w:pPr>
-        <w:pStyle w:val="Verzeichnis1"/>
+        <w:pStyle w:val="Verzeichnis2"/>
         <w:tabs>
           <w:tab w:val="right" w:leader="dot" w:pos="10272"/>
         </w:tabs>
-        <w:spacing w:after="0" w:line="196" w:lineRule="exact"/>
+        <w:spacing w:after="0" w:line="192" w:lineRule="exact"/>
         <w:rPr>
           <w:rFonts w:ascii="Arial" w:hAnsi="Arial" w:cs="Arial"/>
           <w:noProof/>
@@ -3750,7 +3750,7 @@
           <w14:ligatures w14:val="standardContextual"/>
         </w:rPr>
       </w:pPr>
-      <w:hyperlink w:anchor="_Toc232814725" w:history="1">
+      <w:hyperlink w:anchor="_Toc232815394" w:history="1">
         <w:r>
           <w:rPr>
             <w:rStyle w:val="Hyperlink"/>
@@ -3758,7 +3758,7 @@
             <w:noProof/>
             <w:sz w:val="17"/>
           </w:rPr>
-          <w:t>8. Testing</w:t>
+          <w:t>7.7 Weekly Automation</w:t>
         </w:r>
         <w:r>
           <w:rPr>
@@ -3785,7 +3785,7 @@
             <w:webHidden/>
             <w:sz w:val="17"/>
           </w:rPr>
-          <w:instrText xml:space="preserve"> PAGEREF _Toc232814725 \h </w:instrText>
+          <w:instrText xml:space="preserve"> PAGEREF _Toc232815394 \h </w:instrText>
         </w:r>
         <w:r>
           <w:rPr>
@@ -3811,7 +3811,7 @@
             <w:webHidden/>
             <w:sz w:val="17"/>
           </w:rPr>
-          <w:t>15</w:t>
+          <w:t>14</w:t>
         </w:r>
         <w:r>
           <w:rPr>
@@ -3830,7 +3830,7 @@
         <w:tabs>
           <w:tab w:val="right" w:leader="dot" w:pos="10272"/>
         </w:tabs>
-        <w:spacing w:after="0" w:line="196" w:lineRule="exact"/>
+        <w:spacing w:after="0" w:line="192" w:lineRule="exact"/>
         <w:rPr>
           <w:rFonts w:ascii="Arial" w:hAnsi="Arial" w:cs="Arial"/>
           <w:noProof/>
@@ -3841,7 +3841,7 @@
           <w14:ligatures w14:val="standardContextual"/>
         </w:rPr>
       </w:pPr>
-      <w:hyperlink w:anchor="_Toc232814726" w:history="1">
+      <w:hyperlink w:anchor="_Toc232815395" w:history="1">
         <w:r>
           <w:rPr>
             <w:rStyle w:val="Hyperlink"/>
@@ -3849,7 +3849,7 @@
             <w:noProof/>
             <w:sz w:val="17"/>
           </w:rPr>
-          <w:t>9. Assignment Coverage</w:t>
+          <w:t>8. Testing</w:t>
         </w:r>
         <w:r>
           <w:rPr>
@@ -3876,7 +3876,7 @@
             <w:webHidden/>
             <w:sz w:val="17"/>
           </w:rPr>
-          <w:instrText xml:space="preserve"> PAGEREF _Toc232814726 \h </w:instrText>
+          <w:instrText xml:space="preserve"> PAGEREF _Toc232815395 \h </w:instrText>
         </w:r>
         <w:r>
           <w:rPr>
@@ -3902,7 +3902,7 @@
             <w:webHidden/>
             <w:sz w:val="17"/>
           </w:rPr>
-          <w:t>16</w:t>
+          <w:t>15</w:t>
         </w:r>
         <w:r>
           <w:rPr>
@@ -3921,7 +3921,7 @@
         <w:tabs>
           <w:tab w:val="right" w:leader="dot" w:pos="10272"/>
         </w:tabs>
-        <w:spacing w:after="0" w:line="196" w:lineRule="exact"/>
+        <w:spacing w:after="0" w:line="192" w:lineRule="exact"/>
         <w:rPr>
           <w:rFonts w:ascii="Arial" w:hAnsi="Arial" w:cs="Arial"/>
           <w:noProof/>
@@ -3932,7 +3932,7 @@
           <w14:ligatures w14:val="standardContextual"/>
         </w:rPr>
       </w:pPr>
-      <w:hyperlink w:anchor="_Toc232814727" w:history="1">
+      <w:hyperlink w:anchor="_Toc232815396" w:history="1">
         <w:r>
           <w:rPr>
             <w:rStyle w:val="Hyperlink"/>
@@ -3940,7 +3940,7 @@
             <w:noProof/>
             <w:sz w:val="17"/>
           </w:rPr>
-          <w:t>10. Conclusion</w:t>
+          <w:t>9. Assignment Coverage</w:t>
         </w:r>
         <w:r>
           <w:rPr>
@@ -3967,7 +3967,7 @@
             <w:webHidden/>
             <w:sz w:val="17"/>
           </w:rPr>
-          <w:instrText xml:space="preserve"> PAGEREF _Toc232814727 \h </w:instrText>
+          <w:instrText xml:space="preserve"> PAGEREF _Toc232815396 \h </w:instrText>
         </w:r>
         <w:r>
           <w:rPr>
@@ -4008,14 +4008,104 @@
     </w:p>
     <w:p>
       <w:pPr>
-        <w:spacing w:after="0" w:line="196" w:lineRule="exact"/>
+        <w:pStyle w:val="Verzeichnis1"/>
+        <w:tabs>
+          <w:tab w:val="right" w:leader="dot" w:pos="10272"/>
+        </w:tabs>
+        <w:spacing w:after="0" w:line="192" w:lineRule="exact"/>
+        <w:rPr>
+          <w:rFonts w:ascii="Arial" w:hAnsi="Arial" w:cs="Arial"/>
+          <w:noProof/>
+          <w:kern w:val="2"/>
+          <w:sz w:val="17"/>
+          <w:szCs w:val="24"/>
+          <w:lang w:val="de-CH" w:eastAsia="de-CH"/>
+          <w14:ligatures w14:val="standardContextual"/>
+        </w:rPr>
+      </w:pPr>
+      <w:hyperlink w:anchor="_Toc232815397" w:history="1">
+        <w:r>
+          <w:rPr>
+            <w:rStyle w:val="Hyperlink"/>
+            <w:rFonts w:ascii="Arial" w:hAnsi="Arial" w:cs="Arial"/>
+            <w:noProof/>
+            <w:sz w:val="17"/>
+          </w:rPr>
+          <w:t>10. Conclusion</w:t>
+        </w:r>
+        <w:r>
+          <w:rPr>
+            <w:rFonts w:ascii="Arial" w:hAnsi="Arial" w:cs="Arial"/>
+            <w:noProof/>
+            <w:webHidden/>
+            <w:sz w:val="17"/>
+          </w:rPr>
+          <w:tab/>
+        </w:r>
+        <w:r>
+          <w:rPr>
+            <w:rFonts w:ascii="Arial" w:hAnsi="Arial" w:cs="Arial"/>
+            <w:noProof/>
+            <w:webHidden/>
+            <w:sz w:val="17"/>
+          </w:rPr>
+          <w:fldChar w:fldCharType="begin"/>
+        </w:r>
+        <w:r>
+          <w:rPr>
+            <w:rFonts w:ascii="Arial" w:hAnsi="Arial" w:cs="Arial"/>
+            <w:noProof/>
+            <w:webHidden/>
+            <w:sz w:val="17"/>
+          </w:rPr>
+          <w:instrText xml:space="preserve"> PAGEREF _Toc232815397 \h </w:instrText>
+        </w:r>
+        <w:r>
+          <w:rPr>
+            <w:rFonts w:ascii="Arial" w:hAnsi="Arial" w:cs="Arial"/>
+            <w:noProof/>
+            <w:webHidden/>
+            <w:sz w:val="17"/>
+          </w:rPr>
+        </w:r>
+        <w:r>
+          <w:rPr>
+            <w:rFonts w:ascii="Arial" w:hAnsi="Arial" w:cs="Arial"/>
+            <w:noProof/>
+            <w:webHidden/>
+            <w:sz w:val="17"/>
+          </w:rPr>
+          <w:fldChar w:fldCharType="separate"/>
+        </w:r>
+        <w:r>
+          <w:rPr>
+            <w:rFonts w:ascii="Arial" w:hAnsi="Arial" w:cs="Arial"/>
+            <w:noProof/>
+            <w:webHidden/>
+            <w:sz w:val="17"/>
+          </w:rPr>
+          <w:t>16</w:t>
+        </w:r>
+        <w:r>
+          <w:rPr>
+            <w:rFonts w:ascii="Arial" w:hAnsi="Arial" w:cs="Arial"/>
+            <w:noProof/>
+            <w:webHidden/>
+            <w:sz w:val="17"/>
+          </w:rPr>
+          <w:fldChar w:fldCharType="end"/>
+        </w:r>
+      </w:hyperlink>
+    </w:p>
+    <w:p>
+      <w:pPr>
+        <w:spacing w:after="0" w:line="192" w:lineRule="exact"/>
       </w:pPr>
       <w:r>
         <w:rPr>
           <w:rFonts w:ascii="Arial" w:hAnsi="Arial" w:cs="Arial"/>
           <w:sz w:val="17"/>
         </w:rPr>
-        <w:lastRenderedPageBreak/>
         <w:fldChar w:fldCharType="end"/>
       </w:r>
     </w:p>
@@ -4031,7 +4121,7 @@
           <w:rFonts w:ascii="Arial" w:hAnsi="Arial" w:cs="Arial"/>
         </w:rPr>
       </w:pPr>
-      <w:bookmarkStart w:id="0" w:name="_Toc232814689"/>
+      <w:bookmarkStart w:id="0" w:name="_Toc232815358"/>
       <w:r>
         <w:rPr>
           <w:rFonts w:ascii="Arial" w:hAnsi="Arial" w:cs="Arial"/>
@@ -4048,7 +4138,7 @@
           <w:rFonts w:ascii="Arial" w:hAnsi="Arial" w:cs="Arial"/>
         </w:rPr>
       </w:pPr>
-      <w:bookmarkStart w:id="1" w:name="_Toc232814690"/>
+      <w:bookmarkStart w:id="1" w:name="_Toc232815359"/>
       <w:r>
         <w:rPr>
           <w:rFonts w:ascii="Arial" w:hAnsi="Arial" w:cs="Arial"/>
@@ -4074,7 +4164,7 @@
           <w:rFonts w:ascii="Arial" w:hAnsi="Arial" w:cs="Arial"/>
         </w:rPr>
       </w:pPr>
-      <w:bookmarkStart w:id="2" w:name="_Toc232814691"/>
+      <w:bookmarkStart w:id="2" w:name="_Toc232815360"/>
       <w:r>
         <w:rPr>
           <w:rFonts w:ascii="Arial" w:hAnsi="Arial" w:cs="Arial"/>
@@ -4095,7 +4185,7 @@
           <w:rFonts w:ascii="Arial" w:hAnsi="Arial" w:cs="Arial"/>
         </w:rPr>
       </w:pPr>
-      <w:bookmarkStart w:id="3" w:name="_Toc232814692"/>
+      <w:bookmarkStart w:id="3" w:name="_Toc232815361"/>
       <w:r>
         <w:rPr>
           <w:rFonts w:ascii="Arial" w:hAnsi="Arial" w:cs="Arial"/>
@@ -4116,7 +4206,7 @@
           <w:rFonts w:ascii="Arial" w:hAnsi="Arial" w:cs="Arial"/>
         </w:rPr>
       </w:pPr>
-      <w:bookmarkStart w:id="4" w:name="_Toc232814693"/>
+      <w:bookmarkStart w:id="4" w:name="_Toc232815362"/>
       <w:r>
         <w:rPr>
           <w:rFonts w:ascii="Arial" w:hAnsi="Arial" w:cs="Arial"/>
@@ -4132,7 +4222,7 @@
           <w:rFonts w:ascii="Arial" w:hAnsi="Arial" w:cs="Arial"/>
         </w:rPr>
       </w:pPr>
-      <w:bookmarkStart w:id="5" w:name="_Toc232814694"/>
+      <w:bookmarkStart w:id="5" w:name="_Toc232815363"/>
       <w:r>
         <w:rPr>
           <w:rFonts w:ascii="Arial" w:hAnsi="Arial" w:cs="Arial"/>
@@ -4158,7 +4248,7 @@
           <w:rFonts w:ascii="Arial" w:hAnsi="Arial" w:cs="Arial"/>
         </w:rPr>
       </w:pPr>
-      <w:bookmarkStart w:id="6" w:name="_Toc232814695"/>
+      <w:bookmarkStart w:id="6" w:name="_Toc232815364"/>
       <w:r>
         <w:rPr>
           <w:rFonts w:ascii="Arial" w:hAnsi="Arial" w:cs="Arial"/>
@@ -4189,7 +4279,7 @@
           <w:rFonts w:ascii="Arial" w:hAnsi="Arial" w:cs="Arial"/>
         </w:rPr>
       </w:pPr>
-      <w:bookmarkStart w:id="7" w:name="_Toc232814696"/>
+      <w:bookmarkStart w:id="7" w:name="_Toc232815365"/>
       <w:r>
         <w:rPr>
           <w:rFonts w:ascii="Arial" w:hAnsi="Arial" w:cs="Arial"/>
@@ -4210,7 +4300,7 @@
           <w:rFonts w:ascii="Arial" w:hAnsi="Arial" w:cs="Arial"/>
         </w:rPr>
       </w:pPr>
-      <w:bookmarkStart w:id="8" w:name="_Toc232814697"/>
+      <w:bookmarkStart w:id="8" w:name="_Toc232815366"/>
       <w:r>
         <w:rPr>
           <w:rFonts w:ascii="Arial" w:hAnsi="Arial" w:cs="Arial"/>
@@ -4753,7 +4843,7 @@
           <w:rFonts w:ascii="Arial" w:hAnsi="Arial" w:cs="Arial"/>
         </w:rPr>
       </w:pPr>
-      <w:bookmarkStart w:id="9" w:name="_Toc232814698"/>
+      <w:bookmarkStart w:id="9" w:name="_Toc232815367"/>
       <w:r>
         <w:rPr>
           <w:rFonts w:ascii="Arial" w:hAnsi="Arial" w:cs="Arial"/>
@@ -4769,7 +4859,7 @@
           <w:rFonts w:ascii="Arial" w:hAnsi="Arial" w:cs="Arial"/>
         </w:rPr>
       </w:pPr>
-      <w:bookmarkStart w:id="10" w:name="_Toc232814699"/>
+      <w:bookmarkStart w:id="10" w:name="_Toc232815368"/>
       <w:r>
         <w:rPr>
           <w:rFonts w:ascii="Arial" w:hAnsi="Arial" w:cs="Arial"/>
@@ -6312,7 +6402,7 @@
           <w:rFonts w:ascii="Arial" w:hAnsi="Arial" w:cs="Arial"/>
         </w:rPr>
       </w:pPr>
-      <w:bookmarkStart w:id="11" w:name="_Toc232814700"/>
+      <w:bookmarkStart w:id="11" w:name="_Toc232815369"/>
       <w:r>
         <w:rPr>
           <w:rFonts w:ascii="Arial" w:hAnsi="Arial" w:cs="Arial"/>
@@ -7165,7 +7255,7 @@
           <w:rFonts w:ascii="Arial" w:hAnsi="Arial" w:cs="Arial"/>
         </w:rPr>
       </w:pPr>
-      <w:bookmarkStart w:id="12" w:name="_Toc232814701"/>
+      <w:bookmarkStart w:id="12" w:name="_Toc232815370"/>
       <w:r>
         <w:rPr>
           <w:rFonts w:ascii="Arial" w:hAnsi="Arial" w:cs="Arial"/>
@@ -7181,7 +7271,7 @@
           <w:rFonts w:ascii="Arial" w:hAnsi="Arial" w:cs="Arial"/>
         </w:rPr>
       </w:pPr>
-      <w:bookmarkStart w:id="13" w:name="_Toc232814702"/>
+      <w:bookmarkStart w:id="13" w:name="_Toc232815371"/>
       <w:r>
         <w:rPr>
           <w:rFonts w:ascii="Arial" w:hAnsi="Arial" w:cs="Arial"/>
@@ -7664,7 +7754,7 @@
           <w:rFonts w:ascii="Arial" w:hAnsi="Arial" w:cs="Arial"/>
         </w:rPr>
       </w:pPr>
-      <w:bookmarkStart w:id="14" w:name="_Toc232814703"/>
+      <w:bookmarkStart w:id="14" w:name="_Toc232815372"/>
       <w:r>
         <w:rPr>
           <w:rFonts w:ascii="Arial" w:hAnsi="Arial" w:cs="Arial"/>
@@ -7771,7 +7861,7 @@
           <w:rFonts w:ascii="Arial" w:hAnsi="Arial" w:cs="Arial"/>
         </w:rPr>
       </w:pPr>
-      <w:bookmarkStart w:id="15" w:name="_Toc232814704"/>
+      <w:bookmarkStart w:id="15" w:name="_Toc232815373"/>
       <w:r>
         <w:rPr>
           <w:rFonts w:ascii="Arial" w:hAnsi="Arial" w:cs="Arial"/>
@@ -7838,7 +7928,7 @@
           <w:rFonts w:ascii="Arial" w:hAnsi="Arial" w:cs="Arial"/>
         </w:rPr>
       </w:pPr>
-      <w:bookmarkStart w:id="16" w:name="_Toc232814705"/>
+      <w:bookmarkStart w:id="16" w:name="_Toc232815374"/>
       <w:r>
         <w:rPr>
           <w:rFonts w:ascii="Arial" w:hAnsi="Arial" w:cs="Arial"/>
@@ -7900,7 +7990,7 @@
           <w:rFonts w:ascii="Arial" w:hAnsi="Arial" w:cs="Arial"/>
         </w:rPr>
       </w:pPr>
-      <w:bookmarkStart w:id="17" w:name="_Toc232814706"/>
+      <w:bookmarkStart w:id="17" w:name="_Toc232815375"/>
       <w:r>
         <w:rPr>
           <w:rFonts w:ascii="Arial" w:hAnsi="Arial" w:cs="Arial"/>
@@ -7962,7 +8052,7 @@
           <w:rFonts w:ascii="Arial" w:hAnsi="Arial" w:cs="Arial"/>
         </w:rPr>
       </w:pPr>
-      <w:bookmarkStart w:id="18" w:name="_Toc232814707"/>
+      <w:bookmarkStart w:id="18" w:name="_Toc232815376"/>
       <w:r>
         <w:rPr>
           <w:rFonts w:ascii="Arial" w:hAnsi="Arial" w:cs="Arial"/>
@@ -8023,7 +8113,7 @@
           <w:rFonts w:ascii="Arial" w:hAnsi="Arial" w:cs="Arial"/>
         </w:rPr>
       </w:pPr>
-      <w:bookmarkStart w:id="19" w:name="_Toc232814708"/>
+      <w:bookmarkStart w:id="19" w:name="_Toc232815377"/>
       <w:r>
         <w:rPr>
           <w:rFonts w:ascii="Arial" w:hAnsi="Arial" w:cs="Arial"/>
@@ -8085,7 +8175,7 @@
           <w:rFonts w:ascii="Arial" w:hAnsi="Arial" w:cs="Arial"/>
         </w:rPr>
       </w:pPr>
-      <w:bookmarkStart w:id="20" w:name="_Toc232814709"/>
+      <w:bookmarkStart w:id="20" w:name="_Toc232815378"/>
       <w:r>
         <w:rPr>
           <w:rFonts w:ascii="Arial" w:hAnsi="Arial" w:cs="Arial"/>
@@ -8146,7 +8236,7 @@
           <w:rFonts w:ascii="Arial" w:hAnsi="Arial" w:cs="Arial"/>
         </w:rPr>
       </w:pPr>
-      <w:bookmarkStart w:id="21" w:name="_Toc232814710"/>
+      <w:bookmarkStart w:id="21" w:name="_Toc232815379"/>
       <w:r>
         <w:rPr>
           <w:rFonts w:ascii="Arial" w:hAnsi="Arial" w:cs="Arial"/>
@@ -8208,7 +8298,7 @@
           <w:rFonts w:ascii="Arial" w:hAnsi="Arial" w:cs="Arial"/>
         </w:rPr>
       </w:pPr>
-      <w:bookmarkStart w:id="22" w:name="_Toc232814711"/>
+      <w:bookmarkStart w:id="22" w:name="_Toc232815380"/>
       <w:r>
         <w:rPr>
           <w:rFonts w:ascii="Arial" w:hAnsi="Arial" w:cs="Arial"/>
@@ -8689,7 +8779,7 @@
           <w:rFonts w:ascii="Arial" w:hAnsi="Arial" w:cs="Arial"/>
         </w:rPr>
       </w:pPr>
-      <w:bookmarkStart w:id="23" w:name="_Toc232814712"/>
+      <w:bookmarkStart w:id="23" w:name="_Toc232815381"/>
       <w:r>
         <w:rPr>
           <w:rFonts w:ascii="Arial" w:hAnsi="Arial" w:cs="Arial"/>
@@ -8706,7 +8796,7 @@
           <w:rFonts w:ascii="Arial" w:hAnsi="Arial" w:cs="Arial"/>
         </w:rPr>
       </w:pPr>
-      <w:bookmarkStart w:id="24" w:name="_Toc232814713"/>
+      <w:bookmarkStart w:id="24" w:name="_Toc232815382"/>
       <w:r>
         <w:rPr>
           <w:rFonts w:ascii="Arial" w:hAnsi="Arial" w:cs="Arial"/>
@@ -9041,7 +9131,7 @@
           <w:rFonts w:ascii="Arial" w:hAnsi="Arial" w:cs="Arial"/>
         </w:rPr>
       </w:pPr>
-      <w:bookmarkStart w:id="25" w:name="_Toc232814714"/>
+      <w:bookmarkStart w:id="25" w:name="_Toc232815383"/>
       <w:r>
         <w:rPr>
           <w:rFonts w:ascii="Arial" w:hAnsi="Arial" w:cs="Arial"/>
@@ -9164,7 +9254,7 @@
           <w:rFonts w:ascii="Arial" w:hAnsi="Arial" w:cs="Arial"/>
         </w:rPr>
       </w:pPr>
-      <w:bookmarkStart w:id="26" w:name="_Toc232814715"/>
+      <w:bookmarkStart w:id="26" w:name="_Toc232815384"/>
       <w:r>
         <w:rPr>
           <w:rFonts w:ascii="Arial" w:hAnsi="Arial" w:cs="Arial"/>
@@ -9250,7 +9340,7 @@
           <w:rFonts w:ascii="Arial" w:hAnsi="Arial" w:cs="Arial"/>
         </w:rPr>
       </w:pPr>
-      <w:bookmarkStart w:id="27" w:name="_Toc232814716"/>
+      <w:bookmarkStart w:id="27" w:name="_Toc232815385"/>
       <w:r>
         <w:rPr>
           <w:rFonts w:ascii="Arial" w:hAnsi="Arial" w:cs="Arial"/>
@@ -9775,7 +9865,7 @@
           <w:rFonts w:ascii="Arial" w:hAnsi="Arial" w:cs="Arial"/>
         </w:rPr>
       </w:pPr>
-      <w:bookmarkStart w:id="28" w:name="_Toc232814717"/>
+      <w:bookmarkStart w:id="28" w:name="_Toc232815386"/>
       <w:r>
         <w:rPr>
           <w:rFonts w:ascii="Arial" w:hAnsi="Arial" w:cs="Arial"/>
@@ -9791,7 +9881,7 @@
           <w:rFonts w:ascii="Arial" w:hAnsi="Arial" w:cs="Arial"/>
         </w:rPr>
       </w:pPr>
-      <w:bookmarkStart w:id="29" w:name="_Toc232814718"/>
+      <w:bookmarkStart w:id="29" w:name="_Toc232815387"/>
       <w:r>
         <w:rPr>
           <w:rFonts w:ascii="Arial" w:hAnsi="Arial" w:cs="Arial"/>
@@ -9966,7 +10056,7 @@
           <w:rFonts w:ascii="Arial" w:hAnsi="Arial" w:cs="Arial"/>
         </w:rPr>
       </w:pPr>
-      <w:bookmarkStart w:id="30" w:name="_Toc232814719"/>
+      <w:bookmarkStart w:id="30" w:name="_Toc232815388"/>
       <w:r>
         <w:rPr>
           <w:rFonts w:ascii="Arial" w:hAnsi="Arial" w:cs="Arial"/>
@@ -10170,7 +10260,7 @@
           <w:rFonts w:ascii="Arial" w:hAnsi="Arial" w:cs="Arial"/>
         </w:rPr>
       </w:pPr>
-      <w:bookmarkStart w:id="31" w:name="_Toc232814720"/>
+      <w:bookmarkStart w:id="31" w:name="_Toc232815389"/>
       <w:r>
         <w:rPr>
           <w:rFonts w:ascii="Arial" w:hAnsi="Arial" w:cs="Arial"/>
@@ -10314,7 +10404,7 @@
           <w:rFonts w:ascii="Arial" w:hAnsi="Arial" w:cs="Arial"/>
         </w:rPr>
       </w:pPr>
-      <w:bookmarkStart w:id="32" w:name="_Toc232814721"/>
+      <w:bookmarkStart w:id="32" w:name="_Toc232815390"/>
       <w:r>
         <w:rPr>
           <w:rFonts w:ascii="Arial" w:hAnsi="Arial" w:cs="Arial"/>
@@ -10459,7 +10549,7 @@
           <w:rFonts w:ascii="Arial" w:hAnsi="Arial" w:cs="Arial"/>
         </w:rPr>
       </w:pPr>
-      <w:bookmarkStart w:id="33" w:name="_Toc232814722"/>
+      <w:bookmarkStart w:id="33" w:name="_Toc232815391"/>
       <w:r>
         <w:rPr>
           <w:rFonts w:ascii="Arial" w:hAnsi="Arial" w:cs="Arial"/>
@@ -10643,14 +10733,60 @@
     </w:p>
     <w:p>
       <w:pPr>
+        <w:pStyle w:val="berschrift3"/>
+        <w:rPr>
+          <w:rFonts w:ascii="Arial" w:hAnsi="Arial" w:cs="Arial"/>
+        </w:rPr>
+      </w:pPr>
+      <w:bookmarkStart w:id="34" w:name="_Toc232813578"/>
+      <w:bookmarkStart w:id="35" w:name="_Toc232815392"/>
+      <w:r>
+        <w:rPr>
+          <w:rFonts w:ascii="Arial" w:hAnsi="Arial" w:cs="Arial"/>
+        </w:rPr>
+        <w:t>7.5.6 Running Without Spotify Or Email</w:t>
+      </w:r>
+      <w:bookmarkEnd w:id="35"/>
+    </w:p>
+    <w:p>
+      <w:pPr>
+        <w:rPr>
+          <w:rFonts w:ascii="Arial" w:hAnsi="Arial" w:cs="Arial"/>
+          <w:sz w:val="21"/>
+        </w:rPr>
+      </w:pPr>
+      <w:r>
+        <w:rPr>
+          <w:rFonts w:ascii="Arial" w:hAnsi="Arial" w:cs="Arial"/>
+          <w:sz w:val="21"/>
+        </w:rPr>
+        <w:t>The program can also run without Spotify and without email sending. This works because Last.fm is the required data source. Spotify is only used to enrich the report with covers, durations, links and optional playlist updates. Gmail is only used to send the finished HTML report by email.</w:t>
+      </w:r>
+    </w:p>
+    <w:p>
+      <w:pPr>
+        <w:rPr>
+          <w:rFonts w:ascii="Arial" w:hAnsi="Arial" w:cs="Arial"/>
+          <w:sz w:val="21"/>
+        </w:rPr>
+      </w:pPr>
+      <w:r>
+        <w:rPr>
+          <w:rFonts w:ascii="Arial" w:hAnsi="Arial" w:cs="Arial"/>
+          <w:sz w:val="21"/>
+        </w:rPr>
+        <w:t>If Spotify and Gmail are disabled, the script still loads Last.fm tracks, stores them in SQLite, calculates statistics and creates the HTML report in output/. For a simple teacher test, set SEND_EMAIL=false, ENABLE_PLAYLIST=false and leave SPOTIFY_CLIENT_ID, SPOTIFY_CLIENT_SECRET, SPOTIFY_REFRESH_TOKEN, SPOTIFY_PLAYLIST_ID and PLAYLIST_URL empty. In this setup, no Gmail account and no Spotify app are required. Only LASTFM_API_KEY and LASTFM_USERNAME are required.</w:t>
+      </w:r>
+    </w:p>
+    <w:p>
+      <w:pPr>
         <w:pStyle w:val="berschrift2"/>
       </w:pPr>
-      <w:bookmarkStart w:id="34" w:name="_Toc232813578"/>
-      <w:bookmarkStart w:id="35" w:name="_Toc232814723"/>
+      <w:bookmarkStart w:id="36" w:name="_Toc232815393"/>
       <w:r>
         <w:t>7.6 Start The Program</w:t>
       </w:r>
-      <w:bookmarkEnd w:id="35"/>
+      <w:bookmarkEnd w:id="36"/>
     </w:p>
     <w:p>
       <w:pPr>
@@ -10741,14 +10877,14 @@
           <w:rFonts w:ascii="Arial" w:hAnsi="Arial" w:cs="Arial"/>
         </w:rPr>
       </w:pPr>
-      <w:bookmarkStart w:id="36" w:name="_Toc232814724"/>
+      <w:bookmarkStart w:id="37" w:name="_Toc232815394"/>
       <w:r>
         <w:rPr>
           <w:rFonts w:ascii="Arial" w:hAnsi="Arial" w:cs="Arial"/>
         </w:rPr>
         <w:t>7.7 Weekly Automation</w:t>
       </w:r>
-      <w:bookmarkEnd w:id="36"/>
+      <w:bookmarkEnd w:id="37"/>
     </w:p>
     <w:p>
       <w:r>
@@ -10802,6 +10938,7 @@
                 <w:color w:val="111827"/>
                 <w:sz w:val="17"/>
               </w:rPr>
+              <w:lastRenderedPageBreak/>
               <w:t>&lt;project-path&gt;\.venv\Scripts\python.exe</w:t>
             </w:r>
             <w:r>
@@ -10866,15 +11003,14 @@
           <w:rFonts w:ascii="Arial" w:hAnsi="Arial" w:cs="Arial"/>
         </w:rPr>
       </w:pPr>
-      <w:bookmarkStart w:id="37" w:name="_Toc232814725"/>
+      <w:bookmarkStart w:id="38" w:name="_Toc232815395"/>
       <w:r>
         <w:rPr>
           <w:rFonts w:ascii="Arial" w:hAnsi="Arial" w:cs="Arial"/>
         </w:rPr>
-        <w:lastRenderedPageBreak/>
         <w:t>8. Testing</w:t>
       </w:r>
-      <w:bookmarkEnd w:id="37"/>
+      <w:bookmarkEnd w:id="38"/>
     </w:p>
     <w:p>
       <w:r>
@@ -10982,7 +11118,7 @@
           <w:rFonts w:ascii="Arial" w:hAnsi="Arial" w:cs="Arial"/>
         </w:rPr>
       </w:pPr>
-      <w:bookmarkStart w:id="38" w:name="_Toc232814726"/>
+      <w:bookmarkStart w:id="39" w:name="_Toc232815396"/>
       <w:r>
         <w:rPr>
           <w:rFonts w:ascii="Arial" w:hAnsi="Arial" w:cs="Arial"/>
@@ -10990,7 +11126,7 @@
         <w:lastRenderedPageBreak/>
         <w:t>9. Assignment Coverage</w:t>
       </w:r>
-      <w:bookmarkEnd w:id="38"/>
+      <w:bookmarkEnd w:id="39"/>
     </w:p>
     <w:p>
       <w:r>
@@ -11563,14 +11699,14 @@
           <w:rFonts w:ascii="Arial" w:hAnsi="Arial" w:cs="Arial"/>
         </w:rPr>
       </w:pPr>
-      <w:bookmarkStart w:id="39" w:name="_Toc232814727"/>
+      <w:bookmarkStart w:id="40" w:name="_Toc232815397"/>
       <w:r>
         <w:rPr>
           <w:rFonts w:ascii="Arial" w:hAnsi="Arial" w:cs="Arial"/>
         </w:rPr>
         <w:t>10. Conclusion</w:t>
       </w:r>
-      <w:bookmarkEnd w:id="39"/>
+      <w:bookmarkEnd w:id="40"/>
     </w:p>
     <w:p>
       <w:r>

</xml_diff>

<commit_message>
Format fallback env values in final documentation
</commit_message>
<xml_diff>
--- a/docs/M122E_Final_Documentation.docx
+++ b/docs/M122E_Final_Documentation.docx
@@ -474,7 +474,7 @@
         </w:rPr>
         <w:fldChar w:fldCharType="separate"/>
       </w:r>
-      <w:hyperlink w:anchor="_Toc232815358" w:history="1">
+      <w:hyperlink w:anchor="_Toc232816361" w:history="1">
         <w:r>
           <w:rPr>
             <w:rStyle w:val="Hyperlink"/>
@@ -509,7 +509,7 @@
             <w:webHidden/>
             <w:sz w:val="17"/>
           </w:rPr>
-          <w:instrText xml:space="preserve"> PAGEREF _Toc232815358 \h </w:instrText>
+          <w:instrText xml:space="preserve"> PAGEREF _Toc232816361 \h </w:instrText>
         </w:r>
         <w:r>
           <w:rPr>
@@ -565,7 +565,7 @@
           <w14:ligatures w14:val="standardContextual"/>
         </w:rPr>
       </w:pPr>
-      <w:hyperlink w:anchor="_Toc232815359" w:history="1">
+      <w:hyperlink w:anchor="_Toc232816362" w:history="1">
         <w:r>
           <w:rPr>
             <w:rStyle w:val="Hyperlink"/>
@@ -600,7 +600,7 @@
             <w:webHidden/>
             <w:sz w:val="17"/>
           </w:rPr>
-          <w:instrText xml:space="preserve"> PAGEREF _Toc232815359 \h </w:instrText>
+          <w:instrText xml:space="preserve"> PAGEREF _Toc232816362 \h </w:instrText>
         </w:r>
         <w:r>
           <w:rPr>
@@ -656,7 +656,7 @@
           <w14:ligatures w14:val="standardContextual"/>
         </w:rPr>
       </w:pPr>
-      <w:hyperlink w:anchor="_Toc232815360" w:history="1">
+      <w:hyperlink w:anchor="_Toc232816363" w:history="1">
         <w:r>
           <w:rPr>
             <w:rStyle w:val="Hyperlink"/>
@@ -691,7 +691,7 @@
             <w:webHidden/>
             <w:sz w:val="17"/>
           </w:rPr>
-          <w:instrText xml:space="preserve"> PAGEREF _Toc232815360 \h </w:instrText>
+          <w:instrText xml:space="preserve"> PAGEREF _Toc232816363 \h </w:instrText>
         </w:r>
         <w:r>
           <w:rPr>
@@ -747,7 +747,7 @@
           <w14:ligatures w14:val="standardContextual"/>
         </w:rPr>
       </w:pPr>
-      <w:hyperlink w:anchor="_Toc232815361" w:history="1">
+      <w:hyperlink w:anchor="_Toc232816364" w:history="1">
         <w:r>
           <w:rPr>
             <w:rStyle w:val="Hyperlink"/>
@@ -782,7 +782,7 @@
             <w:webHidden/>
             <w:sz w:val="17"/>
           </w:rPr>
-          <w:instrText xml:space="preserve"> PAGEREF _Toc232815361 \h </w:instrText>
+          <w:instrText xml:space="preserve"> PAGEREF _Toc232816364 \h </w:instrText>
         </w:r>
         <w:r>
           <w:rPr>
@@ -838,7 +838,7 @@
           <w14:ligatures w14:val="standardContextual"/>
         </w:rPr>
       </w:pPr>
-      <w:hyperlink w:anchor="_Toc232815362" w:history="1">
+      <w:hyperlink w:anchor="_Toc232816365" w:history="1">
         <w:r>
           <w:rPr>
             <w:rStyle w:val="Hyperlink"/>
@@ -873,7 +873,7 @@
             <w:webHidden/>
             <w:sz w:val="17"/>
           </w:rPr>
-          <w:instrText xml:space="preserve"> PAGEREF _Toc232815362 \h </w:instrText>
+          <w:instrText xml:space="preserve"> PAGEREF _Toc232816365 \h </w:instrText>
         </w:r>
         <w:r>
           <w:rPr>
@@ -929,7 +929,7 @@
           <w14:ligatures w14:val="standardContextual"/>
         </w:rPr>
       </w:pPr>
-      <w:hyperlink w:anchor="_Toc232815363" w:history="1">
+      <w:hyperlink w:anchor="_Toc232816366" w:history="1">
         <w:r>
           <w:rPr>
             <w:rStyle w:val="Hyperlink"/>
@@ -964,7 +964,7 @@
             <w:webHidden/>
             <w:sz w:val="17"/>
           </w:rPr>
-          <w:instrText xml:space="preserve"> PAGEREF _Toc232815363 \h </w:instrText>
+          <w:instrText xml:space="preserve"> PAGEREF _Toc232816366 \h </w:instrText>
         </w:r>
         <w:r>
           <w:rPr>
@@ -1020,7 +1020,7 @@
           <w14:ligatures w14:val="standardContextual"/>
         </w:rPr>
       </w:pPr>
-      <w:hyperlink w:anchor="_Toc232815364" w:history="1">
+      <w:hyperlink w:anchor="_Toc232816367" w:history="1">
         <w:r>
           <w:rPr>
             <w:rStyle w:val="Hyperlink"/>
@@ -1055,7 +1055,7 @@
             <w:webHidden/>
             <w:sz w:val="17"/>
           </w:rPr>
-          <w:instrText xml:space="preserve"> PAGEREF _Toc232815364 \h </w:instrText>
+          <w:instrText xml:space="preserve"> PAGEREF _Toc232816367 \h </w:instrText>
         </w:r>
         <w:r>
           <w:rPr>
@@ -1111,7 +1111,7 @@
           <w14:ligatures w14:val="standardContextual"/>
         </w:rPr>
       </w:pPr>
-      <w:hyperlink w:anchor="_Toc232815365" w:history="1">
+      <w:hyperlink w:anchor="_Toc232816368" w:history="1">
         <w:r>
           <w:rPr>
             <w:rStyle w:val="Hyperlink"/>
@@ -1146,7 +1146,7 @@
             <w:webHidden/>
             <w:sz w:val="17"/>
           </w:rPr>
-          <w:instrText xml:space="preserve"> PAGEREF _Toc232815365 \h </w:instrText>
+          <w:instrText xml:space="preserve"> PAGEREF _Toc232816368 \h </w:instrText>
         </w:r>
         <w:r>
           <w:rPr>
@@ -1202,7 +1202,7 @@
           <w14:ligatures w14:val="standardContextual"/>
         </w:rPr>
       </w:pPr>
-      <w:hyperlink w:anchor="_Toc232815366" w:history="1">
+      <w:hyperlink w:anchor="_Toc232816369" w:history="1">
         <w:r>
           <w:rPr>
             <w:rStyle w:val="Hyperlink"/>
@@ -1237,7 +1237,7 @@
             <w:webHidden/>
             <w:sz w:val="17"/>
           </w:rPr>
-          <w:instrText xml:space="preserve"> PAGEREF _Toc232815366 \h </w:instrText>
+          <w:instrText xml:space="preserve"> PAGEREF _Toc232816369 \h </w:instrText>
         </w:r>
         <w:r>
           <w:rPr>
@@ -1293,7 +1293,7 @@
           <w14:ligatures w14:val="standardContextual"/>
         </w:rPr>
       </w:pPr>
-      <w:hyperlink w:anchor="_Toc232815367" w:history="1">
+      <w:hyperlink w:anchor="_Toc232816370" w:history="1">
         <w:r>
           <w:rPr>
             <w:rStyle w:val="Hyperlink"/>
@@ -1328,7 +1328,7 @@
             <w:webHidden/>
             <w:sz w:val="17"/>
           </w:rPr>
-          <w:instrText xml:space="preserve"> PAGEREF _Toc232815367 \h </w:instrText>
+          <w:instrText xml:space="preserve"> PAGEREF _Toc232816370 \h </w:instrText>
         </w:r>
         <w:r>
           <w:rPr>
@@ -1384,7 +1384,7 @@
           <w14:ligatures w14:val="standardContextual"/>
         </w:rPr>
       </w:pPr>
-      <w:hyperlink w:anchor="_Toc232815368" w:history="1">
+      <w:hyperlink w:anchor="_Toc232816371" w:history="1">
         <w:r>
           <w:rPr>
             <w:rStyle w:val="Hyperlink"/>
@@ -1419,7 +1419,7 @@
             <w:webHidden/>
             <w:sz w:val="17"/>
           </w:rPr>
-          <w:instrText xml:space="preserve"> PAGEREF _Toc232815368 \h </w:instrText>
+          <w:instrText xml:space="preserve"> PAGEREF _Toc232816371 \h </w:instrText>
         </w:r>
         <w:r>
           <w:rPr>
@@ -1475,7 +1475,7 @@
           <w14:ligatures w14:val="standardContextual"/>
         </w:rPr>
       </w:pPr>
-      <w:hyperlink w:anchor="_Toc232815369" w:history="1">
+      <w:hyperlink w:anchor="_Toc232816372" w:history="1">
         <w:r>
           <w:rPr>
             <w:rStyle w:val="Hyperlink"/>
@@ -1510,7 +1510,7 @@
             <w:webHidden/>
             <w:sz w:val="17"/>
           </w:rPr>
-          <w:instrText xml:space="preserve"> PAGEREF _Toc232815369 \h </w:instrText>
+          <w:instrText xml:space="preserve"> PAGEREF _Toc232816372 \h </w:instrText>
         </w:r>
         <w:r>
           <w:rPr>
@@ -1566,7 +1566,7 @@
           <w14:ligatures w14:val="standardContextual"/>
         </w:rPr>
       </w:pPr>
-      <w:hyperlink w:anchor="_Toc232815370" w:history="1">
+      <w:hyperlink w:anchor="_Toc232816373" w:history="1">
         <w:r>
           <w:rPr>
             <w:rStyle w:val="Hyperlink"/>
@@ -1601,7 +1601,7 @@
             <w:webHidden/>
             <w:sz w:val="17"/>
           </w:rPr>
-          <w:instrText xml:space="preserve"> PAGEREF _Toc232815370 \h </w:instrText>
+          <w:instrText xml:space="preserve"> PAGEREF _Toc232816373 \h </w:instrText>
         </w:r>
         <w:r>
           <w:rPr>
@@ -1657,7 +1657,7 @@
           <w14:ligatures w14:val="standardContextual"/>
         </w:rPr>
       </w:pPr>
-      <w:hyperlink w:anchor="_Toc232815371" w:history="1">
+      <w:hyperlink w:anchor="_Toc232816374" w:history="1">
         <w:r>
           <w:rPr>
             <w:rStyle w:val="Hyperlink"/>
@@ -1692,7 +1692,7 @@
             <w:webHidden/>
             <w:sz w:val="17"/>
           </w:rPr>
-          <w:instrText xml:space="preserve"> PAGEREF _Toc232815371 \h </w:instrText>
+          <w:instrText xml:space="preserve"> PAGEREF _Toc232816374 \h </w:instrText>
         </w:r>
         <w:r>
           <w:rPr>
@@ -1748,7 +1748,7 @@
           <w14:ligatures w14:val="standardContextual"/>
         </w:rPr>
       </w:pPr>
-      <w:hyperlink w:anchor="_Toc232815372" w:history="1">
+      <w:hyperlink w:anchor="_Toc232816375" w:history="1">
         <w:r>
           <w:rPr>
             <w:rStyle w:val="Hyperlink"/>
@@ -1783,7 +1783,7 @@
             <w:webHidden/>
             <w:sz w:val="17"/>
           </w:rPr>
-          <w:instrText xml:space="preserve"> PAGEREF _Toc232815372 \h </w:instrText>
+          <w:instrText xml:space="preserve"> PAGEREF _Toc232816375 \h </w:instrText>
         </w:r>
         <w:r>
           <w:rPr>
@@ -1839,7 +1839,7 @@
           <w14:ligatures w14:val="standardContextual"/>
         </w:rPr>
       </w:pPr>
-      <w:hyperlink w:anchor="_Toc232815373" w:history="1">
+      <w:hyperlink w:anchor="_Toc232816376" w:history="1">
         <w:r>
           <w:rPr>
             <w:rStyle w:val="Hyperlink"/>
@@ -1874,7 +1874,7 @@
             <w:webHidden/>
             <w:sz w:val="17"/>
           </w:rPr>
-          <w:instrText xml:space="preserve"> PAGEREF _Toc232815373 \h </w:instrText>
+          <w:instrText xml:space="preserve"> PAGEREF _Toc232816376 \h </w:instrText>
         </w:r>
         <w:r>
           <w:rPr>
@@ -1930,7 +1930,7 @@
           <w14:ligatures w14:val="standardContextual"/>
         </w:rPr>
       </w:pPr>
-      <w:hyperlink w:anchor="_Toc232815374" w:history="1">
+      <w:hyperlink w:anchor="_Toc232816377" w:history="1">
         <w:r>
           <w:rPr>
             <w:rStyle w:val="Hyperlink"/>
@@ -1965,7 +1965,7 @@
             <w:webHidden/>
             <w:sz w:val="17"/>
           </w:rPr>
-          <w:instrText xml:space="preserve"> PAGEREF _Toc232815374 \h </w:instrText>
+          <w:instrText xml:space="preserve"> PAGEREF _Toc232816377 \h </w:instrText>
         </w:r>
         <w:r>
           <w:rPr>
@@ -2021,7 +2021,7 @@
           <w14:ligatures w14:val="standardContextual"/>
         </w:rPr>
       </w:pPr>
-      <w:hyperlink w:anchor="_Toc232815375" w:history="1">
+      <w:hyperlink w:anchor="_Toc232816378" w:history="1">
         <w:r>
           <w:rPr>
             <w:rStyle w:val="Hyperlink"/>
@@ -2056,7 +2056,7 @@
             <w:webHidden/>
             <w:sz w:val="17"/>
           </w:rPr>
-          <w:instrText xml:space="preserve"> PAGEREF _Toc232815375 \h </w:instrText>
+          <w:instrText xml:space="preserve"> PAGEREF _Toc232816378 \h </w:instrText>
         </w:r>
         <w:r>
           <w:rPr>
@@ -2112,7 +2112,7 @@
           <w14:ligatures w14:val="standardContextual"/>
         </w:rPr>
       </w:pPr>
-      <w:hyperlink w:anchor="_Toc232815376" w:history="1">
+      <w:hyperlink w:anchor="_Toc232816379" w:history="1">
         <w:r>
           <w:rPr>
             <w:rStyle w:val="Hyperlink"/>
@@ -2147,7 +2147,7 @@
             <w:webHidden/>
             <w:sz w:val="17"/>
           </w:rPr>
-          <w:instrText xml:space="preserve"> PAGEREF _Toc232815376 \h </w:instrText>
+          <w:instrText xml:space="preserve"> PAGEREF _Toc232816379 \h </w:instrText>
         </w:r>
         <w:r>
           <w:rPr>
@@ -2203,7 +2203,7 @@
           <w14:ligatures w14:val="standardContextual"/>
         </w:rPr>
       </w:pPr>
-      <w:hyperlink w:anchor="_Toc232815377" w:history="1">
+      <w:hyperlink w:anchor="_Toc232816380" w:history="1">
         <w:r>
           <w:rPr>
             <w:rStyle w:val="Hyperlink"/>
@@ -2238,7 +2238,7 @@
             <w:webHidden/>
             <w:sz w:val="17"/>
           </w:rPr>
-          <w:instrText xml:space="preserve"> PAGEREF _Toc232815377 \h </w:instrText>
+          <w:instrText xml:space="preserve"> PAGEREF _Toc232816380 \h </w:instrText>
         </w:r>
         <w:r>
           <w:rPr>
@@ -2294,7 +2294,7 @@
           <w14:ligatures w14:val="standardContextual"/>
         </w:rPr>
       </w:pPr>
-      <w:hyperlink w:anchor="_Toc232815378" w:history="1">
+      <w:hyperlink w:anchor="_Toc232816381" w:history="1">
         <w:r>
           <w:rPr>
             <w:rStyle w:val="Hyperlink"/>
@@ -2329,7 +2329,7 @@
             <w:webHidden/>
             <w:sz w:val="17"/>
           </w:rPr>
-          <w:instrText xml:space="preserve"> PAGEREF _Toc232815378 \h </w:instrText>
+          <w:instrText xml:space="preserve"> PAGEREF _Toc232816381 \h </w:instrText>
         </w:r>
         <w:r>
           <w:rPr>
@@ -2385,7 +2385,7 @@
           <w14:ligatures w14:val="standardContextual"/>
         </w:rPr>
       </w:pPr>
-      <w:hyperlink w:anchor="_Toc232815379" w:history="1">
+      <w:hyperlink w:anchor="_Toc232816382" w:history="1">
         <w:r>
           <w:rPr>
             <w:rStyle w:val="Hyperlink"/>
@@ -2420,7 +2420,7 @@
             <w:webHidden/>
             <w:sz w:val="17"/>
           </w:rPr>
-          <w:instrText xml:space="preserve"> PAGEREF _Toc232815379 \h </w:instrText>
+          <w:instrText xml:space="preserve"> PAGEREF _Toc232816382 \h </w:instrText>
         </w:r>
         <w:r>
           <w:rPr>
@@ -2476,7 +2476,7 @@
           <w14:ligatures w14:val="standardContextual"/>
         </w:rPr>
       </w:pPr>
-      <w:hyperlink w:anchor="_Toc232815380" w:history="1">
+      <w:hyperlink w:anchor="_Toc232816383" w:history="1">
         <w:r>
           <w:rPr>
             <w:rStyle w:val="Hyperlink"/>
@@ -2511,7 +2511,7 @@
             <w:webHidden/>
             <w:sz w:val="17"/>
           </w:rPr>
-          <w:instrText xml:space="preserve"> PAGEREF _Toc232815380 \h </w:instrText>
+          <w:instrText xml:space="preserve"> PAGEREF _Toc232816383 \h </w:instrText>
         </w:r>
         <w:r>
           <w:rPr>
@@ -2567,7 +2567,7 @@
           <w14:ligatures w14:val="standardContextual"/>
         </w:rPr>
       </w:pPr>
-      <w:hyperlink w:anchor="_Toc232815381" w:history="1">
+      <w:hyperlink w:anchor="_Toc232816384" w:history="1">
         <w:r>
           <w:rPr>
             <w:rStyle w:val="Hyperlink"/>
@@ -2602,7 +2602,7 @@
             <w:webHidden/>
             <w:sz w:val="17"/>
           </w:rPr>
-          <w:instrText xml:space="preserve"> PAGEREF _Toc232815381 \h </w:instrText>
+          <w:instrText xml:space="preserve"> PAGEREF _Toc232816384 \h </w:instrText>
         </w:r>
         <w:r>
           <w:rPr>
@@ -2658,7 +2658,7 @@
           <w14:ligatures w14:val="standardContextual"/>
         </w:rPr>
       </w:pPr>
-      <w:hyperlink w:anchor="_Toc232815382" w:history="1">
+      <w:hyperlink w:anchor="_Toc232816385" w:history="1">
         <w:r>
           <w:rPr>
             <w:rStyle w:val="Hyperlink"/>
@@ -2693,7 +2693,7 @@
             <w:webHidden/>
             <w:sz w:val="17"/>
           </w:rPr>
-          <w:instrText xml:space="preserve"> PAGEREF _Toc232815382 \h </w:instrText>
+          <w:instrText xml:space="preserve"> PAGEREF _Toc232816385 \h </w:instrText>
         </w:r>
         <w:r>
           <w:rPr>
@@ -2749,7 +2749,7 @@
           <w14:ligatures w14:val="standardContextual"/>
         </w:rPr>
       </w:pPr>
-      <w:hyperlink w:anchor="_Toc232815383" w:history="1">
+      <w:hyperlink w:anchor="_Toc232816386" w:history="1">
         <w:r>
           <w:rPr>
             <w:rStyle w:val="Hyperlink"/>
@@ -2784,7 +2784,7 @@
             <w:webHidden/>
             <w:sz w:val="17"/>
           </w:rPr>
-          <w:instrText xml:space="preserve"> PAGEREF _Toc232815383 \h </w:instrText>
+          <w:instrText xml:space="preserve"> PAGEREF _Toc232816386 \h </w:instrText>
         </w:r>
         <w:r>
           <w:rPr>
@@ -2840,7 +2840,7 @@
           <w14:ligatures w14:val="standardContextual"/>
         </w:rPr>
       </w:pPr>
-      <w:hyperlink w:anchor="_Toc232815384" w:history="1">
+      <w:hyperlink w:anchor="_Toc232816387" w:history="1">
         <w:r>
           <w:rPr>
             <w:rStyle w:val="Hyperlink"/>
@@ -2875,7 +2875,7 @@
             <w:webHidden/>
             <w:sz w:val="17"/>
           </w:rPr>
-          <w:instrText xml:space="preserve"> PAGEREF _Toc232815384 \h </w:instrText>
+          <w:instrText xml:space="preserve"> PAGEREF _Toc232816387 \h </w:instrText>
         </w:r>
         <w:r>
           <w:rPr>
@@ -2931,7 +2931,7 @@
           <w14:ligatures w14:val="standardContextual"/>
         </w:rPr>
       </w:pPr>
-      <w:hyperlink w:anchor="_Toc232815385" w:history="1">
+      <w:hyperlink w:anchor="_Toc232816388" w:history="1">
         <w:r>
           <w:rPr>
             <w:rStyle w:val="Hyperlink"/>
@@ -2966,7 +2966,7 @@
             <w:webHidden/>
             <w:sz w:val="17"/>
           </w:rPr>
-          <w:instrText xml:space="preserve"> PAGEREF _Toc232815385 \h </w:instrText>
+          <w:instrText xml:space="preserve"> PAGEREF _Toc232816388 \h </w:instrText>
         </w:r>
         <w:r>
           <w:rPr>
@@ -3022,7 +3022,7 @@
           <w14:ligatures w14:val="standardContextual"/>
         </w:rPr>
       </w:pPr>
-      <w:hyperlink w:anchor="_Toc232815386" w:history="1">
+      <w:hyperlink w:anchor="_Toc232816389" w:history="1">
         <w:r>
           <w:rPr>
             <w:rStyle w:val="Hyperlink"/>
@@ -3057,7 +3057,7 @@
             <w:webHidden/>
             <w:sz w:val="17"/>
           </w:rPr>
-          <w:instrText xml:space="preserve"> PAGEREF _Toc232815386 \h </w:instrText>
+          <w:instrText xml:space="preserve"> PAGEREF _Toc232816389 \h </w:instrText>
         </w:r>
         <w:r>
           <w:rPr>
@@ -3113,7 +3113,7 @@
           <w14:ligatures w14:val="standardContextual"/>
         </w:rPr>
       </w:pPr>
-      <w:hyperlink w:anchor="_Toc232815387" w:history="1">
+      <w:hyperlink w:anchor="_Toc232816390" w:history="1">
         <w:r>
           <w:rPr>
             <w:rStyle w:val="Hyperlink"/>
@@ -3148,7 +3148,7 @@
             <w:webHidden/>
             <w:sz w:val="17"/>
           </w:rPr>
-          <w:instrText xml:space="preserve"> PAGEREF _Toc232815387 \h </w:instrText>
+          <w:instrText xml:space="preserve"> PAGEREF _Toc232816390 \h </w:instrText>
         </w:r>
         <w:r>
           <w:rPr>
@@ -3204,7 +3204,7 @@
           <w14:ligatures w14:val="standardContextual"/>
         </w:rPr>
       </w:pPr>
-      <w:hyperlink w:anchor="_Toc232815388" w:history="1">
+      <w:hyperlink w:anchor="_Toc232816391" w:history="1">
         <w:r>
           <w:rPr>
             <w:rStyle w:val="Hyperlink"/>
@@ -3239,7 +3239,7 @@
             <w:webHidden/>
             <w:sz w:val="17"/>
           </w:rPr>
-          <w:instrText xml:space="preserve"> PAGEREF _Toc232815388 \h </w:instrText>
+          <w:instrText xml:space="preserve"> PAGEREF _Toc232816391 \h </w:instrText>
         </w:r>
         <w:r>
           <w:rPr>
@@ -3295,7 +3295,7 @@
           <w14:ligatures w14:val="standardContextual"/>
         </w:rPr>
       </w:pPr>
-      <w:hyperlink w:anchor="_Toc232815389" w:history="1">
+      <w:hyperlink w:anchor="_Toc232816392" w:history="1">
         <w:r>
           <w:rPr>
             <w:rStyle w:val="Hyperlink"/>
@@ -3330,7 +3330,7 @@
             <w:webHidden/>
             <w:sz w:val="17"/>
           </w:rPr>
-          <w:instrText xml:space="preserve"> PAGEREF _Toc232815389 \h </w:instrText>
+          <w:instrText xml:space="preserve"> PAGEREF _Toc232816392 \h </w:instrText>
         </w:r>
         <w:r>
           <w:rPr>
@@ -3386,7 +3386,7 @@
           <w14:ligatures w14:val="standardContextual"/>
         </w:rPr>
       </w:pPr>
-      <w:hyperlink w:anchor="_Toc232815390" w:history="1">
+      <w:hyperlink w:anchor="_Toc232816393" w:history="1">
         <w:r>
           <w:rPr>
             <w:rStyle w:val="Hyperlink"/>
@@ -3421,7 +3421,7 @@
             <w:webHidden/>
             <w:sz w:val="17"/>
           </w:rPr>
-          <w:instrText xml:space="preserve"> PAGEREF _Toc232815390 \h </w:instrText>
+          <w:instrText xml:space="preserve"> PAGEREF _Toc232816393 \h </w:instrText>
         </w:r>
         <w:r>
           <w:rPr>
@@ -3477,7 +3477,7 @@
           <w14:ligatures w14:val="standardContextual"/>
         </w:rPr>
       </w:pPr>
-      <w:hyperlink w:anchor="_Toc232815391" w:history="1">
+      <w:hyperlink w:anchor="_Toc232816394" w:history="1">
         <w:r>
           <w:rPr>
             <w:rStyle w:val="Hyperlink"/>
@@ -3512,7 +3512,7 @@
             <w:webHidden/>
             <w:sz w:val="17"/>
           </w:rPr>
-          <w:instrText xml:space="preserve"> PAGEREF _Toc232815391 \h </w:instrText>
+          <w:instrText xml:space="preserve"> PAGEREF _Toc232816394 \h </w:instrText>
         </w:r>
         <w:r>
           <w:rPr>
@@ -3568,7 +3568,7 @@
           <w14:ligatures w14:val="standardContextual"/>
         </w:rPr>
       </w:pPr>
-      <w:hyperlink w:anchor="_Toc232815392" w:history="1">
+      <w:hyperlink w:anchor="_Toc232816395" w:history="1">
         <w:r>
           <w:rPr>
             <w:rStyle w:val="Hyperlink"/>
@@ -3603,7 +3603,7 @@
             <w:webHidden/>
             <w:sz w:val="17"/>
           </w:rPr>
-          <w:instrText xml:space="preserve"> PAGEREF _Toc232815392 \h </w:instrText>
+          <w:instrText xml:space="preserve"> PAGEREF _Toc232816395 \h </w:instrText>
         </w:r>
         <w:r>
           <w:rPr>
@@ -3659,7 +3659,7 @@
           <w14:ligatures w14:val="standardContextual"/>
         </w:rPr>
       </w:pPr>
-      <w:hyperlink w:anchor="_Toc232815393" w:history="1">
+      <w:hyperlink w:anchor="_Toc232816396" w:history="1">
         <w:r>
           <w:rPr>
             <w:rStyle w:val="Hyperlink"/>
@@ -3694,7 +3694,7 @@
             <w:webHidden/>
             <w:sz w:val="17"/>
           </w:rPr>
-          <w:instrText xml:space="preserve"> PAGEREF _Toc232815393 \h </w:instrText>
+          <w:instrText xml:space="preserve"> PAGEREF _Toc232816396 \h </w:instrText>
         </w:r>
         <w:r>
           <w:rPr>
@@ -3720,7 +3720,7 @@
             <w:webHidden/>
             <w:sz w:val="17"/>
           </w:rPr>
-          <w:t>14</w:t>
+          <w:t>15</w:t>
         </w:r>
         <w:r>
           <w:rPr>
@@ -3750,7 +3750,7 @@
           <w14:ligatures w14:val="standardContextual"/>
         </w:rPr>
       </w:pPr>
-      <w:hyperlink w:anchor="_Toc232815394" w:history="1">
+      <w:hyperlink w:anchor="_Toc232816397" w:history="1">
         <w:r>
           <w:rPr>
             <w:rStyle w:val="Hyperlink"/>
@@ -3785,7 +3785,7 @@
             <w:webHidden/>
             <w:sz w:val="17"/>
           </w:rPr>
-          <w:instrText xml:space="preserve"> PAGEREF _Toc232815394 \h </w:instrText>
+          <w:instrText xml:space="preserve"> PAGEREF _Toc232816397 \h </w:instrText>
         </w:r>
         <w:r>
           <w:rPr>
@@ -3811,7 +3811,7 @@
             <w:webHidden/>
             <w:sz w:val="17"/>
           </w:rPr>
-          <w:t>14</w:t>
+          <w:t>15</w:t>
         </w:r>
         <w:r>
           <w:rPr>
@@ -3841,7 +3841,7 @@
           <w14:ligatures w14:val="standardContextual"/>
         </w:rPr>
       </w:pPr>
-      <w:hyperlink w:anchor="_Toc232815395" w:history="1">
+      <w:hyperlink w:anchor="_Toc232816398" w:history="1">
         <w:r>
           <w:rPr>
             <w:rStyle w:val="Hyperlink"/>
@@ -3876,7 +3876,7 @@
             <w:webHidden/>
             <w:sz w:val="17"/>
           </w:rPr>
-          <w:instrText xml:space="preserve"> PAGEREF _Toc232815395 \h </w:instrText>
+          <w:instrText xml:space="preserve"> PAGEREF _Toc232816398 \h </w:instrText>
         </w:r>
         <w:r>
           <w:rPr>
@@ -3932,7 +3932,7 @@
           <w14:ligatures w14:val="standardContextual"/>
         </w:rPr>
       </w:pPr>
-      <w:hyperlink w:anchor="_Toc232815396" w:history="1">
+      <w:hyperlink w:anchor="_Toc232816399" w:history="1">
         <w:r>
           <w:rPr>
             <w:rStyle w:val="Hyperlink"/>
@@ -3967,7 +3967,7 @@
             <w:webHidden/>
             <w:sz w:val="17"/>
           </w:rPr>
-          <w:instrText xml:space="preserve"> PAGEREF _Toc232815396 \h </w:instrText>
+          <w:instrText xml:space="preserve"> PAGEREF _Toc232816399 \h </w:instrText>
         </w:r>
         <w:r>
           <w:rPr>
@@ -3993,7 +3993,7 @@
             <w:webHidden/>
             <w:sz w:val="17"/>
           </w:rPr>
-          <w:t>16</w:t>
+          <w:t>17</w:t>
         </w:r>
         <w:r>
           <w:rPr>
@@ -4023,7 +4023,7 @@
           <w14:ligatures w14:val="standardContextual"/>
         </w:rPr>
       </w:pPr>
-      <w:hyperlink w:anchor="_Toc232815397" w:history="1">
+      <w:hyperlink w:anchor="_Toc232816400" w:history="1">
         <w:r>
           <w:rPr>
             <w:rStyle w:val="Hyperlink"/>
@@ -4058,7 +4058,7 @@
             <w:webHidden/>
             <w:sz w:val="17"/>
           </w:rPr>
-          <w:instrText xml:space="preserve"> PAGEREF _Toc232815397 \h </w:instrText>
+          <w:instrText xml:space="preserve"> PAGEREF _Toc232816400 \h </w:instrText>
         </w:r>
         <w:r>
           <w:rPr>
@@ -4084,7 +4084,7 @@
             <w:webHidden/>
             <w:sz w:val="17"/>
           </w:rPr>
-          <w:t>16</w:t>
+          <w:t>17</w:t>
         </w:r>
         <w:r>
           <w:rPr>
@@ -4121,7 +4121,7 @@
           <w:rFonts w:ascii="Arial" w:hAnsi="Arial" w:cs="Arial"/>
         </w:rPr>
       </w:pPr>
-      <w:bookmarkStart w:id="0" w:name="_Toc232815358"/>
+      <w:bookmarkStart w:id="0" w:name="_Toc232816361"/>
       <w:r>
         <w:rPr>
           <w:rFonts w:ascii="Arial" w:hAnsi="Arial" w:cs="Arial"/>
@@ -4138,7 +4138,7 @@
           <w:rFonts w:ascii="Arial" w:hAnsi="Arial" w:cs="Arial"/>
         </w:rPr>
       </w:pPr>
-      <w:bookmarkStart w:id="1" w:name="_Toc232815359"/>
+      <w:bookmarkStart w:id="1" w:name="_Toc232816362"/>
       <w:r>
         <w:rPr>
           <w:rFonts w:ascii="Arial" w:hAnsi="Arial" w:cs="Arial"/>
@@ -4164,7 +4164,7 @@
           <w:rFonts w:ascii="Arial" w:hAnsi="Arial" w:cs="Arial"/>
         </w:rPr>
       </w:pPr>
-      <w:bookmarkStart w:id="2" w:name="_Toc232815360"/>
+      <w:bookmarkStart w:id="2" w:name="_Toc232816363"/>
       <w:r>
         <w:rPr>
           <w:rFonts w:ascii="Arial" w:hAnsi="Arial" w:cs="Arial"/>
@@ -4185,7 +4185,7 @@
           <w:rFonts w:ascii="Arial" w:hAnsi="Arial" w:cs="Arial"/>
         </w:rPr>
       </w:pPr>
-      <w:bookmarkStart w:id="3" w:name="_Toc232815361"/>
+      <w:bookmarkStart w:id="3" w:name="_Toc232816364"/>
       <w:r>
         <w:rPr>
           <w:rFonts w:ascii="Arial" w:hAnsi="Arial" w:cs="Arial"/>
@@ -4206,7 +4206,7 @@
           <w:rFonts w:ascii="Arial" w:hAnsi="Arial" w:cs="Arial"/>
         </w:rPr>
       </w:pPr>
-      <w:bookmarkStart w:id="4" w:name="_Toc232815362"/>
+      <w:bookmarkStart w:id="4" w:name="_Toc232816365"/>
       <w:r>
         <w:rPr>
           <w:rFonts w:ascii="Arial" w:hAnsi="Arial" w:cs="Arial"/>
@@ -4222,7 +4222,7 @@
           <w:rFonts w:ascii="Arial" w:hAnsi="Arial" w:cs="Arial"/>
         </w:rPr>
       </w:pPr>
-      <w:bookmarkStart w:id="5" w:name="_Toc232815363"/>
+      <w:bookmarkStart w:id="5" w:name="_Toc232816366"/>
       <w:r>
         <w:rPr>
           <w:rFonts w:ascii="Arial" w:hAnsi="Arial" w:cs="Arial"/>
@@ -4248,7 +4248,7 @@
           <w:rFonts w:ascii="Arial" w:hAnsi="Arial" w:cs="Arial"/>
         </w:rPr>
       </w:pPr>
-      <w:bookmarkStart w:id="6" w:name="_Toc232815364"/>
+      <w:bookmarkStart w:id="6" w:name="_Toc232816367"/>
       <w:r>
         <w:rPr>
           <w:rFonts w:ascii="Arial" w:hAnsi="Arial" w:cs="Arial"/>
@@ -4279,7 +4279,7 @@
           <w:rFonts w:ascii="Arial" w:hAnsi="Arial" w:cs="Arial"/>
         </w:rPr>
       </w:pPr>
-      <w:bookmarkStart w:id="7" w:name="_Toc232815365"/>
+      <w:bookmarkStart w:id="7" w:name="_Toc232816368"/>
       <w:r>
         <w:rPr>
           <w:rFonts w:ascii="Arial" w:hAnsi="Arial" w:cs="Arial"/>
@@ -4300,7 +4300,7 @@
           <w:rFonts w:ascii="Arial" w:hAnsi="Arial" w:cs="Arial"/>
         </w:rPr>
       </w:pPr>
-      <w:bookmarkStart w:id="8" w:name="_Toc232815366"/>
+      <w:bookmarkStart w:id="8" w:name="_Toc232816369"/>
       <w:r>
         <w:rPr>
           <w:rFonts w:ascii="Arial" w:hAnsi="Arial" w:cs="Arial"/>
@@ -4843,7 +4843,7 @@
           <w:rFonts w:ascii="Arial" w:hAnsi="Arial" w:cs="Arial"/>
         </w:rPr>
       </w:pPr>
-      <w:bookmarkStart w:id="9" w:name="_Toc232815367"/>
+      <w:bookmarkStart w:id="9" w:name="_Toc232816370"/>
       <w:r>
         <w:rPr>
           <w:rFonts w:ascii="Arial" w:hAnsi="Arial" w:cs="Arial"/>
@@ -4859,7 +4859,7 @@
           <w:rFonts w:ascii="Arial" w:hAnsi="Arial" w:cs="Arial"/>
         </w:rPr>
       </w:pPr>
-      <w:bookmarkStart w:id="10" w:name="_Toc232815368"/>
+      <w:bookmarkStart w:id="10" w:name="_Toc232816371"/>
       <w:r>
         <w:rPr>
           <w:rFonts w:ascii="Arial" w:hAnsi="Arial" w:cs="Arial"/>
@@ -6402,7 +6402,7 @@
           <w:rFonts w:ascii="Arial" w:hAnsi="Arial" w:cs="Arial"/>
         </w:rPr>
       </w:pPr>
-      <w:bookmarkStart w:id="11" w:name="_Toc232815369"/>
+      <w:bookmarkStart w:id="11" w:name="_Toc232816372"/>
       <w:r>
         <w:rPr>
           <w:rFonts w:ascii="Arial" w:hAnsi="Arial" w:cs="Arial"/>
@@ -7255,7 +7255,7 @@
           <w:rFonts w:ascii="Arial" w:hAnsi="Arial" w:cs="Arial"/>
         </w:rPr>
       </w:pPr>
-      <w:bookmarkStart w:id="12" w:name="_Toc232815370"/>
+      <w:bookmarkStart w:id="12" w:name="_Toc232816373"/>
       <w:r>
         <w:rPr>
           <w:rFonts w:ascii="Arial" w:hAnsi="Arial" w:cs="Arial"/>
@@ -7271,7 +7271,7 @@
           <w:rFonts w:ascii="Arial" w:hAnsi="Arial" w:cs="Arial"/>
         </w:rPr>
       </w:pPr>
-      <w:bookmarkStart w:id="13" w:name="_Toc232815371"/>
+      <w:bookmarkStart w:id="13" w:name="_Toc232816374"/>
       <w:r>
         <w:rPr>
           <w:rFonts w:ascii="Arial" w:hAnsi="Arial" w:cs="Arial"/>
@@ -7754,7 +7754,7 @@
           <w:rFonts w:ascii="Arial" w:hAnsi="Arial" w:cs="Arial"/>
         </w:rPr>
       </w:pPr>
-      <w:bookmarkStart w:id="14" w:name="_Toc232815372"/>
+      <w:bookmarkStart w:id="14" w:name="_Toc232816375"/>
       <w:r>
         <w:rPr>
           <w:rFonts w:ascii="Arial" w:hAnsi="Arial" w:cs="Arial"/>
@@ -7861,7 +7861,7 @@
           <w:rFonts w:ascii="Arial" w:hAnsi="Arial" w:cs="Arial"/>
         </w:rPr>
       </w:pPr>
-      <w:bookmarkStart w:id="15" w:name="_Toc232815373"/>
+      <w:bookmarkStart w:id="15" w:name="_Toc232816376"/>
       <w:r>
         <w:rPr>
           <w:rFonts w:ascii="Arial" w:hAnsi="Arial" w:cs="Arial"/>
@@ -7928,7 +7928,7 @@
           <w:rFonts w:ascii="Arial" w:hAnsi="Arial" w:cs="Arial"/>
         </w:rPr>
       </w:pPr>
-      <w:bookmarkStart w:id="16" w:name="_Toc232815374"/>
+      <w:bookmarkStart w:id="16" w:name="_Toc232816377"/>
       <w:r>
         <w:rPr>
           <w:rFonts w:ascii="Arial" w:hAnsi="Arial" w:cs="Arial"/>
@@ -7990,7 +7990,7 @@
           <w:rFonts w:ascii="Arial" w:hAnsi="Arial" w:cs="Arial"/>
         </w:rPr>
       </w:pPr>
-      <w:bookmarkStart w:id="17" w:name="_Toc232815375"/>
+      <w:bookmarkStart w:id="17" w:name="_Toc232816378"/>
       <w:r>
         <w:rPr>
           <w:rFonts w:ascii="Arial" w:hAnsi="Arial" w:cs="Arial"/>
@@ -8052,7 +8052,7 @@
           <w:rFonts w:ascii="Arial" w:hAnsi="Arial" w:cs="Arial"/>
         </w:rPr>
       </w:pPr>
-      <w:bookmarkStart w:id="18" w:name="_Toc232815376"/>
+      <w:bookmarkStart w:id="18" w:name="_Toc232816379"/>
       <w:r>
         <w:rPr>
           <w:rFonts w:ascii="Arial" w:hAnsi="Arial" w:cs="Arial"/>
@@ -8113,7 +8113,7 @@
           <w:rFonts w:ascii="Arial" w:hAnsi="Arial" w:cs="Arial"/>
         </w:rPr>
       </w:pPr>
-      <w:bookmarkStart w:id="19" w:name="_Toc232815377"/>
+      <w:bookmarkStart w:id="19" w:name="_Toc232816380"/>
       <w:r>
         <w:rPr>
           <w:rFonts w:ascii="Arial" w:hAnsi="Arial" w:cs="Arial"/>
@@ -8175,7 +8175,7 @@
           <w:rFonts w:ascii="Arial" w:hAnsi="Arial" w:cs="Arial"/>
         </w:rPr>
       </w:pPr>
-      <w:bookmarkStart w:id="20" w:name="_Toc232815378"/>
+      <w:bookmarkStart w:id="20" w:name="_Toc232816381"/>
       <w:r>
         <w:rPr>
           <w:rFonts w:ascii="Arial" w:hAnsi="Arial" w:cs="Arial"/>
@@ -8236,7 +8236,7 @@
           <w:rFonts w:ascii="Arial" w:hAnsi="Arial" w:cs="Arial"/>
         </w:rPr>
       </w:pPr>
-      <w:bookmarkStart w:id="21" w:name="_Toc232815379"/>
+      <w:bookmarkStart w:id="21" w:name="_Toc232816382"/>
       <w:r>
         <w:rPr>
           <w:rFonts w:ascii="Arial" w:hAnsi="Arial" w:cs="Arial"/>
@@ -8298,7 +8298,7 @@
           <w:rFonts w:ascii="Arial" w:hAnsi="Arial" w:cs="Arial"/>
         </w:rPr>
       </w:pPr>
-      <w:bookmarkStart w:id="22" w:name="_Toc232815380"/>
+      <w:bookmarkStart w:id="22" w:name="_Toc232816383"/>
       <w:r>
         <w:rPr>
           <w:rFonts w:ascii="Arial" w:hAnsi="Arial" w:cs="Arial"/>
@@ -8779,7 +8779,7 @@
           <w:rFonts w:ascii="Arial" w:hAnsi="Arial" w:cs="Arial"/>
         </w:rPr>
       </w:pPr>
-      <w:bookmarkStart w:id="23" w:name="_Toc232815381"/>
+      <w:bookmarkStart w:id="23" w:name="_Toc232816384"/>
       <w:r>
         <w:rPr>
           <w:rFonts w:ascii="Arial" w:hAnsi="Arial" w:cs="Arial"/>
@@ -8796,7 +8796,7 @@
           <w:rFonts w:ascii="Arial" w:hAnsi="Arial" w:cs="Arial"/>
         </w:rPr>
       </w:pPr>
-      <w:bookmarkStart w:id="24" w:name="_Toc232815382"/>
+      <w:bookmarkStart w:id="24" w:name="_Toc232816385"/>
       <w:r>
         <w:rPr>
           <w:rFonts w:ascii="Arial" w:hAnsi="Arial" w:cs="Arial"/>
@@ -9131,7 +9131,7 @@
           <w:rFonts w:ascii="Arial" w:hAnsi="Arial" w:cs="Arial"/>
         </w:rPr>
       </w:pPr>
-      <w:bookmarkStart w:id="25" w:name="_Toc232815383"/>
+      <w:bookmarkStart w:id="25" w:name="_Toc232816386"/>
       <w:r>
         <w:rPr>
           <w:rFonts w:ascii="Arial" w:hAnsi="Arial" w:cs="Arial"/>
@@ -9254,7 +9254,7 @@
           <w:rFonts w:ascii="Arial" w:hAnsi="Arial" w:cs="Arial"/>
         </w:rPr>
       </w:pPr>
-      <w:bookmarkStart w:id="26" w:name="_Toc232815384"/>
+      <w:bookmarkStart w:id="26" w:name="_Toc232816387"/>
       <w:r>
         <w:rPr>
           <w:rFonts w:ascii="Arial" w:hAnsi="Arial" w:cs="Arial"/>
@@ -9340,7 +9340,7 @@
           <w:rFonts w:ascii="Arial" w:hAnsi="Arial" w:cs="Arial"/>
         </w:rPr>
       </w:pPr>
-      <w:bookmarkStart w:id="27" w:name="_Toc232815385"/>
+      <w:bookmarkStart w:id="27" w:name="_Toc232816388"/>
       <w:r>
         <w:rPr>
           <w:rFonts w:ascii="Arial" w:hAnsi="Arial" w:cs="Arial"/>
@@ -9865,7 +9865,7 @@
           <w:rFonts w:ascii="Arial" w:hAnsi="Arial" w:cs="Arial"/>
         </w:rPr>
       </w:pPr>
-      <w:bookmarkStart w:id="28" w:name="_Toc232815386"/>
+      <w:bookmarkStart w:id="28" w:name="_Toc232816389"/>
       <w:r>
         <w:rPr>
           <w:rFonts w:ascii="Arial" w:hAnsi="Arial" w:cs="Arial"/>
@@ -9881,7 +9881,7 @@
           <w:rFonts w:ascii="Arial" w:hAnsi="Arial" w:cs="Arial"/>
         </w:rPr>
       </w:pPr>
-      <w:bookmarkStart w:id="29" w:name="_Toc232815387"/>
+      <w:bookmarkStart w:id="29" w:name="_Toc232816390"/>
       <w:r>
         <w:rPr>
           <w:rFonts w:ascii="Arial" w:hAnsi="Arial" w:cs="Arial"/>
@@ -10056,7 +10056,7 @@
           <w:rFonts w:ascii="Arial" w:hAnsi="Arial" w:cs="Arial"/>
         </w:rPr>
       </w:pPr>
-      <w:bookmarkStart w:id="30" w:name="_Toc232815388"/>
+      <w:bookmarkStart w:id="30" w:name="_Toc232816391"/>
       <w:r>
         <w:rPr>
           <w:rFonts w:ascii="Arial" w:hAnsi="Arial" w:cs="Arial"/>
@@ -10260,7 +10260,7 @@
           <w:rFonts w:ascii="Arial" w:hAnsi="Arial" w:cs="Arial"/>
         </w:rPr>
       </w:pPr>
-      <w:bookmarkStart w:id="31" w:name="_Toc232815389"/>
+      <w:bookmarkStart w:id="31" w:name="_Toc232816392"/>
       <w:r>
         <w:rPr>
           <w:rFonts w:ascii="Arial" w:hAnsi="Arial" w:cs="Arial"/>
@@ -10404,7 +10404,7 @@
           <w:rFonts w:ascii="Arial" w:hAnsi="Arial" w:cs="Arial"/>
         </w:rPr>
       </w:pPr>
-      <w:bookmarkStart w:id="32" w:name="_Toc232815390"/>
+      <w:bookmarkStart w:id="32" w:name="_Toc232816393"/>
       <w:r>
         <w:rPr>
           <w:rFonts w:ascii="Arial" w:hAnsi="Arial" w:cs="Arial"/>
@@ -10549,7 +10549,7 @@
           <w:rFonts w:ascii="Arial" w:hAnsi="Arial" w:cs="Arial"/>
         </w:rPr>
       </w:pPr>
-      <w:bookmarkStart w:id="33" w:name="_Toc232815391"/>
+      <w:bookmarkStart w:id="33" w:name="_Toc232816394"/>
       <w:r>
         <w:rPr>
           <w:rFonts w:ascii="Arial" w:hAnsi="Arial" w:cs="Arial"/>
@@ -10739,7 +10739,7 @@
         </w:rPr>
       </w:pPr>
       <w:bookmarkStart w:id="34" w:name="_Toc232813578"/>
-      <w:bookmarkStart w:id="35" w:name="_Toc232815392"/>
+      <w:bookmarkStart w:id="35" w:name="_Toc232816395"/>
       <w:r>
         <w:rPr>
           <w:rFonts w:ascii="Arial" w:hAnsi="Arial" w:cs="Arial"/>
@@ -10760,7 +10760,7 @@
           <w:rFonts w:ascii="Arial" w:hAnsi="Arial" w:cs="Arial"/>
           <w:sz w:val="21"/>
         </w:rPr>
-        <w:t>The program can also run without Spotify and without email sending. This works because Last.fm is the required data source. Spotify is only used to enrich the report with covers, durations, links and optional playlist updates. Gmail is only used to send the finished HTML report by email.</w:t>
+        <w:t>The program can also run without Spotify and without email sending. This works because Last.fm is the required data source. Spotify only enriches the report with covers, durations, links and optional playlist updates. Gmail only sends the finished HTML report by email.</w:t>
       </w:r>
     </w:p>
     <w:p>
@@ -10775,14 +10775,355 @@
           <w:rFonts w:ascii="Arial" w:hAnsi="Arial" w:cs="Arial"/>
           <w:sz w:val="21"/>
         </w:rPr>
-        <w:t>If Spotify and Gmail are disabled, the script still loads Last.fm tracks, stores them in SQLite, calculates statistics and creates the HTML report in output/. For a simple teacher test, set SEND_EMAIL=false, ENABLE_PLAYLIST=false and leave SPOTIFY_CLIENT_ID, SPOTIFY_CLIENT_SECRET, SPOTIFY_REFRESH_TOKEN, SPOTIFY_PLAYLIST_ID and PLAYLIST_URL empty. In this setup, no Gmail account and no Spotify app are required. Only LASTFM_API_KEY and LASTFM_USERNAME are required.</w:t>
+        <w:t>For a simple teacher test, the .env file can be configured like this:</w:t>
       </w:r>
     </w:p>
     <w:p>
       <w:pPr>
         <w:pStyle w:val="berschrift2"/>
-      </w:pPr>
-      <w:bookmarkStart w:id="36" w:name="_Toc232815393"/>
+        <w:rPr>
+          <w:rFonts w:ascii="Arial" w:eastAsiaTheme="minorEastAsia" w:hAnsi="Arial" w:cs="Arial"/>
+          <w:b w:val="0"/>
+          <w:bCs w:val="0"/>
+          <w:color w:val="auto"/>
+          <w:sz w:val="21"/>
+          <w:szCs w:val="22"/>
+        </w:rPr>
+      </w:pPr>
+    </w:p>
+    <w:p>
+      <w:pPr>
+        <w:rPr>
+          <w:rFonts w:ascii="Arial" w:hAnsi="Arial" w:cs="Arial"/>
+          <w:b/>
+          <w:sz w:val="21"/>
+        </w:rPr>
+      </w:pPr>
+      <w:r>
+        <w:rPr>
+          <w:rFonts w:ascii="Arial" w:hAnsi="Arial" w:cs="Arial"/>
+          <w:b/>
+          <w:sz w:val="21"/>
+        </w:rPr>
+        <w:t>Required Last.fm values:</w:t>
+      </w:r>
+    </w:p>
+    <w:p>
+      <w:pPr>
+        <w:ind w:left="360"/>
+        <w:rPr>
+          <w:rFonts w:ascii="Consolas" w:hAnsi="Consolas"/>
+          <w:sz w:val="19"/>
+        </w:rPr>
+      </w:pPr>
+      <w:r>
+        <w:rPr>
+          <w:rFonts w:ascii="Consolas" w:hAnsi="Consolas"/>
+          <w:sz w:val="19"/>
+        </w:rPr>
+        <w:t>LASTFM_API_KEY=&lt;own Last.fm API key&gt;</w:t>
+      </w:r>
+    </w:p>
+    <w:p>
+      <w:pPr>
+        <w:ind w:left="360"/>
+        <w:rPr>
+          <w:rFonts w:ascii="Consolas" w:hAnsi="Consolas"/>
+          <w:sz w:val="19"/>
+        </w:rPr>
+      </w:pPr>
+      <w:r>
+        <w:rPr>
+          <w:rFonts w:ascii="Consolas" w:hAnsi="Consolas"/>
+          <w:sz w:val="19"/>
+        </w:rPr>
+        <w:t>LASTFM_USERNAME=&lt;own Last.fm username&gt;</w:t>
+      </w:r>
+    </w:p>
+    <w:p>
+      <w:pPr>
+        <w:pStyle w:val="berschrift2"/>
+        <w:rPr>
+          <w:rFonts w:ascii="Arial" w:eastAsiaTheme="minorEastAsia" w:hAnsi="Arial" w:cs="Arial"/>
+          <w:b w:val="0"/>
+          <w:bCs w:val="0"/>
+          <w:color w:val="auto"/>
+          <w:sz w:val="21"/>
+          <w:szCs w:val="22"/>
+        </w:rPr>
+      </w:pPr>
+    </w:p>
+    <w:p>
+      <w:pPr>
+        <w:rPr>
+          <w:rFonts w:ascii="Arial" w:hAnsi="Arial" w:cs="Arial"/>
+          <w:b/>
+          <w:sz w:val="21"/>
+        </w:rPr>
+      </w:pPr>
+      <w:r>
+        <w:rPr>
+          <w:rFonts w:ascii="Arial" w:hAnsi="Arial" w:cs="Arial"/>
+          <w:b/>
+          <w:sz w:val="21"/>
+        </w:rPr>
+        <w:t>Disable optional services:</w:t>
+      </w:r>
+    </w:p>
+    <w:p>
+      <w:pPr>
+        <w:ind w:left="360"/>
+        <w:rPr>
+          <w:rFonts w:ascii="Consolas" w:hAnsi="Consolas"/>
+          <w:sz w:val="19"/>
+        </w:rPr>
+      </w:pPr>
+      <w:r>
+        <w:rPr>
+          <w:rFonts w:ascii="Consolas" w:hAnsi="Consolas"/>
+          <w:sz w:val="19"/>
+        </w:rPr>
+        <w:t>SEND_EMAIL=false</w:t>
+      </w:r>
+    </w:p>
+    <w:p>
+      <w:pPr>
+        <w:ind w:left="360"/>
+        <w:rPr>
+          <w:rFonts w:ascii="Consolas" w:hAnsi="Consolas"/>
+          <w:sz w:val="19"/>
+        </w:rPr>
+      </w:pPr>
+      <w:r>
+        <w:rPr>
+          <w:rFonts w:ascii="Consolas" w:hAnsi="Consolas"/>
+          <w:sz w:val="19"/>
+        </w:rPr>
+        <w:t>ENABLE_PLAYLIST=false</w:t>
+      </w:r>
+    </w:p>
+    <w:p>
+      <w:pPr>
+        <w:pStyle w:val="berschrift2"/>
+        <w:rPr>
+          <w:rFonts w:ascii="Arial" w:eastAsiaTheme="minorEastAsia" w:hAnsi="Arial" w:cs="Arial"/>
+          <w:b w:val="0"/>
+          <w:bCs w:val="0"/>
+          <w:color w:val="auto"/>
+          <w:sz w:val="21"/>
+          <w:szCs w:val="22"/>
+        </w:rPr>
+      </w:pPr>
+    </w:p>
+    <w:p>
+      <w:pPr>
+        <w:rPr>
+          <w:rFonts w:ascii="Arial" w:hAnsi="Arial" w:cs="Arial"/>
+          <w:b/>
+          <w:sz w:val="21"/>
+        </w:rPr>
+      </w:pPr>
+      <w:r>
+        <w:rPr>
+          <w:rFonts w:ascii="Arial" w:hAnsi="Arial" w:cs="Arial"/>
+          <w:b/>
+          <w:sz w:val="21"/>
+        </w:rPr>
+        <w:t>Leave Spotify values empty:</w:t>
+      </w:r>
+    </w:p>
+    <w:p>
+      <w:pPr>
+        <w:ind w:left="360"/>
+        <w:rPr>
+          <w:rFonts w:ascii="Consolas" w:hAnsi="Consolas"/>
+          <w:sz w:val="19"/>
+        </w:rPr>
+      </w:pPr>
+      <w:r>
+        <w:rPr>
+          <w:rFonts w:ascii="Consolas" w:hAnsi="Consolas"/>
+          <w:sz w:val="19"/>
+        </w:rPr>
+        <w:t>SPOTIFY_CLIENT_ID=</w:t>
+      </w:r>
+    </w:p>
+    <w:p>
+      <w:pPr>
+        <w:ind w:left="360"/>
+        <w:rPr>
+          <w:rFonts w:ascii="Consolas" w:hAnsi="Consolas"/>
+          <w:sz w:val="19"/>
+        </w:rPr>
+      </w:pPr>
+      <w:r>
+        <w:rPr>
+          <w:rFonts w:ascii="Consolas" w:hAnsi="Consolas"/>
+          <w:sz w:val="19"/>
+        </w:rPr>
+        <w:t>SPOTIFY_CLIENT_SECRET=</w:t>
+      </w:r>
+    </w:p>
+    <w:p>
+      <w:pPr>
+        <w:ind w:left="360"/>
+        <w:rPr>
+          <w:rFonts w:ascii="Consolas" w:hAnsi="Consolas"/>
+          <w:sz w:val="19"/>
+        </w:rPr>
+      </w:pPr>
+      <w:r>
+        <w:rPr>
+          <w:rFonts w:ascii="Consolas" w:hAnsi="Consolas"/>
+          <w:sz w:val="19"/>
+        </w:rPr>
+        <w:t>SPOTIFY_REFRESH_TOKEN=</w:t>
+      </w:r>
+    </w:p>
+    <w:p>
+      <w:pPr>
+        <w:ind w:left="360"/>
+        <w:rPr>
+          <w:rFonts w:ascii="Consolas" w:hAnsi="Consolas"/>
+          <w:sz w:val="19"/>
+        </w:rPr>
+      </w:pPr>
+      <w:r>
+        <w:rPr>
+          <w:rFonts w:ascii="Consolas" w:hAnsi="Consolas"/>
+          <w:sz w:val="19"/>
+        </w:rPr>
+        <w:lastRenderedPageBreak/>
+        <w:t>SPOTIFY_PLAYLIST_ID=</w:t>
+      </w:r>
+    </w:p>
+    <w:p>
+      <w:pPr>
+        <w:ind w:left="360"/>
+        <w:rPr>
+          <w:rFonts w:ascii="Consolas" w:hAnsi="Consolas"/>
+          <w:sz w:val="19"/>
+        </w:rPr>
+      </w:pPr>
+      <w:r>
+        <w:rPr>
+          <w:rFonts w:ascii="Consolas" w:hAnsi="Consolas"/>
+          <w:sz w:val="19"/>
+        </w:rPr>
+        <w:t>PLAYLIST_URL=</w:t>
+      </w:r>
+    </w:p>
+    <w:p>
+      <w:pPr>
+        <w:pStyle w:val="berschrift2"/>
+        <w:rPr>
+          <w:rFonts w:ascii="Arial" w:eastAsiaTheme="minorEastAsia" w:hAnsi="Arial" w:cs="Arial"/>
+          <w:b w:val="0"/>
+          <w:bCs w:val="0"/>
+          <w:color w:val="auto"/>
+          <w:sz w:val="21"/>
+          <w:szCs w:val="22"/>
+        </w:rPr>
+      </w:pPr>
+    </w:p>
+    <w:p>
+      <w:pPr>
+        <w:rPr>
+          <w:rFonts w:ascii="Arial" w:hAnsi="Arial" w:cs="Arial"/>
+          <w:b/>
+          <w:sz w:val="21"/>
+        </w:rPr>
+      </w:pPr>
+      <w:r>
+        <w:rPr>
+          <w:rFonts w:ascii="Arial" w:hAnsi="Arial" w:cs="Arial"/>
+          <w:b/>
+          <w:sz w:val="21"/>
+        </w:rPr>
+        <w:t>Gmail values can also stay empty when SEND_EMAIL=false:</w:t>
+      </w:r>
+    </w:p>
+    <w:p>
+      <w:pPr>
+        <w:ind w:left="360"/>
+        <w:rPr>
+          <w:rFonts w:ascii="Consolas" w:hAnsi="Consolas"/>
+          <w:sz w:val="19"/>
+        </w:rPr>
+      </w:pPr>
+      <w:r>
+        <w:rPr>
+          <w:rFonts w:ascii="Consolas" w:hAnsi="Consolas"/>
+          <w:sz w:val="19"/>
+        </w:rPr>
+        <w:t>GMAIL_ADDRESS=</w:t>
+      </w:r>
+    </w:p>
+    <w:p>
+      <w:pPr>
+        <w:ind w:left="360"/>
+        <w:rPr>
+          <w:rFonts w:ascii="Consolas" w:hAnsi="Consolas"/>
+          <w:sz w:val="19"/>
+        </w:rPr>
+      </w:pPr>
+      <w:r>
+        <w:rPr>
+          <w:rFonts w:ascii="Consolas" w:hAnsi="Consolas"/>
+          <w:sz w:val="19"/>
+        </w:rPr>
+        <w:t>GMAIL_APP_PASSWORD=</w:t>
+      </w:r>
+    </w:p>
+    <w:p>
+      <w:pPr>
+        <w:ind w:left="360"/>
+        <w:rPr>
+          <w:rFonts w:ascii="Consolas" w:hAnsi="Consolas"/>
+          <w:sz w:val="19"/>
+        </w:rPr>
+      </w:pPr>
+      <w:r>
+        <w:rPr>
+          <w:rFonts w:ascii="Consolas" w:hAnsi="Consolas"/>
+          <w:sz w:val="19"/>
+        </w:rPr>
+        <w:t>RECIPIENT_EMAIL=</w:t>
+      </w:r>
+    </w:p>
+    <w:p>
+      <w:pPr>
+        <w:pStyle w:val="berschrift2"/>
+        <w:rPr>
+          <w:rFonts w:ascii="Arial" w:eastAsiaTheme="minorEastAsia" w:hAnsi="Arial" w:cs="Arial"/>
+          <w:b w:val="0"/>
+          <w:bCs w:val="0"/>
+          <w:color w:val="auto"/>
+          <w:sz w:val="21"/>
+          <w:szCs w:val="22"/>
+        </w:rPr>
+      </w:pPr>
+    </w:p>
+    <w:p>
+      <w:pPr>
+        <w:rPr>
+          <w:rFonts w:ascii="Arial" w:hAnsi="Arial" w:cs="Arial"/>
+          <w:sz w:val="21"/>
+        </w:rPr>
+      </w:pPr>
+      <w:r>
+        <w:rPr>
+          <w:rFonts w:ascii="Arial" w:hAnsi="Arial" w:cs="Arial"/>
+          <w:sz w:val="21"/>
+        </w:rPr>
+        <w:t>With this setup, no Gmail account and no Spotify app are required. The script still loads Last.fm tracks, stores them in SQLite, calculates statistics and creates the HTML report in output/.</w:t>
+      </w:r>
+    </w:p>
+    <w:p>
+      <w:pPr>
+        <w:pStyle w:val="berschrift2"/>
+      </w:pPr>
+      <w:bookmarkStart w:id="36" w:name="_Toc232816396"/>
       <w:r>
         <w:t>7.6 Start The Program</w:t>
       </w:r>
@@ -10877,7 +11218,7 @@
           <w:rFonts w:ascii="Arial" w:hAnsi="Arial" w:cs="Arial"/>
         </w:rPr>
       </w:pPr>
-      <w:bookmarkStart w:id="37" w:name="_Toc232815394"/>
+      <w:bookmarkStart w:id="37" w:name="_Toc232816397"/>
       <w:r>
         <w:rPr>
           <w:rFonts w:ascii="Arial" w:hAnsi="Arial" w:cs="Arial"/>
@@ -10938,7 +11279,6 @@
                 <w:color w:val="111827"/>
                 <w:sz w:val="17"/>
               </w:rPr>
-              <w:lastRenderedPageBreak/>
               <w:t>&lt;project-path&gt;\.venv\Scripts\python.exe</w:t>
             </w:r>
             <w:r>
@@ -11003,7 +11343,7 @@
           <w:rFonts w:ascii="Arial" w:hAnsi="Arial" w:cs="Arial"/>
         </w:rPr>
       </w:pPr>
-      <w:bookmarkStart w:id="38" w:name="_Toc232815395"/>
+      <w:bookmarkStart w:id="38" w:name="_Toc232816398"/>
       <w:r>
         <w:rPr>
           <w:rFonts w:ascii="Arial" w:hAnsi="Arial" w:cs="Arial"/>
@@ -11098,6 +11438,7 @@
     <w:p/>
     <w:p>
       <w:r>
+        <w:lastRenderedPageBreak/>
         <w:t>For the test design, I focused on the parts that could fail in real use: missing configuration values, duplicate listening entries, API responses with incomplete data, email sending and the main workflow. External services are mocked in the unit tests, so the tests can run without using private API keys or sending real emails.</w:t>
       </w:r>
     </w:p>
@@ -11118,7 +11459,7 @@
           <w:rFonts w:ascii="Arial" w:hAnsi="Arial" w:cs="Arial"/>
         </w:rPr>
       </w:pPr>
-      <w:bookmarkStart w:id="39" w:name="_Toc232815396"/>
+      <w:bookmarkStart w:id="39" w:name="_Toc232816399"/>
       <w:r>
         <w:rPr>
           <w:rFonts w:ascii="Arial" w:hAnsi="Arial" w:cs="Arial"/>
@@ -11699,7 +12040,7 @@
           <w:rFonts w:ascii="Arial" w:hAnsi="Arial" w:cs="Arial"/>
         </w:rPr>
       </w:pPr>
-      <w:bookmarkStart w:id="40" w:name="_Toc232815397"/>
+      <w:bookmarkStart w:id="40" w:name="_Toc232816400"/>
       <w:r>
         <w:rPr>
           <w:rFonts w:ascii="Arial" w:hAnsi="Arial" w:cs="Arial"/>

</xml_diff>